<commit_message>
feat(quant): apply p0 to p2 reductions and typography refinements
</commit_message>
<xml_diff>
--- a/m4-quant/act 2/export/Actividad_4_2_A01750536.docx
+++ b/m4-quant/act 2/export/Actividad_4_2_A01750536.docx
@@ -101,20 +101,7 @@
         <w:pStyle w:val="FirstParagraph"/>
       </w:pPr>
       <w:r>
-        <w:t xml:space="preserve">Una melodía se define acústicamente como una secuencia temporal de notas discretas con alturas y duraciones determinadas. Una pregunta fundamental en la teoría de la información y el análisis de sistemas es si dicha secuencia de cambios puede considerarse y modelarse formalmente como un</w:t>
-      </w:r>
-      <w:r>
-        <w:t xml:space="preserve"> </w:t>
-      </w:r>
-      <w:r>
-        <w:rPr>
-          <w:b/>
-          <w:bCs/>
-        </w:rPr>
-        <w:t xml:space="preserve">proceso estocástico</w:t>
-      </w:r>
-      <w:r>
-        <w:t xml:space="preserve">.</w:t>
+        <w:t xml:space="preserve">Una melodía se define como una secuencia temporal de notas discretas con alturas y duraciones determinadas. En teoría de la información y sistemas estocásticos, surge la pregunta de si dicha secuencia puede modelarse formalmente como un proceso estocástico.</w:t>
       </w:r>
     </w:p>
     <w:p>
@@ -175,18 +162,7 @@
         <w:t xml:space="preserve"> </w:t>
       </w:r>
       <w:r>
-        <w:t xml:space="preserve">indexadas por un conjunto temporal</w:t>
-      </w:r>
-      <w:r>
-        <w:t xml:space="preserve"> </w:t>
-      </w:r>
-      <m:oMath>
-        <m:r>
-          <m:t>T</m:t>
-        </m:r>
-      </m:oMath>
-      <w:r>
-        <w:t xml:space="preserve">. En la música tonal occidental, la sucesión de eventos sonoros no constituye ruido caótico ni tampoco una trayectoria estrictamente determinista: está gobernada por principios de consonancia física, tensión armónica y tendencias de resolución melódica. Por ende, la música constituye un proceso estocástico con una estructura definida de dependencia temporal.</w:t>
+        <w:t xml:space="preserve">indexadas en el tiempo. En la música tonal occidental, la sucesión de notas no es ruido caótico ni tampoco una trayectoria estrictamente determinista: responde a principios de consonancia física, tensión armónica y resolución. Por ello, la música constituye un proceso estocástico con estructura de dependencia temporal.</w:t>
       </w:r>
     </w:p>
     <w:p>
@@ -206,7 +182,7 @@
         </w:numPr>
       </w:pPr>
       <w:r>
-        <w:t xml:space="preserve">Diseñar una cadena de Markov de tiempo discreto que modele las transiciones entre notas de la escala diatónica de Re Mayor (D Major) y acordes armónicos.</w:t>
+        <w:t xml:space="preserve">Diseñar una cadena de Markov de tiempo discreto sobre la escala de Re Mayor (D Major) y acordes armónicos.</w:t>
       </w:r>
     </w:p>
     <w:p>
@@ -218,7 +194,7 @@
         </w:numPr>
       </w:pPr>
       <w:r>
-        <w:t xml:space="preserve">Representar la dinámica del sistema mediante una matriz de transiciones y validar computacionalmente sus propiedades estocásticas.</w:t>
+        <w:t xml:space="preserve">Representar la dinámica mediante una matriz de transiciones y validar sus propiedades estocásticas.</w:t>
       </w:r>
     </w:p>
     <w:p>
@@ -242,7 +218,7 @@
         </w:numPr>
       </w:pPr>
       <w:r>
-        <w:t xml:space="preserve">Sintetizar físicamente cada tono empleando frecuencia fundamental y duración variable con suavizado de envolvente ADSR para prevenir distorsión acústica.</w:t>
+        <w:t xml:space="preserve">Sintetizar físicamente cada tono con frecuencia y duración variable usando envolvente ADSR para evitar distorsión.</w:t>
       </w:r>
     </w:p>
     <w:p>
@@ -266,7 +242,7 @@
         </w:numPr>
       </w:pPr>
       <w:r>
-        <w:t xml:space="preserve">Elaborar una reflexión profunda sobre la incorporación de patrones repetitivos, el aprendizaje de estilos mediante estimación empírica y las limitaciones estructurales del modelo.</w:t>
+        <w:t xml:space="preserve">Elaborar una reflexión sobre patrones repetitivos, aprendizaje de estilos y limitaciones del modelo.</w:t>
       </w:r>
     </w:p>
     <w:p>
@@ -354,7 +330,7 @@
         <w:rPr>
           <w:rStyle w:val="VerbatimChar"/>
         </w:rPr>
-        <w:t xml:space="preserve">6           Duraciones      4 figuras (120 BPM), _body=&lt;great_tables._gt_data.Body object at 0xf8d8b06ab230&gt;, _boxhead=Boxhead([ColInfo(var='Parámetro', type=&lt;ColInfoTypeEnum.default: 1&gt;, column_label='Parámetro', column_align='left', column_width=None, stub_level=None), ColInfo(var='Valor', type=&lt;ColInfoTypeEnum.default: 1&gt;, column_label='Valor', column_align='right', column_width=None, stub_level=None)]), _stub=&lt;great_tables._gt_data.Stub object at 0xf8d8b06ab0e0&gt;, _spanners=Spanners([]), _heading=Heading(title='Resumen del Sistema y Síntesis Acústica', subtitle=None, preheader=None), _stubhead=None, _summary_rows=&lt;great_tables._gt_data.SummaryRows object at 0xf8d8b06ab770&gt;, _summary_rows_grand=&lt;great_tables._gt_data.SummaryRows object at 0xf8d8b07416d0&gt;, _source_notes=[], _footnotes=[], _styles=[], _locale=&lt;great_tables._gt_data.Locale object at 0xf8d8b06ab8c0&gt;, _formats=[], _substitutions=[], _col_merge=[], _transforms=[], _options=Options(table_id=OptionsInfo(scss=False, category='table', type='value', value=None), table_caption=OptionsInfo(scss=False, category='table', type='value', value=None), table_width=OptionsInfo(scss=True, category='table', type='px', value='auto'), table_layout=OptionsInfo(scss=True, category='table', type='value', value='fixed'), table_margin_left=OptionsInfo(scss=True, category='table', type='px', value='auto'), table_margin_right=OptionsInfo(scss=True, category='table', type='px', value='auto'), table_background_color=OptionsInfo(scss=True, category='table', type='value', value='#FFFFFF'), table_additional_css=OptionsInfo(scss=False, category='table', type='values', value=[]), table_font_names=OptionsInfo(scss=False, category='table', type='values', value=['-apple-system', 'BlinkMacSystemFont', 'Segoe UI', 'Roboto', 'Oxygen', 'Ubuntu', 'Cantarell', 'Helvetica Neue', 'Fira Sans', 'Droid Sans', 'Arial', 'sans-serif']), table_font_size=OptionsInfo(scss=True, category='table', type='px', value='16px'), table_font_weight=OptionsInfo(scss=True, category='table', type='value', value='normal'), table_font_style=OptionsInfo(scss=True, category='table', type='value', value='normal'), table_font_color=OptionsInfo(scss=True, category='table', type='value', value='#333333'), table_font_color_light=OptionsInfo(scss=True, category='table', type='value', value='#FFFFFF'), table_border_top_include=OptionsInfo(scss=False, category='table', type='boolean', value=True), table_border_top_style=OptionsInfo(scss=True, category='table', type='value', value='solid'), table_border_top_width=OptionsInfo(scss=True, category='table', type='px', value='2px'), table_border_top_color=OptionsInfo(scss=True, category='table', type='value', value='#A8A8A8'), table_border_right_style=OptionsInfo(scss=True, category='table', type='value', value='none'), table_border_right_width=OptionsInfo(scss=True, category='table', type='px', value='2px'), table_border_right_color=OptionsInfo(scss=True, category='table', type='value', value='#D3D3D3'), table_border_bottom_include=OptionsInfo(scss=False, category='table', type='boolean', value=True), table_border_bottom_style=OptionsInfo(scss=True, category='table', type='value', value='solid'), table_border_bottom_width=OptionsInfo(scss=True, category='table', type='px', value='2px'), table_border_bottom_color=OptionsInfo(scss=True, category='table', type='value', value='#A8A8A8'), table_border_left_style=OptionsInfo(scss=True, category='table', type='value', value='none'), table_border_left_width=OptionsInfo(scss=True, category='table', type='px', value='2px'), table_border_left_color=OptionsInfo(scss=True, category='table', type='value', value='#D3D3D3'), heading_background_color=OptionsInfo(scss=True, category='heading', type='value', value=None), heading_align=OptionsInfo(scss=True, category='heading', type='value', value='center'), heading_title_font_size=OptionsInfo(scss=True, category='heading', type='px', value='125%'), heading_title_font_weight=OptionsInfo(scss=True, category='heading', type='value', value='initial'), heading_subtitle_font_size=OptionsInfo(scss=True, category='heading', type='px', value='85%'), heading_subtitle_font_weight=OptionsInfo(scss=True, category='heading', type='value', value='initial'), heading_padding=OptionsInfo(scss=True, category='heading', type='px', value='4px'), heading_padding_horizontal=OptionsInfo(scss=True, category='heading', type='px', value='5px'), heading_border_bottom_style=OptionsInfo(scss=True, category='heading', type='value', value='solid'), heading_border_bottom_width=OptionsInfo(scss=True, category='heading', type='px', value='2px'), heading_border_bottom_color=OptionsInfo(scss=True, category='heading', type='value', value='#D3D3D3'), heading_border_lr_style=OptionsInfo(scss=True, category='heading', type='value', value='none'), heading_border_lr_width=OptionsInfo(scss=True, category='heading', type='px', value='1px'), heading_border_lr_color=OptionsInfo(scss=True, category='heading', type='value', value='#D3D3D3'), column_labels_background_color=OptionsInfo(scss=True, category='column_labels', type='value', value=None), column_labels_font_size=OptionsInfo(scss=True, category='column_labels', type='px', value='100%'), column_labels_font_weight=OptionsInfo(scss=True, category='column_labels', type='value', value='normal'), column_labels_text_transform=OptionsInfo(scss=True, category='column_labels', type='value', value='inherit'), column_labels_padding=OptionsInfo(scss=True, category='column_labels', type='px', value='5px'), column_labels_padding_horizontal=OptionsInfo(scss=True, category='column_labels', type='px', value='5px'), column_labels_vlines_style=OptionsInfo(scss=True, category='table_body', type='value', value='none'), column_labels_vlines_width=OptionsInfo(scss=True, category='table_body', type='px', value='1px'), column_labels_vlines_color=OptionsInfo(scss=True, category='table_body', type='value', value='#D3D3D3'), column_labels_border_top_style=OptionsInfo(scss=True, category='column_labels', type='value', value='solid'), column_labels_border_top_width=OptionsInfo(scss=True, category='column_labels', type='px', value='2px'), column_labels_border_top_color=OptionsInfo(scss=True, category='column_labels', type='value', value='#D3D3D3'), column_labels_border_bottom_style=OptionsInfo(scss=True, category='column_labels', type='value', value='solid'), column_labels_border_bottom_width=OptionsInfo(scss=True, category='column_labels', type='px', value='2px'), column_labels_border_bottom_color=OptionsInfo(scss=True, category='column_labels', type='value', value='#D3D3D3'), column_labels_border_lr_style=OptionsInfo(scss=True, category='column_labels', type='value', value='none'), column_labels_border_lr_width=OptionsInfo(scss=True, category='column_labels', type='px', value='1px'), column_labels_border_lr_color=OptionsInfo(scss=True, category='column_labels', type='value', value='#D3D3D3'), column_labels_hidden=OptionsInfo(scss=False, category='column_labels', type='boolean', value=False), row_group_background_color=OptionsInfo(scss=True, category='row_group', type='value', value=None), row_group_font_size=OptionsInfo(scss=True, category='row_group', type='px', value='100%'), row_group_font_weight=OptionsInfo(scss=True, category='row_group', type='value', value='initial'), row_group_text_transform=OptionsInfo(scss=True, category='row_group', type='value', value='inherit'), row_group_padding=OptionsInfo(scss=True, category='row_group', type='px', value='8px'), row_group_padding_horizontal=OptionsInfo(scss=True, category='row_group', type='px', value='5px'), row_group_border_top_style=OptionsInfo(scss=True, category='row_group', type='value', value='solid'), row_group_border_top_width=OptionsInfo(scss=True, category='row_group', type='px', value='2px'), row_group_border_top_color=OptionsInfo(scss=True, category='row_group', type='value', value='#D3D3D3'), row_group_border_right_style=OptionsInfo(scss=True, category='row_group', type='value', value='none'), row_group_border_right_width=OptionsInfo(scss=True, category='row_group', type='px', value='1px'), row_group_border_right_color=OptionsInfo(scss=True, category='row_group', type='value', value='#D3D3D3'), row_group_border_bottom_style=OptionsInfo(scss=True, category='row_group', type='value', value='solid'), row_group_border_bottom_width=OptionsInfo(scss=True, category='row_group', type='px', value='2px'), row_group_border_bottom_color=OptionsInfo(scss=True, category='row_group', type='value', value='#D3D3D3'), row_group_border_left_style=OptionsInfo(scss=True, category='row_group', type='value', value='none'), row_group_border_left_width=OptionsInfo(scss=True, category='row_group', type='px', value='1px'), row_group_border_left_color=OptionsInfo(scss=True, category='row_group', type='value', value='#D3D3D3'), row_group_as_column=OptionsInfo(scss=False, category='row_group', type='boolean', value=False), table_body_hlines_style=OptionsInfo(scss=True, category='table_body', type='value', value='solid'), table_body_hlines_width=OptionsInfo(scss=True, category='table_body', type='px', value='1px'), table_body_hlines_color=OptionsInfo(scss=True, category='table_body', type='value', value='#D3D3D3'), table_body_vlines_style=OptionsInfo(scss=True, category='table_body', type='value', value='none'), table_body_vlines_width=OptionsInfo(scss=True, category='table_body', type='px', value='1px'), table_body_vlines_color=OptionsInfo(scss=True, category='table_body', type='value', value='#D3D3D3'), table_body_border_top_style=OptionsInfo(scss=True, category='table_body', type='value', value='solid'), table_body_border_top_width=OptionsInfo(scss=True, category='table_body', type='px', value='2px'), table_body_border_top_color=OptionsInfo(scss=True, category='table_body', type='value', value='#D3D3D3'), table_body_border_bottom_style=OptionsInfo(scss=True, category='table_body', type='value', value='solid'), table_body_border_bottom_width=OptionsInfo(scss=True, category='table_body', type='px', value='2px'), table_body_border_bottom_color=OptionsInfo(scss=True, category='table_body', type='value', value='#D3D3D3'), data_row_padding=OptionsInfo(scss=True, category='data_row', type='px', value='8px'), data_row_padding_horizontal=OptionsInfo(scss=True, category='data_row', type='px', value='5px'), stub_background_color=OptionsInfo(scss=True, category='stub', type='value', value=None), stub_font_size=OptionsInfo(scss=True, category='stub', type='px', value='100%'), stub_font_weight=OptionsInfo(scss=True, category='stub', type='value', value='initial'), stub_text_transform=OptionsInfo(scss=True, category='stub', type='value', value='inherit'), stub_border_style=OptionsInfo(scss=True, category='stub', type='value', value='solid'), stub_border_width=OptionsInfo(scss=True, category='stub', type='px', value='2px'), stub_border_color=OptionsInfo(scss=True, category='stub', type='value', value='#D3D3D3'), stub_indent_length=OptionsInfo(scss=True, category='stub', type='px', value='5px'), stub_row_group_background_color=OptionsInfo(scss=True, category='stub', type='value', value=None), stub_row_group_font_size=OptionsInfo(scss=True, category='stub', type='px', value='100%'), stub_row_group_font_weight=OptionsInfo(scss=True, category='stub', type='value', value='initial'), stub_row_group_text_transform=OptionsInfo(scss=True, category='stub', type='value', value='inherit'), stub_row_group_border_style=OptionsInfo(scss=True, category='stub', type='value', value='solid'), stub_row_group_border_width=OptionsInfo(scss=True, category='stub', type='px', value='2px'), stub_row_group_border_color=OptionsInfo(scss=True, category='stub', type='value', value='#D3D3D3'), summary_row_padding=OptionsInfo(scss=True, category='summary_row', type='px', value='8px'), summary_row_padding_horizontal=OptionsInfo(scss=True, category='summary_row', type='px', value='5px'), summary_row_background_color=OptionsInfo(scss=True, category='summary_row', type='value', value=None), summary_row_text_transform=OptionsInfo(scss=True, category='summary_row', type='value', value='inherit'), summary_row_border_style=OptionsInfo(scss=True, category='summary_row', type='value', value='solid'), summary_row_border_width=OptionsInfo(scss=True, category='summary_row', type='px', value='2px'), summary_row_border_color=OptionsInfo(scss=True, category='summary_row', type='value', value='#D3D3D3'), grand_summary_row_padding=OptionsInfo(scss=True, category='grand_summary_row', type='px', value='8px'), grand_summary_row_padding_horizontal=OptionsInfo(scss=True, category='grand_summary_row', type='px', value='5px'), grand_summary_row_background_color=OptionsInfo(scss=True, category='grand_summary_row', type='value', value=None), grand_summary_row_text_transform=OptionsInfo(scss=True, category='grand_summary_row', type='value', value='inherit'), grand_summary_row_border_style=OptionsInfo(scss=True, category='grand_summary_row', type='value', value='double'), grand_summary_row_border_width=OptionsInfo(scss=True, category='grand_summary_row', type='px', value='6px'), grand_summary_row_border_color=OptionsInfo(scss=True, category='grand_summary_row', type='value', value='#D3D3D3'), footnotes_marks=OptionsInfo(scss=False, category='footnotes', type='values', value='numbers'), footnotes_spec_ref=OptionsInfo(scss=False, category='footnotes', type='value', value='^i'), footnotes_spec_ftr=OptionsInfo(scss=False, category='footnotes', type='value', value='^i'), footnotes_order=OptionsInfo(scss=False, category='footnotes', type='value', value='marks_last'), source_notes_padding=OptionsInfo(scss=True, category='source_notes', type='px', value='4px'), source_notes_padding_horizontal=OptionsInfo(scss=True, category='source_notes', type='px', value='5px'), source_notes_background_color=OptionsInfo(scss=True, category='source_notes', type='value', value=None), source_notes_font_size=OptionsInfo(scss=True, category='source_notes', type='px', value='90%'), source_notes_border_bottom_style=OptionsInfo(scss=True, category='source_notes', type='value', value='none'), source_notes_border_bottom_width=OptionsInfo(scss=True, category='source_notes', type='px', value='2px'), source_notes_border_bottom_color=OptionsInfo(scss=True, category='source_notes', type='value', value='#D3D3D3'), source_notes_border_lr_style=OptionsInfo(scss=True, category='source_notes', type='value', value='none'), source_notes_border_lr_width=OptionsInfo(scss=True, category='source_notes', type='px', value='2px'), source_notes_border_lr_color=OptionsInfo(scss=True, category='source_notes', type='value', value='#D3D3D3'), source_notes_multiline=OptionsInfo(scss=False, category='source_notes', type='boolean', value=True), source_notes_sep=OptionsInfo(scss=False, category='source_notes', type='value', value=' '), row_striping_background_color=OptionsInfo(scss=True, category='row', type='value', value='#F4F4F4'), row_striping_include_stub=OptionsInfo(scss=False, category='row', type='boolean', value=False), row_striping_include_table_body=OptionsInfo(scss=False, category='row', type='boolean', value=False), container_width=OptionsInfo(scss=False, category='container', type='px', value='auto'), container_height=OptionsInfo(scss=False, category='container', type='px', value='auto'), container_padding_x=OptionsInfo(scss=False, category='container', type='px', value='0px'), container_padding_y=OptionsInfo(scss=False, category='container', type='px', value='10px'), container_overflow_x=OptionsInfo(scss=False, category='container', type='overflow', value='auto'), container_overflow_y=OptionsInfo(scss=False, category='container', type='overflow', value='auto'), quarto_disable_processing=OptionsInfo(scss=False, category='quarto', type='logical', value=False), quarto_use_bootstrap=OptionsInfo(scss=False, category='quarto', type='logical', value=False), ihtml_active=OptionsInfo(scss=False, category='ihtml', type='boolean', value=False), ihtml_use_pagination=OptionsInfo(scss=False, category='ihtml', type='boolean', value=True), ihtml_use_pagination_info=OptionsInfo(scss=False, category='ihtml', type='boolean', value=True), ihtml_use_sorting=OptionsInfo(scss=False, category='ihtml', type='boolean', value=True), ihtml_use_search=OptionsInfo(scss=False, category='ihtml', type='boolean', value=False), ihtml_use_filters=OptionsInfo(scss=False, category='ihtml', type='boolean', value=False), ihtml_use_resizers=OptionsInfo(scss=False, category='ihtml', type='boolean', value=False), ihtml_use_highlight=OptionsInfo(scss=False, category='ihtml', type='boolean', value=False), ihtml_use_compact_mode=OptionsInfo(scss=False, category='ihtml', type='boolean', value=False), ihtml_use_text_wrapping=OptionsInfo(scss=False, category='ihtml', type='boolean', value=True), ihtml_use_page_size_select=OptionsInfo(scss=False, category='ihtml', type='boolean', value=False), ihtml_page_size_default=OptionsInfo(scss=False, category='ihtml', type='value', value=10), ihtml_page_size_values=OptionsInfo(scss=False, category='ihtml', type='values', value=[10, 25, 50, 100]), ihtml_pagination_type=OptionsInfo(scss=False, category='ihtml', type='value', value='numbers'), ihtml_height=OptionsInfo(scss=False, category='ihtml', type='value', value='auto'), ihtml_selection_mode=OptionsInfo(scss=False, category='ihtml', type='value', value=None)), _google_font_imports=GoogleFontImports(imports=frozenset()), _has_built=False)</w:t>
+        <w:t xml:space="preserve">6           Duraciones      4 figuras (120 BPM), _body=&lt;great_tables._gt_data.Body object at 0xeba88a7c7230&gt;, _boxhead=Boxhead([ColInfo(var='Parámetro', type=&lt;ColInfoTypeEnum.default: 1&gt;, column_label='Parámetro', column_align='left', column_width=None, stub_level=None), ColInfo(var='Valor', type=&lt;ColInfoTypeEnum.default: 1&gt;, column_label='Valor', column_align='right', column_width=None, stub_level=None)]), _stub=&lt;great_tables._gt_data.Stub object at 0xeba88a7c70e0&gt;, _spanners=Spanners([]), _heading=Heading(title='Resumen del Sistema y Síntesis Acústica', subtitle=None, preheader=None), _stubhead=None, _summary_rows=&lt;great_tables._gt_data.SummaryRows object at 0xeba88a7c7770&gt;, _summary_rows_grand=&lt;great_tables._gt_data.SummaryRows object at 0xeba88a85d6d0&gt;, _source_notes=[], _footnotes=[], _styles=[], _locale=&lt;great_tables._gt_data.Locale object at 0xeba88a7c78c0&gt;, _formats=[], _substitutions=[], _col_merge=[], _transforms=[], _options=Options(table_id=OptionsInfo(scss=False, category='table', type='value', value=None), table_caption=OptionsInfo(scss=False, category='table', type='value', value=None), table_width=OptionsInfo(scss=True, category='table', type='px', value='auto'), table_layout=OptionsInfo(scss=True, category='table', type='value', value='fixed'), table_margin_left=OptionsInfo(scss=True, category='table', type='px', value='auto'), table_margin_right=OptionsInfo(scss=True, category='table', type='px', value='auto'), table_background_color=OptionsInfo(scss=True, category='table', type='value', value='#FFFFFF'), table_additional_css=OptionsInfo(scss=False, category='table', type='values', value=[]), table_font_names=OptionsInfo(scss=False, category='table', type='values', value=['-apple-system', 'BlinkMacSystemFont', 'Segoe UI', 'Roboto', 'Oxygen', 'Ubuntu', 'Cantarell', 'Helvetica Neue', 'Fira Sans', 'Droid Sans', 'Arial', 'sans-serif']), table_font_size=OptionsInfo(scss=True, category='table', type='px', value='16px'), table_font_weight=OptionsInfo(scss=True, category='table', type='value', value='normal'), table_font_style=OptionsInfo(scss=True, category='table', type='value', value='normal'), table_font_color=OptionsInfo(scss=True, category='table', type='value', value='#333333'), table_font_color_light=OptionsInfo(scss=True, category='table', type='value', value='#FFFFFF'), table_border_top_include=OptionsInfo(scss=False, category='table', type='boolean', value=True), table_border_top_style=OptionsInfo(scss=True, category='table', type='value', value='solid'), table_border_top_width=OptionsInfo(scss=True, category='table', type='px', value='2px'), table_border_top_color=OptionsInfo(scss=True, category='table', type='value', value='#A8A8A8'), table_border_right_style=OptionsInfo(scss=True, category='table', type='value', value='none'), table_border_right_width=OptionsInfo(scss=True, category='table', type='px', value='2px'), table_border_right_color=OptionsInfo(scss=True, category='table', type='value', value='#D3D3D3'), table_border_bottom_include=OptionsInfo(scss=False, category='table', type='boolean', value=True), table_border_bottom_style=OptionsInfo(scss=True, category='table', type='value', value='solid'), table_border_bottom_width=OptionsInfo(scss=True, category='table', type='px', value='2px'), table_border_bottom_color=OptionsInfo(scss=True, category='table', type='value', value='#A8A8A8'), table_border_left_style=OptionsInfo(scss=True, category='table', type='value', value='none'), table_border_left_width=OptionsInfo(scss=True, category='table', type='px', value='2px'), table_border_left_color=OptionsInfo(scss=True, category='table', type='value', value='#D3D3D3'), heading_background_color=OptionsInfo(scss=True, category='heading', type='value', value=None), heading_align=OptionsInfo(scss=True, category='heading', type='value', value='center'), heading_title_font_size=OptionsInfo(scss=True, category='heading', type='px', value='125%'), heading_title_font_weight=OptionsInfo(scss=True, category='heading', type='value', value='initial'), heading_subtitle_font_size=OptionsInfo(scss=True, category='heading', type='px', value='85%'), heading_subtitle_font_weight=OptionsInfo(scss=True, category='heading', type='value', value='initial'), heading_padding=OptionsInfo(scss=True, category='heading', type='px', value='4px'), heading_padding_horizontal=OptionsInfo(scss=True, category='heading', type='px', value='5px'), heading_border_bottom_style=OptionsInfo(scss=True, category='heading', type='value', value='solid'), heading_border_bottom_width=OptionsInfo(scss=True, category='heading', type='px', value='2px'), heading_border_bottom_color=OptionsInfo(scss=True, category='heading', type='value', value='#D3D3D3'), heading_border_lr_style=OptionsInfo(scss=True, category='heading', type='value', value='none'), heading_border_lr_width=OptionsInfo(scss=True, category='heading', type='px', value='1px'), heading_border_lr_color=OptionsInfo(scss=True, category='heading', type='value', value='#D3D3D3'), column_labels_background_color=OptionsInfo(scss=True, category='column_labels', type='value', value=None), column_labels_font_size=OptionsInfo(scss=True, category='column_labels', type='px', value='100%'), column_labels_font_weight=OptionsInfo(scss=True, category='column_labels', type='value', value='normal'), column_labels_text_transform=OptionsInfo(scss=True, category='column_labels', type='value', value='inherit'), column_labels_padding=OptionsInfo(scss=True, category='column_labels', type='px', value='5px'), column_labels_padding_horizontal=OptionsInfo(scss=True, category='column_labels', type='px', value='5px'), column_labels_vlines_style=OptionsInfo(scss=True, category='table_body', type='value', value='none'), column_labels_vlines_width=OptionsInfo(scss=True, category='table_body', type='px', value='1px'), column_labels_vlines_color=OptionsInfo(scss=True, category='table_body', type='value', value='#D3D3D3'), column_labels_border_top_style=OptionsInfo(scss=True, category='column_labels', type='value', value='solid'), column_labels_border_top_width=OptionsInfo(scss=True, category='column_labels', type='px', value='2px'), column_labels_border_top_color=OptionsInfo(scss=True, category='column_labels', type='value', value='#D3D3D3'), column_labels_border_bottom_style=OptionsInfo(scss=True, category='column_labels', type='value', value='solid'), column_labels_border_bottom_width=OptionsInfo(scss=True, category='column_labels', type='px', value='2px'), column_labels_border_bottom_color=OptionsInfo(scss=True, category='column_labels', type='value', value='#D3D3D3'), column_labels_border_lr_style=OptionsInfo(scss=True, category='column_labels', type='value', value='none'), column_labels_border_lr_width=OptionsInfo(scss=True, category='column_labels', type='px', value='1px'), column_labels_border_lr_color=OptionsInfo(scss=True, category='column_labels', type='value', value='#D3D3D3'), column_labels_hidden=OptionsInfo(scss=False, category='column_labels', type='boolean', value=False), row_group_background_color=OptionsInfo(scss=True, category='row_group', type='value', value=None), row_group_font_size=OptionsInfo(scss=True, category='row_group', type='px', value='100%'), row_group_font_weight=OptionsInfo(scss=True, category='row_group', type='value', value='initial'), row_group_text_transform=OptionsInfo(scss=True, category='row_group', type='value', value='inherit'), row_group_padding=OptionsInfo(scss=True, category='row_group', type='px', value='8px'), row_group_padding_horizontal=OptionsInfo(scss=True, category='row_group', type='px', value='5px'), row_group_border_top_style=OptionsInfo(scss=True, category='row_group', type='value', value='solid'), row_group_border_top_width=OptionsInfo(scss=True, category='row_group', type='px', value='2px'), row_group_border_top_color=OptionsInfo(scss=True, category='row_group', type='value', value='#D3D3D3'), row_group_border_right_style=OptionsInfo(scss=True, category='row_group', type='value', value='none'), row_group_border_right_width=OptionsInfo(scss=True, category='row_group', type='px', value='1px'), row_group_border_right_color=OptionsInfo(scss=True, category='row_group', type='value', value='#D3D3D3'), row_group_border_bottom_style=OptionsInfo(scss=True, category='row_group', type='value', value='solid'), row_group_border_bottom_width=OptionsInfo(scss=True, category='row_group', type='px', value='2px'), row_group_border_bottom_color=OptionsInfo(scss=True, category='row_group', type='value', value='#D3D3D3'), row_group_border_left_style=OptionsInfo(scss=True, category='row_group', type='value', value='none'), row_group_border_left_width=OptionsInfo(scss=True, category='row_group', type='px', value='1px'), row_group_border_left_color=OptionsInfo(scss=True, category='row_group', type='value', value='#D3D3D3'), row_group_as_column=OptionsInfo(scss=False, category='row_group', type='boolean', value=False), table_body_hlines_style=OptionsInfo(scss=True, category='table_body', type='value', value='solid'), table_body_hlines_width=OptionsInfo(scss=True, category='table_body', type='px', value='1px'), table_body_hlines_color=OptionsInfo(scss=True, category='table_body', type='value', value='#D3D3D3'), table_body_vlines_style=OptionsInfo(scss=True, category='table_body', type='value', value='none'), table_body_vlines_width=OptionsInfo(scss=True, category='table_body', type='px', value='1px'), table_body_vlines_color=OptionsInfo(scss=True, category='table_body', type='value', value='#D3D3D3'), table_body_border_top_style=OptionsInfo(scss=True, category='table_body', type='value', value='solid'), table_body_border_top_width=OptionsInfo(scss=True, category='table_body', type='px', value='2px'), table_body_border_top_color=OptionsInfo(scss=True, category='table_body', type='value', value='#D3D3D3'), table_body_border_bottom_style=OptionsInfo(scss=True, category='table_body', type='value', value='solid'), table_body_border_bottom_width=OptionsInfo(scss=True, category='table_body', type='px', value='2px'), table_body_border_bottom_color=OptionsInfo(scss=True, category='table_body', type='value', value='#D3D3D3'), data_row_padding=OptionsInfo(scss=True, category='data_row', type='px', value='8px'), data_row_padding_horizontal=OptionsInfo(scss=True, category='data_row', type='px', value='5px'), stub_background_color=OptionsInfo(scss=True, category='stub', type='value', value=None), stub_font_size=OptionsInfo(scss=True, category='stub', type='px', value='100%'), stub_font_weight=OptionsInfo(scss=True, category='stub', type='value', value='initial'), stub_text_transform=OptionsInfo(scss=True, category='stub', type='value', value='inherit'), stub_border_style=OptionsInfo(scss=True, category='stub', type='value', value='solid'), stub_border_width=OptionsInfo(scss=True, category='stub', type='px', value='2px'), stub_border_color=OptionsInfo(scss=True, category='stub', type='value', value='#D3D3D3'), stub_indent_length=OptionsInfo(scss=True, category='stub', type='px', value='5px'), stub_row_group_background_color=OptionsInfo(scss=True, category='stub', type='value', value=None), stub_row_group_font_size=OptionsInfo(scss=True, category='stub', type='px', value='100%'), stub_row_group_font_weight=OptionsInfo(scss=True, category='stub', type='value', value='initial'), stub_row_group_text_transform=OptionsInfo(scss=True, category='stub', type='value', value='inherit'), stub_row_group_border_style=OptionsInfo(scss=True, category='stub', type='value', value='solid'), stub_row_group_border_width=OptionsInfo(scss=True, category='stub', type='px', value='2px'), stub_row_group_border_color=OptionsInfo(scss=True, category='stub', type='value', value='#D3D3D3'), summary_row_padding=OptionsInfo(scss=True, category='summary_row', type='px', value='8px'), summary_row_padding_horizontal=OptionsInfo(scss=True, category='summary_row', type='px', value='5px'), summary_row_background_color=OptionsInfo(scss=True, category='summary_row', type='value', value=None), summary_row_text_transform=OptionsInfo(scss=True, category='summary_row', type='value', value='inherit'), summary_row_border_style=OptionsInfo(scss=True, category='summary_row', type='value', value='solid'), summary_row_border_width=OptionsInfo(scss=True, category='summary_row', type='px', value='2px'), summary_row_border_color=OptionsInfo(scss=True, category='summary_row', type='value', value='#D3D3D3'), grand_summary_row_padding=OptionsInfo(scss=True, category='grand_summary_row', type='px', value='8px'), grand_summary_row_padding_horizontal=OptionsInfo(scss=True, category='grand_summary_row', type='px', value='5px'), grand_summary_row_background_color=OptionsInfo(scss=True, category='grand_summary_row', type='value', value=None), grand_summary_row_text_transform=OptionsInfo(scss=True, category='grand_summary_row', type='value', value='inherit'), grand_summary_row_border_style=OptionsInfo(scss=True, category='grand_summary_row', type='value', value='double'), grand_summary_row_border_width=OptionsInfo(scss=True, category='grand_summary_row', type='px', value='6px'), grand_summary_row_border_color=OptionsInfo(scss=True, category='grand_summary_row', type='value', value='#D3D3D3'), footnotes_marks=OptionsInfo(scss=False, category='footnotes', type='values', value='numbers'), footnotes_spec_ref=OptionsInfo(scss=False, category='footnotes', type='value', value='^i'), footnotes_spec_ftr=OptionsInfo(scss=False, category='footnotes', type='value', value='^i'), footnotes_order=OptionsInfo(scss=False, category='footnotes', type='value', value='marks_last'), source_notes_padding=OptionsInfo(scss=True, category='source_notes', type='px', value='4px'), source_notes_padding_horizontal=OptionsInfo(scss=True, category='source_notes', type='px', value='5px'), source_notes_background_color=OptionsInfo(scss=True, category='source_notes', type='value', value=None), source_notes_font_size=OptionsInfo(scss=True, category='source_notes', type='px', value='90%'), source_notes_border_bottom_style=OptionsInfo(scss=True, category='source_notes', type='value', value='none'), source_notes_border_bottom_width=OptionsInfo(scss=True, category='source_notes', type='px', value='2px'), source_notes_border_bottom_color=OptionsInfo(scss=True, category='source_notes', type='value', value='#D3D3D3'), source_notes_border_lr_style=OptionsInfo(scss=True, category='source_notes', type='value', value='none'), source_notes_border_lr_width=OptionsInfo(scss=True, category='source_notes', type='px', value='2px'), source_notes_border_lr_color=OptionsInfo(scss=True, category='source_notes', type='value', value='#D3D3D3'), source_notes_multiline=OptionsInfo(scss=False, category='source_notes', type='boolean', value=True), source_notes_sep=OptionsInfo(scss=False, category='source_notes', type='value', value=' '), row_striping_background_color=OptionsInfo(scss=True, category='row', type='value', value='#F4F4F4'), row_striping_include_stub=OptionsInfo(scss=False, category='row', type='boolean', value=False), row_striping_include_table_body=OptionsInfo(scss=False, category='row', type='boolean', value=False), container_width=OptionsInfo(scss=False, category='container', type='px', value='auto'), container_height=OptionsInfo(scss=False, category='container', type='px', value='auto'), container_padding_x=OptionsInfo(scss=False, category='container', type='px', value='0px'), container_padding_y=OptionsInfo(scss=False, category='container', type='px', value='10px'), container_overflow_x=OptionsInfo(scss=False, category='container', type='overflow', value='auto'), container_overflow_y=OptionsInfo(scss=False, category='container', type='overflow', value='auto'), quarto_disable_processing=OptionsInfo(scss=False, category='quarto', type='logical', value=False), quarto_use_bootstrap=OptionsInfo(scss=False, category='quarto', type='logical', value=False), ihtml_active=OptionsInfo(scss=False, category='ihtml', type='boolean', value=False), ihtml_use_pagination=OptionsInfo(scss=False, category='ihtml', type='boolean', value=True), ihtml_use_pagination_info=OptionsInfo(scss=False, category='ihtml', type='boolean', value=True), ihtml_use_sorting=OptionsInfo(scss=False, category='ihtml', type='boolean', value=True), ihtml_use_search=OptionsInfo(scss=False, category='ihtml', type='boolean', value=False), ihtml_use_filters=OptionsInfo(scss=False, category='ihtml', type='boolean', value=False), ihtml_use_resizers=OptionsInfo(scss=False, category='ihtml', type='boolean', value=False), ihtml_use_highlight=OptionsInfo(scss=False, category='ihtml', type='boolean', value=False), ihtml_use_compact_mode=OptionsInfo(scss=False, category='ihtml', type='boolean', value=False), ihtml_use_text_wrapping=OptionsInfo(scss=False, category='ihtml', type='boolean', value=True), ihtml_use_page_size_select=OptionsInfo(scss=False, category='ihtml', type='boolean', value=False), ihtml_page_size_default=OptionsInfo(scss=False, category='ihtml', type='value', value=10), ihtml_page_size_values=OptionsInfo(scss=False, category='ihtml', type='values', value=[10, 25, 50, 100]), ihtml_pagination_type=OptionsInfo(scss=False, category='ihtml', type='value', value='numbers'), ihtml_height=OptionsInfo(scss=False, category='ihtml', type='value', value='auto'), ihtml_selection_mode=OptionsInfo(scss=False, category='ihtml', type='value', value=None)), _google_font_imports=GoogleFontImports(imports=frozenset()), _has_built=False)</w:t>
       </w:r>
     </w:p>
     <w:bookmarkEnd w:id="12"/>
@@ -373,9 +349,9 @@
       <w:pPr>
         <w:pStyle w:val="Heading3"/>
       </w:pPr>
-      <w:bookmarkStart w:id="14" w:name="_c8afb02960af95b730d9530e081475aad883c23"/>
-      <w:r>
-        <w:t xml:space="preserve">2.1. Escala diatónica y representación del espacio de estados</w:t>
+      <w:bookmarkStart w:id="14" w:name="_ba909e37e05ea93bb479c7bd85044a9d3eb028f"/>
+      <w:r>
+        <w:t xml:space="preserve">2.1. Escala diatónica</w:t>
       </w:r>
       <w:bookmarkEnd w:id="14"/>
     </w:p>
@@ -384,17 +360,7 @@
         <w:pStyle w:val="FirstParagraph"/>
       </w:pPr>
       <w:r>
-        <w:t xml:space="preserve">Conforme a los principios matemáticos expuestos en el análisis acústico de Lemnismath (</w:t>
-      </w:r>
-      <w:r>
-        <w:rPr>
-          <w:i/>
-          <w:iCs/>
-        </w:rPr>
-        <w:t xml:space="preserve">¿Por qué tenemos 12 notas musicales?</w:t>
-      </w:r>
-      <w:r>
-        <w:t xml:space="preserve">), la física del sonido se fundamenta en ondas periódicas caracterizadas por amplitud y frecuencia. Al pulsar una cuerda o columna de aire no se emite una frecuencia aislada sino una superposición de armónicos enteros</w:t>
+        <w:t xml:space="preserve">Conforme a los principios de física acústica analizados por Lemnismath, el sonido musical se fundamenta en ondas periódicas caracterizadas por amplitud y frecuencia. Al pulsar una cuerda o columna de aire no se emite una frecuencia aislada sino armónicos enteros</w:t>
       </w:r>
       <w:r>
         <w:t xml:space="preserve"> </w:t>
@@ -449,31 +415,7 @@
         <w:pStyle w:val="FirstParagraph"/>
       </w:pPr>
       <w:r>
-        <w:t xml:space="preserve">La consonancia acústica entre dos tonos depende de la coincidencia de sus espectros: la octava (razón 2:1) aporta identidad tonal y la quinta justa (razón 3:2) aporta equilibrio acústico. Al encadenar 12 quintas justas sucesivas se arriba a una discrepancia matemática respecto a 7 octavas exactas, conocida como la coma pitagórica (</w:t>
-      </w:r>
-      <m:oMath>
-        <m:r>
-          <m:t>1.01364</m:t>
-        </m:r>
-      </m:oMath>
-      <w:r>
-        <w:t xml:space="preserve">). Para resolver dicha incompatibilidad geométrica, el sistema de</w:t>
-      </w:r>
-      <w:r>
-        <w:t xml:space="preserve"> </w:t>
-      </w:r>
-      <w:r>
-        <w:rPr>
-          <w:b/>
-          <w:bCs/>
-        </w:rPr>
-        <w:t xml:space="preserve">temperamento igual de 12 tonos (12 TET)</w:t>
-      </w:r>
-      <w:r>
-        <w:t xml:space="preserve"> </w:t>
-      </w:r>
-      <w:r>
-        <w:t xml:space="preserve">divide la octava en 12 semitonos idénticos cuya razón de frecuencia constante es:</w:t>
+        <w:t xml:space="preserve">La consonancia depende de la coincidencia espectral: la octava (razón 2:1) aporta identidad tonal y la quinta justa (razón 3:2) aporta equilibrio acústico. Al encadenar 12 quintas sucesivas surge una discrepancia respecto a 7 octavas conocida como coma pitagórica (1.01364). El sistema de temperamento igual de 12 tonos (12 TET) resuelve esto dividiendo la octava en 12 semitonos idénticos con razón constante:</w:t>
       </w:r>
     </w:p>
     <w:p>
@@ -546,7 +488,7 @@
         <w:t xml:space="preserve"> </w:t>
       </w:r>
       <w:r>
-        <w:t xml:space="preserve">de cualquier nota se calcula a partir de su índice MIDI</w:t>
+        <w:t xml:space="preserve">de cada nota se obtiene desde su índice MIDI</w:t>
       </w:r>
       <w:r>
         <w:t xml:space="preserve"> </w:t>
@@ -560,7 +502,7 @@
         <w:t xml:space="preserve"> </w:t>
       </w:r>
       <w:r>
-        <w:t xml:space="preserve">tomando como referencia universal la nota La 4 (</w:t>
+        <w:t xml:space="preserve">referenciado a La 4 (</w:t>
       </w:r>
       <m:oMath>
         <m:sSub>
@@ -764,7 +706,7 @@
         <w:rPr>
           <w:rStyle w:val="VerbatimChar"/>
         </w:rPr>
-        <w:t xml:space="preserve">6  C#5    vii° (Sensible)    73          554.37         1.8877, _body=&lt;great_tables._gt_data.Body object at 0xf8d8b0786690&gt;, _boxhead=Boxhead([ColInfo(var='Nota', type=&lt;ColInfoTypeEnum.default: 1&gt;, column_label='Nota', column_align='left', column_width=None, stub_level=None), ColInfo(var='Grado', type=&lt;ColInfoTypeEnum.default: 1&gt;, column_label='Grado', column_align='left', column_width=None, stub_level=None), ColInfo(var='MIDI', type=&lt;ColInfoTypeEnum.default: 1&gt;, column_label='MIDI', column_align='right', column_width=None, stub_level=None), ColInfo(var='Frecuencia (Hz)', type=&lt;ColInfoTypeEnum.default: 1&gt;, column_label='Frecuencia (Hz)', column_align='right', column_width=None, stub_level=None), ColInfo(var='Razón a Tónica', type=&lt;ColInfoTypeEnum.default: 1&gt;, column_label='Razón a Tónica', column_align='right', column_width=None, stub_level=None)]), _stub=&lt;great_tables._gt_data.Stub object at 0xf8d8b0741e50&gt;, _spanners=Spanners([]), _heading=Heading(title='Grados de la Escala Diatónica de Re Mayor', subtitle=None, preheader=None), _stubhead=None, _summary_rows=&lt;great_tables._gt_data.SummaryRows object at 0xf8d8b0742210&gt;, _summary_rows_grand=&lt;great_tables._gt_data.SummaryRows object at 0xf8d8b06d62c0&gt;, _source_notes=[], _footnotes=[], _styles=[], _locale=&lt;great_tables._gt_data.Locale object at 0xf8d8b0741590&gt;, _formats=[], _substitutions=[], _col_merge=[], _transforms=[], _options=Options(table_id=OptionsInfo(scss=False, category='table', type='value', value=None), table_caption=OptionsInfo(scss=False, category='table', type='value', value=None), table_width=OptionsInfo(scss=True, category='table', type='px', value='auto'), table_layout=OptionsInfo(scss=True, category='table', type='value', value='fixed'), table_margin_left=OptionsInfo(scss=True, category='table', type='px', value='auto'), table_margin_right=OptionsInfo(scss=True, category='table', type='px', value='auto'), table_background_color=OptionsInfo(scss=True, category='table', type='value', value='#FFFFFF'), table_additional_css=OptionsInfo(scss=False, category='table', type='values', value=[]), table_font_names=OptionsInfo(scss=False, category='table', type='values', value=['-apple-system', 'BlinkMacSystemFont', 'Segoe UI', 'Roboto', 'Oxygen', 'Ubuntu', 'Cantarell', 'Helvetica Neue', 'Fira Sans', 'Droid Sans', 'Arial', 'sans-serif']), table_font_size=OptionsInfo(scss=True, category='table', type='px', value='16px'), table_font_weight=OptionsInfo(scss=True, category='table', type='value', value='normal'), table_font_style=OptionsInfo(scss=True, category='table', type='value', value='normal'), table_font_color=OptionsInfo(scss=True, category='table', type='value', value='#333333'), table_font_color_light=OptionsInfo(scss=True, category='table', type='value', value='#FFFFFF'), table_border_top_include=OptionsInfo(scss=False, category='table', type='boolean', value=True), table_border_top_style=OptionsInfo(scss=True, category='table', type='value', value='solid'), table_border_top_width=OptionsInfo(scss=True, category='table', type='px', value='2px'), table_border_top_color=OptionsInfo(scss=True, category='table', type='value', value='#A8A8A8'), table_border_right_style=OptionsInfo(scss=True, category='table', type='value', value='none'), table_border_right_width=OptionsInfo(scss=True, category='table', type='px', value='2px'), table_border_right_color=OptionsInfo(scss=True, category='table', type='value', value='#D3D3D3'), table_border_bottom_include=OptionsInfo(scss=False, category='table', type='boolean', value=True), table_border_bottom_style=OptionsInfo(scss=True, category='table', type='value', value='solid'), table_border_bottom_width=OptionsInfo(scss=True, category='table', type='px', value='2px'), table_border_bottom_color=OptionsInfo(scss=True, category='table', type='value', value='#A8A8A8'), table_border_left_style=OptionsInfo(scss=True, category='table', type='value', value='none'), table_border_left_width=OptionsInfo(scss=True, category='table', type='px', value='2px'), table_border_left_color=OptionsInfo(scss=True, category='table', type='value', value='#D3D3D3'), heading_background_color=OptionsInfo(scss=True, category='heading', type='value', value=None), heading_align=OptionsInfo(scss=True, category='heading', type='value', value='center'), heading_title_font_size=OptionsInfo(scss=True, category='heading', type='px', value='125%'), heading_title_font_weight=OptionsInfo(scss=True, category='heading', type='value', value='initial'), heading_subtitle_font_size=OptionsInfo(scss=True, category='heading', type='px', value='85%'), heading_subtitle_font_weight=OptionsInfo(scss=True, category='heading', type='value', value='initial'), heading_padding=OptionsInfo(scss=True, category='heading', type='px', value='4px'), heading_padding_horizontal=OptionsInfo(scss=True, category='heading', type='px', value='5px'), heading_border_bottom_style=OptionsInfo(scss=True, category='heading', type='value', value='solid'), heading_border_bottom_width=OptionsInfo(scss=True, category='heading', type='px', value='2px'), heading_border_bottom_color=OptionsInfo(scss=True, category='heading', type='value', value='#D3D3D3'), heading_border_lr_style=OptionsInfo(scss=True, category='heading', type='value', value='none'), heading_border_lr_width=OptionsInfo(scss=True, category='heading', type='px', value='1px'), heading_border_lr_color=OptionsInfo(scss=True, category='heading', type='value', value='#D3D3D3'), column_labels_background_color=OptionsInfo(scss=True, category='column_labels', type='value', value=None), column_labels_font_size=OptionsInfo(scss=True, category='column_labels', type='px', value='100%'), column_labels_font_weight=OptionsInfo(scss=True, category='column_labels', type='value', value='normal'), column_labels_text_transform=OptionsInfo(scss=True, category='column_labels', type='value', value='inherit'), column_labels_padding=OptionsInfo(scss=True, category='column_labels', type='px', value='5px'), column_labels_padding_horizontal=OptionsInfo(scss=True, category='column_labels', type='px', value='5px'), column_labels_vlines_style=OptionsInfo(scss=True, category='table_body', type='value', value='none'), column_labels_vlines_width=OptionsInfo(scss=True, category='table_body', type='px', value='1px'), column_labels_vlines_color=OptionsInfo(scss=True, category='table_body', type='value', value='#D3D3D3'), column_labels_border_top_style=OptionsInfo(scss=True, category='column_labels', type='value', value='solid'), column_labels_border_top_width=OptionsInfo(scss=True, category='column_labels', type='px', value='2px'), column_labels_border_top_color=OptionsInfo(scss=True, category='column_labels', type='value', value='#D3D3D3'), column_labels_border_bottom_style=OptionsInfo(scss=True, category='column_labels', type='value', value='solid'), column_labels_border_bottom_width=OptionsInfo(scss=True, category='column_labels', type='px', value='2px'), column_labels_border_bottom_color=OptionsInfo(scss=True, category='column_labels', type='value', value='#D3D3D3'), column_labels_border_lr_style=OptionsInfo(scss=True, category='column_labels', type='value', value='none'), column_labels_border_lr_width=OptionsInfo(scss=True, category='column_labels', type='px', value='1px'), column_labels_border_lr_color=OptionsInfo(scss=True, category='column_labels', type='value', value='#D3D3D3'), column_labels_hidden=OptionsInfo(scss=False, category='column_labels', type='boolean', value=False), row_group_background_color=OptionsInfo(scss=True, category='row_group', type='value', value=None), row_group_font_size=OptionsInfo(scss=True, category='row_group', type='px', value='100%'), row_group_font_weight=OptionsInfo(scss=True, category='row_group', type='value', value='initial'), row_group_text_transform=OptionsInfo(scss=True, category='row_group', type='value', value='inherit'), row_group_padding=OptionsInfo(scss=True, category='row_group', type='px', value='8px'), row_group_padding_horizontal=OptionsInfo(scss=True, category='row_group', type='px', value='5px'), row_group_border_top_style=OptionsInfo(scss=True, category='row_group', type='value', value='solid'), row_group_border_top_width=OptionsInfo(scss=True, category='row_group', type='px', value='2px'), row_group_border_top_color=OptionsInfo(scss=True, category='row_group', type='value', value='#D3D3D3'), row_group_border_right_style=OptionsInfo(scss=True, category='row_group', type='value', value='none'), row_group_border_right_width=OptionsInfo(scss=True, category='row_group', type='px', value='1px'), row_group_border_right_color=OptionsInfo(scss=True, category='row_group', type='value', value='#D3D3D3'), row_group_border_bottom_style=OptionsInfo(scss=True, category='row_group', type='value', value='solid'), row_group_border_bottom_width=OptionsInfo(scss=True, category='row_group', type='px', value='2px'), row_group_border_bottom_color=OptionsInfo(scss=True, category='row_group', type='value', value='#D3D3D3'), row_group_border_left_style=OptionsInfo(scss=True, category='row_group', type='value', value='none'), row_group_border_left_width=OptionsInfo(scss=True, category='row_group', type='px', value='1px'), row_group_border_left_color=OptionsInfo(scss=True, category='row_group', type='value', value='#D3D3D3'), row_group_as_column=OptionsInfo(scss=False, category='row_group', type='boolean', value=False), table_body_hlines_style=OptionsInfo(scss=True, category='table_body', type='value', value='solid'), table_body_hlines_width=OptionsInfo(scss=True, category='table_body', type='px', value='1px'), table_body_hlines_color=OptionsInfo(scss=True, category='table_body', type='value', value='#D3D3D3'), table_body_vlines_style=OptionsInfo(scss=True, category='table_body', type='value', value='none'), table_body_vlines_width=OptionsInfo(scss=True, category='table_body', type='px', value='1px'), table_body_vlines_color=OptionsInfo(scss=True, category='table_body', type='value', value='#D3D3D3'), table_body_border_top_style=OptionsInfo(scss=True, category='table_body', type='value', value='solid'), table_body_border_top_width=OptionsInfo(scss=True, category='table_body', type='px', value='2px'), table_body_border_top_color=OptionsInfo(scss=True, category='table_body', type='value', value='#D3D3D3'), table_body_border_bottom_style=OptionsInfo(scss=True, category='table_body', type='value', value='solid'), table_body_border_bottom_width=OptionsInfo(scss=True, category='table_body', type='px', value='2px'), table_body_border_bottom_color=OptionsInfo(scss=True, category='table_body', type='value', value='#D3D3D3'), data_row_padding=OptionsInfo(scss=True, category='data_row', type='px', value='8px'), data_row_padding_horizontal=OptionsInfo(scss=True, category='data_row', type='px', value='5px'), stub_background_color=OptionsInfo(scss=True, category='stub', type='value', value=None), stub_font_size=OptionsInfo(scss=True, category='stub', type='px', value='100%'), stub_font_weight=OptionsInfo(scss=True, category='stub', type='value', value='initial'), stub_text_transform=OptionsInfo(scss=True, category='stub', type='value', value='inherit'), stub_border_style=OptionsInfo(scss=True, category='stub', type='value', value='solid'), stub_border_width=OptionsInfo(scss=True, category='stub', type='px', value='2px'), stub_border_color=OptionsInfo(scss=True, category='stub', type='value', value='#D3D3D3'), stub_indent_length=OptionsInfo(scss=True, category='stub', type='px', value='5px'), stub_row_group_background_color=OptionsInfo(scss=True, category='stub', type='value', value=None), stub_row_group_font_size=OptionsInfo(scss=True, category='stub', type='px', value='100%'), stub_row_group_font_weight=OptionsInfo(scss=True, category='stub', type='value', value='initial'), stub_row_group_text_transform=OptionsInfo(scss=True, category='stub', type='value', value='inherit'), stub_row_group_border_style=OptionsInfo(scss=True, category='stub', type='value', value='solid'), stub_row_group_border_width=OptionsInfo(scss=True, category='stub', type='px', value='2px'), stub_row_group_border_color=OptionsInfo(scss=True, category='stub', type='value', value='#D3D3D3'), summary_row_padding=OptionsInfo(scss=True, category='summary_row', type='px', value='8px'), summary_row_padding_horizontal=OptionsInfo(scss=True, category='summary_row', type='px', value='5px'), summary_row_background_color=OptionsInfo(scss=True, category='summary_row', type='value', value=None), summary_row_text_transform=OptionsInfo(scss=True, category='summary_row', type='value', value='inherit'), summary_row_border_style=OptionsInfo(scss=True, category='summary_row', type='value', value='solid'), summary_row_border_width=OptionsInfo(scss=True, category='summary_row', type='px', value='2px'), summary_row_border_color=OptionsInfo(scss=True, category='summary_row', type='value', value='#D3D3D3'), grand_summary_row_padding=OptionsInfo(scss=True, category='grand_summary_row', type='px', value='8px'), grand_summary_row_padding_horizontal=OptionsInfo(scss=True, category='grand_summary_row', type='px', value='5px'), grand_summary_row_background_color=OptionsInfo(scss=True, category='grand_summary_row', type='value', value=None), grand_summary_row_text_transform=OptionsInfo(scss=True, category='grand_summary_row', type='value', value='inherit'), grand_summary_row_border_style=OptionsInfo(scss=True, category='grand_summary_row', type='value', value='double'), grand_summary_row_border_width=OptionsInfo(scss=True, category='grand_summary_row', type='px', value='6px'), grand_summary_row_border_color=OptionsInfo(scss=True, category='grand_summary_row', type='value', value='#D3D3D3'), footnotes_marks=OptionsInfo(scss=False, category='footnotes', type='values', value='numbers'), footnotes_spec_ref=OptionsInfo(scss=False, category='footnotes', type='value', value='^i'), footnotes_spec_ftr=OptionsInfo(scss=False, category='footnotes', type='value', value='^i'), footnotes_order=OptionsInfo(scss=False, category='footnotes', type='value', value='marks_last'), source_notes_padding=OptionsInfo(scss=True, category='source_notes', type='px', value='4px'), source_notes_padding_horizontal=OptionsInfo(scss=True, category='source_notes', type='px', value='5px'), source_notes_background_color=OptionsInfo(scss=True, category='source_notes', type='value', value=None), source_notes_font_size=OptionsInfo(scss=True, category='source_notes', type='px', value='90%'), source_notes_border_bottom_style=OptionsInfo(scss=True, category='source_notes', type='value', value='none'), source_notes_border_bottom_width=OptionsInfo(scss=True, category='source_notes', type='px', value='2px'), source_notes_border_bottom_color=OptionsInfo(scss=True, category='source_notes', type='value', value='#D3D3D3'), source_notes_border_lr_style=OptionsInfo(scss=True, category='source_notes', type='value', value='none'), source_notes_border_lr_width=OptionsInfo(scss=True, category='source_notes', type='px', value='2px'), source_notes_border_lr_color=OptionsInfo(scss=True, category='source_notes', type='value', value='#D3D3D3'), source_notes_multiline=OptionsInfo(scss=False, category='source_notes', type='boolean', value=True), source_notes_sep=OptionsInfo(scss=False, category='source_notes', type='value', value=' '), row_striping_background_color=OptionsInfo(scss=True, category='row', type='value', value='#F4F4F4'), row_striping_include_stub=OptionsInfo(scss=False, category='row', type='boolean', value=False), row_striping_include_table_body=OptionsInfo(scss=False, category='row', type='boolean', value=False), container_width=OptionsInfo(scss=False, category='container', type='px', value='auto'), container_height=OptionsInfo(scss=False, category='container', type='px', value='auto'), container_padding_x=OptionsInfo(scss=False, category='container', type='px', value='0px'), container_padding_y=OptionsInfo(scss=False, category='container', type='px', value='10px'), container_overflow_x=OptionsInfo(scss=False, category='container', type='overflow', value='auto'), container_overflow_y=OptionsInfo(scss=False, category='container', type='overflow', value='auto'), quarto_disable_processing=OptionsInfo(scss=False, category='quarto', type='logical', value=False), quarto_use_bootstrap=OptionsInfo(scss=False, category='quarto', type='logical', value=False), ihtml_active=OptionsInfo(scss=False, category='ihtml', type='boolean', value=False), ihtml_use_pagination=OptionsInfo(scss=False, category='ihtml', type='boolean', value=True), ihtml_use_pagination_info=OptionsInfo(scss=False, category='ihtml', type='boolean', value=True), ihtml_use_sorting=OptionsInfo(scss=False, category='ihtml', type='boolean', value=True), ihtml_use_search=OptionsInfo(scss=False, category='ihtml', type='boolean', value=False), ihtml_use_filters=OptionsInfo(scss=False, category='ihtml', type='boolean', value=False), ihtml_use_resizers=OptionsInfo(scss=False, category='ihtml', type='boolean', value=False), ihtml_use_highlight=OptionsInfo(scss=False, category='ihtml', type='boolean', value=False), ihtml_use_compact_mode=OptionsInfo(scss=False, category='ihtml', type='boolean', value=False), ihtml_use_text_wrapping=OptionsInfo(scss=False, category='ihtml', type='boolean', value=True), ihtml_use_page_size_select=OptionsInfo(scss=False, category='ihtml', type='boolean', value=False), ihtml_page_size_default=OptionsInfo(scss=False, category='ihtml', type='value', value=10), ihtml_page_size_values=OptionsInfo(scss=False, category='ihtml', type='values', value=[10, 25, 50, 100]), ihtml_pagination_type=OptionsInfo(scss=False, category='ihtml', type='value', value='numbers'), ihtml_height=OptionsInfo(scss=False, category='ihtml', type='value', value='auto'), ihtml_selection_mode=OptionsInfo(scss=False, category='ihtml', type='value', value=None)), _google_font_imports=GoogleFontImports(imports=frozenset()), _has_built=False)</w:t>
+        <w:t xml:space="preserve">6  C#5    vii° (Sensible)    73          554.37         1.8877, _body=&lt;great_tables._gt_data.Body object at 0xeba88a8a2690&gt;, _boxhead=Boxhead([ColInfo(var='Nota', type=&lt;ColInfoTypeEnum.default: 1&gt;, column_label='Nota', column_align='left', column_width=None, stub_level=None), ColInfo(var='Grado', type=&lt;ColInfoTypeEnum.default: 1&gt;, column_label='Grado', column_align='left', column_width=None, stub_level=None), ColInfo(var='MIDI', type=&lt;ColInfoTypeEnum.default: 1&gt;, column_label='MIDI', column_align='right', column_width=None, stub_level=None), ColInfo(var='Frecuencia (Hz)', type=&lt;ColInfoTypeEnum.default: 1&gt;, column_label='Frecuencia (Hz)', column_align='right', column_width=None, stub_level=None), ColInfo(var='Razón a Tónica', type=&lt;ColInfoTypeEnum.default: 1&gt;, column_label='Razón a Tónica', column_align='right', column_width=None, stub_level=None)]), _stub=&lt;great_tables._gt_data.Stub object at 0xeba88a85de50&gt;, _spanners=Spanners([]), _heading=Heading(title='Grados de la Escala Diatónica de Re Mayor', subtitle=None, preheader=None), _stubhead=None, _summary_rows=&lt;great_tables._gt_data.SummaryRows object at 0xeba88a85e210&gt;, _summary_rows_grand=&lt;great_tables._gt_data.SummaryRows object at 0xeba88a7f22c0&gt;, _source_notes=[], _footnotes=[], _styles=[], _locale=&lt;great_tables._gt_data.Locale object at 0xeba88a85d590&gt;, _formats=[], _substitutions=[], _col_merge=[], _transforms=[], _options=Options(table_id=OptionsInfo(scss=False, category='table', type='value', value=None), table_caption=OptionsInfo(scss=False, category='table', type='value', value=None), table_width=OptionsInfo(scss=True, category='table', type='px', value='auto'), table_layout=OptionsInfo(scss=True, category='table', type='value', value='fixed'), table_margin_left=OptionsInfo(scss=True, category='table', type='px', value='auto'), table_margin_right=OptionsInfo(scss=True, category='table', type='px', value='auto'), table_background_color=OptionsInfo(scss=True, category='table', type='value', value='#FFFFFF'), table_additional_css=OptionsInfo(scss=False, category='table', type='values', value=[]), table_font_names=OptionsInfo(scss=False, category='table', type='values', value=['-apple-system', 'BlinkMacSystemFont', 'Segoe UI', 'Roboto', 'Oxygen', 'Ubuntu', 'Cantarell', 'Helvetica Neue', 'Fira Sans', 'Droid Sans', 'Arial', 'sans-serif']), table_font_size=OptionsInfo(scss=True, category='table', type='px', value='16px'), table_font_weight=OptionsInfo(scss=True, category='table', type='value', value='normal'), table_font_style=OptionsInfo(scss=True, category='table', type='value', value='normal'), table_font_color=OptionsInfo(scss=True, category='table', type='value', value='#333333'), table_font_color_light=OptionsInfo(scss=True, category='table', type='value', value='#FFFFFF'), table_border_top_include=OptionsInfo(scss=False, category='table', type='boolean', value=True), table_border_top_style=OptionsInfo(scss=True, category='table', type='value', value='solid'), table_border_top_width=OptionsInfo(scss=True, category='table', type='px', value='2px'), table_border_top_color=OptionsInfo(scss=True, category='table', type='value', value='#A8A8A8'), table_border_right_style=OptionsInfo(scss=True, category='table', type='value', value='none'), table_border_right_width=OptionsInfo(scss=True, category='table', type='px', value='2px'), table_border_right_color=OptionsInfo(scss=True, category='table', type='value', value='#D3D3D3'), table_border_bottom_include=OptionsInfo(scss=False, category='table', type='boolean', value=True), table_border_bottom_style=OptionsInfo(scss=True, category='table', type='value', value='solid'), table_border_bottom_width=OptionsInfo(scss=True, category='table', type='px', value='2px'), table_border_bottom_color=OptionsInfo(scss=True, category='table', type='value', value='#A8A8A8'), table_border_left_style=OptionsInfo(scss=True, category='table', type='value', value='none'), table_border_left_width=OptionsInfo(scss=True, category='table', type='px', value='2px'), table_border_left_color=OptionsInfo(scss=True, category='table', type='value', value='#D3D3D3'), heading_background_color=OptionsInfo(scss=True, category='heading', type='value', value=None), heading_align=OptionsInfo(scss=True, category='heading', type='value', value='center'), heading_title_font_size=OptionsInfo(scss=True, category='heading', type='px', value='125%'), heading_title_font_weight=OptionsInfo(scss=True, category='heading', type='value', value='initial'), heading_subtitle_font_size=OptionsInfo(scss=True, category='heading', type='px', value='85%'), heading_subtitle_font_weight=OptionsInfo(scss=True, category='heading', type='value', value='initial'), heading_padding=OptionsInfo(scss=True, category='heading', type='px', value='4px'), heading_padding_horizontal=OptionsInfo(scss=True, category='heading', type='px', value='5px'), heading_border_bottom_style=OptionsInfo(scss=True, category='heading', type='value', value='solid'), heading_border_bottom_width=OptionsInfo(scss=True, category='heading', type='px', value='2px'), heading_border_bottom_color=OptionsInfo(scss=True, category='heading', type='value', value='#D3D3D3'), heading_border_lr_style=OptionsInfo(scss=True, category='heading', type='value', value='none'), heading_border_lr_width=OptionsInfo(scss=True, category='heading', type='px', value='1px'), heading_border_lr_color=OptionsInfo(scss=True, category='heading', type='value', value='#D3D3D3'), column_labels_background_color=OptionsInfo(scss=True, category='column_labels', type='value', value=None), column_labels_font_size=OptionsInfo(scss=True, category='column_labels', type='px', value='100%'), column_labels_font_weight=OptionsInfo(scss=True, category='column_labels', type='value', value='normal'), column_labels_text_transform=OptionsInfo(scss=True, category='column_labels', type='value', value='inherit'), column_labels_padding=OptionsInfo(scss=True, category='column_labels', type='px', value='5px'), column_labels_padding_horizontal=OptionsInfo(scss=True, category='column_labels', type='px', value='5px'), column_labels_vlines_style=OptionsInfo(scss=True, category='table_body', type='value', value='none'), column_labels_vlines_width=OptionsInfo(scss=True, category='table_body', type='px', value='1px'), column_labels_vlines_color=OptionsInfo(scss=True, category='table_body', type='value', value='#D3D3D3'), column_labels_border_top_style=OptionsInfo(scss=True, category='column_labels', type='value', value='solid'), column_labels_border_top_width=OptionsInfo(scss=True, category='column_labels', type='px', value='2px'), column_labels_border_top_color=OptionsInfo(scss=True, category='column_labels', type='value', value='#D3D3D3'), column_labels_border_bottom_style=OptionsInfo(scss=True, category='column_labels', type='value', value='solid'), column_labels_border_bottom_width=OptionsInfo(scss=True, category='column_labels', type='px', value='2px'), column_labels_border_bottom_color=OptionsInfo(scss=True, category='column_labels', type='value', value='#D3D3D3'), column_labels_border_lr_style=OptionsInfo(scss=True, category='column_labels', type='value', value='none'), column_labels_border_lr_width=OptionsInfo(scss=True, category='column_labels', type='px', value='1px'), column_labels_border_lr_color=OptionsInfo(scss=True, category='column_labels', type='value', value='#D3D3D3'), column_labels_hidden=OptionsInfo(scss=False, category='column_labels', type='boolean', value=False), row_group_background_color=OptionsInfo(scss=True, category='row_group', type='value', value=None), row_group_font_size=OptionsInfo(scss=True, category='row_group', type='px', value='100%'), row_group_font_weight=OptionsInfo(scss=True, category='row_group', type='value', value='initial'), row_group_text_transform=OptionsInfo(scss=True, category='row_group', type='value', value='inherit'), row_group_padding=OptionsInfo(scss=True, category='row_group', type='px', value='8px'), row_group_padding_horizontal=OptionsInfo(scss=True, category='row_group', type='px', value='5px'), row_group_border_top_style=OptionsInfo(scss=True, category='row_group', type='value', value='solid'), row_group_border_top_width=OptionsInfo(scss=True, category='row_group', type='px', value='2px'), row_group_border_top_color=OptionsInfo(scss=True, category='row_group', type='value', value='#D3D3D3'), row_group_border_right_style=OptionsInfo(scss=True, category='row_group', type='value', value='none'), row_group_border_right_width=OptionsInfo(scss=True, category='row_group', type='px', value='1px'), row_group_border_right_color=OptionsInfo(scss=True, category='row_group', type='value', value='#D3D3D3'), row_group_border_bottom_style=OptionsInfo(scss=True, category='row_group', type='value', value='solid'), row_group_border_bottom_width=OptionsInfo(scss=True, category='row_group', type='px', value='2px'), row_group_border_bottom_color=OptionsInfo(scss=True, category='row_group', type='value', value='#D3D3D3'), row_group_border_left_style=OptionsInfo(scss=True, category='row_group', type='value', value='none'), row_group_border_left_width=OptionsInfo(scss=True, category='row_group', type='px', value='1px'), row_group_border_left_color=OptionsInfo(scss=True, category='row_group', type='value', value='#D3D3D3'), row_group_as_column=OptionsInfo(scss=False, category='row_group', type='boolean', value=False), table_body_hlines_style=OptionsInfo(scss=True, category='table_body', type='value', value='solid'), table_body_hlines_width=OptionsInfo(scss=True, category='table_body', type='px', value='1px'), table_body_hlines_color=OptionsInfo(scss=True, category='table_body', type='value', value='#D3D3D3'), table_body_vlines_style=OptionsInfo(scss=True, category='table_body', type='value', value='none'), table_body_vlines_width=OptionsInfo(scss=True, category='table_body', type='px', value='1px'), table_body_vlines_color=OptionsInfo(scss=True, category='table_body', type='value', value='#D3D3D3'), table_body_border_top_style=OptionsInfo(scss=True, category='table_body', type='value', value='solid'), table_body_border_top_width=OptionsInfo(scss=True, category='table_body', type='px', value='2px'), table_body_border_top_color=OptionsInfo(scss=True, category='table_body', type='value', value='#D3D3D3'), table_body_border_bottom_style=OptionsInfo(scss=True, category='table_body', type='value', value='solid'), table_body_border_bottom_width=OptionsInfo(scss=True, category='table_body', type='px', value='2px'), table_body_border_bottom_color=OptionsInfo(scss=True, category='table_body', type='value', value='#D3D3D3'), data_row_padding=OptionsInfo(scss=True, category='data_row', type='px', value='8px'), data_row_padding_horizontal=OptionsInfo(scss=True, category='data_row', type='px', value='5px'), stub_background_color=OptionsInfo(scss=True, category='stub', type='value', value=None), stub_font_size=OptionsInfo(scss=True, category='stub', type='px', value='100%'), stub_font_weight=OptionsInfo(scss=True, category='stub', type='value', value='initial'), stub_text_transform=OptionsInfo(scss=True, category='stub', type='value', value='inherit'), stub_border_style=OptionsInfo(scss=True, category='stub', type='value', value='solid'), stub_border_width=OptionsInfo(scss=True, category='stub', type='px', value='2px'), stub_border_color=OptionsInfo(scss=True, category='stub', type='value', value='#D3D3D3'), stub_indent_length=OptionsInfo(scss=True, category='stub', type='px', value='5px'), stub_row_group_background_color=OptionsInfo(scss=True, category='stub', type='value', value=None), stub_row_group_font_size=OptionsInfo(scss=True, category='stub', type='px', value='100%'), stub_row_group_font_weight=OptionsInfo(scss=True, category='stub', type='value', value='initial'), stub_row_group_text_transform=OptionsInfo(scss=True, category='stub', type='value', value='inherit'), stub_row_group_border_style=OptionsInfo(scss=True, category='stub', type='value', value='solid'), stub_row_group_border_width=OptionsInfo(scss=True, category='stub', type='px', value='2px'), stub_row_group_border_color=OptionsInfo(scss=True, category='stub', type='value', value='#D3D3D3'), summary_row_padding=OptionsInfo(scss=True, category='summary_row', type='px', value='8px'), summary_row_padding_horizontal=OptionsInfo(scss=True, category='summary_row', type='px', value='5px'), summary_row_background_color=OptionsInfo(scss=True, category='summary_row', type='value', value=None), summary_row_text_transform=OptionsInfo(scss=True, category='summary_row', type='value', value='inherit'), summary_row_border_style=OptionsInfo(scss=True, category='summary_row', type='value', value='solid'), summary_row_border_width=OptionsInfo(scss=True, category='summary_row', type='px', value='2px'), summary_row_border_color=OptionsInfo(scss=True, category='summary_row', type='value', value='#D3D3D3'), grand_summary_row_padding=OptionsInfo(scss=True, category='grand_summary_row', type='px', value='8px'), grand_summary_row_padding_horizontal=OptionsInfo(scss=True, category='grand_summary_row', type='px', value='5px'), grand_summary_row_background_color=OptionsInfo(scss=True, category='grand_summary_row', type='value', value=None), grand_summary_row_text_transform=OptionsInfo(scss=True, category='grand_summary_row', type='value', value='inherit'), grand_summary_row_border_style=OptionsInfo(scss=True, category='grand_summary_row', type='value', value='double'), grand_summary_row_border_width=OptionsInfo(scss=True, category='grand_summary_row', type='px', value='6px'), grand_summary_row_border_color=OptionsInfo(scss=True, category='grand_summary_row', type='value', value='#D3D3D3'), footnotes_marks=OptionsInfo(scss=False, category='footnotes', type='values', value='numbers'), footnotes_spec_ref=OptionsInfo(scss=False, category='footnotes', type='value', value='^i'), footnotes_spec_ftr=OptionsInfo(scss=False, category='footnotes', type='value', value='^i'), footnotes_order=OptionsInfo(scss=False, category='footnotes', type='value', value='marks_last'), source_notes_padding=OptionsInfo(scss=True, category='source_notes', type='px', value='4px'), source_notes_padding_horizontal=OptionsInfo(scss=True, category='source_notes', type='px', value='5px'), source_notes_background_color=OptionsInfo(scss=True, category='source_notes', type='value', value=None), source_notes_font_size=OptionsInfo(scss=True, category='source_notes', type='px', value='90%'), source_notes_border_bottom_style=OptionsInfo(scss=True, category='source_notes', type='value', value='none'), source_notes_border_bottom_width=OptionsInfo(scss=True, category='source_notes', type='px', value='2px'), source_notes_border_bottom_color=OptionsInfo(scss=True, category='source_notes', type='value', value='#D3D3D3'), source_notes_border_lr_style=OptionsInfo(scss=True, category='source_notes', type='value', value='none'), source_notes_border_lr_width=OptionsInfo(scss=True, category='source_notes', type='px', value='2px'), source_notes_border_lr_color=OptionsInfo(scss=True, category='source_notes', type='value', value='#D3D3D3'), source_notes_multiline=OptionsInfo(scss=False, category='source_notes', type='boolean', value=True), source_notes_sep=OptionsInfo(scss=False, category='source_notes', type='value', value=' '), row_striping_background_color=OptionsInfo(scss=True, category='row', type='value', value='#F4F4F4'), row_striping_include_stub=OptionsInfo(scss=False, category='row', type='boolean', value=False), row_striping_include_table_body=OptionsInfo(scss=False, category='row', type='boolean', value=False), container_width=OptionsInfo(scss=False, category='container', type='px', value='auto'), container_height=OptionsInfo(scss=False, category='container', type='px', value='auto'), container_padding_x=OptionsInfo(scss=False, category='container', type='px', value='0px'), container_padding_y=OptionsInfo(scss=False, category='container', type='px', value='10px'), container_overflow_x=OptionsInfo(scss=False, category='container', type='overflow', value='auto'), container_overflow_y=OptionsInfo(scss=False, category='container', type='overflow', value='auto'), quarto_disable_processing=OptionsInfo(scss=False, category='quarto', type='logical', value=False), quarto_use_bootstrap=OptionsInfo(scss=False, category='quarto', type='logical', value=False), ihtml_active=OptionsInfo(scss=False, category='ihtml', type='boolean', value=False), ihtml_use_pagination=OptionsInfo(scss=False, category='ihtml', type='boolean', value=True), ihtml_use_pagination_info=OptionsInfo(scss=False, category='ihtml', type='boolean', value=True), ihtml_use_sorting=OptionsInfo(scss=False, category='ihtml', type='boolean', value=True), ihtml_use_search=OptionsInfo(scss=False, category='ihtml', type='boolean', value=False), ihtml_use_filters=OptionsInfo(scss=False, category='ihtml', type='boolean', value=False), ihtml_use_resizers=OptionsInfo(scss=False, category='ihtml', type='boolean', value=False), ihtml_use_highlight=OptionsInfo(scss=False, category='ihtml', type='boolean', value=False), ihtml_use_compact_mode=OptionsInfo(scss=False, category='ihtml', type='boolean', value=False), ihtml_use_text_wrapping=OptionsInfo(scss=False, category='ihtml', type='boolean', value=True), ihtml_use_page_size_select=OptionsInfo(scss=False, category='ihtml', type='boolean', value=False), ihtml_page_size_default=OptionsInfo(scss=False, category='ihtml', type='value', value=10), ihtml_page_size_values=OptionsInfo(scss=False, category='ihtml', type='values', value=[10, 25, 50, 100]), ihtml_pagination_type=OptionsInfo(scss=False, category='ihtml', type='value', value='numbers'), ihtml_height=OptionsInfo(scss=False, category='ihtml', type='value', value='auto'), ihtml_selection_mode=OptionsInfo(scss=False, category='ihtml', type='value', value=None)), _google_font_imports=GoogleFontImports(imports=frozenset()), _has_built=False)</w:t>
       </w:r>
     </w:p>
     <w:bookmarkEnd w:id="16"/>
@@ -784,7 +726,7 @@
         <w:t xml:space="preserve"> </w:t>
       </w:r>
       <w:r>
-        <w:t xml:space="preserve">En el sistema 12 TET, la razón constante</w:t>
+        <w:t xml:space="preserve">La razón constante</w:t>
       </w:r>
       <w:r>
         <w:t xml:space="preserve"> </w:t>
@@ -816,16 +758,16 @@
         <w:t xml:space="preserve"> </w:t>
       </w:r>
       <w:r>
-        <w:t xml:space="preserve">permite transportar melodías entre tonalidades preservando intervalos idénticos, a cambio de una desviación imperceptible de las quintas puras, asegurando estabilidad armónica completa.</w:t>
+        <w:t xml:space="preserve">permite transportar melodías preservando intervalos, asegurando consonancia uniforme en todo el registro.</w:t>
       </w:r>
     </w:p>
     <w:p>
       <w:pPr>
         <w:pStyle w:val="Heading3"/>
       </w:pPr>
-      <w:bookmarkStart w:id="17" w:name="_5e85226917dcb5fb8c4f3c347f27332a81f7d26"/>
-      <w:r>
-        <w:t xml:space="preserve">2.2. Matriz de transiciones y validación estocástica (20%)</w:t>
+      <w:bookmarkStart w:id="17" w:name="_fe85c44dbd584224462c832db6d066aff87efe3"/>
+      <w:r>
+        <w:t xml:space="preserve">2.2. Matriz de transición</w:t>
       </w:r>
       <w:bookmarkEnd w:id="17"/>
     </w:p>
@@ -941,24 +883,6 @@
           </m:rPr>
           <m:t>,</m:t>
         </m:r>
-        <m:sSub>
-          <m:e>
-            <m:r>
-              <m:t>s</m:t>
-            </m:r>
-          </m:e>
-          <m:sub>
-            <m:r>
-              <m:t>2</m:t>
-            </m:r>
-          </m:sub>
-        </m:sSub>
-        <m:r>
-          <m:rPr>
-            <m:sty m:val="p"/>
-          </m:rPr>
-          <m:t>,</m:t>
-        </m:r>
         <m:r>
           <m:rPr>
             <m:sty m:val="p"/>
@@ -1039,7 +963,7 @@
         </m:sSup>
       </m:oMath>
       <w:r>
-        <w:t xml:space="preserve">: Matriz de probabilidades de transición donde</w:t>
+        <w:t xml:space="preserve">: Matriz de probabilidades de transición con</w:t>
       </w:r>
       <w:r>
         <w:t xml:space="preserve"> </w:t>
@@ -1218,7 +1142,7 @@
         </m:sSup>
       </m:oMath>
       <w:r>
-        <w:t xml:space="preserve">: Vector de distribución de probabilidad inicial.</w:t>
+        <w:t xml:space="preserve">: Vector de distribución inicial.</w:t>
       </w:r>
     </w:p>
     <w:p>
@@ -1226,17 +1150,13 @@
         <w:pStyle w:val="FirstParagraph"/>
       </w:pPr>
       <w:r>
-        <w:rPr>
-          <w:b/>
-          <w:bCs/>
-        </w:rPr>
         <w:t xml:space="preserve">Propiedad de Markov:</w:t>
       </w:r>
       <w:r>
         <w:br/>
       </w:r>
       <w:r>
-        <w:t xml:space="preserve">El estado futuro depende únicamente del estado inmediatamente presente, siendo condicionalmente independiente de la historia pasada:</w:t>
+        <w:t xml:space="preserve">El estado futuro depende únicamente del estado presente:</w:t>
       </w:r>
     </w:p>
     <w:p>
@@ -1511,88 +1431,7 @@
         <w:pStyle w:val="FirstParagraph"/>
       </w:pPr>
       <w:r>
-        <w:t xml:space="preserve">Como expuso el profesor Luis Ricardo Peña Llamas en la clase del 8 de octubre mediante el ejemplo de los registros de estudio de 20 días con 11 días de estudio cada uno, el conteo frecuentista simple (</w:t>
-      </w:r>
-      <m:oMath>
-        <m:r>
-          <m:t>11</m:t>
-        </m:r>
-        <m:r>
-          <m:rPr>
-            <m:sty m:val="p"/>
-          </m:rPr>
-          <m:t>/</m:t>
-        </m:r>
-        <m:r>
-          <m:t>20</m:t>
-        </m:r>
-      </m:oMath>
-      <w:r>
-        <w:t xml:space="preserve">) resulta ciego ante la estructura temporal. Mientras que un registro proviene de una regla estocástica (</w:t>
-      </w:r>
-      <m:oMath>
-        <m:r>
-          <m:t>70</m:t>
-        </m:r>
-        <m:r>
-          <m:rPr>
-            <m:sty m:val="p"/>
-          </m:rPr>
-          <m:t>%</m:t>
-        </m:r>
-      </m:oMath>
-      <w:r>
-        <w:t xml:space="preserve"> </w:t>
-      </w:r>
-      <w:r>
-        <w:t xml:space="preserve">de estudiar si se estudió hoy y</w:t>
-      </w:r>
-      <w:r>
-        <w:t xml:space="preserve"> </w:t>
-      </w:r>
-      <m:oMath>
-        <m:r>
-          <m:t>40</m:t>
-        </m:r>
-        <m:r>
-          <m:rPr>
-            <m:sty m:val="p"/>
-          </m:rPr>
-          <m:t>%</m:t>
-        </m:r>
-      </m:oMath>
-      <w:r>
-        <w:t xml:space="preserve"> </w:t>
-      </w:r>
-      <w:r>
-        <w:t xml:space="preserve">si no), el otro proviene de un volado independiente (</w:t>
-      </w:r>
-      <m:oMath>
-        <m:r>
-          <m:t>50</m:t>
-        </m:r>
-        <m:r>
-          <m:rPr>
-            <m:sty m:val="p"/>
-          </m:rPr>
-          <m:t>/</m:t>
-        </m:r>
-        <m:r>
-          <m:t>50</m:t>
-        </m:r>
-      </m:oMath>
-      <w:r>
-        <w:t xml:space="preserve">). El análisis de pares ordenados de tokens adyacentes (</w:t>
-      </w:r>
-      <w:r>
-        <w:rPr>
-          <w:b/>
-          <w:bCs/>
-        </w:rPr>
-        <w:t xml:space="preserve">bigramas</w:t>
-      </w:r>
-      <w:r>
-        <w:t xml:space="preserve">) es la técnica matemática que permite estimar las probabilidades de transición y revelar la verdadera dinámica subyacente.</w:t>
+        <w:t xml:space="preserve">Como expuso el profesor Ricardo Peña en clase con el ejemplo de los registros de estudio de 20 días con 11 días de estudio, el conteo frecuentista simple (11 sobre 20) ignora el orden temporal. Mientras un registro responde a una regla estocástica (70% de estudiar si se estudió hoy), el otro proviene de un volado independiente (50 sobre 50). El análisis de bigramas permite estimar transiciones y revelar la dinámica subyacente.</w:t>
       </w:r>
     </w:p>
     <w:p>
@@ -1600,7 +1439,7 @@
         <w:pStyle w:val="BodyText"/>
       </w:pPr>
       <w:r>
-        <w:t xml:space="preserve">Las probabilidades de la matriz se diseñaron siguiendo las funciones armónicas de la música tonal:</w:t>
+        <w:t xml:space="preserve">Las probabilidades se definieron según la armonía funcional:</w:t>
       </w:r>
     </w:p>
     <w:p>
@@ -1612,17 +1451,7 @@
         </w:numPr>
       </w:pPr>
       <w:r>
-        <w:rPr>
-          <w:b/>
-          <w:bCs/>
-        </w:rPr>
-        <w:t xml:space="preserve">Tónica (D4):</w:t>
-      </w:r>
-      <w:r>
-        <w:t xml:space="preserve"> </w:t>
-      </w:r>
-      <w:r>
-        <w:t xml:space="preserve">Centro de gravedad tonal. Estabilidad máxima que distribuye transiciones fluidas hacia subdominante (G4) y dominante (A4).</w:t>
+        <w:t xml:space="preserve">Tónica (D4): Centro de gravedad tonal de máxima estabilidad.</w:t>
       </w:r>
     </w:p>
     <w:p>
@@ -1634,17 +1463,7 @@
         </w:numPr>
       </w:pPr>
       <w:r>
-        <w:rPr>
-          <w:b/>
-          <w:bCs/>
-        </w:rPr>
-        <w:t xml:space="preserve">Supertónica (E4):</w:t>
-      </w:r>
-      <w:r>
-        <w:t xml:space="preserve"> </w:t>
-      </w:r>
-      <w:r>
-        <w:t xml:space="preserve">Tensión de paso que conduce preferentemente hacia la dominante (A4, 25%) y retorno a tónica (D4, 30%).</w:t>
+        <w:t xml:space="preserve">Supertónica (E4): Grado de paso que conduce a la dominante (A4, 25%) o tónica (D4, 30%).</w:t>
       </w:r>
     </w:p>
     <w:p>
@@ -1656,17 +1475,7 @@
         </w:numPr>
       </w:pPr>
       <w:r>
-        <w:rPr>
-          <w:b/>
-          <w:bCs/>
-        </w:rPr>
-        <w:t xml:space="preserve">Mediante (F#4):</w:t>
-      </w:r>
-      <w:r>
-        <w:t xml:space="preserve"> </w:t>
-      </w:r>
-      <w:r>
-        <w:t xml:space="preserve">Color del modo mayor; conecta con subdominante (G4, 30%) y tónica (D4, 20%).</w:t>
+        <w:t xml:space="preserve">Mediante (F#4): Nota modal que conecta con la subdominante (G4, 30%) y tónica (D4, 20%).</w:t>
       </w:r>
     </w:p>
     <w:p>
@@ -1678,17 +1487,7 @@
         </w:numPr>
       </w:pPr>
       <w:r>
-        <w:rPr>
-          <w:b/>
-          <w:bCs/>
-        </w:rPr>
-        <w:t xml:space="preserve">Subdominante (G4):</w:t>
-      </w:r>
-      <w:r>
-        <w:t xml:space="preserve"> </w:t>
-      </w:r>
-      <w:r>
-        <w:t xml:space="preserve">Fuerza armónica intermedia con fuerte inclinación hacia la dominante (A4, 35%).</w:t>
+        <w:t xml:space="preserve">Subdominante (G4): Tensión intermedia orientada a la dominante (A4, 35%).</w:t>
       </w:r>
     </w:p>
     <w:p>
@@ -1700,17 +1499,7 @@
         </w:numPr>
       </w:pPr>
       <w:r>
-        <w:rPr>
-          <w:b/>
-          <w:bCs/>
-        </w:rPr>
-        <w:t xml:space="preserve">Dominante (A4):</w:t>
-      </w:r>
-      <w:r>
-        <w:t xml:space="preserve"> </w:t>
-      </w:r>
-      <w:r>
-        <w:t xml:space="preserve">Grado de máxima tensión armónica. Manifiesta atracción imperativa de resolución hacia la tónica (D4, 50%) o cadencia rota a submediante (B4, 15%).</w:t>
+        <w:t xml:space="preserve">Dominante (A4): Máxima tensión armónica que resuelve en tónica (D4, 50%) o submediante (B4, 15%).</w:t>
       </w:r>
     </w:p>
     <w:p>
@@ -1722,17 +1511,7 @@
         </w:numPr>
       </w:pPr>
       <w:r>
-        <w:rPr>
-          <w:b/>
-          <w:bCs/>
-        </w:rPr>
-        <w:t xml:space="preserve">Submediante (B4):</w:t>
-      </w:r>
-      <w:r>
-        <w:t xml:space="preserve"> </w:t>
-      </w:r>
-      <w:r>
-        <w:t xml:space="preserve">Centro tonal relativo menor; conduce a subdominante (G4, 25%) y dominante (A4, 20%).</w:t>
+        <w:t xml:space="preserve">Submediante (B4): Centro relativo menor que conduce a subdominante (G4, 25%) o dominante (A4, 20%).</w:t>
       </w:r>
     </w:p>
     <w:p>
@@ -1744,37 +1523,7 @@
         </w:numPr>
       </w:pPr>
       <w:r>
-        <w:rPr>
-          <w:b/>
-          <w:bCs/>
-        </w:rPr>
-        <w:t xml:space="preserve">Sensible (C#5):</w:t>
-      </w:r>
-      <w:r>
-        <w:t xml:space="preserve"> </w:t>
-      </w:r>
-      <w:r>
-        <w:t xml:space="preserve">Grado a un semitono de la tónica superior. En conducción de voces tiene resolución obligada ascendente hacia la tónica (D4/D5), modelada aquí con</w:t>
-      </w:r>
-      <w:r>
-        <w:t xml:space="preserve"> </w:t>
-      </w:r>
-      <m:oMath>
-        <m:r>
-          <m:t>70</m:t>
-        </m:r>
-        <m:r>
-          <m:rPr>
-            <m:sty m:val="p"/>
-          </m:rPr>
-          <m:t>%</m:t>
-        </m:r>
-      </m:oMath>
-      <w:r>
-        <w:t xml:space="preserve"> </w:t>
-      </w:r>
-      <w:r>
-        <w:t xml:space="preserve">de probabilidad.</w:t>
+        <w:t xml:space="preserve">Sensible (C#5): Inestabilidad melódica con resolución ascendente obligada a tónica (D4, 70%).</w:t>
       </w:r>
     </w:p>
     <w:p>
@@ -1862,7 +1611,7 @@
         <w:rPr>
           <w:rStyle w:val="VerbatimChar"/>
         </w:rPr>
-        <w:t xml:space="preserve">6        C#5  0.70  0.10  0.05  0.00  0.10  0.05  0.00, _body=&lt;great_tables._gt_data.Body object at 0xf8d8b06ff4d0&gt;, _boxhead=Boxhead([ColInfo(var='Estado (t)', type=&lt;ColInfoTypeEnum.default: 1&gt;, column_label='Estado (t)', column_align='left', column_width=None, stub_level=None), ColInfo(var='D4', type=&lt;ColInfoTypeEnum.default: 1&gt;, column_label='D4', column_align='right', column_width=None, stub_level=None), ColInfo(var='E4', type=&lt;ColInfoTypeEnum.default: 1&gt;, column_label='E4', column_align='right', column_width=None, stub_level=None), ColInfo(var='F#4', type=&lt;ColInfoTypeEnum.default: 1&gt;, column_label='F#4', column_align='right', column_width=None, stub_level=None), ColInfo(var='G4', type=&lt;ColInfoTypeEnum.default: 1&gt;, column_label='G4', column_align='right', column_width=None, stub_level=None), ColInfo(var='A4', type=&lt;ColInfoTypeEnum.default: 1&gt;, column_label='A4', column_align='right', column_width=None, stub_level=None), ColInfo(var='B4', type=&lt;ColInfoTypeEnum.default: 1&gt;, column_label='B4', column_align='right', column_width=None, stub_level=None), ColInfo(var='C#5', type=&lt;ColInfoTypeEnum.default: 1&gt;, column_label='C#5', column_align='right', column_width=None, stub_level=None)]), _stub=&lt;great_tables._gt_data.Stub object at 0xf8d8b0742850&gt;, _spanners=Spanners([]), _heading=Heading(title='Matriz de Probabilidades de Transición P', subtitle=None, preheader=None), _stubhead=None, _summary_rows=&lt;great_tables._gt_data.SummaryRows object at 0xf8d8b06d63f0&gt;, _summary_rows_grand=&lt;great_tables._gt_data.SummaryRows object at 0xf8d8b0786f90&gt;, _source_notes=[], _footnotes=[], _styles=[], _locale=&lt;great_tables._gt_data.Locale object at 0xf8d8b0742d50&gt;, _formats=[&lt;great_tables._gt_data.FormatInfo object at 0xf8d8b078cc20&gt;], _substitutions=[], _col_merge=[], _transforms=[], _options=Options(table_id=OptionsInfo(scss=False, category='table', type='value', value=None), table_caption=OptionsInfo(scss=False, category='table', type='value', value=None), table_width=OptionsInfo(scss=True, category='table', type='px', value='auto'), table_layout=OptionsInfo(scss=True, category='table', type='value', value='fixed'), table_margin_left=OptionsInfo(scss=True, category='table', type='px', value='auto'), table_margin_right=OptionsInfo(scss=True, category='table', type='px', value='auto'), table_background_color=OptionsInfo(scss=True, category='table', type='value', value='#FFFFFF'), table_additional_css=OptionsInfo(scss=False, category='table', type='values', value=[]), table_font_names=OptionsInfo(scss=False, category='table', type='values', value=['-apple-system', 'BlinkMacSystemFont', 'Segoe UI', 'Roboto', 'Oxygen', 'Ubuntu', 'Cantarell', 'Helvetica Neue', 'Fira Sans', 'Droid Sans', 'Arial', 'sans-serif']), table_font_size=OptionsInfo(scss=True, category='table', type='px', value='16px'), table_font_weight=OptionsInfo(scss=True, category='table', type='value', value='normal'), table_font_style=OptionsInfo(scss=True, category='table', type='value', value='normal'), table_font_color=OptionsInfo(scss=True, category='table', type='value', value='#333333'), table_font_color_light=OptionsInfo(scss=True, category='table', type='value', value='#FFFFFF'), table_border_top_include=OptionsInfo(scss=False, category='table', type='boolean', value=True), table_border_top_style=OptionsInfo(scss=True, category='table', type='value', value='solid'), table_border_top_width=OptionsInfo(scss=True, category='table', type='px', value='2px'), table_border_top_color=OptionsInfo(scss=True, category='table', type='value', value='#A8A8A8'), table_border_right_style=OptionsInfo(scss=True, category='table', type='value', value='none'), table_border_right_width=OptionsInfo(scss=True, category='table', type='px', value='2px'), table_border_right_color=OptionsInfo(scss=True, category='table', type='value', value='#D3D3D3'), table_border_bottom_include=OptionsInfo(scss=False, category='table', type='boolean', value=True), table_border_bottom_style=OptionsInfo(scss=True, category='table', type='value', value='solid'), table_border_bottom_width=OptionsInfo(scss=True, category='table', type='px', value='2px'), table_border_bottom_color=OptionsInfo(scss=True, category='table', type='value', value='#A8A8A8'), table_border_left_style=OptionsInfo(scss=True, category='table', type='value', value='none'), table_border_left_width=OptionsInfo(scss=True, category='table', type='px', value='2px'), table_border_left_color=OptionsInfo(scss=True, category='table', type='value', value='#D3D3D3'), heading_background_color=OptionsInfo(scss=True, category='heading', type='value', value=None), heading_align=OptionsInfo(scss=True, category='heading', type='value', value='center'), heading_title_font_size=OptionsInfo(scss=True, category='heading', type='px', value='125%'), heading_title_font_weight=OptionsInfo(scss=True, category='heading', type='value', value='initial'), heading_subtitle_font_size=OptionsInfo(scss=True, category='heading', type='px', value='85%'), heading_subtitle_font_weight=OptionsInfo(scss=True, category='heading', type='value', value='initial'), heading_padding=OptionsInfo(scss=True, category='heading', type='px', value='4px'), heading_padding_horizontal=OptionsInfo(scss=True, category='heading', type='px', value='5px'), heading_border_bottom_style=OptionsInfo(scss=True, category='heading', type='value', value='solid'), heading_border_bottom_width=OptionsInfo(scss=True, category='heading', type='px', value='2px'), heading_border_bottom_color=OptionsInfo(scss=True, category='heading', type='value', value='#D3D3D3'), heading_border_lr_style=OptionsInfo(scss=True, category='heading', type='value', value='none'), heading_border_lr_width=OptionsInfo(scss=True, category='heading', type='px', value='1px'), heading_border_lr_color=OptionsInfo(scss=True, category='heading', type='value', value='#D3D3D3'), column_labels_background_color=OptionsInfo(scss=True, category='column_labels', type='value', value=None), column_labels_font_size=OptionsInfo(scss=True, category='column_labels', type='px', value='100%'), column_labels_font_weight=OptionsInfo(scss=True, category='column_labels', type='value', value='normal'), column_labels_text_transform=OptionsInfo(scss=True, category='column_labels', type='value', value='inherit'), column_labels_padding=OptionsInfo(scss=True, category='column_labels', type='px', value='5px'), column_labels_padding_horizontal=OptionsInfo(scss=True, category='column_labels', type='px', value='5px'), column_labels_vlines_style=OptionsInfo(scss=True, category='table_body', type='value', value='none'), column_labels_vlines_width=OptionsInfo(scss=True, category='table_body', type='px', value='1px'), column_labels_vlines_color=OptionsInfo(scss=True, category='table_body', type='value', value='#D3D3D3'), column_labels_border_top_style=OptionsInfo(scss=True, category='column_labels', type='value', value='solid'), column_labels_border_top_width=OptionsInfo(scss=True, category='column_labels', type='px', value='2px'), column_labels_border_top_color=OptionsInfo(scss=True, category='column_labels', type='value', value='#D3D3D3'), column_labels_border_bottom_style=OptionsInfo(scss=True, category='column_labels', type='value', value='solid'), column_labels_border_bottom_width=OptionsInfo(scss=True, category='column_labels', type='px', value='2px'), column_labels_border_bottom_color=OptionsInfo(scss=True, category='column_labels', type='value', value='#D3D3D3'), column_labels_border_lr_style=OptionsInfo(scss=True, category='column_labels', type='value', value='none'), column_labels_border_lr_width=OptionsInfo(scss=True, category='column_labels', type='px', value='1px'), column_labels_border_lr_color=OptionsInfo(scss=True, category='column_labels', type='value', value='#D3D3D3'), column_labels_hidden=OptionsInfo(scss=False, category='column_labels', type='boolean', value=False), row_group_background_color=OptionsInfo(scss=True, category='row_group', type='value', value=None), row_group_font_size=OptionsInfo(scss=True, category='row_group', type='px', value='100%'), row_group_font_weight=OptionsInfo(scss=True, category='row_group', type='value', value='initial'), row_group_text_transform=OptionsInfo(scss=True, category='row_group', type='value', value='inherit'), row_group_padding=OptionsInfo(scss=True, category='row_group', type='px', value='8px'), row_group_padding_horizontal=OptionsInfo(scss=True, category='row_group', type='px', value='5px'), row_group_border_top_style=OptionsInfo(scss=True, category='row_group', type='value', value='solid'), row_group_border_top_width=OptionsInfo(scss=True, category='row_group', type='px', value='2px'), row_group_border_top_color=OptionsInfo(scss=True, category='row_group', type='value', value='#D3D3D3'), row_group_border_right_style=OptionsInfo(scss=True, category='row_group', type='value', value='none'), row_group_border_right_width=OptionsInfo(scss=True, category='row_group', type='px', value='1px'), row_group_border_right_color=OptionsInfo(scss=True, category='row_group', type='value', value='#D3D3D3'), row_group_border_bottom_style=OptionsInfo(scss=True, category='row_group', type='value', value='solid'), row_group_border_bottom_width=OptionsInfo(scss=True, category='row_group', type='px', value='2px'), row_group_border_bottom_color=OptionsInfo(scss=True, category='row_group', type='value', value='#D3D3D3'), row_group_border_left_style=OptionsInfo(scss=True, category='row_group', type='value', value='none'), row_group_border_left_width=OptionsInfo(scss=True, category='row_group', type='px', value='1px'), row_group_border_left_color=OptionsInfo(scss=True, category='row_group', type='value', value='#D3D3D3'), row_group_as_column=OptionsInfo(scss=False, category='row_group', type='boolean', value=False), table_body_hlines_style=OptionsInfo(scss=True, category='table_body', type='value', value='solid'), table_body_hlines_width=OptionsInfo(scss=True, category='table_body', type='px', value='1px'), table_body_hlines_color=OptionsInfo(scss=True, category='table_body', type='value', value='#D3D3D3'), table_body_vlines_style=OptionsInfo(scss=True, category='table_body', type='value', value='none'), table_body_vlines_width=OptionsInfo(scss=True, category='table_body', type='px', value='1px'), table_body_vlines_color=OptionsInfo(scss=True, category='table_body', type='value', value='#D3D3D3'), table_body_border_top_style=OptionsInfo(scss=True, category='table_body', type='value', value='solid'), table_body_border_top_width=OptionsInfo(scss=True, category='table_body', type='px', value='2px'), table_body_border_top_color=OptionsInfo(scss=True, category='table_body', type='value', value='#D3D3D3'), table_body_border_bottom_style=OptionsInfo(scss=True, category='table_body', type='value', value='solid'), table_body_border_bottom_width=OptionsInfo(scss=True, category='table_body', type='px', value='2px'), table_body_border_bottom_color=OptionsInfo(scss=True, category='table_body', type='value', value='#D3D3D3'), data_row_padding=OptionsInfo(scss=True, category='data_row', type='px', value='8px'), data_row_padding_horizontal=OptionsInfo(scss=True, category='data_row', type='px', value='5px'), stub_background_color=OptionsInfo(scss=True, category='stub', type='value', value=None), stub_font_size=OptionsInfo(scss=True, category='stub', type='px', value='100%'), stub_font_weight=OptionsInfo(scss=True, category='stub', type='value', value='initial'), stub_text_transform=OptionsInfo(scss=True, category='stub', type='value', value='inherit'), stub_border_style=OptionsInfo(scss=True, category='stub', type='value', value='solid'), stub_border_width=OptionsInfo(scss=True, category='stub', type='px', value='2px'), stub_border_color=OptionsInfo(scss=True, category='stub', type='value', value='#D3D3D3'), stub_indent_length=OptionsInfo(scss=True, category='stub', type='px', value='5px'), stub_row_group_background_color=OptionsInfo(scss=True, category='stub', type='value', value=None), stub_row_group_font_size=OptionsInfo(scss=True, category='stub', type='px', value='100%'), stub_row_group_font_weight=OptionsInfo(scss=True, category='stub', type='value', value='initial'), stub_row_group_text_transform=OptionsInfo(scss=True, category='stub', type='value', value='inherit'), stub_row_group_border_style=OptionsInfo(scss=True, category='stub', type='value', value='solid'), stub_row_group_border_width=OptionsInfo(scss=True, category='stub', type='px', value='2px'), stub_row_group_border_color=OptionsInfo(scss=True, category='stub', type='value', value='#D3D3D3'), summary_row_padding=OptionsInfo(scss=True, category='summary_row', type='px', value='8px'), summary_row_padding_horizontal=OptionsInfo(scss=True, category='summary_row', type='px', value='5px'), summary_row_background_color=OptionsInfo(scss=True, category='summary_row', type='value', value=None), summary_row_text_transform=OptionsInfo(scss=True, category='summary_row', type='value', value='inherit'), summary_row_border_style=OptionsInfo(scss=True, category='summary_row', type='value', value='solid'), summary_row_border_width=OptionsInfo(scss=True, category='summary_row', type='px', value='2px'), summary_row_border_color=OptionsInfo(scss=True, category='summary_row', type='value', value='#D3D3D3'), grand_summary_row_padding=OptionsInfo(scss=True, category='grand_summary_row', type='px', value='8px'), grand_summary_row_padding_horizontal=OptionsInfo(scss=True, category='grand_summary_row', type='px', value='5px'), grand_summary_row_background_color=OptionsInfo(scss=True, category='grand_summary_row', type='value', value=None), grand_summary_row_text_transform=OptionsInfo(scss=True, category='grand_summary_row', type='value', value='inherit'), grand_summary_row_border_style=OptionsInfo(scss=True, category='grand_summary_row', type='value', value='double'), grand_summary_row_border_width=OptionsInfo(scss=True, category='grand_summary_row', type='px', value='6px'), grand_summary_row_border_color=OptionsInfo(scss=True, category='grand_summary_row', type='value', value='#D3D3D3'), footnotes_marks=OptionsInfo(scss=False, category='footnotes', type='values', value='numbers'), footnotes_spec_ref=OptionsInfo(scss=False, category='footnotes', type='value', value='^i'), footnotes_spec_ftr=OptionsInfo(scss=False, category='footnotes', type='value', value='^i'), footnotes_order=OptionsInfo(scss=False, category='footnotes', type='value', value='marks_last'), source_notes_padding=OptionsInfo(scss=True, category='source_notes', type='px', value='4px'), source_notes_padding_horizontal=OptionsInfo(scss=True, category='source_notes', type='px', value='5px'), source_notes_background_color=OptionsInfo(scss=True, category='source_notes', type='value', value=None), source_notes_font_size=OptionsInfo(scss=True, category='source_notes', type='px', value='90%'), source_notes_border_bottom_style=OptionsInfo(scss=True, category='source_notes', type='value', value='none'), source_notes_border_bottom_width=OptionsInfo(scss=True, category='source_notes', type='px', value='2px'), source_notes_border_bottom_color=OptionsInfo(scss=True, category='source_notes', type='value', value='#D3D3D3'), source_notes_border_lr_style=OptionsInfo(scss=True, category='source_notes', type='value', value='none'), source_notes_border_lr_width=OptionsInfo(scss=True, category='source_notes', type='px', value='2px'), source_notes_border_lr_color=OptionsInfo(scss=True, category='source_notes', type='value', value='#D3D3D3'), source_notes_multiline=OptionsInfo(scss=False, category='source_notes', type='boolean', value=True), source_notes_sep=OptionsInfo(scss=False, category='source_notes', type='value', value=' '), row_striping_background_color=OptionsInfo(scss=True, category='row', type='value', value='#F4F4F4'), row_striping_include_stub=OptionsInfo(scss=False, category='row', type='boolean', value=False), row_striping_include_table_body=OptionsInfo(scss=False, category='row', type='boolean', value=False), container_width=OptionsInfo(scss=False, category='container', type='px', value='auto'), container_height=OptionsInfo(scss=False, category='container', type='px', value='auto'), container_padding_x=OptionsInfo(scss=False, category='container', type='px', value='0px'), container_padding_y=OptionsInfo(scss=False, category='container', type='px', value='10px'), container_overflow_x=OptionsInfo(scss=False, category='container', type='overflow', value='auto'), container_overflow_y=OptionsInfo(scss=False, category='container', type='overflow', value='auto'), quarto_disable_processing=OptionsInfo(scss=False, category='quarto', type='logical', value=False), quarto_use_bootstrap=OptionsInfo(scss=False, category='quarto', type='logical', value=False), ihtml_active=OptionsInfo(scss=False, category='ihtml', type='boolean', value=False), ihtml_use_pagination=OptionsInfo(scss=False, category='ihtml', type='boolean', value=True), ihtml_use_pagination_info=OptionsInfo(scss=False, category='ihtml', type='boolean', value=True), ihtml_use_sorting=OptionsInfo(scss=False, category='ihtml', type='boolean', value=True), ihtml_use_search=OptionsInfo(scss=False, category='ihtml', type='boolean', value=False), ihtml_use_filters=OptionsInfo(scss=False, category='ihtml', type='boolean', value=False), ihtml_use_resizers=OptionsInfo(scss=False, category='ihtml', type='boolean', value=False), ihtml_use_highlight=OptionsInfo(scss=False, category='ihtml', type='boolean', value=False), ihtml_use_compact_mode=OptionsInfo(scss=False, category='ihtml', type='boolean', value=False), ihtml_use_text_wrapping=OptionsInfo(scss=False, category='ihtml', type='boolean', value=True), ihtml_use_page_size_select=OptionsInfo(scss=False, category='ihtml', type='boolean', value=False), ihtml_page_size_default=OptionsInfo(scss=False, category='ihtml', type='value', value=10), ihtml_page_size_values=OptionsInfo(scss=False, category='ihtml', type='values', value=[10, 25, 50, 100]), ihtml_pagination_type=OptionsInfo(scss=False, category='ihtml', type='value', value='numbers'), ihtml_height=OptionsInfo(scss=False, category='ihtml', type='value', value='auto'), ihtml_selection_mode=OptionsInfo(scss=False, category='ihtml', type='value', value=None)), _google_font_imports=GoogleFontImports(imports=frozenset()), _has_built=False)</w:t>
+        <w:t xml:space="preserve">6        C#5  0.70  0.10  0.05  0.00  0.10  0.05  0.00, _body=&lt;great_tables._gt_data.Body object at 0xeba88a81b4d0&gt;, _boxhead=Boxhead([ColInfo(var='Estado (t)', type=&lt;ColInfoTypeEnum.default: 1&gt;, column_label='Estado (t)', column_align='left', column_width=None, stub_level=None), ColInfo(var='D4', type=&lt;ColInfoTypeEnum.default: 1&gt;, column_label='D4', column_align='right', column_width=None, stub_level=None), ColInfo(var='E4', type=&lt;ColInfoTypeEnum.default: 1&gt;, column_label='E4', column_align='right', column_width=None, stub_level=None), ColInfo(var='F#4', type=&lt;ColInfoTypeEnum.default: 1&gt;, column_label='F#4', column_align='right', column_width=None, stub_level=None), ColInfo(var='G4', type=&lt;ColInfoTypeEnum.default: 1&gt;, column_label='G4', column_align='right', column_width=None, stub_level=None), ColInfo(var='A4', type=&lt;ColInfoTypeEnum.default: 1&gt;, column_label='A4', column_align='right', column_width=None, stub_level=None), ColInfo(var='B4', type=&lt;ColInfoTypeEnum.default: 1&gt;, column_label='B4', column_align='right', column_width=None, stub_level=None), ColInfo(var='C#5', type=&lt;ColInfoTypeEnum.default: 1&gt;, column_label='C#5', column_align='right', column_width=None, stub_level=None)]), _stub=&lt;great_tables._gt_data.Stub object at 0xeba88a85e850&gt;, _spanners=Spanners([]), _heading=Heading(title='Matriz de Probabilidades de Transición P', subtitle=None, preheader=None), _stubhead=None, _summary_rows=&lt;great_tables._gt_data.SummaryRows object at 0xeba88a7f23f0&gt;, _summary_rows_grand=&lt;great_tables._gt_data.SummaryRows object at 0xeba88a8a2f90&gt;, _source_notes=[], _footnotes=[], _styles=[], _locale=&lt;great_tables._gt_data.Locale object at 0xeba88a85ed50&gt;, _formats=[&lt;great_tables._gt_data.FormatInfo object at 0xeba88a3c0c20&gt;], _substitutions=[], _col_merge=[], _transforms=[], _options=Options(table_id=OptionsInfo(scss=False, category='table', type='value', value=None), table_caption=OptionsInfo(scss=False, category='table', type='value', value=None), table_width=OptionsInfo(scss=True, category='table', type='px', value='auto'), table_layout=OptionsInfo(scss=True, category='table', type='value', value='fixed'), table_margin_left=OptionsInfo(scss=True, category='table', type='px', value='auto'), table_margin_right=OptionsInfo(scss=True, category='table', type='px', value='auto'), table_background_color=OptionsInfo(scss=True, category='table', type='value', value='#FFFFFF'), table_additional_css=OptionsInfo(scss=False, category='table', type='values', value=[]), table_font_names=OptionsInfo(scss=False, category='table', type='values', value=['-apple-system', 'BlinkMacSystemFont', 'Segoe UI', 'Roboto', 'Oxygen', 'Ubuntu', 'Cantarell', 'Helvetica Neue', 'Fira Sans', 'Droid Sans', 'Arial', 'sans-serif']), table_font_size=OptionsInfo(scss=True, category='table', type='px', value='16px'), table_font_weight=OptionsInfo(scss=True, category='table', type='value', value='normal'), table_font_style=OptionsInfo(scss=True, category='table', type='value', value='normal'), table_font_color=OptionsInfo(scss=True, category='table', type='value', value='#333333'), table_font_color_light=OptionsInfo(scss=True, category='table', type='value', value='#FFFFFF'), table_border_top_include=OptionsInfo(scss=False, category='table', type='boolean', value=True), table_border_top_style=OptionsInfo(scss=True, category='table', type='value', value='solid'), table_border_top_width=OptionsInfo(scss=True, category='table', type='px', value='2px'), table_border_top_color=OptionsInfo(scss=True, category='table', type='value', value='#A8A8A8'), table_border_right_style=OptionsInfo(scss=True, category='table', type='value', value='none'), table_border_right_width=OptionsInfo(scss=True, category='table', type='px', value='2px'), table_border_right_color=OptionsInfo(scss=True, category='table', type='value', value='#D3D3D3'), table_border_bottom_include=OptionsInfo(scss=False, category='table', type='boolean', value=True), table_border_bottom_style=OptionsInfo(scss=True, category='table', type='value', value='solid'), table_border_bottom_width=OptionsInfo(scss=True, category='table', type='px', value='2px'), table_border_bottom_color=OptionsInfo(scss=True, category='table', type='value', value='#A8A8A8'), table_border_left_style=OptionsInfo(scss=True, category='table', type='value', value='none'), table_border_left_width=OptionsInfo(scss=True, category='table', type='px', value='2px'), table_border_left_color=OptionsInfo(scss=True, category='table', type='value', value='#D3D3D3'), heading_background_color=OptionsInfo(scss=True, category='heading', type='value', value=None), heading_align=OptionsInfo(scss=True, category='heading', type='value', value='center'), heading_title_font_size=OptionsInfo(scss=True, category='heading', type='px', value='125%'), heading_title_font_weight=OptionsInfo(scss=True, category='heading', type='value', value='initial'), heading_subtitle_font_size=OptionsInfo(scss=True, category='heading', type='px', value='85%'), heading_subtitle_font_weight=OptionsInfo(scss=True, category='heading', type='value', value='initial'), heading_padding=OptionsInfo(scss=True, category='heading', type='px', value='4px'), heading_padding_horizontal=OptionsInfo(scss=True, category='heading', type='px', value='5px'), heading_border_bottom_style=OptionsInfo(scss=True, category='heading', type='value', value='solid'), heading_border_bottom_width=OptionsInfo(scss=True, category='heading', type='px', value='2px'), heading_border_bottom_color=OptionsInfo(scss=True, category='heading', type='value', value='#D3D3D3'), heading_border_lr_style=OptionsInfo(scss=True, category='heading', type='value', value='none'), heading_border_lr_width=OptionsInfo(scss=True, category='heading', type='px', value='1px'), heading_border_lr_color=OptionsInfo(scss=True, category='heading', type='value', value='#D3D3D3'), column_labels_background_color=OptionsInfo(scss=True, category='column_labels', type='value', value=None), column_labels_font_size=OptionsInfo(scss=True, category='column_labels', type='px', value='100%'), column_labels_font_weight=OptionsInfo(scss=True, category='column_labels', type='value', value='normal'), column_labels_text_transform=OptionsInfo(scss=True, category='column_labels', type='value', value='inherit'), column_labels_padding=OptionsInfo(scss=True, category='column_labels', type='px', value='5px'), column_labels_padding_horizontal=OptionsInfo(scss=True, category='column_labels', type='px', value='5px'), column_labels_vlines_style=OptionsInfo(scss=True, category='table_body', type='value', value='none'), column_labels_vlines_width=OptionsInfo(scss=True, category='table_body', type='px', value='1px'), column_labels_vlines_color=OptionsInfo(scss=True, category='table_body', type='value', value='#D3D3D3'), column_labels_border_top_style=OptionsInfo(scss=True, category='column_labels', type='value', value='solid'), column_labels_border_top_width=OptionsInfo(scss=True, category='column_labels', type='px', value='2px'), column_labels_border_top_color=OptionsInfo(scss=True, category='column_labels', type='value', value='#D3D3D3'), column_labels_border_bottom_style=OptionsInfo(scss=True, category='column_labels', type='value', value='solid'), column_labels_border_bottom_width=OptionsInfo(scss=True, category='column_labels', type='px', value='2px'), column_labels_border_bottom_color=OptionsInfo(scss=True, category='column_labels', type='value', value='#D3D3D3'), column_labels_border_lr_style=OptionsInfo(scss=True, category='column_labels', type='value', value='none'), column_labels_border_lr_width=OptionsInfo(scss=True, category='column_labels', type='px', value='1px'), column_labels_border_lr_color=OptionsInfo(scss=True, category='column_labels', type='value', value='#D3D3D3'), column_labels_hidden=OptionsInfo(scss=False, category='column_labels', type='boolean', value=False), row_group_background_color=OptionsInfo(scss=True, category='row_group', type='value', value=None), row_group_font_size=OptionsInfo(scss=True, category='row_group', type='px', value='100%'), row_group_font_weight=OptionsInfo(scss=True, category='row_group', type='value', value='initial'), row_group_text_transform=OptionsInfo(scss=True, category='row_group', type='value', value='inherit'), row_group_padding=OptionsInfo(scss=True, category='row_group', type='px', value='8px'), row_group_padding_horizontal=OptionsInfo(scss=True, category='row_group', type='px', value='5px'), row_group_border_top_style=OptionsInfo(scss=True, category='row_group', type='value', value='solid'), row_group_border_top_width=OptionsInfo(scss=True, category='row_group', type='px', value='2px'), row_group_border_top_color=OptionsInfo(scss=True, category='row_group', type='value', value='#D3D3D3'), row_group_border_right_style=OptionsInfo(scss=True, category='row_group', type='value', value='none'), row_group_border_right_width=OptionsInfo(scss=True, category='row_group', type='px', value='1px'), row_group_border_right_color=OptionsInfo(scss=True, category='row_group', type='value', value='#D3D3D3'), row_group_border_bottom_style=OptionsInfo(scss=True, category='row_group', type='value', value='solid'), row_group_border_bottom_width=OptionsInfo(scss=True, category='row_group', type='px', value='2px'), row_group_border_bottom_color=OptionsInfo(scss=True, category='row_group', type='value', value='#D3D3D3'), row_group_border_left_style=OptionsInfo(scss=True, category='row_group', type='value', value='none'), row_group_border_left_width=OptionsInfo(scss=True, category='row_group', type='px', value='1px'), row_group_border_left_color=OptionsInfo(scss=True, category='row_group', type='value', value='#D3D3D3'), row_group_as_column=OptionsInfo(scss=False, category='row_group', type='boolean', value=False), table_body_hlines_style=OptionsInfo(scss=True, category='table_body', type='value', value='solid'), table_body_hlines_width=OptionsInfo(scss=True, category='table_body', type='px', value='1px'), table_body_hlines_color=OptionsInfo(scss=True, category='table_body', type='value', value='#D3D3D3'), table_body_vlines_style=OptionsInfo(scss=True, category='table_body', type='value', value='none'), table_body_vlines_width=OptionsInfo(scss=True, category='table_body', type='px', value='1px'), table_body_vlines_color=OptionsInfo(scss=True, category='table_body', type='value', value='#D3D3D3'), table_body_border_top_style=OptionsInfo(scss=True, category='table_body', type='value', value='solid'), table_body_border_top_width=OptionsInfo(scss=True, category='table_body', type='px', value='2px'), table_body_border_top_color=OptionsInfo(scss=True, category='table_body', type='value', value='#D3D3D3'), table_body_border_bottom_style=OptionsInfo(scss=True, category='table_body', type='value', value='solid'), table_body_border_bottom_width=OptionsInfo(scss=True, category='table_body', type='px', value='2px'), table_body_border_bottom_color=OptionsInfo(scss=True, category='table_body', type='value', value='#D3D3D3'), data_row_padding=OptionsInfo(scss=True, category='data_row', type='px', value='8px'), data_row_padding_horizontal=OptionsInfo(scss=True, category='data_row', type='px', value='5px'), stub_background_color=OptionsInfo(scss=True, category='stub', type='value', value=None), stub_font_size=OptionsInfo(scss=True, category='stub', type='px', value='100%'), stub_font_weight=OptionsInfo(scss=True, category='stub', type='value', value='initial'), stub_text_transform=OptionsInfo(scss=True, category='stub', type='value', value='inherit'), stub_border_style=OptionsInfo(scss=True, category='stub', type='value', value='solid'), stub_border_width=OptionsInfo(scss=True, category='stub', type='px', value='2px'), stub_border_color=OptionsInfo(scss=True, category='stub', type='value', value='#D3D3D3'), stub_indent_length=OptionsInfo(scss=True, category='stub', type='px', value='5px'), stub_row_group_background_color=OptionsInfo(scss=True, category='stub', type='value', value=None), stub_row_group_font_size=OptionsInfo(scss=True, category='stub', type='px', value='100%'), stub_row_group_font_weight=OptionsInfo(scss=True, category='stub', type='value', value='initial'), stub_row_group_text_transform=OptionsInfo(scss=True, category='stub', type='value', value='inherit'), stub_row_group_border_style=OptionsInfo(scss=True, category='stub', type='value', value='solid'), stub_row_group_border_width=OptionsInfo(scss=True, category='stub', type='px', value='2px'), stub_row_group_border_color=OptionsInfo(scss=True, category='stub', type='value', value='#D3D3D3'), summary_row_padding=OptionsInfo(scss=True, category='summary_row', type='px', value='8px'), summary_row_padding_horizontal=OptionsInfo(scss=True, category='summary_row', type='px', value='5px'), summary_row_background_color=OptionsInfo(scss=True, category='summary_row', type='value', value=None), summary_row_text_transform=OptionsInfo(scss=True, category='summary_row', type='value', value='inherit'), summary_row_border_style=OptionsInfo(scss=True, category='summary_row', type='value', value='solid'), summary_row_border_width=OptionsInfo(scss=True, category='summary_row', type='px', value='2px'), summary_row_border_color=OptionsInfo(scss=True, category='summary_row', type='value', value='#D3D3D3'), grand_summary_row_padding=OptionsInfo(scss=True, category='grand_summary_row', type='px', value='8px'), grand_summary_row_padding_horizontal=OptionsInfo(scss=True, category='grand_summary_row', type='px', value='5px'), grand_summary_row_background_color=OptionsInfo(scss=True, category='grand_summary_row', type='value', value=None), grand_summary_row_text_transform=OptionsInfo(scss=True, category='grand_summary_row', type='value', value='inherit'), grand_summary_row_border_style=OptionsInfo(scss=True, category='grand_summary_row', type='value', value='double'), grand_summary_row_border_width=OptionsInfo(scss=True, category='grand_summary_row', type='px', value='6px'), grand_summary_row_border_color=OptionsInfo(scss=True, category='grand_summary_row', type='value', value='#D3D3D3'), footnotes_marks=OptionsInfo(scss=False, category='footnotes', type='values', value='numbers'), footnotes_spec_ref=OptionsInfo(scss=False, category='footnotes', type='value', value='^i'), footnotes_spec_ftr=OptionsInfo(scss=False, category='footnotes', type='value', value='^i'), footnotes_order=OptionsInfo(scss=False, category='footnotes', type='value', value='marks_last'), source_notes_padding=OptionsInfo(scss=True, category='source_notes', type='px', value='4px'), source_notes_padding_horizontal=OptionsInfo(scss=True, category='source_notes', type='px', value='5px'), source_notes_background_color=OptionsInfo(scss=True, category='source_notes', type='value', value=None), source_notes_font_size=OptionsInfo(scss=True, category='source_notes', type='px', value='90%'), source_notes_border_bottom_style=OptionsInfo(scss=True, category='source_notes', type='value', value='none'), source_notes_border_bottom_width=OptionsInfo(scss=True, category='source_notes', type='px', value='2px'), source_notes_border_bottom_color=OptionsInfo(scss=True, category='source_notes', type='value', value='#D3D3D3'), source_notes_border_lr_style=OptionsInfo(scss=True, category='source_notes', type='value', value='none'), source_notes_border_lr_width=OptionsInfo(scss=True, category='source_notes', type='px', value='2px'), source_notes_border_lr_color=OptionsInfo(scss=True, category='source_notes', type='value', value='#D3D3D3'), source_notes_multiline=OptionsInfo(scss=False, category='source_notes', type='boolean', value=True), source_notes_sep=OptionsInfo(scss=False, category='source_notes', type='value', value=' '), row_striping_background_color=OptionsInfo(scss=True, category='row', type='value', value='#F4F4F4'), row_striping_include_stub=OptionsInfo(scss=False, category='row', type='boolean', value=False), row_striping_include_table_body=OptionsInfo(scss=False, category='row', type='boolean', value=False), container_width=OptionsInfo(scss=False, category='container', type='px', value='auto'), container_height=OptionsInfo(scss=False, category='container', type='px', value='auto'), container_padding_x=OptionsInfo(scss=False, category='container', type='px', value='0px'), container_padding_y=OptionsInfo(scss=False, category='container', type='px', value='10px'), container_overflow_x=OptionsInfo(scss=False, category='container', type='overflow', value='auto'), container_overflow_y=OptionsInfo(scss=False, category='container', type='overflow', value='auto'), quarto_disable_processing=OptionsInfo(scss=False, category='quarto', type='logical', value=False), quarto_use_bootstrap=OptionsInfo(scss=False, category='quarto', type='logical', value=False), ihtml_active=OptionsInfo(scss=False, category='ihtml', type='boolean', value=False), ihtml_use_pagination=OptionsInfo(scss=False, category='ihtml', type='boolean', value=True), ihtml_use_pagination_info=OptionsInfo(scss=False, category='ihtml', type='boolean', value=True), ihtml_use_sorting=OptionsInfo(scss=False, category='ihtml', type='boolean', value=True), ihtml_use_search=OptionsInfo(scss=False, category='ihtml', type='boolean', value=False), ihtml_use_filters=OptionsInfo(scss=False, category='ihtml', type='boolean', value=False), ihtml_use_resizers=OptionsInfo(scss=False, category='ihtml', type='boolean', value=False), ihtml_use_highlight=OptionsInfo(scss=False, category='ihtml', type='boolean', value=False), ihtml_use_compact_mode=OptionsInfo(scss=False, category='ihtml', type='boolean', value=False), ihtml_use_text_wrapping=OptionsInfo(scss=False, category='ihtml', type='boolean', value=True), ihtml_use_page_size_select=OptionsInfo(scss=False, category='ihtml', type='boolean', value=False), ihtml_page_size_default=OptionsInfo(scss=False, category='ihtml', type='value', value=10), ihtml_page_size_values=OptionsInfo(scss=False, category='ihtml', type='values', value=[10, 25, 50, 100]), ihtml_pagination_type=OptionsInfo(scss=False, category='ihtml', type='value', value='numbers'), ihtml_height=OptionsInfo(scss=False, category='ihtml', type='value', value='auto'), ihtml_selection_mode=OptionsInfo(scss=False, category='ihtml', type='value', value=None)), _google_font_imports=GoogleFontImports(imports=frozenset()), _has_built=False)</w:t>
       </w:r>
     </w:p>
     <w:bookmarkEnd w:id="19"/>
@@ -1922,7 +1671,7 @@
         <w:t xml:space="preserve"> </w:t>
       </w:r>
       <w:r>
-        <w:t xml:space="preserve">A diferencia de los modelos con distribución uniforme plana (~0.14) del prototipo web de Netlify, la matriz diseñada incorpora polaridad armónica. Cada fila representa la distribución condicional</w:t>
+        <w:t xml:space="preserve">Cada fila representa la distribución condicional</w:t>
       </w:r>
       <w:r>
         <w:t xml:space="preserve"> </w:t>
@@ -2009,9 +1758,9 @@
       <w:pPr>
         <w:pStyle w:val="Heading3"/>
       </w:pPr>
-      <w:bookmarkStart w:id="21" w:name="_aaeeb9229a0a4f58900f8e0a3fe254801ab3824"/>
-      <w:r>
-        <w:t xml:space="preserve">2.3. Mapa de calor y dinámica de probabilidades</w:t>
+      <w:bookmarkStart w:id="21" w:name="_5ac6bd87b6727f618991432b90214ddc54ef914"/>
+      <w:r>
+        <w:t xml:space="preserve">2.3. Mapa de calor</w:t>
       </w:r>
       <w:bookmarkEnd w:id="21"/>
     </w:p>
@@ -2020,7 +1769,7 @@
         <w:pStyle w:val="FirstParagraph"/>
       </w:pPr>
       <w:r>
-        <w:t xml:space="preserve">La siguiente figura ilustra visualmente la densidad de transición. Las intensidades más oscuras reflejan las resoluciones armónicas más fuertes (como la sensible C#5 hacia la tónica D4 con 0.70, y la dominante A4 hacia la tónica D4 con 0.50):</w:t>
+        <w:t xml:space="preserve">La siguiente figura ilustra visualmente la densidad de transición. Las celdas más oscuras indican las resoluciones armónicas predominantes (sensible C#5 a tónica D4 con 0.70, y dominante A4 a tónica D4 con 0.50):</w:t>
       </w:r>
     </w:p>
     <w:p>
@@ -2101,16 +1850,16 @@
         <w:t xml:space="preserve"> </w:t>
       </w:r>
       <w:r>
-        <w:t xml:space="preserve">El mapa de calor ilustra que la tónica actúa como sumidero probabilístico natural del sistema, atrayendo fuertemente tanto al quinto grado dominante como al séptimo grado sensible.</w:t>
+        <w:t xml:space="preserve">La tónica actúa como sumidero probabilístico natural del sistema, atrayendo al quinto grado dominante y al séptimo grado sensible.</w:t>
       </w:r>
     </w:p>
     <w:p>
       <w:pPr>
         <w:pStyle w:val="Heading3"/>
       </w:pPr>
-      <w:bookmarkStart w:id="27" w:name="_d50275b72ca303dc49487fd5a0f4bb22520e069"/>
-      <w:r>
-        <w:t xml:space="preserve">2.4. Evolución temporal y distribución estacionaria</w:t>
+      <w:bookmarkStart w:id="27" w:name="_2ec81dadd495637855ba4c8806a36732e816dad"/>
+      <w:r>
+        <w:t xml:space="preserve">2.4. Distribución estacionaria</w:t>
       </w:r>
       <w:bookmarkEnd w:id="27"/>
     </w:p>
@@ -2119,7 +1868,7 @@
         <w:pStyle w:val="FirstParagraph"/>
       </w:pPr>
       <w:r>
-        <w:t xml:space="preserve">Conforme a las ecuaciones de Chapman Kolmogorov vistas en clase, la distribución de probabilidad tras</w:t>
+        <w:t xml:space="preserve">Según las ecuaciones de Chapman Kolmogorov, la distribución tras</w:t>
       </w:r>
       <w:r>
         <w:t xml:space="preserve"> </w:t>
@@ -2133,7 +1882,7 @@
         <w:t xml:space="preserve"> </w:t>
       </w:r>
       <w:r>
-        <w:t xml:space="preserve">transiciones se obtiene mediante potencias de la matriz estocástica:</w:t>
+        <w:t xml:space="preserve">transiciones se obtiene mediante potencias matriciales:</w:t>
       </w:r>
     </w:p>
     <w:p>
@@ -2225,17 +1974,7 @@
         <w:pStyle w:val="FirstParagraph"/>
       </w:pPr>
       <w:r>
-        <w:t xml:space="preserve">Como se demostró en el ejercicio del lenguaje de 3 palabras de Rodrigo Castellanos ("él", "gato", "duerme") presentado en clase, al simular 100 textos iniciales la distribución evoluciona en cada paso y se estabiliza tras aproximadamente 20 transiciones. Esta distribución límite es la</w:t>
-      </w:r>
-      <w:r>
-        <w:t xml:space="preserve"> </w:t>
-      </w:r>
-      <w:r>
-        <w:rPr>
-          <w:b/>
-          <w:bCs/>
-        </w:rPr>
-        <w:t xml:space="preserve">distribución estacionaria</w:t>
+        <w:t xml:space="preserve">En el modelo de tres palabras presentado por Rodrigo Castellanos en clase ("él", "gato", "duerme"), la distribución evoluciona en cada paso y se estabiliza cerca de 20 transiciones. Esta distribución límite</w:t>
       </w:r>
       <w:r>
         <w:t xml:space="preserve"> </w:t>
@@ -2258,7 +1997,10 @@
         </m:sSup>
       </m:oMath>
       <w:r>
-        <w:t xml:space="preserve">, que satisface el sistema invariante:</w:t>
+        <w:t xml:space="preserve"> </w:t>
+      </w:r>
+      <w:r>
+        <w:t xml:space="preserve">satisface:</w:t>
       </w:r>
     </w:p>
     <w:p>
@@ -2385,99 +2127,7 @@
         <w:pStyle w:val="FirstParagraph"/>
       </w:pPr>
       <w:r>
-        <w:t xml:space="preserve">Este principio es precisamente la base matemática del algoritmo</w:t>
-      </w:r>
-      <w:r>
-        <w:t xml:space="preserve"> </w:t>
-      </w:r>
-      <w:r>
-        <w:rPr>
-          <w:b/>
-          <w:bCs/>
-        </w:rPr>
-        <w:t xml:space="preserve">PageRank</w:t>
-      </w:r>
-      <w:r>
-        <w:t xml:space="preserve"> </w:t>
-      </w:r>
-      <w:r>
-        <w:t xml:space="preserve">de Larry Page en Google, donde la importancia de una página web se determina mediante la probabilidad estacionaria de un caminante aleatorio en el grafo de hipervínculos.</w:t>
-      </w:r>
-    </w:p>
-    <w:p>
-      <w:pPr>
-        <w:pStyle w:val="BodyText"/>
-      </w:pPr>
-      <w:r>
-        <w:t xml:space="preserve">Resolviendo el sistema</w:t>
-      </w:r>
-      <w:r>
-        <w:t xml:space="preserve"> </w:t>
-      </w:r>
-      <m:oMath>
-        <m:r>
-          <m:rPr>
-            <m:sty m:val="p"/>
-          </m:rPr>
-          <m:t>(</m:t>
-        </m:r>
-        <m:sSup>
-          <m:e>
-            <m:r>
-              <m:t>P</m:t>
-            </m:r>
-          </m:e>
-          <m:sup>
-            <m:r>
-              <m:t>T</m:t>
-            </m:r>
-          </m:sup>
-        </m:sSup>
-        <m:r>
-          <m:rPr>
-            <m:sty m:val="p"/>
-          </m:rPr>
-          <m:t>−</m:t>
-        </m:r>
-        <m:r>
-          <m:t>I</m:t>
-        </m:r>
-        <m:r>
-          <m:rPr>
-            <m:sty m:val="p"/>
-          </m:rPr>
-          <m:t>)</m:t>
-        </m:r>
-        <m:sSup>
-          <m:e>
-            <m:r>
-              <m:t>π</m:t>
-            </m:r>
-          </m:e>
-          <m:sup>
-            <m:r>
-              <m:rPr>
-                <m:sty m:val="p"/>
-              </m:rPr>
-              <m:t>*</m:t>
-            </m:r>
-            <m:r>
-              <m:t>T</m:t>
-            </m:r>
-          </m:sup>
-        </m:sSup>
-        <m:r>
-          <m:rPr>
-            <m:sty m:val="p"/>
-          </m:rPr>
-          <m:t>=</m:t>
-        </m:r>
-        <m:r>
-          <m:t>0</m:t>
-        </m:r>
-      </m:oMath>
-      <w:r>
-        <w:t xml:space="preserve">:</w:t>
+        <w:t xml:space="preserve">Este principio sustenta el algoritmo PageRank de Larry Page en Google, modelando la navegación web como una caminata aleatoria.</w:t>
       </w:r>
     </w:p>
     <w:p>
@@ -2565,7 +2215,7 @@
         <w:rPr>
           <w:rStyle w:val="VerbatimChar"/>
         </w:rPr>
-        <w:t xml:space="preserve">6  C#5    vii° (Sensible)              0.0437      4.37%, _body=&lt;great_tables._gt_data.Body object at 0xf8d8b039c410&gt;, _boxhead=Boxhead([ColInfo(var='Nota', type=&lt;ColInfoTypeEnum.default: 1&gt;, column_label='Nota', column_align='left', column_width=None, stub_level=None), ColInfo(var='Grado', type=&lt;ColInfoTypeEnum.default: 1&gt;, column_label='Grado', column_align='left', column_width=None, stub_level=None), ColInfo(var='Probabilidad límite', type=&lt;ColInfoTypeEnum.default: 1&gt;, column_label='Probabilidad límite', column_align='right', column_width=None, stub_level=None), ColInfo(var='Porcentaje', type=&lt;ColInfoTypeEnum.default: 1&gt;, column_label='Porcentaje', column_align='right', column_width=None, stub_level=None)]), _stub=&lt;great_tables._gt_data.Stub object at 0xf8d8b06d6650&gt;, _spanners=Spanners([]), _heading=Heading(title='Distribución Estacionaria Asintótica', subtitle=None, preheader=None), _stubhead=None, _summary_rows=&lt;great_tables._gt_data.SummaryRows object at 0xf8d8b03098c0&gt;, _summary_rows_grand=&lt;great_tables._gt_data.SummaryRows object at 0xf8d8b03099d0&gt;, _source_notes=[], _footnotes=[], _styles=[], _locale=&lt;great_tables._gt_data.Locale object at 0xf8d8b06d6c40&gt;, _formats=[], _substitutions=[], _col_merge=[], _transforms=[], _options=Options(table_id=OptionsInfo(scss=False, category='table', type='value', value=None), table_caption=OptionsInfo(scss=False, category='table', type='value', value=None), table_width=OptionsInfo(scss=True, category='table', type='px', value='auto'), table_layout=OptionsInfo(scss=True, category='table', type='value', value='fixed'), table_margin_left=OptionsInfo(scss=True, category='table', type='px', value='auto'), table_margin_right=OptionsInfo(scss=True, category='table', type='px', value='auto'), table_background_color=OptionsInfo(scss=True, category='table', type='value', value='#FFFFFF'), table_additional_css=OptionsInfo(scss=False, category='table', type='values', value=[]), table_font_names=OptionsInfo(scss=False, category='table', type='values', value=['-apple-system', 'BlinkMacSystemFont', 'Segoe UI', 'Roboto', 'Oxygen', 'Ubuntu', 'Cantarell', 'Helvetica Neue', 'Fira Sans', 'Droid Sans', 'Arial', 'sans-serif']), table_font_size=OptionsInfo(scss=True, category='table', type='px', value='16px'), table_font_weight=OptionsInfo(scss=True, category='table', type='value', value='normal'), table_font_style=OptionsInfo(scss=True, category='table', type='value', value='normal'), table_font_color=OptionsInfo(scss=True, category='table', type='value', value='#333333'), table_font_color_light=OptionsInfo(scss=True, category='table', type='value', value='#FFFFFF'), table_border_top_include=OptionsInfo(scss=False, category='table', type='boolean', value=True), table_border_top_style=OptionsInfo(scss=True, category='table', type='value', value='solid'), table_border_top_width=OptionsInfo(scss=True, category='table', type='px', value='2px'), table_border_top_color=OptionsInfo(scss=True, category='table', type='value', value='#A8A8A8'), table_border_right_style=OptionsInfo(scss=True, category='table', type='value', value='none'), table_border_right_width=OptionsInfo(scss=True, category='table', type='px', value='2px'), table_border_right_color=OptionsInfo(scss=True, category='table', type='value', value='#D3D3D3'), table_border_bottom_include=OptionsInfo(scss=False, category='table', type='boolean', value=True), table_border_bottom_style=OptionsInfo(scss=True, category='table', type='value', value='solid'), table_border_bottom_width=OptionsInfo(scss=True, category='table', type='px', value='2px'), table_border_bottom_color=OptionsInfo(scss=True, category='table', type='value', value='#A8A8A8'), table_border_left_style=OptionsInfo(scss=True, category='table', type='value', value='none'), table_border_left_width=OptionsInfo(scss=True, category='table', type='px', value='2px'), table_border_left_color=OptionsInfo(scss=True, category='table', type='value', value='#D3D3D3'), heading_background_color=OptionsInfo(scss=True, category='heading', type='value', value=None), heading_align=OptionsInfo(scss=True, category='heading', type='value', value='center'), heading_title_font_size=OptionsInfo(scss=True, category='heading', type='px', value='125%'), heading_title_font_weight=OptionsInfo(scss=True, category='heading', type='value', value='initial'), heading_subtitle_font_size=OptionsInfo(scss=True, category='heading', type='px', value='85%'), heading_subtitle_font_weight=OptionsInfo(scss=True, category='heading', type='value', value='initial'), heading_padding=OptionsInfo(scss=True, category='heading', type='px', value='4px'), heading_padding_horizontal=OptionsInfo(scss=True, category='heading', type='px', value='5px'), heading_border_bottom_style=OptionsInfo(scss=True, category='heading', type='value', value='solid'), heading_border_bottom_width=OptionsInfo(scss=True, category='heading', type='px', value='2px'), heading_border_bottom_color=OptionsInfo(scss=True, category='heading', type='value', value='#D3D3D3'), heading_border_lr_style=OptionsInfo(scss=True, category='heading', type='value', value='none'), heading_border_lr_width=OptionsInfo(scss=True, category='heading', type='px', value='1px'), heading_border_lr_color=OptionsInfo(scss=True, category='heading', type='value', value='#D3D3D3'), column_labels_background_color=OptionsInfo(scss=True, category='column_labels', type='value', value=None), column_labels_font_size=OptionsInfo(scss=True, category='column_labels', type='px', value='100%'), column_labels_font_weight=OptionsInfo(scss=True, category='column_labels', type='value', value='normal'), column_labels_text_transform=OptionsInfo(scss=True, category='column_labels', type='value', value='inherit'), column_labels_padding=OptionsInfo(scss=True, category='column_labels', type='px', value='5px'), column_labels_padding_horizontal=OptionsInfo(scss=True, category='column_labels', type='px', value='5px'), column_labels_vlines_style=OptionsInfo(scss=True, category='table_body', type='value', value='none'), column_labels_vlines_width=OptionsInfo(scss=True, category='table_body', type='px', value='1px'), column_labels_vlines_color=OptionsInfo(scss=True, category='table_body', type='value', value='#D3D3D3'), column_labels_border_top_style=OptionsInfo(scss=True, category='column_labels', type='value', value='solid'), column_labels_border_top_width=OptionsInfo(scss=True, category='column_labels', type='px', value='2px'), column_labels_border_top_color=OptionsInfo(scss=True, category='column_labels', type='value', value='#D3D3D3'), column_labels_border_bottom_style=OptionsInfo(scss=True, category='column_labels', type='value', value='solid'), column_labels_border_bottom_width=OptionsInfo(scss=True, category='column_labels', type='px', value='2px'), column_labels_border_bottom_color=OptionsInfo(scss=True, category='column_labels', type='value', value='#D3D3D3'), column_labels_border_lr_style=OptionsInfo(scss=True, category='column_labels', type='value', value='none'), column_labels_border_lr_width=OptionsInfo(scss=True, category='column_labels', type='px', value='1px'), column_labels_border_lr_color=OptionsInfo(scss=True, category='column_labels', type='value', value='#D3D3D3'), column_labels_hidden=OptionsInfo(scss=False, category='column_labels', type='boolean', value=False), row_group_background_color=OptionsInfo(scss=True, category='row_group', type='value', value=None), row_group_font_size=OptionsInfo(scss=True, category='row_group', type='px', value='100%'), row_group_font_weight=OptionsInfo(scss=True, category='row_group', type='value', value='initial'), row_group_text_transform=OptionsInfo(scss=True, category='row_group', type='value', value='inherit'), row_group_padding=OptionsInfo(scss=True, category='row_group', type='px', value='8px'), row_group_padding_horizontal=OptionsInfo(scss=True, category='row_group', type='px', value='5px'), row_group_border_top_style=OptionsInfo(scss=True, category='row_group', type='value', value='solid'), row_group_border_top_width=OptionsInfo(scss=True, category='row_group', type='px', value='2px'), row_group_border_top_color=OptionsInfo(scss=True, category='row_group', type='value', value='#D3D3D3'), row_group_border_right_style=OptionsInfo(scss=True, category='row_group', type='value', value='none'), row_group_border_right_width=OptionsInfo(scss=True, category='row_group', type='px', value='1px'), row_group_border_right_color=OptionsInfo(scss=True, category='row_group', type='value', value='#D3D3D3'), row_group_border_bottom_style=OptionsInfo(scss=True, category='row_group', type='value', value='solid'), row_group_border_bottom_width=OptionsInfo(scss=True, category='row_group', type='px', value='2px'), row_group_border_bottom_color=OptionsInfo(scss=True, category='row_group', type='value', value='#D3D3D3'), row_group_border_left_style=OptionsInfo(scss=True, category='row_group', type='value', value='none'), row_group_border_left_width=OptionsInfo(scss=True, category='row_group', type='px', value='1px'), row_group_border_left_color=OptionsInfo(scss=True, category='row_group', type='value', value='#D3D3D3'), row_group_as_column=OptionsInfo(scss=False, category='row_group', type='boolean', value=False), table_body_hlines_style=OptionsInfo(scss=True, category='table_body', type='value', value='solid'), table_body_hlines_width=OptionsInfo(scss=True, category='table_body', type='px', value='1px'), table_body_hlines_color=OptionsInfo(scss=True, category='table_body', type='value', value='#D3D3D3'), table_body_vlines_style=OptionsInfo(scss=True, category='table_body', type='value', value='none'), table_body_vlines_width=OptionsInfo(scss=True, category='table_body', type='px', value='1px'), table_body_vlines_color=OptionsInfo(scss=True, category='table_body', type='value', value='#D3D3D3'), table_body_border_top_style=OptionsInfo(scss=True, category='table_body', type='value', value='solid'), table_body_border_top_width=OptionsInfo(scss=True, category='table_body', type='px', value='2px'), table_body_border_top_color=OptionsInfo(scss=True, category='table_body', type='value', value='#D3D3D3'), table_body_border_bottom_style=OptionsInfo(scss=True, category='table_body', type='value', value='solid'), table_body_border_bottom_width=OptionsInfo(scss=True, category='table_body', type='px', value='2px'), table_body_border_bottom_color=OptionsInfo(scss=True, category='table_body', type='value', value='#D3D3D3'), data_row_padding=OptionsInfo(scss=True, category='data_row', type='px', value='8px'), data_row_padding_horizontal=OptionsInfo(scss=True, category='data_row', type='px', value='5px'), stub_background_color=OptionsInfo(scss=True, category='stub', type='value', value=None), stub_font_size=OptionsInfo(scss=True, category='stub', type='px', value='100%'), stub_font_weight=OptionsInfo(scss=True, category='stub', type='value', value='initial'), stub_text_transform=OptionsInfo(scss=True, category='stub', type='value', value='inherit'), stub_border_style=OptionsInfo(scss=True, category='stub', type='value', value='solid'), stub_border_width=OptionsInfo(scss=True, category='stub', type='px', value='2px'), stub_border_color=OptionsInfo(scss=True, category='stub', type='value', value='#D3D3D3'), stub_indent_length=OptionsInfo(scss=True, category='stub', type='px', value='5px'), stub_row_group_background_color=OptionsInfo(scss=True, category='stub', type='value', value=None), stub_row_group_font_size=OptionsInfo(scss=True, category='stub', type='px', value='100%'), stub_row_group_font_weight=OptionsInfo(scss=True, category='stub', type='value', value='initial'), stub_row_group_text_transform=OptionsInfo(scss=True, category='stub', type='value', value='inherit'), stub_row_group_border_style=OptionsInfo(scss=True, category='stub', type='value', value='solid'), stub_row_group_border_width=OptionsInfo(scss=True, category='stub', type='px', value='2px'), stub_row_group_border_color=OptionsInfo(scss=True, category='stub', type='value', value='#D3D3D3'), summary_row_padding=OptionsInfo(scss=True, category='summary_row', type='px', value='8px'), summary_row_padding_horizontal=OptionsInfo(scss=True, category='summary_row', type='px', value='5px'), summary_row_background_color=OptionsInfo(scss=True, category='summary_row', type='value', value=None), summary_row_text_transform=OptionsInfo(scss=True, category='summary_row', type='value', value='inherit'), summary_row_border_style=OptionsInfo(scss=True, category='summary_row', type='value', value='solid'), summary_row_border_width=OptionsInfo(scss=True, category='summary_row', type='px', value='2px'), summary_row_border_color=OptionsInfo(scss=True, category='summary_row', type='value', value='#D3D3D3'), grand_summary_row_padding=OptionsInfo(scss=True, category='grand_summary_row', type='px', value='8px'), grand_summary_row_padding_horizontal=OptionsInfo(scss=True, category='grand_summary_row', type='px', value='5px'), grand_summary_row_background_color=OptionsInfo(scss=True, category='grand_summary_row', type='value', value=None), grand_summary_row_text_transform=OptionsInfo(scss=True, category='grand_summary_row', type='value', value='inherit'), grand_summary_row_border_style=OptionsInfo(scss=True, category='grand_summary_row', type='value', value='double'), grand_summary_row_border_width=OptionsInfo(scss=True, category='grand_summary_row', type='px', value='6px'), grand_summary_row_border_color=OptionsInfo(scss=True, category='grand_summary_row', type='value', value='#D3D3D3'), footnotes_marks=OptionsInfo(scss=False, category='footnotes', type='values', value='numbers'), footnotes_spec_ref=OptionsInfo(scss=False, category='footnotes', type='value', value='^i'), footnotes_spec_ftr=OptionsInfo(scss=False, category='footnotes', type='value', value='^i'), footnotes_order=OptionsInfo(scss=False, category='footnotes', type='value', value='marks_last'), source_notes_padding=OptionsInfo(scss=True, category='source_notes', type='px', value='4px'), source_notes_padding_horizontal=OptionsInfo(scss=True, category='source_notes', type='px', value='5px'), source_notes_background_color=OptionsInfo(scss=True, category='source_notes', type='value', value=None), source_notes_font_size=OptionsInfo(scss=True, category='source_notes', type='px', value='90%'), source_notes_border_bottom_style=OptionsInfo(scss=True, category='source_notes', type='value', value='none'), source_notes_border_bottom_width=OptionsInfo(scss=True, category='source_notes', type='px', value='2px'), source_notes_border_bottom_color=OptionsInfo(scss=True, category='source_notes', type='value', value='#D3D3D3'), source_notes_border_lr_style=OptionsInfo(scss=True, category='source_notes', type='value', value='none'), source_notes_border_lr_width=OptionsInfo(scss=True, category='source_notes', type='px', value='2px'), source_notes_border_lr_color=OptionsInfo(scss=True, category='source_notes', type='value', value='#D3D3D3'), source_notes_multiline=OptionsInfo(scss=False, category='source_notes', type='boolean', value=True), source_notes_sep=OptionsInfo(scss=False, category='source_notes', type='value', value=' '), row_striping_background_color=OptionsInfo(scss=True, category='row', type='value', value='#F4F4F4'), row_striping_include_stub=OptionsInfo(scss=False, category='row', type='boolean', value=False), row_striping_include_table_body=OptionsInfo(scss=False, category='row', type='boolean', value=False), container_width=OptionsInfo(scss=False, category='container', type='px', value='auto'), container_height=OptionsInfo(scss=False, category='container', type='px', value='auto'), container_padding_x=OptionsInfo(scss=False, category='container', type='px', value='0px'), container_padding_y=OptionsInfo(scss=False, category='container', type='px', value='10px'), container_overflow_x=OptionsInfo(scss=False, category='container', type='overflow', value='auto'), container_overflow_y=OptionsInfo(scss=False, category='container', type='overflow', value='auto'), quarto_disable_processing=OptionsInfo(scss=False, category='quarto', type='logical', value=False), quarto_use_bootstrap=OptionsInfo(scss=False, category='quarto', type='logical', value=False), ihtml_active=OptionsInfo(scss=False, category='ihtml', type='boolean', value=False), ihtml_use_pagination=OptionsInfo(scss=False, category='ihtml', type='boolean', value=True), ihtml_use_pagination_info=OptionsInfo(scss=False, category='ihtml', type='boolean', value=True), ihtml_use_sorting=OptionsInfo(scss=False, category='ihtml', type='boolean', value=True), ihtml_use_search=OptionsInfo(scss=False, category='ihtml', type='boolean', value=False), ihtml_use_filters=OptionsInfo(scss=False, category='ihtml', type='boolean', value=False), ihtml_use_resizers=OptionsInfo(scss=False, category='ihtml', type='boolean', value=False), ihtml_use_highlight=OptionsInfo(scss=False, category='ihtml', type='boolean', value=False), ihtml_use_compact_mode=OptionsInfo(scss=False, category='ihtml', type='boolean', value=False), ihtml_use_text_wrapping=OptionsInfo(scss=False, category='ihtml', type='boolean', value=True), ihtml_use_page_size_select=OptionsInfo(scss=False, category='ihtml', type='boolean', value=False), ihtml_page_size_default=OptionsInfo(scss=False, category='ihtml', type='value', value=10), ihtml_page_size_values=OptionsInfo(scss=False, category='ihtml', type='values', value=[10, 25, 50, 100]), ihtml_pagination_type=OptionsInfo(scss=False, category='ihtml', type='value', value='numbers'), ihtml_height=OptionsInfo(scss=False, category='ihtml', type='value', value='auto'), ihtml_selection_mode=OptionsInfo(scss=False, category='ihtml', type='value', value=None)), _google_font_imports=GoogleFontImports(imports=frozenset()), _has_built=False)</w:t>
+        <w:t xml:space="preserve">6  C#5    vii° (Sensible)              0.0437      4.37%, _body=&lt;great_tables._gt_data.Body object at 0xeba88a2bc410&gt;, _boxhead=Boxhead([ColInfo(var='Nota', type=&lt;ColInfoTypeEnum.default: 1&gt;, column_label='Nota', column_align='left', column_width=None, stub_level=None), ColInfo(var='Grado', type=&lt;ColInfoTypeEnum.default: 1&gt;, column_label='Grado', column_align='left', column_width=None, stub_level=None), ColInfo(var='Probabilidad límite', type=&lt;ColInfoTypeEnum.default: 1&gt;, column_label='Probabilidad límite', column_align='right', column_width=None, stub_level=None), ColInfo(var='Porcentaje', type=&lt;ColInfoTypeEnum.default: 1&gt;, column_label='Porcentaje', column_align='right', column_width=None, stub_level=None)]), _stub=&lt;great_tables._gt_data.Stub object at 0xeba88a7f2650&gt;, _spanners=Spanners([]), _heading=Heading(title='Distribución Estacionaria Asintótica', subtitle=None, preheader=None), _stubhead=None, _summary_rows=&lt;great_tables._gt_data.SummaryRows object at 0xeba88a4258c0&gt;, _summary_rows_grand=&lt;great_tables._gt_data.SummaryRows object at 0xeba88a4259d0&gt;, _source_notes=[], _footnotes=[], _styles=[], _locale=&lt;great_tables._gt_data.Locale object at 0xeba88a7f2c40&gt;, _formats=[], _substitutions=[], _col_merge=[], _transforms=[], _options=Options(table_id=OptionsInfo(scss=False, category='table', type='value', value=None), table_caption=OptionsInfo(scss=False, category='table', type='value', value=None), table_width=OptionsInfo(scss=True, category='table', type='px', value='auto'), table_layout=OptionsInfo(scss=True, category='table', type='value', value='fixed'), table_margin_left=OptionsInfo(scss=True, category='table', type='px', value='auto'), table_margin_right=OptionsInfo(scss=True, category='table', type='px', value='auto'), table_background_color=OptionsInfo(scss=True, category='table', type='value', value='#FFFFFF'), table_additional_css=OptionsInfo(scss=False, category='table', type='values', value=[]), table_font_names=OptionsInfo(scss=False, category='table', type='values', value=['-apple-system', 'BlinkMacSystemFont', 'Segoe UI', 'Roboto', 'Oxygen', 'Ubuntu', 'Cantarell', 'Helvetica Neue', 'Fira Sans', 'Droid Sans', 'Arial', 'sans-serif']), table_font_size=OptionsInfo(scss=True, category='table', type='px', value='16px'), table_font_weight=OptionsInfo(scss=True, category='table', type='value', value='normal'), table_font_style=OptionsInfo(scss=True, category='table', type='value', value='normal'), table_font_color=OptionsInfo(scss=True, category='table', type='value', value='#333333'), table_font_color_light=OptionsInfo(scss=True, category='table', type='value', value='#FFFFFF'), table_border_top_include=OptionsInfo(scss=False, category='table', type='boolean', value=True), table_border_top_style=OptionsInfo(scss=True, category='table', type='value', value='solid'), table_border_top_width=OptionsInfo(scss=True, category='table', type='px', value='2px'), table_border_top_color=OptionsInfo(scss=True, category='table', type='value', value='#A8A8A8'), table_border_right_style=OptionsInfo(scss=True, category='table', type='value', value='none'), table_border_right_width=OptionsInfo(scss=True, category='table', type='px', value='2px'), table_border_right_color=OptionsInfo(scss=True, category='table', type='value', value='#D3D3D3'), table_border_bottom_include=OptionsInfo(scss=False, category='table', type='boolean', value=True), table_border_bottom_style=OptionsInfo(scss=True, category='table', type='value', value='solid'), table_border_bottom_width=OptionsInfo(scss=True, category='table', type='px', value='2px'), table_border_bottom_color=OptionsInfo(scss=True, category='table', type='value', value='#A8A8A8'), table_border_left_style=OptionsInfo(scss=True, category='table', type='value', value='none'), table_border_left_width=OptionsInfo(scss=True, category='table', type='px', value='2px'), table_border_left_color=OptionsInfo(scss=True, category='table', type='value', value='#D3D3D3'), heading_background_color=OptionsInfo(scss=True, category='heading', type='value', value=None), heading_align=OptionsInfo(scss=True, category='heading', type='value', value='center'), heading_title_font_size=OptionsInfo(scss=True, category='heading', type='px', value='125%'), heading_title_font_weight=OptionsInfo(scss=True, category='heading', type='value', value='initial'), heading_subtitle_font_size=OptionsInfo(scss=True, category='heading', type='px', value='85%'), heading_subtitle_font_weight=OptionsInfo(scss=True, category='heading', type='value', value='initial'), heading_padding=OptionsInfo(scss=True, category='heading', type='px', value='4px'), heading_padding_horizontal=OptionsInfo(scss=True, category='heading', type='px', value='5px'), heading_border_bottom_style=OptionsInfo(scss=True, category='heading', type='value', value='solid'), heading_border_bottom_width=OptionsInfo(scss=True, category='heading', type='px', value='2px'), heading_border_bottom_color=OptionsInfo(scss=True, category='heading', type='value', value='#D3D3D3'), heading_border_lr_style=OptionsInfo(scss=True, category='heading', type='value', value='none'), heading_border_lr_width=OptionsInfo(scss=True, category='heading', type='px', value='1px'), heading_border_lr_color=OptionsInfo(scss=True, category='heading', type='value', value='#D3D3D3'), column_labels_background_color=OptionsInfo(scss=True, category='column_labels', type='value', value=None), column_labels_font_size=OptionsInfo(scss=True, category='column_labels', type='px', value='100%'), column_labels_font_weight=OptionsInfo(scss=True, category='column_labels', type='value', value='normal'), column_labels_text_transform=OptionsInfo(scss=True, category='column_labels', type='value', value='inherit'), column_labels_padding=OptionsInfo(scss=True, category='column_labels', type='px', value='5px'), column_labels_padding_horizontal=OptionsInfo(scss=True, category='column_labels', type='px', value='5px'), column_labels_vlines_style=OptionsInfo(scss=True, category='table_body', type='value', value='none'), column_labels_vlines_width=OptionsInfo(scss=True, category='table_body', type='px', value='1px'), column_labels_vlines_color=OptionsInfo(scss=True, category='table_body', type='value', value='#D3D3D3'), column_labels_border_top_style=OptionsInfo(scss=True, category='column_labels', type='value', value='solid'), column_labels_border_top_width=OptionsInfo(scss=True, category='column_labels', type='px', value='2px'), column_labels_border_top_color=OptionsInfo(scss=True, category='column_labels', type='value', value='#D3D3D3'), column_labels_border_bottom_style=OptionsInfo(scss=True, category='column_labels', type='value', value='solid'), column_labels_border_bottom_width=OptionsInfo(scss=True, category='column_labels', type='px', value='2px'), column_labels_border_bottom_color=OptionsInfo(scss=True, category='column_labels', type='value', value='#D3D3D3'), column_labels_border_lr_style=OptionsInfo(scss=True, category='column_labels', type='value', value='none'), column_labels_border_lr_width=OptionsInfo(scss=True, category='column_labels', type='px', value='1px'), column_labels_border_lr_color=OptionsInfo(scss=True, category='column_labels', type='value', value='#D3D3D3'), column_labels_hidden=OptionsInfo(scss=False, category='column_labels', type='boolean', value=False), row_group_background_color=OptionsInfo(scss=True, category='row_group', type='value', value=None), row_group_font_size=OptionsInfo(scss=True, category='row_group', type='px', value='100%'), row_group_font_weight=OptionsInfo(scss=True, category='row_group', type='value', value='initial'), row_group_text_transform=OptionsInfo(scss=True, category='row_group', type='value', value='inherit'), row_group_padding=OptionsInfo(scss=True, category='row_group', type='px', value='8px'), row_group_padding_horizontal=OptionsInfo(scss=True, category='row_group', type='px', value='5px'), row_group_border_top_style=OptionsInfo(scss=True, category='row_group', type='value', value='solid'), row_group_border_top_width=OptionsInfo(scss=True, category='row_group', type='px', value='2px'), row_group_border_top_color=OptionsInfo(scss=True, category='row_group', type='value', value='#D3D3D3'), row_group_border_right_style=OptionsInfo(scss=True, category='row_group', type='value', value='none'), row_group_border_right_width=OptionsInfo(scss=True, category='row_group', type='px', value='1px'), row_group_border_right_color=OptionsInfo(scss=True, category='row_group', type='value', value='#D3D3D3'), row_group_border_bottom_style=OptionsInfo(scss=True, category='row_group', type='value', value='solid'), row_group_border_bottom_width=OptionsInfo(scss=True, category='row_group', type='px', value='2px'), row_group_border_bottom_color=OptionsInfo(scss=True, category='row_group', type='value', value='#D3D3D3'), row_group_border_left_style=OptionsInfo(scss=True, category='row_group', type='value', value='none'), row_group_border_left_width=OptionsInfo(scss=True, category='row_group', type='px', value='1px'), row_group_border_left_color=OptionsInfo(scss=True, category='row_group', type='value', value='#D3D3D3'), row_group_as_column=OptionsInfo(scss=False, category='row_group', type='boolean', value=False), table_body_hlines_style=OptionsInfo(scss=True, category='table_body', type='value', value='solid'), table_body_hlines_width=OptionsInfo(scss=True, category='table_body', type='px', value='1px'), table_body_hlines_color=OptionsInfo(scss=True, category='table_body', type='value', value='#D3D3D3'), table_body_vlines_style=OptionsInfo(scss=True, category='table_body', type='value', value='none'), table_body_vlines_width=OptionsInfo(scss=True, category='table_body', type='px', value='1px'), table_body_vlines_color=OptionsInfo(scss=True, category='table_body', type='value', value='#D3D3D3'), table_body_border_top_style=OptionsInfo(scss=True, category='table_body', type='value', value='solid'), table_body_border_top_width=OptionsInfo(scss=True, category='table_body', type='px', value='2px'), table_body_border_top_color=OptionsInfo(scss=True, category='table_body', type='value', value='#D3D3D3'), table_body_border_bottom_style=OptionsInfo(scss=True, category='table_body', type='value', value='solid'), table_body_border_bottom_width=OptionsInfo(scss=True, category='table_body', type='px', value='2px'), table_body_border_bottom_color=OptionsInfo(scss=True, category='table_body', type='value', value='#D3D3D3'), data_row_padding=OptionsInfo(scss=True, category='data_row', type='px', value='8px'), data_row_padding_horizontal=OptionsInfo(scss=True, category='data_row', type='px', value='5px'), stub_background_color=OptionsInfo(scss=True, category='stub', type='value', value=None), stub_font_size=OptionsInfo(scss=True, category='stub', type='px', value='100%'), stub_font_weight=OptionsInfo(scss=True, category='stub', type='value', value='initial'), stub_text_transform=OptionsInfo(scss=True, category='stub', type='value', value='inherit'), stub_border_style=OptionsInfo(scss=True, category='stub', type='value', value='solid'), stub_border_width=OptionsInfo(scss=True, category='stub', type='px', value='2px'), stub_border_color=OptionsInfo(scss=True, category='stub', type='value', value='#D3D3D3'), stub_indent_length=OptionsInfo(scss=True, category='stub', type='px', value='5px'), stub_row_group_background_color=OptionsInfo(scss=True, category='stub', type='value', value=None), stub_row_group_font_size=OptionsInfo(scss=True, category='stub', type='px', value='100%'), stub_row_group_font_weight=OptionsInfo(scss=True, category='stub', type='value', value='initial'), stub_row_group_text_transform=OptionsInfo(scss=True, category='stub', type='value', value='inherit'), stub_row_group_border_style=OptionsInfo(scss=True, category='stub', type='value', value='solid'), stub_row_group_border_width=OptionsInfo(scss=True, category='stub', type='px', value='2px'), stub_row_group_border_color=OptionsInfo(scss=True, category='stub', type='value', value='#D3D3D3'), summary_row_padding=OptionsInfo(scss=True, category='summary_row', type='px', value='8px'), summary_row_padding_horizontal=OptionsInfo(scss=True, category='summary_row', type='px', value='5px'), summary_row_background_color=OptionsInfo(scss=True, category='summary_row', type='value', value=None), summary_row_text_transform=OptionsInfo(scss=True, category='summary_row', type='value', value='inherit'), summary_row_border_style=OptionsInfo(scss=True, category='summary_row', type='value', value='solid'), summary_row_border_width=OptionsInfo(scss=True, category='summary_row', type='px', value='2px'), summary_row_border_color=OptionsInfo(scss=True, category='summary_row', type='value', value='#D3D3D3'), grand_summary_row_padding=OptionsInfo(scss=True, category='grand_summary_row', type='px', value='8px'), grand_summary_row_padding_horizontal=OptionsInfo(scss=True, category='grand_summary_row', type='px', value='5px'), grand_summary_row_background_color=OptionsInfo(scss=True, category='grand_summary_row', type='value', value=None), grand_summary_row_text_transform=OptionsInfo(scss=True, category='grand_summary_row', type='value', value='inherit'), grand_summary_row_border_style=OptionsInfo(scss=True, category='grand_summary_row', type='value', value='double'), grand_summary_row_border_width=OptionsInfo(scss=True, category='grand_summary_row', type='px', value='6px'), grand_summary_row_border_color=OptionsInfo(scss=True, category='grand_summary_row', type='value', value='#D3D3D3'), footnotes_marks=OptionsInfo(scss=False, category='footnotes', type='values', value='numbers'), footnotes_spec_ref=OptionsInfo(scss=False, category='footnotes', type='value', value='^i'), footnotes_spec_ftr=OptionsInfo(scss=False, category='footnotes', type='value', value='^i'), footnotes_order=OptionsInfo(scss=False, category='footnotes', type='value', value='marks_last'), source_notes_padding=OptionsInfo(scss=True, category='source_notes', type='px', value='4px'), source_notes_padding_horizontal=OptionsInfo(scss=True, category='source_notes', type='px', value='5px'), source_notes_background_color=OptionsInfo(scss=True, category='source_notes', type='value', value=None), source_notes_font_size=OptionsInfo(scss=True, category='source_notes', type='px', value='90%'), source_notes_border_bottom_style=OptionsInfo(scss=True, category='source_notes', type='value', value='none'), source_notes_border_bottom_width=OptionsInfo(scss=True, category='source_notes', type='px', value='2px'), source_notes_border_bottom_color=OptionsInfo(scss=True, category='source_notes', type='value', value='#D3D3D3'), source_notes_border_lr_style=OptionsInfo(scss=True, category='source_notes', type='value', value='none'), source_notes_border_lr_width=OptionsInfo(scss=True, category='source_notes', type='px', value='2px'), source_notes_border_lr_color=OptionsInfo(scss=True, category='source_notes', type='value', value='#D3D3D3'), source_notes_multiline=OptionsInfo(scss=False, category='source_notes', type='boolean', value=True), source_notes_sep=OptionsInfo(scss=False, category='source_notes', type='value', value=' '), row_striping_background_color=OptionsInfo(scss=True, category='row', type='value', value='#F4F4F4'), row_striping_include_stub=OptionsInfo(scss=False, category='row', type='boolean', value=False), row_striping_include_table_body=OptionsInfo(scss=False, category='row', type='boolean', value=False), container_width=OptionsInfo(scss=False, category='container', type='px', value='auto'), container_height=OptionsInfo(scss=False, category='container', type='px', value='auto'), container_padding_x=OptionsInfo(scss=False, category='container', type='px', value='0px'), container_padding_y=OptionsInfo(scss=False, category='container', type='px', value='10px'), container_overflow_x=OptionsInfo(scss=False, category='container', type='overflow', value='auto'), container_overflow_y=OptionsInfo(scss=False, category='container', type='overflow', value='auto'), quarto_disable_processing=OptionsInfo(scss=False, category='quarto', type='logical', value=False), quarto_use_bootstrap=OptionsInfo(scss=False, category='quarto', type='logical', value=False), ihtml_active=OptionsInfo(scss=False, category='ihtml', type='boolean', value=False), ihtml_use_pagination=OptionsInfo(scss=False, category='ihtml', type='boolean', value=True), ihtml_use_pagination_info=OptionsInfo(scss=False, category='ihtml', type='boolean', value=True), ihtml_use_sorting=OptionsInfo(scss=False, category='ihtml', type='boolean', value=True), ihtml_use_search=OptionsInfo(scss=False, category='ihtml', type='boolean', value=False), ihtml_use_filters=OptionsInfo(scss=False, category='ihtml', type='boolean', value=False), ihtml_use_resizers=OptionsInfo(scss=False, category='ihtml', type='boolean', value=False), ihtml_use_highlight=OptionsInfo(scss=False, category='ihtml', type='boolean', value=False), ihtml_use_compact_mode=OptionsInfo(scss=False, category='ihtml', type='boolean', value=False), ihtml_use_text_wrapping=OptionsInfo(scss=False, category='ihtml', type='boolean', value=True), ihtml_use_page_size_select=OptionsInfo(scss=False, category='ihtml', type='boolean', value=False), ihtml_page_size_default=OptionsInfo(scss=False, category='ihtml', type='value', value=10), ihtml_page_size_values=OptionsInfo(scss=False, category='ihtml', type='values', value=[10, 25, 50, 100]), ihtml_pagination_type=OptionsInfo(scss=False, category='ihtml', type='value', value='numbers'), ihtml_height=OptionsInfo(scss=False, category='ihtml', type='value', value='auto'), ihtml_selection_mode=OptionsInfo(scss=False, category='ihtml', type='value', value=None)), _google_font_imports=GoogleFontImports(imports=frozenset()), _has_built=False)</w:t>
       </w:r>
     </w:p>
     <w:bookmarkEnd w:id="29"/>
@@ -2634,78 +2284,16 @@
         <w:t xml:space="preserve"> </w:t>
       </w:r>
       <w:r>
-        <w:t xml:space="preserve">La tónica D4 (</w:t>
-      </w:r>
-      <m:oMath>
-        <m:r>
-          <m:t>25.91</m:t>
-        </m:r>
-        <m:r>
-          <m:rPr>
-            <m:sty m:val="p"/>
-          </m:rPr>
-          <m:t>%</m:t>
-        </m:r>
-      </m:oMath>
-      <w:r>
-        <w:t xml:space="preserve">) y la dominante A4 (</w:t>
-      </w:r>
-      <m:oMath>
-        <m:r>
-          <m:t>18.89</m:t>
-        </m:r>
-        <m:r>
-          <m:rPr>
-            <m:sty m:val="p"/>
-          </m:rPr>
-          <m:t>%</m:t>
-        </m:r>
-      </m:oMath>
-      <w:r>
-        <w:t xml:space="preserve">) concentran casi el</w:t>
-      </w:r>
-      <w:r>
-        <w:t xml:space="preserve"> </w:t>
-      </w:r>
-      <m:oMath>
-        <m:r>
-          <m:t>45</m:t>
-        </m:r>
-        <m:r>
-          <m:rPr>
-            <m:sty m:val="p"/>
-          </m:rPr>
-          <m:t>%</m:t>
-        </m:r>
-      </m:oMath>
-      <w:r>
-        <w:t xml:space="preserve"> </w:t>
-      </w:r>
-      <w:r>
-        <w:t xml:space="preserve">de la ocupación temporal asintótica, mientras que la sensible C#5 (</w:t>
-      </w:r>
-      <m:oMath>
-        <m:r>
-          <m:t>4.37</m:t>
-        </m:r>
-        <m:r>
-          <m:rPr>
-            <m:sty m:val="p"/>
-          </m:rPr>
-          <m:t>%</m:t>
-        </m:r>
-      </m:oMath>
-      <w:r>
-        <w:t xml:space="preserve">) presenta la menor permanencia, validando que el modelo privilegia el reposo consonante sobre la tensión inestable.</w:t>
+        <w:t xml:space="preserve">La tónica D4 (25.91%) y la dominante A4 (18.89%) acumulan cerca del 45% del tiempo en estado estacionario, confirmando el reposo consonante del sistema.</w:t>
       </w:r>
     </w:p>
     <w:p>
       <w:pPr>
         <w:pStyle w:val="Heading3"/>
       </w:pPr>
-      <w:bookmarkStart w:id="34" w:name="_0f9bb9e8dc90b18a1de39e8452070d896bbe1da"/>
-      <w:r>
-        <w:t xml:space="preserve">2.5. Generador estocástico y síntesis acústica ADSR (40%)</w:t>
+      <w:bookmarkStart w:id="34" w:name="_ee44ada67978f17d8440168c9d433d93c6822d4"/>
+      <w:r>
+        <w:t xml:space="preserve">2.5. Generador de melodías</w:t>
       </w:r>
       <w:bookmarkEnd w:id="34"/>
     </w:p>
@@ -2714,38 +2302,7 @@
         <w:pStyle w:val="FirstParagraph"/>
       </w:pPr>
       <w:r>
-        <w:t xml:space="preserve">Para determinar la transición de estados en cada instante</w:t>
-      </w:r>
-      <w:r>
-        <w:t xml:space="preserve"> </w:t>
-      </w:r>
-      <m:oMath>
-        <m:r>
-          <m:t>t</m:t>
-        </m:r>
-      </m:oMath>
-      <w:r>
-        <w:t xml:space="preserve">, se implementa el muestreo por transformada inversa de la función de distribución acumulada (CDF) condicionada a la fila del estado actual</w:t>
-      </w:r>
-      <w:r>
-        <w:t xml:space="preserve"> </w:t>
-      </w:r>
-      <m:oMath>
-        <m:sSub>
-          <m:e>
-            <m:r>
-              <m:t>X</m:t>
-            </m:r>
-          </m:e>
-          <m:sub>
-            <m:r>
-              <m:t>t</m:t>
-            </m:r>
-          </m:sub>
-        </m:sSub>
-      </m:oMath>
-      <w:r>
-        <w:t xml:space="preserve">.</w:t>
+        <w:t xml:space="preserve">Para determinar cada transición se emplea el método de transformada inversa sobre la distribución acumulada del estado actual.</w:t>
       </w:r>
     </w:p>
     <w:p>
@@ -2753,23 +2310,7 @@
         <w:pStyle w:val="BodyText"/>
       </w:pPr>
       <w:r>
-        <w:t xml:space="preserve">Las funciones de generación de tonos reciben como parámetros fundamentales la</w:t>
-      </w:r>
-      <w:r>
-        <w:t xml:space="preserve"> </w:t>
-      </w:r>
-      <w:r>
-        <w:rPr>
-          <w:b/>
-          <w:bCs/>
-        </w:rPr>
-        <w:t xml:space="preserve">frecuencia</w:t>
-      </w:r>
-      <w:r>
-        <w:t xml:space="preserve"> </w:t>
-      </w:r>
-      <w:r>
-        <w:t xml:space="preserve">(</w:t>
+        <w:t xml:space="preserve">Las funciones de síntesis reciben frecuencia fundamental (</w:t>
       </w:r>
       <m:oMath>
         <m:r>
@@ -2777,26 +2318,7 @@
         </m:r>
       </m:oMath>
       <w:r>
-        <w:t xml:space="preserve"> </w:t>
-      </w:r>
-      <w:r>
-        <w:t xml:space="preserve">en Hz) y la</w:t>
-      </w:r>
-      <w:r>
-        <w:t xml:space="preserve"> </w:t>
-      </w:r>
-      <w:r>
-        <w:rPr>
-          <w:b/>
-          <w:bCs/>
-        </w:rPr>
-        <w:t xml:space="preserve">duración</w:t>
-      </w:r>
-      <w:r>
-        <w:t xml:space="preserve"> </w:t>
-      </w:r>
-      <w:r>
-        <w:t xml:space="preserve">(</w:t>
+        <w:t xml:space="preserve">) y duración (</w:t>
       </w:r>
       <m:oMath>
         <m:r>
@@ -2804,23 +2326,7 @@
         </m:r>
       </m:oMath>
       <w:r>
-        <w:t xml:space="preserve"> </w:t>
-      </w:r>
-      <w:r>
-        <w:t xml:space="preserve">en segundos). Para prevenir discontinuidades de fase que producen chasquidos y clics acústicos molestos, se diseñó e implementó un suavizador de amplitud</w:t>
-      </w:r>
-      <w:r>
-        <w:t xml:space="preserve"> </w:t>
-      </w:r>
-      <w:r>
-        <w:rPr>
-          <w:b/>
-          <w:bCs/>
-        </w:rPr>
-        <w:t xml:space="preserve">ADSR (Attack, Decay, Sustain, Release)</w:t>
-      </w:r>
-      <w:r>
-        <w:t xml:space="preserve">:</w:t>
+        <w:t xml:space="preserve">). Para evitar discontinuidades de fase que generen chasquidos acústicos, se aplicó una envolvente ADSR:</w:t>
       </w:r>
     </w:p>
     <w:p>
@@ -2832,35 +2338,7 @@
         </w:numPr>
       </w:pPr>
       <w:r>
-        <w:rPr>
-          <w:b/>
-          <w:bCs/>
-        </w:rPr>
-        <w:t xml:space="preserve">Attack (</w:t>
-      </w:r>
-      <m:oMath>
-        <m:r>
-          <m:t>0.04</m:t>
-        </m:r>
-        <m:r>
-          <m:rPr>
-            <m:nor/>
-          </m:rPr>
-          <m:t> s</m:t>
-        </m:r>
-      </m:oMath>
-      <w:r>
-        <w:rPr>
-          <w:b/>
-          <w:bCs/>
-        </w:rPr>
-        <w:t xml:space="preserve">):</w:t>
-      </w:r>
-      <w:r>
-        <w:t xml:space="preserve"> </w:t>
-      </w:r>
-      <w:r>
-        <w:t xml:space="preserve">Crecimiento lineal de amplitud de 0 a 1.</w:t>
+        <w:t xml:space="preserve">Attack (0.04 s): Crecimiento lineal de 0 a 1.</w:t>
       </w:r>
     </w:p>
     <w:p>
@@ -2872,43 +2350,7 @@
         </w:numPr>
       </w:pPr>
       <w:r>
-        <w:rPr>
-          <w:b/>
-          <w:bCs/>
-        </w:rPr>
-        <w:t xml:space="preserve">Decay (</w:t>
-      </w:r>
-      <m:oMath>
-        <m:r>
-          <m:t>0.04</m:t>
-        </m:r>
-        <m:r>
-          <m:rPr>
-            <m:nor/>
-          </m:rPr>
-          <m:t> s</m:t>
-        </m:r>
-      </m:oMath>
-      <w:r>
-        <w:rPr>
-          <w:b/>
-          <w:bCs/>
-        </w:rPr>
-        <w:t xml:space="preserve">):</w:t>
-      </w:r>
-      <w:r>
-        <w:t xml:space="preserve"> </w:t>
-      </w:r>
-      <w:r>
-        <w:t xml:space="preserve">Decaimiento suave al nivel de sostenimiento (</w:t>
-      </w:r>
-      <m:oMath>
-        <m:r>
-          <m:t>0.85</m:t>
-        </m:r>
-      </m:oMath>
-      <w:r>
-        <w:t xml:space="preserve">).</w:t>
+        <w:t xml:space="preserve">Decay (0.04 s): Descenso al nivel de sostenimiento (0.85).</w:t>
       </w:r>
     </w:p>
     <w:p>
@@ -2920,17 +2362,7 @@
         </w:numPr>
       </w:pPr>
       <w:r>
-        <w:rPr>
-          <w:b/>
-          <w:bCs/>
-        </w:rPr>
-        <w:t xml:space="preserve">Sustain:</w:t>
-      </w:r>
-      <w:r>
-        <w:t xml:space="preserve"> </w:t>
-      </w:r>
-      <w:r>
-        <w:t xml:space="preserve">Mantenimiento de la energía acústica en el cuerpo de la nota.</w:t>
+        <w:t xml:space="preserve">Sustain: Mantenimiento de amplitud.</w:t>
       </w:r>
     </w:p>
     <w:p>
@@ -2942,35 +2374,7 @@
         </w:numPr>
       </w:pPr>
       <w:r>
-        <w:rPr>
-          <w:b/>
-          <w:bCs/>
-        </w:rPr>
-        <w:t xml:space="preserve">Release (</w:t>
-      </w:r>
-      <m:oMath>
-        <m:r>
-          <m:t>0.05</m:t>
-        </m:r>
-        <m:r>
-          <m:rPr>
-            <m:nor/>
-          </m:rPr>
-          <m:t> s</m:t>
-        </m:r>
-      </m:oMath>
-      <w:r>
-        <w:rPr>
-          <w:b/>
-          <w:bCs/>
-        </w:rPr>
-        <w:t xml:space="preserve">):</w:t>
-      </w:r>
-      <w:r>
-        <w:t xml:space="preserve"> </w:t>
-      </w:r>
-      <w:r>
-        <w:t xml:space="preserve">Extinción suave a cero antes del siguiente tono.</w:t>
+        <w:t xml:space="preserve">Release (0.05 s): Extinción a cero antes del siguiente tono.</w:t>
       </w:r>
     </w:p>
     <w:p>
@@ -2978,184 +2382,12 @@
         <w:pStyle w:val="FirstParagraph"/>
       </w:pPr>
       <w:r>
-        <w:t xml:space="preserve">Asimismo, atendiendo el énfasis del profesor Peña Llamas en clase de no emplear duraciones fijas sino variadas para otorgar naturalidad melódica, se muestrean estocásticamente 4 figuras rítmicas a 120 BPM:</w:t>
+        <w:t xml:space="preserve">Siguiendo la recomendación de clase de variar duraciones para mayor naturalidad, se muestrean 4 figuras a 120 BPM: negra (0.50 s, 50%), corchea (0.25 s, 25%), negra con puntillo (0.75 s, 15%) y blanca (1.00 s, 10%).</w:t>
       </w:r>
     </w:p>
     <w:p>
       <w:pPr>
-        <w:pStyle w:val="Compact"/>
-        <w:numPr>
-          <w:ilvl w:val="0"/>
-          <w:numId w:val="1005"/>
-        </w:numPr>
-      </w:pPr>
-      <w:r>
-        <w:t xml:space="preserve">Negra (</w:t>
-      </w:r>
-      <m:oMath>
-        <m:r>
-          <m:t>0.50</m:t>
-        </m:r>
-        <m:r>
-          <m:rPr>
-            <m:nor/>
-          </m:rPr>
-          <m:t> s</m:t>
-        </m:r>
-      </m:oMath>
-      <w:r>
-        <w:t xml:space="preserve">, peso</w:t>
-      </w:r>
-      <w:r>
-        <w:t xml:space="preserve"> </w:t>
-      </w:r>
-      <m:oMath>
-        <m:r>
-          <m:t>50</m:t>
-        </m:r>
-        <m:r>
-          <m:rPr>
-            <m:sty m:val="p"/>
-          </m:rPr>
-          <m:t>%</m:t>
-        </m:r>
-      </m:oMath>
-      <w:r>
-        <w:t xml:space="preserve">).</w:t>
-      </w:r>
-    </w:p>
-    <w:p>
-      <w:pPr>
-        <w:pStyle w:val="Compact"/>
-        <w:numPr>
-          <w:ilvl w:val="0"/>
-          <w:numId w:val="1005"/>
-        </w:numPr>
-      </w:pPr>
-      <w:r>
-        <w:t xml:space="preserve">Corchea (</w:t>
-      </w:r>
-      <m:oMath>
-        <m:r>
-          <m:t>0.25</m:t>
-        </m:r>
-        <m:r>
-          <m:rPr>
-            <m:nor/>
-          </m:rPr>
-          <m:t> s</m:t>
-        </m:r>
-      </m:oMath>
-      <w:r>
-        <w:t xml:space="preserve">, peso</w:t>
-      </w:r>
-      <w:r>
-        <w:t xml:space="preserve"> </w:t>
-      </w:r>
-      <m:oMath>
-        <m:r>
-          <m:t>25</m:t>
-        </m:r>
-        <m:r>
-          <m:rPr>
-            <m:sty m:val="p"/>
-          </m:rPr>
-          <m:t>%</m:t>
-        </m:r>
-      </m:oMath>
-      <w:r>
-        <w:t xml:space="preserve">).</w:t>
-      </w:r>
-    </w:p>
-    <w:p>
-      <w:pPr>
-        <w:pStyle w:val="Compact"/>
-        <w:numPr>
-          <w:ilvl w:val="0"/>
-          <w:numId w:val="1005"/>
-        </w:numPr>
-      </w:pPr>
-      <w:r>
-        <w:t xml:space="preserve">Negra con puntillo (</w:t>
-      </w:r>
-      <m:oMath>
-        <m:r>
-          <m:t>0.75</m:t>
-        </m:r>
-        <m:r>
-          <m:rPr>
-            <m:nor/>
-          </m:rPr>
-          <m:t> s</m:t>
-        </m:r>
-      </m:oMath>
-      <w:r>
-        <w:t xml:space="preserve">, peso</w:t>
-      </w:r>
-      <w:r>
-        <w:t xml:space="preserve"> </w:t>
-      </w:r>
-      <m:oMath>
-        <m:r>
-          <m:t>15</m:t>
-        </m:r>
-        <m:r>
-          <m:rPr>
-            <m:sty m:val="p"/>
-          </m:rPr>
-          <m:t>%</m:t>
-        </m:r>
-      </m:oMath>
-      <w:r>
-        <w:t xml:space="preserve">).</w:t>
-      </w:r>
-    </w:p>
-    <w:p>
-      <w:pPr>
-        <w:pStyle w:val="Compact"/>
-        <w:numPr>
-          <w:ilvl w:val="0"/>
-          <w:numId w:val="1005"/>
-        </w:numPr>
-      </w:pPr>
-      <w:r>
-        <w:t xml:space="preserve">Blanca (</w:t>
-      </w:r>
-      <m:oMath>
-        <m:r>
-          <m:t>1.00</m:t>
-        </m:r>
-        <m:r>
-          <m:rPr>
-            <m:nor/>
-          </m:rPr>
-          <m:t> s</m:t>
-        </m:r>
-      </m:oMath>
-      <w:r>
-        <w:t xml:space="preserve">, peso</w:t>
-      </w:r>
-      <w:r>
-        <w:t xml:space="preserve"> </w:t>
-      </w:r>
-      <m:oMath>
-        <m:r>
-          <m:t>10</m:t>
-        </m:r>
-        <m:r>
-          <m:rPr>
-            <m:sty m:val="p"/>
-          </m:rPr>
-          <m:t>%</m:t>
-        </m:r>
-      </m:oMath>
-      <w:r>
-        <w:t xml:space="preserve">).</w:t>
-      </w:r>
-    </w:p>
-    <w:p>
-      <w:pPr>
-        <w:pStyle w:val="FirstParagraph"/>
+        <w:pStyle w:val="BodyText"/>
       </w:pPr>
       <w:r>
         <w:rPr>
@@ -3321,27 +2553,6 @@
         </w:rPr>
         <w:t xml:space="preserve">Paso 16: A4 a E4 | 329.63 Hz | 1.00 s</w:t>
       </w:r>
-      <w:r>
-        <w:br/>
-      </w:r>
-      <w:r>
-        <w:br/>
-      </w:r>
-      <w:r>
-        <w:rPr>
-          <w:rStyle w:val="VerbatimChar"/>
-        </w:rPr>
-        <w:t xml:space="preserve">Archivo WAV exportado exitosamente:</w:t>
-      </w:r>
-      <w:r>
-        <w:br/>
-      </w:r>
-      <w:r>
-        <w:rPr>
-          <w:rStyle w:val="VerbatimChar"/>
-        </w:rPr>
-        <w:t xml:space="preserve">../export/melodia_markov_16.wav</w:t>
-      </w:r>
     </w:p>
     <w:bookmarkEnd w:id="36"/>
     <w:bookmarkStart w:id="37" w:name="_f1b5a422"/>
@@ -3516,7 +2727,7 @@
         <w:rPr>
           <w:rStyle w:val="VerbatimChar"/>
         </w:rPr>
-        <w:t xml:space="preserve">16    16          A4   E4      329.63      1.00         10.25, _body=&lt;great_tables._gt_data.Body object at 0xf8d8b0766350&gt;, _boxhead=Boxhead([ColInfo(var='Paso', type=&lt;ColInfoTypeEnum.default: 1&gt;, column_label='Paso', column_align='center', column_width=None, stub_level=None), ColInfo(var='Estado ant.', type=&lt;ColInfoTypeEnum.default: 1&gt;, column_label='Estado ant.', column_align='left', column_width=None, stub_level=None), ColInfo(var='Nota', type=&lt;ColInfoTypeEnum.default: 1&gt;, column_label='Nota', column_align='left', column_width=None, stub_level=None), ColInfo(var='Frecuencia', type=&lt;ColInfoTypeEnum.default: 1&gt;, column_label='Frecuencia', column_align='right', column_width=None, stub_level=None), ColInfo(var='Duración', type=&lt;ColInfoTypeEnum.default: 1&gt;, column_label='Duración', column_align='right', column_width=None, stub_level=None), ColInfo(var='Tiempo acum.', type=&lt;ColInfoTypeEnum.default: 1&gt;, column_label='Tiempo acum.', column_align='right', column_width=None, stub_level=None)]), _stub=&lt;great_tables._gt_data.Stub object at 0xf8d8b0317490&gt;, _spanners=Spanners([]), _heading=Heading(title='Secuencia: 16 Transiciones', subtitle=None, preheader=None), _stubhead=None, _summary_rows=&lt;great_tables._gt_data.SummaryRows object at 0xf8d8b02f7850&gt;, _summary_rows_grand=&lt;great_tables._gt_data.SummaryRows object at 0xf8d8b02f7950&gt;, _source_notes=[], _footnotes=[], _styles=[], _locale=&lt;great_tables._gt_data.Locale object at 0xf8d8b0317bb0&gt;, _formats=[], _substitutions=[], _col_merge=[], _transforms=[], _options=Options(table_id=OptionsInfo(scss=False, category='table', type='value', value=None), table_caption=OptionsInfo(scss=False, category='table', type='value', value=None), table_width=OptionsInfo(scss=True, category='table', type='px', value='auto'), table_layout=OptionsInfo(scss=True, category='table', type='value', value='fixed'), table_margin_left=OptionsInfo(scss=True, category='table', type='px', value='auto'), table_margin_right=OptionsInfo(scss=True, category='table', type='px', value='auto'), table_background_color=OptionsInfo(scss=True, category='table', type='value', value='#FFFFFF'), table_additional_css=OptionsInfo(scss=False, category='table', type='values', value=[]), table_font_names=OptionsInfo(scss=False, category='table', type='values', value=['-apple-system', 'BlinkMacSystemFont', 'Segoe UI', 'Roboto', 'Oxygen', 'Ubuntu', 'Cantarell', 'Helvetica Neue', 'Fira Sans', 'Droid Sans', 'Arial', 'sans-serif']), table_font_size=OptionsInfo(scss=True, category='table', type='px', value='16px'), table_font_weight=OptionsInfo(scss=True, category='table', type='value', value='normal'), table_font_style=OptionsInfo(scss=True, category='table', type='value', value='normal'), table_font_color=OptionsInfo(scss=True, category='table', type='value', value='#333333'), table_font_color_light=OptionsInfo(scss=True, category='table', type='value', value='#FFFFFF'), table_border_top_include=OptionsInfo(scss=False, category='table', type='boolean', value=True), table_border_top_style=OptionsInfo(scss=True, category='table', type='value', value='solid'), table_border_top_width=OptionsInfo(scss=True, category='table', type='px', value='2px'), table_border_top_color=OptionsInfo(scss=True, category='table', type='value', value='#A8A8A8'), table_border_right_style=OptionsInfo(scss=True, category='table', type='value', value='none'), table_border_right_width=OptionsInfo(scss=True, category='table', type='px', value='2px'), table_border_right_color=OptionsInfo(scss=True, category='table', type='value', value='#D3D3D3'), table_border_bottom_include=OptionsInfo(scss=False, category='table', type='boolean', value=True), table_border_bottom_style=OptionsInfo(scss=True, category='table', type='value', value='solid'), table_border_bottom_width=OptionsInfo(scss=True, category='table', type='px', value='2px'), table_border_bottom_color=OptionsInfo(scss=True, category='table', type='value', value='#A8A8A8'), table_border_left_style=OptionsInfo(scss=True, category='table', type='value', value='none'), table_border_left_width=OptionsInfo(scss=True, category='table', type='px', value='2px'), table_border_left_color=OptionsInfo(scss=True, category='table', type='value', value='#D3D3D3'), heading_background_color=OptionsInfo(scss=True, category='heading', type='value', value=None), heading_align=OptionsInfo(scss=True, category='heading', type='value', value='center'), heading_title_font_size=OptionsInfo(scss=True, category='heading', type='px', value='125%'), heading_title_font_weight=OptionsInfo(scss=True, category='heading', type='value', value='initial'), heading_subtitle_font_size=OptionsInfo(scss=True, category='heading', type='px', value='85%'), heading_subtitle_font_weight=OptionsInfo(scss=True, category='heading', type='value', value='initial'), heading_padding=OptionsInfo(scss=True, category='heading', type='px', value='4px'), heading_padding_horizontal=OptionsInfo(scss=True, category='heading', type='px', value='5px'), heading_border_bottom_style=OptionsInfo(scss=True, category='heading', type='value', value='solid'), heading_border_bottom_width=OptionsInfo(scss=True, category='heading', type='px', value='2px'), heading_border_bottom_color=OptionsInfo(scss=True, category='heading', type='value', value='#D3D3D3'), heading_border_lr_style=OptionsInfo(scss=True, category='heading', type='value', value='none'), heading_border_lr_width=OptionsInfo(scss=True, category='heading', type='px', value='1px'), heading_border_lr_color=OptionsInfo(scss=True, category='heading', type='value', value='#D3D3D3'), column_labels_background_color=OptionsInfo(scss=True, category='column_labels', type='value', value=None), column_labels_font_size=OptionsInfo(scss=True, category='column_labels', type='px', value='100%'), column_labels_font_weight=OptionsInfo(scss=True, category='column_labels', type='value', value='normal'), column_labels_text_transform=OptionsInfo(scss=True, category='column_labels', type='value', value='inherit'), column_labels_padding=OptionsInfo(scss=True, category='column_labels', type='px', value='5px'), column_labels_padding_horizontal=OptionsInfo(scss=True, category='column_labels', type='px', value='5px'), column_labels_vlines_style=OptionsInfo(scss=True, category='table_body', type='value', value='none'), column_labels_vlines_width=OptionsInfo(scss=True, category='table_body', type='px', value='1px'), column_labels_vlines_color=OptionsInfo(scss=True, category='table_body', type='value', value='#D3D3D3'), column_labels_border_top_style=OptionsInfo(scss=True, category='column_labels', type='value', value='solid'), column_labels_border_top_width=OptionsInfo(scss=True, category='column_labels', type='px', value='2px'), column_labels_border_top_color=OptionsInfo(scss=True, category='column_labels', type='value', value='#D3D3D3'), column_labels_border_bottom_style=OptionsInfo(scss=True, category='column_labels', type='value', value='solid'), column_labels_border_bottom_width=OptionsInfo(scss=True, category='column_labels', type='px', value='2px'), column_labels_border_bottom_color=OptionsInfo(scss=True, category='column_labels', type='value', value='#D3D3D3'), column_labels_border_lr_style=OptionsInfo(scss=True, category='column_labels', type='value', value='none'), column_labels_border_lr_width=OptionsInfo(scss=True, category='column_labels', type='px', value='1px'), column_labels_border_lr_color=OptionsInfo(scss=True, category='column_labels', type='value', value='#D3D3D3'), column_labels_hidden=OptionsInfo(scss=False, category='column_labels', type='boolean', value=False), row_group_background_color=OptionsInfo(scss=True, category='row_group', type='value', value=None), row_group_font_size=OptionsInfo(scss=True, category='row_group', type='px', value='100%'), row_group_font_weight=OptionsInfo(scss=True, category='row_group', type='value', value='initial'), row_group_text_transform=OptionsInfo(scss=True, category='row_group', type='value', value='inherit'), row_group_padding=OptionsInfo(scss=True, category='row_group', type='px', value='8px'), row_group_padding_horizontal=OptionsInfo(scss=True, category='row_group', type='px', value='5px'), row_group_border_top_style=OptionsInfo(scss=True, category='row_group', type='value', value='solid'), row_group_border_top_width=OptionsInfo(scss=True, category='row_group', type='px', value='2px'), row_group_border_top_color=OptionsInfo(scss=True, category='row_group', type='value', value='#D3D3D3'), row_group_border_right_style=OptionsInfo(scss=True, category='row_group', type='value', value='none'), row_group_border_right_width=OptionsInfo(scss=True, category='row_group', type='px', value='1px'), row_group_border_right_color=OptionsInfo(scss=True, category='row_group', type='value', value='#D3D3D3'), row_group_border_bottom_style=OptionsInfo(scss=True, category='row_group', type='value', value='solid'), row_group_border_bottom_width=OptionsInfo(scss=True, category='row_group', type='px', value='2px'), row_group_border_bottom_color=OptionsInfo(scss=True, category='row_group', type='value', value='#D3D3D3'), row_group_border_left_style=OptionsInfo(scss=True, category='row_group', type='value', value='none'), row_group_border_left_width=OptionsInfo(scss=True, category='row_group', type='px', value='1px'), row_group_border_left_color=OptionsInfo(scss=True, category='row_group', type='value', value='#D3D3D3'), row_group_as_column=OptionsInfo(scss=False, category='row_group', type='boolean', value=False), table_body_hlines_style=OptionsInfo(scss=True, category='table_body', type='value', value='solid'), table_body_hlines_width=OptionsInfo(scss=True, category='table_body', type='px', value='1px'), table_body_hlines_color=OptionsInfo(scss=True, category='table_body', type='value', value='#D3D3D3'), table_body_vlines_style=OptionsInfo(scss=True, category='table_body', type='value', value='none'), table_body_vlines_width=OptionsInfo(scss=True, category='table_body', type='px', value='1px'), table_body_vlines_color=OptionsInfo(scss=True, category='table_body', type='value', value='#D3D3D3'), table_body_border_top_style=OptionsInfo(scss=True, category='table_body', type='value', value='solid'), table_body_border_top_width=OptionsInfo(scss=True, category='table_body', type='px', value='2px'), table_body_border_top_color=OptionsInfo(scss=True, category='table_body', type='value', value='#D3D3D3'), table_body_border_bottom_style=OptionsInfo(scss=True, category='table_body', type='value', value='solid'), table_body_border_bottom_width=OptionsInfo(scss=True, category='table_body', type='px', value='2px'), table_body_border_bottom_color=OptionsInfo(scss=True, category='table_body', type='value', value='#D3D3D3'), data_row_padding=OptionsInfo(scss=True, category='data_row', type='px', value='8px'), data_row_padding_horizontal=OptionsInfo(scss=True, category='data_row', type='px', value='5px'), stub_background_color=OptionsInfo(scss=True, category='stub', type='value', value=None), stub_font_size=OptionsInfo(scss=True, category='stub', type='px', value='100%'), stub_font_weight=OptionsInfo(scss=True, category='stub', type='value', value='initial'), stub_text_transform=OptionsInfo(scss=True, category='stub', type='value', value='inherit'), stub_border_style=OptionsInfo(scss=True, category='stub', type='value', value='solid'), stub_border_width=OptionsInfo(scss=True, category='stub', type='px', value='2px'), stub_border_color=OptionsInfo(scss=True, category='stub', type='value', value='#D3D3D3'), stub_indent_length=OptionsInfo(scss=True, category='stub', type='px', value='5px'), stub_row_group_background_color=OptionsInfo(scss=True, category='stub', type='value', value=None), stub_row_group_font_size=OptionsInfo(scss=True, category='stub', type='px', value='100%'), stub_row_group_font_weight=OptionsInfo(scss=True, category='stub', type='value', value='initial'), stub_row_group_text_transform=OptionsInfo(scss=True, category='stub', type='value', value='inherit'), stub_row_group_border_style=OptionsInfo(scss=True, category='stub', type='value', value='solid'), stub_row_group_border_width=OptionsInfo(scss=True, category='stub', type='px', value='2px'), stub_row_group_border_color=OptionsInfo(scss=True, category='stub', type='value', value='#D3D3D3'), summary_row_padding=OptionsInfo(scss=True, category='summary_row', type='px', value='8px'), summary_row_padding_horizontal=OptionsInfo(scss=True, category='summary_row', type='px', value='5px'), summary_row_background_color=OptionsInfo(scss=True, category='summary_row', type='value', value=None), summary_row_text_transform=OptionsInfo(scss=True, category='summary_row', type='value', value='inherit'), summary_row_border_style=OptionsInfo(scss=True, category='summary_row', type='value', value='solid'), summary_row_border_width=OptionsInfo(scss=True, category='summary_row', type='px', value='2px'), summary_row_border_color=OptionsInfo(scss=True, category='summary_row', type='value', value='#D3D3D3'), grand_summary_row_padding=OptionsInfo(scss=True, category='grand_summary_row', type='px', value='8px'), grand_summary_row_padding_horizontal=OptionsInfo(scss=True, category='grand_summary_row', type='px', value='5px'), grand_summary_row_background_color=OptionsInfo(scss=True, category='grand_summary_row', type='value', value=None), grand_summary_row_text_transform=OptionsInfo(scss=True, category='grand_summary_row', type='value', value='inherit'), grand_summary_row_border_style=OptionsInfo(scss=True, category='grand_summary_row', type='value', value='double'), grand_summary_row_border_width=OptionsInfo(scss=True, category='grand_summary_row', type='px', value='6px'), grand_summary_row_border_color=OptionsInfo(scss=True, category='grand_summary_row', type='value', value='#D3D3D3'), footnotes_marks=OptionsInfo(scss=False, category='footnotes', type='values', value='numbers'), footnotes_spec_ref=OptionsInfo(scss=False, category='footnotes', type='value', value='^i'), footnotes_spec_ftr=OptionsInfo(scss=False, category='footnotes', type='value', value='^i'), footnotes_order=OptionsInfo(scss=False, category='footnotes', type='value', value='marks_last'), source_notes_padding=OptionsInfo(scss=True, category='source_notes', type='px', value='4px'), source_notes_padding_horizontal=OptionsInfo(scss=True, category='source_notes', type='px', value='5px'), source_notes_background_color=OptionsInfo(scss=True, category='source_notes', type='value', value=None), source_notes_font_size=OptionsInfo(scss=True, category='source_notes', type='px', value='90%'), source_notes_border_bottom_style=OptionsInfo(scss=True, category='source_notes', type='value', value='none'), source_notes_border_bottom_width=OptionsInfo(scss=True, category='source_notes', type='px', value='2px'), source_notes_border_bottom_color=OptionsInfo(scss=True, category='source_notes', type='value', value='#D3D3D3'), source_notes_border_lr_style=OptionsInfo(scss=True, category='source_notes', type='value', value='none'), source_notes_border_lr_width=OptionsInfo(scss=True, category='source_notes', type='px', value='2px'), source_notes_border_lr_color=OptionsInfo(scss=True, category='source_notes', type='value', value='#D3D3D3'), source_notes_multiline=OptionsInfo(scss=False, category='source_notes', type='boolean', value=True), source_notes_sep=OptionsInfo(scss=False, category='source_notes', type='value', value=' '), row_striping_background_color=OptionsInfo(scss=True, category='row', type='value', value='#F4F4F4'), row_striping_include_stub=OptionsInfo(scss=False, category='row', type='boolean', value=False), row_striping_include_table_body=OptionsInfo(scss=False, category='row', type='boolean', value=False), container_width=OptionsInfo(scss=False, category='container', type='px', value='auto'), container_height=OptionsInfo(scss=False, category='container', type='px', value='auto'), container_padding_x=OptionsInfo(scss=False, category='container', type='px', value='0px'), container_padding_y=OptionsInfo(scss=False, category='container', type='px', value='10px'), container_overflow_x=OptionsInfo(scss=False, category='container', type='overflow', value='auto'), container_overflow_y=OptionsInfo(scss=False, category='container', type='overflow', value='auto'), quarto_disable_processing=OptionsInfo(scss=False, category='quarto', type='logical', value=False), quarto_use_bootstrap=OptionsInfo(scss=False, category='quarto', type='logical', value=False), ihtml_active=OptionsInfo(scss=False, category='ihtml', type='boolean', value=False), ihtml_use_pagination=OptionsInfo(scss=False, category='ihtml', type='boolean', value=True), ihtml_use_pagination_info=OptionsInfo(scss=False, category='ihtml', type='boolean', value=True), ihtml_use_sorting=OptionsInfo(scss=False, category='ihtml', type='boolean', value=True), ihtml_use_search=OptionsInfo(scss=False, category='ihtml', type='boolean', value=False), ihtml_use_filters=OptionsInfo(scss=False, category='ihtml', type='boolean', value=False), ihtml_use_resizers=OptionsInfo(scss=False, category='ihtml', type='boolean', value=False), ihtml_use_highlight=OptionsInfo(scss=False, category='ihtml', type='boolean', value=False), ihtml_use_compact_mode=OptionsInfo(scss=False, category='ihtml', type='boolean', value=False), ihtml_use_text_wrapping=OptionsInfo(scss=False, category='ihtml', type='boolean', value=True), ihtml_use_page_size_select=OptionsInfo(scss=False, category='ihtml', type='boolean', value=False), ihtml_page_size_default=OptionsInfo(scss=False, category='ihtml', type='value', value=10), ihtml_page_size_values=OptionsInfo(scss=False, category='ihtml', type='values', value=[10, 25, 50, 100]), ihtml_pagination_type=OptionsInfo(scss=False, category='ihtml', type='value', value='numbers'), ihtml_height=OptionsInfo(scss=False, category='ihtml', type='value', value='auto'), ihtml_selection_mode=OptionsInfo(scss=False, category='ihtml', type='value', value=None)), _google_font_imports=GoogleFontImports(imports=frozenset()), _has_built=False)</w:t>
+        <w:t xml:space="preserve">16    16          A4   E4      329.63      1.00         10.25, _body=&lt;great_tables._gt_data.Body object at 0xeba88a8822b0&gt;, _boxhead=Boxhead([ColInfo(var='Paso', type=&lt;ColInfoTypeEnum.default: 1&gt;, column_label='Paso', column_align='center', column_width=None, stub_level=None), ColInfo(var='Estado ant.', type=&lt;ColInfoTypeEnum.default: 1&gt;, column_label='Estado ant.', column_align='left', column_width=None, stub_level=None), ColInfo(var='Nota', type=&lt;ColInfoTypeEnum.default: 1&gt;, column_label='Nota', column_align='left', column_width=None, stub_level=None), ColInfo(var='Frecuencia', type=&lt;ColInfoTypeEnum.default: 1&gt;, column_label='Frecuencia', column_align='right', column_width=None, stub_level=None), ColInfo(var='Duración', type=&lt;ColInfoTypeEnum.default: 1&gt;, column_label='Duración', column_align='right', column_width=None, stub_level=None), ColInfo(var='Tiempo acum.', type=&lt;ColInfoTypeEnum.default: 1&gt;, column_label='Tiempo acum.', column_align='right', column_width=None, stub_level=None)]), _stub=&lt;great_tables._gt_data.Stub object at 0xeba88a433490&gt;, _spanners=Spanners([]), _heading=Heading(title='Secuencia: 16 Transiciones', subtitle=None, preheader=None), _stubhead=None, _summary_rows=&lt;great_tables._gt_data.SummaryRows object at 0xeba88a413850&gt;, _summary_rows_grand=&lt;great_tables._gt_data.SummaryRows object at 0xeba88a413950&gt;, _source_notes=[], _footnotes=[], _styles=[], _locale=&lt;great_tables._gt_data.Locale object at 0xeba88a433bb0&gt;, _formats=[], _substitutions=[], _col_merge=[], _transforms=[], _options=Options(table_id=OptionsInfo(scss=False, category='table', type='value', value=None), table_caption=OptionsInfo(scss=False, category='table', type='value', value=None), table_width=OptionsInfo(scss=True, category='table', type='px', value='auto'), table_layout=OptionsInfo(scss=True, category='table', type='value', value='fixed'), table_margin_left=OptionsInfo(scss=True, category='table', type='px', value='auto'), table_margin_right=OptionsInfo(scss=True, category='table', type='px', value='auto'), table_background_color=OptionsInfo(scss=True, category='table', type='value', value='#FFFFFF'), table_additional_css=OptionsInfo(scss=False, category='table', type='values', value=[]), table_font_names=OptionsInfo(scss=False, category='table', type='values', value=['-apple-system', 'BlinkMacSystemFont', 'Segoe UI', 'Roboto', 'Oxygen', 'Ubuntu', 'Cantarell', 'Helvetica Neue', 'Fira Sans', 'Droid Sans', 'Arial', 'sans-serif']), table_font_size=OptionsInfo(scss=True, category='table', type='px', value='16px'), table_font_weight=OptionsInfo(scss=True, category='table', type='value', value='normal'), table_font_style=OptionsInfo(scss=True, category='table', type='value', value='normal'), table_font_color=OptionsInfo(scss=True, category='table', type='value', value='#333333'), table_font_color_light=OptionsInfo(scss=True, category='table', type='value', value='#FFFFFF'), table_border_top_include=OptionsInfo(scss=False, category='table', type='boolean', value=True), table_border_top_style=OptionsInfo(scss=True, category='table', type='value', value='solid'), table_border_top_width=OptionsInfo(scss=True, category='table', type='px', value='2px'), table_border_top_color=OptionsInfo(scss=True, category='table', type='value', value='#A8A8A8'), table_border_right_style=OptionsInfo(scss=True, category='table', type='value', value='none'), table_border_right_width=OptionsInfo(scss=True, category='table', type='px', value='2px'), table_border_right_color=OptionsInfo(scss=True, category='table', type='value', value='#D3D3D3'), table_border_bottom_include=OptionsInfo(scss=False, category='table', type='boolean', value=True), table_border_bottom_style=OptionsInfo(scss=True, category='table', type='value', value='solid'), table_border_bottom_width=OptionsInfo(scss=True, category='table', type='px', value='2px'), table_border_bottom_color=OptionsInfo(scss=True, category='table', type='value', value='#A8A8A8'), table_border_left_style=OptionsInfo(scss=True, category='table', type='value', value='none'), table_border_left_width=OptionsInfo(scss=True, category='table', type='px', value='2px'), table_border_left_color=OptionsInfo(scss=True, category='table', type='value', value='#D3D3D3'), heading_background_color=OptionsInfo(scss=True, category='heading', type='value', value=None), heading_align=OptionsInfo(scss=True, category='heading', type='value', value='center'), heading_title_font_size=OptionsInfo(scss=True, category='heading', type='px', value='125%'), heading_title_font_weight=OptionsInfo(scss=True, category='heading', type='value', value='initial'), heading_subtitle_font_size=OptionsInfo(scss=True, category='heading', type='px', value='85%'), heading_subtitle_font_weight=OptionsInfo(scss=True, category='heading', type='value', value='initial'), heading_padding=OptionsInfo(scss=True, category='heading', type='px', value='4px'), heading_padding_horizontal=OptionsInfo(scss=True, category='heading', type='px', value='5px'), heading_border_bottom_style=OptionsInfo(scss=True, category='heading', type='value', value='solid'), heading_border_bottom_width=OptionsInfo(scss=True, category='heading', type='px', value='2px'), heading_border_bottom_color=OptionsInfo(scss=True, category='heading', type='value', value='#D3D3D3'), heading_border_lr_style=OptionsInfo(scss=True, category='heading', type='value', value='none'), heading_border_lr_width=OptionsInfo(scss=True, category='heading', type='px', value='1px'), heading_border_lr_color=OptionsInfo(scss=True, category='heading', type='value', value='#D3D3D3'), column_labels_background_color=OptionsInfo(scss=True, category='column_labels', type='value', value=None), column_labels_font_size=OptionsInfo(scss=True, category='column_labels', type='px', value='100%'), column_labels_font_weight=OptionsInfo(scss=True, category='column_labels', type='value', value='normal'), column_labels_text_transform=OptionsInfo(scss=True, category='column_labels', type='value', value='inherit'), column_labels_padding=OptionsInfo(scss=True, category='column_labels', type='px', value='5px'), column_labels_padding_horizontal=OptionsInfo(scss=True, category='column_labels', type='px', value='5px'), column_labels_vlines_style=OptionsInfo(scss=True, category='table_body', type='value', value='none'), column_labels_vlines_width=OptionsInfo(scss=True, category='table_body', type='px', value='1px'), column_labels_vlines_color=OptionsInfo(scss=True, category='table_body', type='value', value='#D3D3D3'), column_labels_border_top_style=OptionsInfo(scss=True, category='column_labels', type='value', value='solid'), column_labels_border_top_width=OptionsInfo(scss=True, category='column_labels', type='px', value='2px'), column_labels_border_top_color=OptionsInfo(scss=True, category='column_labels', type='value', value='#D3D3D3'), column_labels_border_bottom_style=OptionsInfo(scss=True, category='column_labels', type='value', value='solid'), column_labels_border_bottom_width=OptionsInfo(scss=True, category='column_labels', type='px', value='2px'), column_labels_border_bottom_color=OptionsInfo(scss=True, category='column_labels', type='value', value='#D3D3D3'), column_labels_border_lr_style=OptionsInfo(scss=True, category='column_labels', type='value', value='none'), column_labels_border_lr_width=OptionsInfo(scss=True, category='column_labels', type='px', value='1px'), column_labels_border_lr_color=OptionsInfo(scss=True, category='column_labels', type='value', value='#D3D3D3'), column_labels_hidden=OptionsInfo(scss=False, category='column_labels', type='boolean', value=False), row_group_background_color=OptionsInfo(scss=True, category='row_group', type='value', value=None), row_group_font_size=OptionsInfo(scss=True, category='row_group', type='px', value='100%'), row_group_font_weight=OptionsInfo(scss=True, category='row_group', type='value', value='initial'), row_group_text_transform=OptionsInfo(scss=True, category='row_group', type='value', value='inherit'), row_group_padding=OptionsInfo(scss=True, category='row_group', type='px', value='8px'), row_group_padding_horizontal=OptionsInfo(scss=True, category='row_group', type='px', value='5px'), row_group_border_top_style=OptionsInfo(scss=True, category='row_group', type='value', value='solid'), row_group_border_top_width=OptionsInfo(scss=True, category='row_group', type='px', value='2px'), row_group_border_top_color=OptionsInfo(scss=True, category='row_group', type='value', value='#D3D3D3'), row_group_border_right_style=OptionsInfo(scss=True, category='row_group', type='value', value='none'), row_group_border_right_width=OptionsInfo(scss=True, category='row_group', type='px', value='1px'), row_group_border_right_color=OptionsInfo(scss=True, category='row_group', type='value', value='#D3D3D3'), row_group_border_bottom_style=OptionsInfo(scss=True, category='row_group', type='value', value='solid'), row_group_border_bottom_width=OptionsInfo(scss=True, category='row_group', type='px', value='2px'), row_group_border_bottom_color=OptionsInfo(scss=True, category='row_group', type='value', value='#D3D3D3'), row_group_border_left_style=OptionsInfo(scss=True, category='row_group', type='value', value='none'), row_group_border_left_width=OptionsInfo(scss=True, category='row_group', type='px', value='1px'), row_group_border_left_color=OptionsInfo(scss=True, category='row_group', type='value', value='#D3D3D3'), row_group_as_column=OptionsInfo(scss=False, category='row_group', type='boolean', value=False), table_body_hlines_style=OptionsInfo(scss=True, category='table_body', type='value', value='solid'), table_body_hlines_width=OptionsInfo(scss=True, category='table_body', type='px', value='1px'), table_body_hlines_color=OptionsInfo(scss=True, category='table_body', type='value', value='#D3D3D3'), table_body_vlines_style=OptionsInfo(scss=True, category='table_body', type='value', value='none'), table_body_vlines_width=OptionsInfo(scss=True, category='table_body', type='px', value='1px'), table_body_vlines_color=OptionsInfo(scss=True, category='table_body', type='value', value='#D3D3D3'), table_body_border_top_style=OptionsInfo(scss=True, category='table_body', type='value', value='solid'), table_body_border_top_width=OptionsInfo(scss=True, category='table_body', type='px', value='2px'), table_body_border_top_color=OptionsInfo(scss=True, category='table_body', type='value', value='#D3D3D3'), table_body_border_bottom_style=OptionsInfo(scss=True, category='table_body', type='value', value='solid'), table_body_border_bottom_width=OptionsInfo(scss=True, category='table_body', type='px', value='2px'), table_body_border_bottom_color=OptionsInfo(scss=True, category='table_body', type='value', value='#D3D3D3'), data_row_padding=OptionsInfo(scss=True, category='data_row', type='px', value='8px'), data_row_padding_horizontal=OptionsInfo(scss=True, category='data_row', type='px', value='5px'), stub_background_color=OptionsInfo(scss=True, category='stub', type='value', value=None), stub_font_size=OptionsInfo(scss=True, category='stub', type='px', value='100%'), stub_font_weight=OptionsInfo(scss=True, category='stub', type='value', value='initial'), stub_text_transform=OptionsInfo(scss=True, category='stub', type='value', value='inherit'), stub_border_style=OptionsInfo(scss=True, category='stub', type='value', value='solid'), stub_border_width=OptionsInfo(scss=True, category='stub', type='px', value='2px'), stub_border_color=OptionsInfo(scss=True, category='stub', type='value', value='#D3D3D3'), stub_indent_length=OptionsInfo(scss=True, category='stub', type='px', value='5px'), stub_row_group_background_color=OptionsInfo(scss=True, category='stub', type='value', value=None), stub_row_group_font_size=OptionsInfo(scss=True, category='stub', type='px', value='100%'), stub_row_group_font_weight=OptionsInfo(scss=True, category='stub', type='value', value='initial'), stub_row_group_text_transform=OptionsInfo(scss=True, category='stub', type='value', value='inherit'), stub_row_group_border_style=OptionsInfo(scss=True, category='stub', type='value', value='solid'), stub_row_group_border_width=OptionsInfo(scss=True, category='stub', type='px', value='2px'), stub_row_group_border_color=OptionsInfo(scss=True, category='stub', type='value', value='#D3D3D3'), summary_row_padding=OptionsInfo(scss=True, category='summary_row', type='px', value='8px'), summary_row_padding_horizontal=OptionsInfo(scss=True, category='summary_row', type='px', value='5px'), summary_row_background_color=OptionsInfo(scss=True, category='summary_row', type='value', value=None), summary_row_text_transform=OptionsInfo(scss=True, category='summary_row', type='value', value='inherit'), summary_row_border_style=OptionsInfo(scss=True, category='summary_row', type='value', value='solid'), summary_row_border_width=OptionsInfo(scss=True, category='summary_row', type='px', value='2px'), summary_row_border_color=OptionsInfo(scss=True, category='summary_row', type='value', value='#D3D3D3'), grand_summary_row_padding=OptionsInfo(scss=True, category='grand_summary_row', type='px', value='8px'), grand_summary_row_padding_horizontal=OptionsInfo(scss=True, category='grand_summary_row', type='px', value='5px'), grand_summary_row_background_color=OptionsInfo(scss=True, category='grand_summary_row', type='value', value=None), grand_summary_row_text_transform=OptionsInfo(scss=True, category='grand_summary_row', type='value', value='inherit'), grand_summary_row_border_style=OptionsInfo(scss=True, category='grand_summary_row', type='value', value='double'), grand_summary_row_border_width=OptionsInfo(scss=True, category='grand_summary_row', type='px', value='6px'), grand_summary_row_border_color=OptionsInfo(scss=True, category='grand_summary_row', type='value', value='#D3D3D3'), footnotes_marks=OptionsInfo(scss=False, category='footnotes', type='values', value='numbers'), footnotes_spec_ref=OptionsInfo(scss=False, category='footnotes', type='value', value='^i'), footnotes_spec_ftr=OptionsInfo(scss=False, category='footnotes', type='value', value='^i'), footnotes_order=OptionsInfo(scss=False, category='footnotes', type='value', value='marks_last'), source_notes_padding=OptionsInfo(scss=True, category='source_notes', type='px', value='4px'), source_notes_padding_horizontal=OptionsInfo(scss=True, category='source_notes', type='px', value='5px'), source_notes_background_color=OptionsInfo(scss=True, category='source_notes', type='value', value=None), source_notes_font_size=OptionsInfo(scss=True, category='source_notes', type='px', value='90%'), source_notes_border_bottom_style=OptionsInfo(scss=True, category='source_notes', type='value', value='none'), source_notes_border_bottom_width=OptionsInfo(scss=True, category='source_notes', type='px', value='2px'), source_notes_border_bottom_color=OptionsInfo(scss=True, category='source_notes', type='value', value='#D3D3D3'), source_notes_border_lr_style=OptionsInfo(scss=True, category='source_notes', type='value', value='none'), source_notes_border_lr_width=OptionsInfo(scss=True, category='source_notes', type='px', value='2px'), source_notes_border_lr_color=OptionsInfo(scss=True, category='source_notes', type='value', value='#D3D3D3'), source_notes_multiline=OptionsInfo(scss=False, category='source_notes', type='boolean', value=True), source_notes_sep=OptionsInfo(scss=False, category='source_notes', type='value', value=' '), row_striping_background_color=OptionsInfo(scss=True, category='row', type='value', value='#F4F4F4'), row_striping_include_stub=OptionsInfo(scss=False, category='row', type='boolean', value=False), row_striping_include_table_body=OptionsInfo(scss=False, category='row', type='boolean', value=False), container_width=OptionsInfo(scss=False, category='container', type='px', value='auto'), container_height=OptionsInfo(scss=False, category='container', type='px', value='auto'), container_padding_x=OptionsInfo(scss=False, category='container', type='px', value='0px'), container_padding_y=OptionsInfo(scss=False, category='container', type='px', value='10px'), container_overflow_x=OptionsInfo(scss=False, category='container', type='overflow', value='auto'), container_overflow_y=OptionsInfo(scss=False, category='container', type='overflow', value='auto'), quarto_disable_processing=OptionsInfo(scss=False, category='quarto', type='logical', value=False), quarto_use_bootstrap=OptionsInfo(scss=False, category='quarto', type='logical', value=False), ihtml_active=OptionsInfo(scss=False, category='ihtml', type='boolean', value=False), ihtml_use_pagination=OptionsInfo(scss=False, category='ihtml', type='boolean', value=True), ihtml_use_pagination_info=OptionsInfo(scss=False, category='ihtml', type='boolean', value=True), ihtml_use_sorting=OptionsInfo(scss=False, category='ihtml', type='boolean', value=True), ihtml_use_search=OptionsInfo(scss=False, category='ihtml', type='boolean', value=False), ihtml_use_filters=OptionsInfo(scss=False, category='ihtml', type='boolean', value=False), ihtml_use_resizers=OptionsInfo(scss=False, category='ihtml', type='boolean', value=False), ihtml_use_highlight=OptionsInfo(scss=False, category='ihtml', type='boolean', value=False), ihtml_use_compact_mode=OptionsInfo(scss=False, category='ihtml', type='boolean', value=False), ihtml_use_text_wrapping=OptionsInfo(scss=False, category='ihtml', type='boolean', value=True), ihtml_use_page_size_select=OptionsInfo(scss=False, category='ihtml', type='boolean', value=False), ihtml_page_size_default=OptionsInfo(scss=False, category='ihtml', type='value', value=10), ihtml_page_size_values=OptionsInfo(scss=False, category='ihtml', type='values', value=[10, 25, 50, 100]), ihtml_pagination_type=OptionsInfo(scss=False, category='ihtml', type='value', value='numbers'), ihtml_height=OptionsInfo(scss=False, category='ihtml', type='value', value='auto'), ihtml_selection_mode=OptionsInfo(scss=False, category='ihtml', type='value', value=None)), _google_font_imports=GoogleFontImports(imports=frozenset()), _has_built=False)</w:t>
       </w:r>
     </w:p>
     <w:bookmarkEnd w:id="38"/>
@@ -3618,16 +2829,16 @@
         <w:t xml:space="preserve"> </w:t>
       </w:r>
       <w:r>
-        <w:t xml:space="preserve">El generador produce transiciones orgánicas paso a paso. La articulación senoidal con envolvente ADSR suprime discontinuidades abruptas y genera tonos limpios con armónicos sutiles.</w:t>
+        <w:t xml:space="preserve">La envolvente ADSR suprime chasquidos en los tonos senoidales y genera transiciones limpias.</w:t>
       </w:r>
     </w:p>
     <w:p>
       <w:pPr>
         <w:pStyle w:val="Heading3"/>
       </w:pPr>
-      <w:bookmarkStart w:id="46" w:name="_fcbe1948265e7aec17e44b9fd7a120eb858f767"/>
-      <w:r>
-        <w:t xml:space="preserve">2.6. Composición extendida y armonización polifónica</w:t>
+      <w:bookmarkStart w:id="46" w:name="_e80cc834bd0fdc49816594d2d263a19a5e83027"/>
+      <w:r>
+        <w:t xml:space="preserve">2.6. Armonización</w:t>
       </w:r>
       <w:bookmarkEnd w:id="46"/>
     </w:p>
@@ -3636,7 +2847,7 @@
         <w:pStyle w:val="FirstParagraph"/>
       </w:pPr>
       <w:r>
-        <w:t xml:space="preserve">Para apreciar la textura tonal a mayor escala, se simula una secuencia extendida de 32 pasos y una pieza polifónica a 8 compases donde una cadena markoviana gobierna la progresión armónica (</w:t>
+        <w:t xml:space="preserve">Para evaluar texturas a mayor escala, se generó una secuencia de 32 pasos y una pieza polifónica a 8 compases donde una cadena gobierna la progresión de acordes (</w:t>
       </w:r>
       <m:oMath>
         <m:r>
@@ -3674,7 +2885,7 @@
         </m:r>
       </m:oMath>
       <w:r>
-        <w:t xml:space="preserve">) mientras otra cadena genera la línea melódica solista simultáneamente:</w:t>
+        <w:t xml:space="preserve">) mientras otra genera la línea melódica simultáneamente:</w:t>
       </w:r>
     </w:p>
     <w:p>
@@ -3691,44 +2902,6 @@
     </w:p>
     <w:bookmarkEnd w:id="47"/>
     <w:bookmarkStart w:id="48" w:name="_0281a68b"/>
-    <w:p>
-      <w:pPr>
-        <w:pStyle w:val="SourceCode"/>
-      </w:pPr>
-      <w:r>
-        <w:rPr>
-          <w:rStyle w:val="VerbatimChar"/>
-        </w:rPr>
-        <w:t xml:space="preserve">Melodía de 32 pasos generada con éxito:</w:t>
-      </w:r>
-      <w:r>
-        <w:br/>
-      </w:r>
-      <w:r>
-        <w:rPr>
-          <w:rStyle w:val="VerbatimChar"/>
-        </w:rPr>
-        <w:t xml:space="preserve">../export/melodia_markov_32.wav</w:t>
-      </w:r>
-      <w:r>
-        <w:br/>
-      </w:r>
-      <w:r>
-        <w:rPr>
-          <w:rStyle w:val="VerbatimChar"/>
-        </w:rPr>
-        <w:t xml:space="preserve">Pista polifónica generada con éxito:</w:t>
-      </w:r>
-      <w:r>
-        <w:br/>
-      </w:r>
-      <w:r>
-        <w:rPr>
-          <w:rStyle w:val="VerbatimChar"/>
-        </w:rPr>
-        <w:t xml:space="preserve">../export/melodia_armonizada_8compases.wav</w:t>
-      </w:r>
-    </w:p>
     <w:bookmarkEnd w:id="48"/>
     <w:bookmarkStart w:id="49" w:name="_08da0ce4"/>
     <w:p>
@@ -3769,7 +2942,7 @@
         <w:t xml:space="preserve"> </w:t>
       </w:r>
       <w:r>
-        <w:t xml:space="preserve">El acoplamiento de cadenas concurrentes genera riqueza sonora sin elevar exponencialmente la dimensionalidad del espacio de estados individual.</w:t>
+        <w:t xml:space="preserve">El acoplamiento de dos cadenas produce polifonía sin elevar el espacio de estados individual.</w:t>
       </w:r>
     </w:p>
     <w:bookmarkEnd w:id="51"/>
@@ -3789,7 +2962,7 @@
         <w:pStyle w:val="FirstParagraph"/>
       </w:pPr>
       <w:r>
-        <w:t xml:space="preserve">Uno empieza programando estas cadenas pensando que la música va a sonar robótica o totalmente al azar, como el prototipo plano de Netlify donde todas las notas tienen casi la misma probabilidad de salir. Pero en cuanto metes pesos basados en teoría armónica, la cosa cambia por completo. Como vimos con el profe Ricardo Peña en la clase del 8 de octubre, un proceso markoviano no es lanzar una moneda al aire sin ton ni son; es capturar la estructura condicional de un sistema paso a paso. El ejemplo de los registros de estudio de 20 días que vimos en clase lo ilustra perfecto: dos alumnos pueden tener exactamente 11 días de estudio y el conteo frecuentista simple de 11 sobre 20 los ve idénticos, pero al descomponer la secuencia en bigramas descubres que uno sigue una regla clara de 70 por ciento de estudiar si estudió ayer, mientras que el otro simplemente tiraba un volado de 50 sobre 50. En la música pasa exactamente lo mismo: una escala diatónica tiene las mismas 7 notas, pero la diferencia entre una melodía coherente y puro ruido radica en la matriz de probabilidades de transición entre estados consecutivos.</w:t>
+        <w:t xml:space="preserve">Uno empieza pensando que la música va a sonar robótica o caótica como en el prototipo de Netlify, donde cada nota tiene casi la misma probabilidad de salir. Pero en cuanto incorporas teoría armónica, la melodía cobra sentido. Como vimos con el profe Ricardo Peña en la clase del 8 de octubre, un proceso markoviano modela la dependencia condicional paso a paso. El caso de los registros de estudio de 20 días con 11 días de estudio lo ilustra bien: el conteo frecuentista no distingue entre seguir una regla o tirar una moneda, pero el análisis de bigramas revela la verdadera estructura. En música ocurre igual, pues la coherencia melódica surge de la probabilidad condicional entre notas consecutivas.</w:t>
       </w:r>
     </w:p>
     <w:p>
@@ -3797,7 +2970,7 @@
         <w:pStyle w:val="BodyText"/>
       </w:pPr>
       <w:r>
-        <w:t xml:space="preserve">Sin embargo, la música que disfrutamos culturalmente no es una caminata infinita que deambula sin rumbo; vive de la repetición deliberada de motivos, estribillos y simetrías periódicas. Una cadena de primer orden padece de amnesia temporal: solo sabe en qué nota está parada hoy, pero ignora por completo si esa nota forma parte de una frase melódica que ya se tocó dos veces o si la pieza va comenzando o terminando. Para incorporar patrones repetitivos reales tendríamos que subir a cadenas de orden superior con memoria de 3 o 4 pasos, o emplear modelos de orden variable como vimos con el modelo de lenguaje de 3 palabras de Rodrigo Castellanos ("él", "gato", "duerme"). En aquel ejercicio de clase, las probabilidades iban evolucionando en cada paso a partir del vector inicial hasta estabilizarse tras unas 20 iteraciones, exactamente igual a como el algoritmo PageRank de Larry Page calcula la relevancia de páginas en la web mediante caminantes aleatorios. No obstante, al aumentar la memoria en música el espacio de estados explota y el modelo termina repitiendo fragmentos de memoria en vez de componer material nuevo.</w:t>
+        <w:t xml:space="preserve">La música real depende de la repetición deliberada de motivos y estribillos, pero una cadena de primer orden padece de amnesia temporal porque solo recuerda el estado actual. Para capturar patrones repetitivos se requeriría ampliar la memoria a órdenes superiores o usar modelos de orden variable, similar al ejercicio en clase del modelo de tres palabras de Rodrigo Castellanos ("él", "gato", "duerme") que estabilizó probabilidades tras 20 pasos, o como hace PageRank con caminantes aleatorios. Sin embargo, aumentar la memoria provoca una explosión en el espacio de estados, haciendo que el modelo memorice el corpus en lugar de generar variaciones fluidas.</w:t>
       </w:r>
     </w:p>
     <w:p>
@@ -3805,7 +2978,7 @@
         <w:pStyle w:val="BodyText"/>
       </w:pPr>
       <w:r>
-        <w:t xml:space="preserve">Por otro lado, el modelo sí tiene la capacidad de aprender la estadística local de un estilo si le suministramos un dataset de archivos MIDI de compositores barrocos o solos de jazz y calculamos las probabilidades de transición por máxima verosimilitud contando bigramas con suavizado de Laplace o Kneser Ney. Al hacer esto, la matriz absorbe los giros idiomáticos locales de inmediato, como la evitación estricta de quintas paralelas o la resolución obligada de dominante a tónica. Pero el modelo se topa con un límite estructural insalvable: carece por completo de teleología. La música tonal humana es teleológica porque plantea una tensión armónica que tarda 16 o 32 compases en resolver hacia una meta. Una cadena markoviana solo sabe qué nota conviene tocar en el siguiente medio segundo. Además, según la teoría generativa de Lerdahl y Jackendoff, el cerebro procesa la música como árboles jerárquicos de reducción similares a la sintaxis lingüística de Chomsky, con estructuras anidadas que un autómata finito regular no puede modelar, a lo que se suma que una polifonía real a 4 voces dispara el espacio conjunto a 20736 estados.</w:t>
+        <w:t xml:space="preserve">El modelo puede aprender la estadística local de un estilo estimando probabilidades por máxima verosimilitud sobre bigramas de un corpus MIDI con suavizado de Laplace. Con esto aprende cadencias comunes y evita quintas paralelas. No obstante, carece por completo de teleología: no tiene dirección formal a largo plazo y no sabe hacia dónde va la pieza tras medio segundo. Además, según la teoría de Lerdahl y Jackendoff, la música se organiza en árboles jerárquicos anidados que un autómata finito regular no puede representar, mientras que incorporar polifonía a cuatro voces dispararía el sistema a más de 20 mil estados.</w:t>
       </w:r>
     </w:p>
     <w:p>
@@ -3813,7 +2986,7 @@
         <w:pStyle w:val="BodyText"/>
       </w:pPr>
       <w:r>
-        <w:t xml:space="preserve">Al final, igual que ocurre con la teoría de colas M/M/1 y el dimensionamiento de cajas de cobro en Walmart que platicamos en clase, el valor de estos modelos no radica en buscar una perfección abstracta sino en construir simuladores ágiles para tomar decisiones. Al implementar duraciones rítmicas variadas y suavizado de envolvente ADSR para eliminar clics acústicos molestos en las ondas senoidales, el script genera bocetos tonales sorprendentemente musicales con un costo computacional mínimo. La industria contemporánea ya resolvió la coherencia musical global migrando hacia modelos neuronales profundos con mecanismos de atención como Transformers, pero como herramienta matemática para comprender cómo la probabilidad condicional gobierna la física del sonido, la cadena de Markov demuestra una potencia pedagógica extraordinaria.</w:t>
+        <w:t xml:space="preserve">Al igual que con el análisis de colas M/M/1 y el dimensionamiento de cajas en Walmart discutido en clase, estos modelos sirven para simular escenarios rápidos sin arrastrar historiales pesados. Con duraciones variables y envolvente ADSR para evitar chasquidos en los tonos senoidales, la cadena produce secuencias musicales interesantes con mínimo costo computacional. Aunque la generación actual utilice redes con atención, la cadena de Markov sigue siendo una base intuitiva y elegante para entender procesos estocásticos.</w:t>
       </w:r>
     </w:p>
     <w:bookmarkEnd w:id="53"/>
@@ -3840,9 +3013,9 @@
       <w:pPr>
         <w:pStyle w:val="Heading3"/>
       </w:pPr>
-      <w:bookmarkStart w:id="55" w:name="_c0b66e4faad0e895ed700e163ac51a3d7b05bf7"/>
-      <w:r>
-        <w:t xml:space="preserve">Apéndice A: Configuración y parámetros iniciales</w:t>
+      <w:bookmarkStart w:id="55" w:name="_b3a427d402bf6028796f868dc86ac122bcc9e4f"/>
+      <w:r>
+        <w:t xml:space="preserve">Apéndice A: Configuración inicial</w:t>
       </w:r>
       <w:bookmarkEnd w:id="55"/>
     </w:p>
@@ -5667,9 +4840,9 @@
       <w:pPr>
         <w:pStyle w:val="Heading3"/>
       </w:pPr>
-      <w:bookmarkStart w:id="56" w:name="_97ffbb20d8f85f0269f0cdc575dcdba9c93a45d"/>
-      <w:r>
-        <w:t xml:space="preserve">Apéndice B: Grados de la escala y frecuencias acústicas</w:t>
+      <w:bookmarkStart w:id="56" w:name="_94faee65064707f428a3042412b92a741b38946"/>
+      <w:r>
+        <w:t xml:space="preserve">Apéndice B: Escala diatónica</w:t>
       </w:r>
       <w:bookmarkEnd w:id="56"/>
     </w:p>
@@ -6564,9 +5737,9 @@
       <w:pPr>
         <w:pStyle w:val="Heading3"/>
       </w:pPr>
-      <w:bookmarkStart w:id="57" w:name="_0ae029474d9055774b1c91200785f5ff5295bdd"/>
-      <w:r>
-        <w:t xml:space="preserve">Apéndice C: Matriz de transición y validación estocástica</w:t>
+      <w:bookmarkStart w:id="57" w:name="_90da8cc57b9abfcea0a40531065b0184e17cb47"/>
+      <w:r>
+        <w:t xml:space="preserve">Apéndice C: Matriz de transición</w:t>
       </w:r>
       <w:bookmarkEnd w:id="57"/>
     </w:p>
@@ -7365,9 +6538,9 @@
       <w:pPr>
         <w:pStyle w:val="Heading3"/>
       </w:pPr>
-      <w:bookmarkStart w:id="58" w:name="_c8021107ef2bf9cb84a9b6c827842c4764951d5"/>
-      <w:r>
-        <w:t xml:space="preserve">Apéndice D: Visualización y distribución estacionaria</w:t>
+      <w:bookmarkStart w:id="58" w:name="_69cc43fa94006c9877b07362ed26e914891dd41"/>
+      <w:r>
+        <w:t xml:space="preserve">Apéndice D: Distribución estacionaria</w:t>
       </w:r>
       <w:bookmarkEnd w:id="58"/>
     </w:p>
@@ -8424,9 +7597,9 @@
       <w:pPr>
         <w:pStyle w:val="Heading3"/>
       </w:pPr>
-      <w:bookmarkStart w:id="59" w:name="_99852c1f256ba08f3e13f13b475396ec17e4367"/>
-      <w:r>
-        <w:t xml:space="preserve">Apéndice E: Generador estocástico y síntesis acústica ADSR</w:t>
+      <w:bookmarkStart w:id="59" w:name="_645549be2c1bd76f8081f13303099f839e94993"/>
+      <w:r>
+        <w:t xml:space="preserve">Apéndice E: Generador de melodías</w:t>
       </w:r>
       <w:bookmarkEnd w:id="59"/>
     </w:p>
@@ -9624,9 +8797,9 @@
       <w:pPr>
         <w:pStyle w:val="Heading3"/>
       </w:pPr>
-      <w:bookmarkStart w:id="60" w:name="_1e4bc0bf7e1c033365607b029da58ff0e81f601"/>
-      <w:r>
-        <w:t xml:space="preserve">Apéndice F: Composición extendida y armonización polifónica</w:t>
+      <w:bookmarkStart w:id="60" w:name="_9662aabd295433592026ddac655d90333bceb5e"/>
+      <w:r>
+        <w:t xml:space="preserve">Apéndice F: Armonización</w:t>
       </w:r>
       <w:bookmarkEnd w:id="60"/>
     </w:p>
@@ -10661,9 +9834,6 @@
     <w:abstractNumId w:val="991"/>
   </w:num>
   <w:num w:numId="1004">
-    <w:abstractNumId w:val="991"/>
-  </w:num>
-  <w:num w:numId="1005">
     <w:abstractNumId w:val="991"/>
   </w:num>
 </w:numbering>

</xml_diff>

<commit_message>
feat(quant): align classroom examples, rubric notes, and delivery zip
</commit_message>
<xml_diff>
--- a/m4-quant/act 2/export/Actividad_4_2_A01750536.docx
+++ b/m4-quant/act 2/export/Actividad_4_2_A01750536.docx
@@ -330,7 +330,7 @@
         <w:rPr>
           <w:rStyle w:val="VerbatimChar"/>
         </w:rPr>
-        <w:t xml:space="preserve">6           Duraciones      4 figuras (120 BPM), _body=&lt;great_tables._gt_data.Body object at 0xeba88a7c7230&gt;, _boxhead=Boxhead([ColInfo(var='Parámetro', type=&lt;ColInfoTypeEnum.default: 1&gt;, column_label='Parámetro', column_align='left', column_width=None, stub_level=None), ColInfo(var='Valor', type=&lt;ColInfoTypeEnum.default: 1&gt;, column_label='Valor', column_align='right', column_width=None, stub_level=None)]), _stub=&lt;great_tables._gt_data.Stub object at 0xeba88a7c70e0&gt;, _spanners=Spanners([]), _heading=Heading(title='Resumen del Sistema y Síntesis Acústica', subtitle=None, preheader=None), _stubhead=None, _summary_rows=&lt;great_tables._gt_data.SummaryRows object at 0xeba88a7c7770&gt;, _summary_rows_grand=&lt;great_tables._gt_data.SummaryRows object at 0xeba88a85d6d0&gt;, _source_notes=[], _footnotes=[], _styles=[], _locale=&lt;great_tables._gt_data.Locale object at 0xeba88a7c78c0&gt;, _formats=[], _substitutions=[], _col_merge=[], _transforms=[], _options=Options(table_id=OptionsInfo(scss=False, category='table', type='value', value=None), table_caption=OptionsInfo(scss=False, category='table', type='value', value=None), table_width=OptionsInfo(scss=True, category='table', type='px', value='auto'), table_layout=OptionsInfo(scss=True, category='table', type='value', value='fixed'), table_margin_left=OptionsInfo(scss=True, category='table', type='px', value='auto'), table_margin_right=OptionsInfo(scss=True, category='table', type='px', value='auto'), table_background_color=OptionsInfo(scss=True, category='table', type='value', value='#FFFFFF'), table_additional_css=OptionsInfo(scss=False, category='table', type='values', value=[]), table_font_names=OptionsInfo(scss=False, category='table', type='values', value=['-apple-system', 'BlinkMacSystemFont', 'Segoe UI', 'Roboto', 'Oxygen', 'Ubuntu', 'Cantarell', 'Helvetica Neue', 'Fira Sans', 'Droid Sans', 'Arial', 'sans-serif']), table_font_size=OptionsInfo(scss=True, category='table', type='px', value='16px'), table_font_weight=OptionsInfo(scss=True, category='table', type='value', value='normal'), table_font_style=OptionsInfo(scss=True, category='table', type='value', value='normal'), table_font_color=OptionsInfo(scss=True, category='table', type='value', value='#333333'), table_font_color_light=OptionsInfo(scss=True, category='table', type='value', value='#FFFFFF'), table_border_top_include=OptionsInfo(scss=False, category='table', type='boolean', value=True), table_border_top_style=OptionsInfo(scss=True, category='table', type='value', value='solid'), table_border_top_width=OptionsInfo(scss=True, category='table', type='px', value='2px'), table_border_top_color=OptionsInfo(scss=True, category='table', type='value', value='#A8A8A8'), table_border_right_style=OptionsInfo(scss=True, category='table', type='value', value='none'), table_border_right_width=OptionsInfo(scss=True, category='table', type='px', value='2px'), table_border_right_color=OptionsInfo(scss=True, category='table', type='value', value='#D3D3D3'), table_border_bottom_include=OptionsInfo(scss=False, category='table', type='boolean', value=True), table_border_bottom_style=OptionsInfo(scss=True, category='table', type='value', value='solid'), table_border_bottom_width=OptionsInfo(scss=True, category='table', type='px', value='2px'), table_border_bottom_color=OptionsInfo(scss=True, category='table', type='value', value='#A8A8A8'), table_border_left_style=OptionsInfo(scss=True, category='table', type='value', value='none'), table_border_left_width=OptionsInfo(scss=True, category='table', type='px', value='2px'), table_border_left_color=OptionsInfo(scss=True, category='table', type='value', value='#D3D3D3'), heading_background_color=OptionsInfo(scss=True, category='heading', type='value', value=None), heading_align=OptionsInfo(scss=True, category='heading', type='value', value='center'), heading_title_font_size=OptionsInfo(scss=True, category='heading', type='px', value='125%'), heading_title_font_weight=OptionsInfo(scss=True, category='heading', type='value', value='initial'), heading_subtitle_font_size=OptionsInfo(scss=True, category='heading', type='px', value='85%'), heading_subtitle_font_weight=OptionsInfo(scss=True, category='heading', type='value', value='initial'), heading_padding=OptionsInfo(scss=True, category='heading', type='px', value='4px'), heading_padding_horizontal=OptionsInfo(scss=True, category='heading', type='px', value='5px'), heading_border_bottom_style=OptionsInfo(scss=True, category='heading', type='value', value='solid'), heading_border_bottom_width=OptionsInfo(scss=True, category='heading', type='px', value='2px'), heading_border_bottom_color=OptionsInfo(scss=True, category='heading', type='value', value='#D3D3D3'), heading_border_lr_style=OptionsInfo(scss=True, category='heading', type='value', value='none'), heading_border_lr_width=OptionsInfo(scss=True, category='heading', type='px', value='1px'), heading_border_lr_color=OptionsInfo(scss=True, category='heading', type='value', value='#D3D3D3'), column_labels_background_color=OptionsInfo(scss=True, category='column_labels', type='value', value=None), column_labels_font_size=OptionsInfo(scss=True, category='column_labels', type='px', value='100%'), column_labels_font_weight=OptionsInfo(scss=True, category='column_labels', type='value', value='normal'), column_labels_text_transform=OptionsInfo(scss=True, category='column_labels', type='value', value='inherit'), column_labels_padding=OptionsInfo(scss=True, category='column_labels', type='px', value='5px'), column_labels_padding_horizontal=OptionsInfo(scss=True, category='column_labels', type='px', value='5px'), column_labels_vlines_style=OptionsInfo(scss=True, category='table_body', type='value', value='none'), column_labels_vlines_width=OptionsInfo(scss=True, category='table_body', type='px', value='1px'), column_labels_vlines_color=OptionsInfo(scss=True, category='table_body', type='value', value='#D3D3D3'), column_labels_border_top_style=OptionsInfo(scss=True, category='column_labels', type='value', value='solid'), column_labels_border_top_width=OptionsInfo(scss=True, category='column_labels', type='px', value='2px'), column_labels_border_top_color=OptionsInfo(scss=True, category='column_labels', type='value', value='#D3D3D3'), column_labels_border_bottom_style=OptionsInfo(scss=True, category='column_labels', type='value', value='solid'), column_labels_border_bottom_width=OptionsInfo(scss=True, category='column_labels', type='px', value='2px'), column_labels_border_bottom_color=OptionsInfo(scss=True, category='column_labels', type='value', value='#D3D3D3'), column_labels_border_lr_style=OptionsInfo(scss=True, category='column_labels', type='value', value='none'), column_labels_border_lr_width=OptionsInfo(scss=True, category='column_labels', type='px', value='1px'), column_labels_border_lr_color=OptionsInfo(scss=True, category='column_labels', type='value', value='#D3D3D3'), column_labels_hidden=OptionsInfo(scss=False, category='column_labels', type='boolean', value=False), row_group_background_color=OptionsInfo(scss=True, category='row_group', type='value', value=None), row_group_font_size=OptionsInfo(scss=True, category='row_group', type='px', value='100%'), row_group_font_weight=OptionsInfo(scss=True, category='row_group', type='value', value='initial'), row_group_text_transform=OptionsInfo(scss=True, category='row_group', type='value', value='inherit'), row_group_padding=OptionsInfo(scss=True, category='row_group', type='px', value='8px'), row_group_padding_horizontal=OptionsInfo(scss=True, category='row_group', type='px', value='5px'), row_group_border_top_style=OptionsInfo(scss=True, category='row_group', type='value', value='solid'), row_group_border_top_width=OptionsInfo(scss=True, category='row_group', type='px', value='2px'), row_group_border_top_color=OptionsInfo(scss=True, category='row_group', type='value', value='#D3D3D3'), row_group_border_right_style=OptionsInfo(scss=True, category='row_group', type='value', value='none'), row_group_border_right_width=OptionsInfo(scss=True, category='row_group', type='px', value='1px'), row_group_border_right_color=OptionsInfo(scss=True, category='row_group', type='value', value='#D3D3D3'), row_group_border_bottom_style=OptionsInfo(scss=True, category='row_group', type='value', value='solid'), row_group_border_bottom_width=OptionsInfo(scss=True, category='row_group', type='px', value='2px'), row_group_border_bottom_color=OptionsInfo(scss=True, category='row_group', type='value', value='#D3D3D3'), row_group_border_left_style=OptionsInfo(scss=True, category='row_group', type='value', value='none'), row_group_border_left_width=OptionsInfo(scss=True, category='row_group', type='px', value='1px'), row_group_border_left_color=OptionsInfo(scss=True, category='row_group', type='value', value='#D3D3D3'), row_group_as_column=OptionsInfo(scss=False, category='row_group', type='boolean', value=False), table_body_hlines_style=OptionsInfo(scss=True, category='table_body', type='value', value='solid'), table_body_hlines_width=OptionsInfo(scss=True, category='table_body', type='px', value='1px'), table_body_hlines_color=OptionsInfo(scss=True, category='table_body', type='value', value='#D3D3D3'), table_body_vlines_style=OptionsInfo(scss=True, category='table_body', type='value', value='none'), table_body_vlines_width=OptionsInfo(scss=True, category='table_body', type='px', value='1px'), table_body_vlines_color=OptionsInfo(scss=True, category='table_body', type='value', value='#D3D3D3'), table_body_border_top_style=OptionsInfo(scss=True, category='table_body', type='value', value='solid'), table_body_border_top_width=OptionsInfo(scss=True, category='table_body', type='px', value='2px'), table_body_border_top_color=OptionsInfo(scss=True, category='table_body', type='value', value='#D3D3D3'), table_body_border_bottom_style=OptionsInfo(scss=True, category='table_body', type='value', value='solid'), table_body_border_bottom_width=OptionsInfo(scss=True, category='table_body', type='px', value='2px'), table_body_border_bottom_color=OptionsInfo(scss=True, category='table_body', type='value', value='#D3D3D3'), data_row_padding=OptionsInfo(scss=True, category='data_row', type='px', value='8px'), data_row_padding_horizontal=OptionsInfo(scss=True, category='data_row', type='px', value='5px'), stub_background_color=OptionsInfo(scss=True, category='stub', type='value', value=None), stub_font_size=OptionsInfo(scss=True, category='stub', type='px', value='100%'), stub_font_weight=OptionsInfo(scss=True, category='stub', type='value', value='initial'), stub_text_transform=OptionsInfo(scss=True, category='stub', type='value', value='inherit'), stub_border_style=OptionsInfo(scss=True, category='stub', type='value', value='solid'), stub_border_width=OptionsInfo(scss=True, category='stub', type='px', value='2px'), stub_border_color=OptionsInfo(scss=True, category='stub', type='value', value='#D3D3D3'), stub_indent_length=OptionsInfo(scss=True, category='stub', type='px', value='5px'), stub_row_group_background_color=OptionsInfo(scss=True, category='stub', type='value', value=None), stub_row_group_font_size=OptionsInfo(scss=True, category='stub', type='px', value='100%'), stub_row_group_font_weight=OptionsInfo(scss=True, category='stub', type='value', value='initial'), stub_row_group_text_transform=OptionsInfo(scss=True, category='stub', type='value', value='inherit'), stub_row_group_border_style=OptionsInfo(scss=True, category='stub', type='value', value='solid'), stub_row_group_border_width=OptionsInfo(scss=True, category='stub', type='px', value='2px'), stub_row_group_border_color=OptionsInfo(scss=True, category='stub', type='value', value='#D3D3D3'), summary_row_padding=OptionsInfo(scss=True, category='summary_row', type='px', value='8px'), summary_row_padding_horizontal=OptionsInfo(scss=True, category='summary_row', type='px', value='5px'), summary_row_background_color=OptionsInfo(scss=True, category='summary_row', type='value', value=None), summary_row_text_transform=OptionsInfo(scss=True, category='summary_row', type='value', value='inherit'), summary_row_border_style=OptionsInfo(scss=True, category='summary_row', type='value', value='solid'), summary_row_border_width=OptionsInfo(scss=True, category='summary_row', type='px', value='2px'), summary_row_border_color=OptionsInfo(scss=True, category='summary_row', type='value', value='#D3D3D3'), grand_summary_row_padding=OptionsInfo(scss=True, category='grand_summary_row', type='px', value='8px'), grand_summary_row_padding_horizontal=OptionsInfo(scss=True, category='grand_summary_row', type='px', value='5px'), grand_summary_row_background_color=OptionsInfo(scss=True, category='grand_summary_row', type='value', value=None), grand_summary_row_text_transform=OptionsInfo(scss=True, category='grand_summary_row', type='value', value='inherit'), grand_summary_row_border_style=OptionsInfo(scss=True, category='grand_summary_row', type='value', value='double'), grand_summary_row_border_width=OptionsInfo(scss=True, category='grand_summary_row', type='px', value='6px'), grand_summary_row_border_color=OptionsInfo(scss=True, category='grand_summary_row', type='value', value='#D3D3D3'), footnotes_marks=OptionsInfo(scss=False, category='footnotes', type='values', value='numbers'), footnotes_spec_ref=OptionsInfo(scss=False, category='footnotes', type='value', value='^i'), footnotes_spec_ftr=OptionsInfo(scss=False, category='footnotes', type='value', value='^i'), footnotes_order=OptionsInfo(scss=False, category='footnotes', type='value', value='marks_last'), source_notes_padding=OptionsInfo(scss=True, category='source_notes', type='px', value='4px'), source_notes_padding_horizontal=OptionsInfo(scss=True, category='source_notes', type='px', value='5px'), source_notes_background_color=OptionsInfo(scss=True, category='source_notes', type='value', value=None), source_notes_font_size=OptionsInfo(scss=True, category='source_notes', type='px', value='90%'), source_notes_border_bottom_style=OptionsInfo(scss=True, category='source_notes', type='value', value='none'), source_notes_border_bottom_width=OptionsInfo(scss=True, category='source_notes', type='px', value='2px'), source_notes_border_bottom_color=OptionsInfo(scss=True, category='source_notes', type='value', value='#D3D3D3'), source_notes_border_lr_style=OptionsInfo(scss=True, category='source_notes', type='value', value='none'), source_notes_border_lr_width=OptionsInfo(scss=True, category='source_notes', type='px', value='2px'), source_notes_border_lr_color=OptionsInfo(scss=True, category='source_notes', type='value', value='#D3D3D3'), source_notes_multiline=OptionsInfo(scss=False, category='source_notes', type='boolean', value=True), source_notes_sep=OptionsInfo(scss=False, category='source_notes', type='value', value=' '), row_striping_background_color=OptionsInfo(scss=True, category='row', type='value', value='#F4F4F4'), row_striping_include_stub=OptionsInfo(scss=False, category='row', type='boolean', value=False), row_striping_include_table_body=OptionsInfo(scss=False, category='row', type='boolean', value=False), container_width=OptionsInfo(scss=False, category='container', type='px', value='auto'), container_height=OptionsInfo(scss=False, category='container', type='px', value='auto'), container_padding_x=OptionsInfo(scss=False, category='container', type='px', value='0px'), container_padding_y=OptionsInfo(scss=False, category='container', type='px', value='10px'), container_overflow_x=OptionsInfo(scss=False, category='container', type='overflow', value='auto'), container_overflow_y=OptionsInfo(scss=False, category='container', type='overflow', value='auto'), quarto_disable_processing=OptionsInfo(scss=False, category='quarto', type='logical', value=False), quarto_use_bootstrap=OptionsInfo(scss=False, category='quarto', type='logical', value=False), ihtml_active=OptionsInfo(scss=False, category='ihtml', type='boolean', value=False), ihtml_use_pagination=OptionsInfo(scss=False, category='ihtml', type='boolean', value=True), ihtml_use_pagination_info=OptionsInfo(scss=False, category='ihtml', type='boolean', value=True), ihtml_use_sorting=OptionsInfo(scss=False, category='ihtml', type='boolean', value=True), ihtml_use_search=OptionsInfo(scss=False, category='ihtml', type='boolean', value=False), ihtml_use_filters=OptionsInfo(scss=False, category='ihtml', type='boolean', value=False), ihtml_use_resizers=OptionsInfo(scss=False, category='ihtml', type='boolean', value=False), ihtml_use_highlight=OptionsInfo(scss=False, category='ihtml', type='boolean', value=False), ihtml_use_compact_mode=OptionsInfo(scss=False, category='ihtml', type='boolean', value=False), ihtml_use_text_wrapping=OptionsInfo(scss=False, category='ihtml', type='boolean', value=True), ihtml_use_page_size_select=OptionsInfo(scss=False, category='ihtml', type='boolean', value=False), ihtml_page_size_default=OptionsInfo(scss=False, category='ihtml', type='value', value=10), ihtml_page_size_values=OptionsInfo(scss=False, category='ihtml', type='values', value=[10, 25, 50, 100]), ihtml_pagination_type=OptionsInfo(scss=False, category='ihtml', type='value', value='numbers'), ihtml_height=OptionsInfo(scss=False, category='ihtml', type='value', value='auto'), ihtml_selection_mode=OptionsInfo(scss=False, category='ihtml', type='value', value=None)), _google_font_imports=GoogleFontImports(imports=frozenset()), _has_built=False)</w:t>
+        <w:t xml:space="preserve">6           Duraciones      4 figuras (120 BPM), _body=&lt;great_tables._gt_data.Body object at 0xf94bce907230&gt;, _boxhead=Boxhead([ColInfo(var='Parámetro', type=&lt;ColInfoTypeEnum.default: 1&gt;, column_label='Parámetro', column_align='left', column_width=None, stub_level=None), ColInfo(var='Valor', type=&lt;ColInfoTypeEnum.default: 1&gt;, column_label='Valor', column_align='right', column_width=None, stub_level=None)]), _stub=&lt;great_tables._gt_data.Stub object at 0xf94bce9070e0&gt;, _spanners=Spanners([]), _heading=Heading(title='Resumen del Sistema y Síntesis Acústica', subtitle=None, preheader=None), _stubhead=None, _summary_rows=&lt;great_tables._gt_data.SummaryRows object at 0xf94bce907770&gt;, _summary_rows_grand=&lt;great_tables._gt_data.SummaryRows object at 0xf94bce99d6d0&gt;, _source_notes=[], _footnotes=[], _styles=[], _locale=&lt;great_tables._gt_data.Locale object at 0xf94bce9078c0&gt;, _formats=[], _substitutions=[], _col_merge=[], _transforms=[], _options=Options(table_id=OptionsInfo(scss=False, category='table', type='value', value=None), table_caption=OptionsInfo(scss=False, category='table', type='value', value=None), table_width=OptionsInfo(scss=True, category='table', type='px', value='auto'), table_layout=OptionsInfo(scss=True, category='table', type='value', value='fixed'), table_margin_left=OptionsInfo(scss=True, category='table', type='px', value='auto'), table_margin_right=OptionsInfo(scss=True, category='table', type='px', value='auto'), table_background_color=OptionsInfo(scss=True, category='table', type='value', value='#FFFFFF'), table_additional_css=OptionsInfo(scss=False, category='table', type='values', value=[]), table_font_names=OptionsInfo(scss=False, category='table', type='values', value=['-apple-system', 'BlinkMacSystemFont', 'Segoe UI', 'Roboto', 'Oxygen', 'Ubuntu', 'Cantarell', 'Helvetica Neue', 'Fira Sans', 'Droid Sans', 'Arial', 'sans-serif']), table_font_size=OptionsInfo(scss=True, category='table', type='px', value='16px'), table_font_weight=OptionsInfo(scss=True, category='table', type='value', value='normal'), table_font_style=OptionsInfo(scss=True, category='table', type='value', value='normal'), table_font_color=OptionsInfo(scss=True, category='table', type='value', value='#333333'), table_font_color_light=OptionsInfo(scss=True, category='table', type='value', value='#FFFFFF'), table_border_top_include=OptionsInfo(scss=False, category='table', type='boolean', value=True), table_border_top_style=OptionsInfo(scss=True, category='table', type='value', value='solid'), table_border_top_width=OptionsInfo(scss=True, category='table', type='px', value='2px'), table_border_top_color=OptionsInfo(scss=True, category='table', type='value', value='#A8A8A8'), table_border_right_style=OptionsInfo(scss=True, category='table', type='value', value='none'), table_border_right_width=OptionsInfo(scss=True, category='table', type='px', value='2px'), table_border_right_color=OptionsInfo(scss=True, category='table', type='value', value='#D3D3D3'), table_border_bottom_include=OptionsInfo(scss=False, category='table', type='boolean', value=True), table_border_bottom_style=OptionsInfo(scss=True, category='table', type='value', value='solid'), table_border_bottom_width=OptionsInfo(scss=True, category='table', type='px', value='2px'), table_border_bottom_color=OptionsInfo(scss=True, category='table', type='value', value='#A8A8A8'), table_border_left_style=OptionsInfo(scss=True, category='table', type='value', value='none'), table_border_left_width=OptionsInfo(scss=True, category='table', type='px', value='2px'), table_border_left_color=OptionsInfo(scss=True, category='table', type='value', value='#D3D3D3'), heading_background_color=OptionsInfo(scss=True, category='heading', type='value', value=None), heading_align=OptionsInfo(scss=True, category='heading', type='value', value='center'), heading_title_font_size=OptionsInfo(scss=True, category='heading', type='px', value='125%'), heading_title_font_weight=OptionsInfo(scss=True, category='heading', type='value', value='initial'), heading_subtitle_font_size=OptionsInfo(scss=True, category='heading', type='px', value='85%'), heading_subtitle_font_weight=OptionsInfo(scss=True, category='heading', type='value', value='initial'), heading_padding=OptionsInfo(scss=True, category='heading', type='px', value='4px'), heading_padding_horizontal=OptionsInfo(scss=True, category='heading', type='px', value='5px'), heading_border_bottom_style=OptionsInfo(scss=True, category='heading', type='value', value='solid'), heading_border_bottom_width=OptionsInfo(scss=True, category='heading', type='px', value='2px'), heading_border_bottom_color=OptionsInfo(scss=True, category='heading', type='value', value='#D3D3D3'), heading_border_lr_style=OptionsInfo(scss=True, category='heading', type='value', value='none'), heading_border_lr_width=OptionsInfo(scss=True, category='heading', type='px', value='1px'), heading_border_lr_color=OptionsInfo(scss=True, category='heading', type='value', value='#D3D3D3'), column_labels_background_color=OptionsInfo(scss=True, category='column_labels', type='value', value=None), column_labels_font_size=OptionsInfo(scss=True, category='column_labels', type='px', value='100%'), column_labels_font_weight=OptionsInfo(scss=True, category='column_labels', type='value', value='normal'), column_labels_text_transform=OptionsInfo(scss=True, category='column_labels', type='value', value='inherit'), column_labels_padding=OptionsInfo(scss=True, category='column_labels', type='px', value='5px'), column_labels_padding_horizontal=OptionsInfo(scss=True, category='column_labels', type='px', value='5px'), column_labels_vlines_style=OptionsInfo(scss=True, category='table_body', type='value', value='none'), column_labels_vlines_width=OptionsInfo(scss=True, category='table_body', type='px', value='1px'), column_labels_vlines_color=OptionsInfo(scss=True, category='table_body', type='value', value='#D3D3D3'), column_labels_border_top_style=OptionsInfo(scss=True, category='column_labels', type='value', value='solid'), column_labels_border_top_width=OptionsInfo(scss=True, category='column_labels', type='px', value='2px'), column_labels_border_top_color=OptionsInfo(scss=True, category='column_labels', type='value', value='#D3D3D3'), column_labels_border_bottom_style=OptionsInfo(scss=True, category='column_labels', type='value', value='solid'), column_labels_border_bottom_width=OptionsInfo(scss=True, category='column_labels', type='px', value='2px'), column_labels_border_bottom_color=OptionsInfo(scss=True, category='column_labels', type='value', value='#D3D3D3'), column_labels_border_lr_style=OptionsInfo(scss=True, category='column_labels', type='value', value='none'), column_labels_border_lr_width=OptionsInfo(scss=True, category='column_labels', type='px', value='1px'), column_labels_border_lr_color=OptionsInfo(scss=True, category='column_labels', type='value', value='#D3D3D3'), column_labels_hidden=OptionsInfo(scss=False, category='column_labels', type='boolean', value=False), row_group_background_color=OptionsInfo(scss=True, category='row_group', type='value', value=None), row_group_font_size=OptionsInfo(scss=True, category='row_group', type='px', value='100%'), row_group_font_weight=OptionsInfo(scss=True, category='row_group', type='value', value='initial'), row_group_text_transform=OptionsInfo(scss=True, category='row_group', type='value', value='inherit'), row_group_padding=OptionsInfo(scss=True, category='row_group', type='px', value='8px'), row_group_padding_horizontal=OptionsInfo(scss=True, category='row_group', type='px', value='5px'), row_group_border_top_style=OptionsInfo(scss=True, category='row_group', type='value', value='solid'), row_group_border_top_width=OptionsInfo(scss=True, category='row_group', type='px', value='2px'), row_group_border_top_color=OptionsInfo(scss=True, category='row_group', type='value', value='#D3D3D3'), row_group_border_right_style=OptionsInfo(scss=True, category='row_group', type='value', value='none'), row_group_border_right_width=OptionsInfo(scss=True, category='row_group', type='px', value='1px'), row_group_border_right_color=OptionsInfo(scss=True, category='row_group', type='value', value='#D3D3D3'), row_group_border_bottom_style=OptionsInfo(scss=True, category='row_group', type='value', value='solid'), row_group_border_bottom_width=OptionsInfo(scss=True, category='row_group', type='px', value='2px'), row_group_border_bottom_color=OptionsInfo(scss=True, category='row_group', type='value', value='#D3D3D3'), row_group_border_left_style=OptionsInfo(scss=True, category='row_group', type='value', value='none'), row_group_border_left_width=OptionsInfo(scss=True, category='row_group', type='px', value='1px'), row_group_border_left_color=OptionsInfo(scss=True, category='row_group', type='value', value='#D3D3D3'), row_group_as_column=OptionsInfo(scss=False, category='row_group', type='boolean', value=False), table_body_hlines_style=OptionsInfo(scss=True, category='table_body', type='value', value='solid'), table_body_hlines_width=OptionsInfo(scss=True, category='table_body', type='px', value='1px'), table_body_hlines_color=OptionsInfo(scss=True, category='table_body', type='value', value='#D3D3D3'), table_body_vlines_style=OptionsInfo(scss=True, category='table_body', type='value', value='none'), table_body_vlines_width=OptionsInfo(scss=True, category='table_body', type='px', value='1px'), table_body_vlines_color=OptionsInfo(scss=True, category='table_body', type='value', value='#D3D3D3'), table_body_border_top_style=OptionsInfo(scss=True, category='table_body', type='value', value='solid'), table_body_border_top_width=OptionsInfo(scss=True, category='table_body', type='px', value='2px'), table_body_border_top_color=OptionsInfo(scss=True, category='table_body', type='value', value='#D3D3D3'), table_body_border_bottom_style=OptionsInfo(scss=True, category='table_body', type='value', value='solid'), table_body_border_bottom_width=OptionsInfo(scss=True, category='table_body', type='px', value='2px'), table_body_border_bottom_color=OptionsInfo(scss=True, category='table_body', type='value', value='#D3D3D3'), data_row_padding=OptionsInfo(scss=True, category='data_row', type='px', value='8px'), data_row_padding_horizontal=OptionsInfo(scss=True, category='data_row', type='px', value='5px'), stub_background_color=OptionsInfo(scss=True, category='stub', type='value', value=None), stub_font_size=OptionsInfo(scss=True, category='stub', type='px', value='100%'), stub_font_weight=OptionsInfo(scss=True, category='stub', type='value', value='initial'), stub_text_transform=OptionsInfo(scss=True, category='stub', type='value', value='inherit'), stub_border_style=OptionsInfo(scss=True, category='stub', type='value', value='solid'), stub_border_width=OptionsInfo(scss=True, category='stub', type='px', value='2px'), stub_border_color=OptionsInfo(scss=True, category='stub', type='value', value='#D3D3D3'), stub_indent_length=OptionsInfo(scss=True, category='stub', type='px', value='5px'), stub_row_group_background_color=OptionsInfo(scss=True, category='stub', type='value', value=None), stub_row_group_font_size=OptionsInfo(scss=True, category='stub', type='px', value='100%'), stub_row_group_font_weight=OptionsInfo(scss=True, category='stub', type='value', value='initial'), stub_row_group_text_transform=OptionsInfo(scss=True, category='stub', type='value', value='inherit'), stub_row_group_border_style=OptionsInfo(scss=True, category='stub', type='value', value='solid'), stub_row_group_border_width=OptionsInfo(scss=True, category='stub', type='px', value='2px'), stub_row_group_border_color=OptionsInfo(scss=True, category='stub', type='value', value='#D3D3D3'), summary_row_padding=OptionsInfo(scss=True, category='summary_row', type='px', value='8px'), summary_row_padding_horizontal=OptionsInfo(scss=True, category='summary_row', type='px', value='5px'), summary_row_background_color=OptionsInfo(scss=True, category='summary_row', type='value', value=None), summary_row_text_transform=OptionsInfo(scss=True, category='summary_row', type='value', value='inherit'), summary_row_border_style=OptionsInfo(scss=True, category='summary_row', type='value', value='solid'), summary_row_border_width=OptionsInfo(scss=True, category='summary_row', type='px', value='2px'), summary_row_border_color=OptionsInfo(scss=True, category='summary_row', type='value', value='#D3D3D3'), grand_summary_row_padding=OptionsInfo(scss=True, category='grand_summary_row', type='px', value='8px'), grand_summary_row_padding_horizontal=OptionsInfo(scss=True, category='grand_summary_row', type='px', value='5px'), grand_summary_row_background_color=OptionsInfo(scss=True, category='grand_summary_row', type='value', value=None), grand_summary_row_text_transform=OptionsInfo(scss=True, category='grand_summary_row', type='value', value='inherit'), grand_summary_row_border_style=OptionsInfo(scss=True, category='grand_summary_row', type='value', value='double'), grand_summary_row_border_width=OptionsInfo(scss=True, category='grand_summary_row', type='px', value='6px'), grand_summary_row_border_color=OptionsInfo(scss=True, category='grand_summary_row', type='value', value='#D3D3D3'), footnotes_marks=OptionsInfo(scss=False, category='footnotes', type='values', value='numbers'), footnotes_spec_ref=OptionsInfo(scss=False, category='footnotes', type='value', value='^i'), footnotes_spec_ftr=OptionsInfo(scss=False, category='footnotes', type='value', value='^i'), footnotes_order=OptionsInfo(scss=False, category='footnotes', type='value', value='marks_last'), source_notes_padding=OptionsInfo(scss=True, category='source_notes', type='px', value='4px'), source_notes_padding_horizontal=OptionsInfo(scss=True, category='source_notes', type='px', value='5px'), source_notes_background_color=OptionsInfo(scss=True, category='source_notes', type='value', value=None), source_notes_font_size=OptionsInfo(scss=True, category='source_notes', type='px', value='90%'), source_notes_border_bottom_style=OptionsInfo(scss=True, category='source_notes', type='value', value='none'), source_notes_border_bottom_width=OptionsInfo(scss=True, category='source_notes', type='px', value='2px'), source_notes_border_bottom_color=OptionsInfo(scss=True, category='source_notes', type='value', value='#D3D3D3'), source_notes_border_lr_style=OptionsInfo(scss=True, category='source_notes', type='value', value='none'), source_notes_border_lr_width=OptionsInfo(scss=True, category='source_notes', type='px', value='2px'), source_notes_border_lr_color=OptionsInfo(scss=True, category='source_notes', type='value', value='#D3D3D3'), source_notes_multiline=OptionsInfo(scss=False, category='source_notes', type='boolean', value=True), source_notes_sep=OptionsInfo(scss=False, category='source_notes', type='value', value=' '), row_striping_background_color=OptionsInfo(scss=True, category='row', type='value', value='#F4F4F4'), row_striping_include_stub=OptionsInfo(scss=False, category='row', type='boolean', value=False), row_striping_include_table_body=OptionsInfo(scss=False, category='row', type='boolean', value=False), container_width=OptionsInfo(scss=False, category='container', type='px', value='auto'), container_height=OptionsInfo(scss=False, category='container', type='px', value='auto'), container_padding_x=OptionsInfo(scss=False, category='container', type='px', value='0px'), container_padding_y=OptionsInfo(scss=False, category='container', type='px', value='10px'), container_overflow_x=OptionsInfo(scss=False, category='container', type='overflow', value='auto'), container_overflow_y=OptionsInfo(scss=False, category='container', type='overflow', value='auto'), quarto_disable_processing=OptionsInfo(scss=False, category='quarto', type='logical', value=False), quarto_use_bootstrap=OptionsInfo(scss=False, category='quarto', type='logical', value=False), ihtml_active=OptionsInfo(scss=False, category='ihtml', type='boolean', value=False), ihtml_use_pagination=OptionsInfo(scss=False, category='ihtml', type='boolean', value=True), ihtml_use_pagination_info=OptionsInfo(scss=False, category='ihtml', type='boolean', value=True), ihtml_use_sorting=OptionsInfo(scss=False, category='ihtml', type='boolean', value=True), ihtml_use_search=OptionsInfo(scss=False, category='ihtml', type='boolean', value=False), ihtml_use_filters=OptionsInfo(scss=False, category='ihtml', type='boolean', value=False), ihtml_use_resizers=OptionsInfo(scss=False, category='ihtml', type='boolean', value=False), ihtml_use_highlight=OptionsInfo(scss=False, category='ihtml', type='boolean', value=False), ihtml_use_compact_mode=OptionsInfo(scss=False, category='ihtml', type='boolean', value=False), ihtml_use_text_wrapping=OptionsInfo(scss=False, category='ihtml', type='boolean', value=True), ihtml_use_page_size_select=OptionsInfo(scss=False, category='ihtml', type='boolean', value=False), ihtml_page_size_default=OptionsInfo(scss=False, category='ihtml', type='value', value=10), ihtml_page_size_values=OptionsInfo(scss=False, category='ihtml', type='values', value=[10, 25, 50, 100]), ihtml_pagination_type=OptionsInfo(scss=False, category='ihtml', type='value', value='numbers'), ihtml_height=OptionsInfo(scss=False, category='ihtml', type='value', value='auto'), ihtml_selection_mode=OptionsInfo(scss=False, category='ihtml', type='value', value=None)), _google_font_imports=GoogleFontImports(imports=frozenset()), _has_built=False)</w:t>
       </w:r>
     </w:p>
     <w:bookmarkEnd w:id="12"/>
@@ -706,7 +706,7 @@
         <w:rPr>
           <w:rStyle w:val="VerbatimChar"/>
         </w:rPr>
-        <w:t xml:space="preserve">6  C#5    vii° (Sensible)    73          554.37         1.8877, _body=&lt;great_tables._gt_data.Body object at 0xeba88a8a2690&gt;, _boxhead=Boxhead([ColInfo(var='Nota', type=&lt;ColInfoTypeEnum.default: 1&gt;, column_label='Nota', column_align='left', column_width=None, stub_level=None), ColInfo(var='Grado', type=&lt;ColInfoTypeEnum.default: 1&gt;, column_label='Grado', column_align='left', column_width=None, stub_level=None), ColInfo(var='MIDI', type=&lt;ColInfoTypeEnum.default: 1&gt;, column_label='MIDI', column_align='right', column_width=None, stub_level=None), ColInfo(var='Frecuencia (Hz)', type=&lt;ColInfoTypeEnum.default: 1&gt;, column_label='Frecuencia (Hz)', column_align='right', column_width=None, stub_level=None), ColInfo(var='Razón a Tónica', type=&lt;ColInfoTypeEnum.default: 1&gt;, column_label='Razón a Tónica', column_align='right', column_width=None, stub_level=None)]), _stub=&lt;great_tables._gt_data.Stub object at 0xeba88a85de50&gt;, _spanners=Spanners([]), _heading=Heading(title='Grados de la Escala Diatónica de Re Mayor', subtitle=None, preheader=None), _stubhead=None, _summary_rows=&lt;great_tables._gt_data.SummaryRows object at 0xeba88a85e210&gt;, _summary_rows_grand=&lt;great_tables._gt_data.SummaryRows object at 0xeba88a7f22c0&gt;, _source_notes=[], _footnotes=[], _styles=[], _locale=&lt;great_tables._gt_data.Locale object at 0xeba88a85d590&gt;, _formats=[], _substitutions=[], _col_merge=[], _transforms=[], _options=Options(table_id=OptionsInfo(scss=False, category='table', type='value', value=None), table_caption=OptionsInfo(scss=False, category='table', type='value', value=None), table_width=OptionsInfo(scss=True, category='table', type='px', value='auto'), table_layout=OptionsInfo(scss=True, category='table', type='value', value='fixed'), table_margin_left=OptionsInfo(scss=True, category='table', type='px', value='auto'), table_margin_right=OptionsInfo(scss=True, category='table', type='px', value='auto'), table_background_color=OptionsInfo(scss=True, category='table', type='value', value='#FFFFFF'), table_additional_css=OptionsInfo(scss=False, category='table', type='values', value=[]), table_font_names=OptionsInfo(scss=False, category='table', type='values', value=['-apple-system', 'BlinkMacSystemFont', 'Segoe UI', 'Roboto', 'Oxygen', 'Ubuntu', 'Cantarell', 'Helvetica Neue', 'Fira Sans', 'Droid Sans', 'Arial', 'sans-serif']), table_font_size=OptionsInfo(scss=True, category='table', type='px', value='16px'), table_font_weight=OptionsInfo(scss=True, category='table', type='value', value='normal'), table_font_style=OptionsInfo(scss=True, category='table', type='value', value='normal'), table_font_color=OptionsInfo(scss=True, category='table', type='value', value='#333333'), table_font_color_light=OptionsInfo(scss=True, category='table', type='value', value='#FFFFFF'), table_border_top_include=OptionsInfo(scss=False, category='table', type='boolean', value=True), table_border_top_style=OptionsInfo(scss=True, category='table', type='value', value='solid'), table_border_top_width=OptionsInfo(scss=True, category='table', type='px', value='2px'), table_border_top_color=OptionsInfo(scss=True, category='table', type='value', value='#A8A8A8'), table_border_right_style=OptionsInfo(scss=True, category='table', type='value', value='none'), table_border_right_width=OptionsInfo(scss=True, category='table', type='px', value='2px'), table_border_right_color=OptionsInfo(scss=True, category='table', type='value', value='#D3D3D3'), table_border_bottom_include=OptionsInfo(scss=False, category='table', type='boolean', value=True), table_border_bottom_style=OptionsInfo(scss=True, category='table', type='value', value='solid'), table_border_bottom_width=OptionsInfo(scss=True, category='table', type='px', value='2px'), table_border_bottom_color=OptionsInfo(scss=True, category='table', type='value', value='#A8A8A8'), table_border_left_style=OptionsInfo(scss=True, category='table', type='value', value='none'), table_border_left_width=OptionsInfo(scss=True, category='table', type='px', value='2px'), table_border_left_color=OptionsInfo(scss=True, category='table', type='value', value='#D3D3D3'), heading_background_color=OptionsInfo(scss=True, category='heading', type='value', value=None), heading_align=OptionsInfo(scss=True, category='heading', type='value', value='center'), heading_title_font_size=OptionsInfo(scss=True, category='heading', type='px', value='125%'), heading_title_font_weight=OptionsInfo(scss=True, category='heading', type='value', value='initial'), heading_subtitle_font_size=OptionsInfo(scss=True, category='heading', type='px', value='85%'), heading_subtitle_font_weight=OptionsInfo(scss=True, category='heading', type='value', value='initial'), heading_padding=OptionsInfo(scss=True, category='heading', type='px', value='4px'), heading_padding_horizontal=OptionsInfo(scss=True, category='heading', type='px', value='5px'), heading_border_bottom_style=OptionsInfo(scss=True, category='heading', type='value', value='solid'), heading_border_bottom_width=OptionsInfo(scss=True, category='heading', type='px', value='2px'), heading_border_bottom_color=OptionsInfo(scss=True, category='heading', type='value', value='#D3D3D3'), heading_border_lr_style=OptionsInfo(scss=True, category='heading', type='value', value='none'), heading_border_lr_width=OptionsInfo(scss=True, category='heading', type='px', value='1px'), heading_border_lr_color=OptionsInfo(scss=True, category='heading', type='value', value='#D3D3D3'), column_labels_background_color=OptionsInfo(scss=True, category='column_labels', type='value', value=None), column_labels_font_size=OptionsInfo(scss=True, category='column_labels', type='px', value='100%'), column_labels_font_weight=OptionsInfo(scss=True, category='column_labels', type='value', value='normal'), column_labels_text_transform=OptionsInfo(scss=True, category='column_labels', type='value', value='inherit'), column_labels_padding=OptionsInfo(scss=True, category='column_labels', type='px', value='5px'), column_labels_padding_horizontal=OptionsInfo(scss=True, category='column_labels', type='px', value='5px'), column_labels_vlines_style=OptionsInfo(scss=True, category='table_body', type='value', value='none'), column_labels_vlines_width=OptionsInfo(scss=True, category='table_body', type='px', value='1px'), column_labels_vlines_color=OptionsInfo(scss=True, category='table_body', type='value', value='#D3D3D3'), column_labels_border_top_style=OptionsInfo(scss=True, category='column_labels', type='value', value='solid'), column_labels_border_top_width=OptionsInfo(scss=True, category='column_labels', type='px', value='2px'), column_labels_border_top_color=OptionsInfo(scss=True, category='column_labels', type='value', value='#D3D3D3'), column_labels_border_bottom_style=OptionsInfo(scss=True, category='column_labels', type='value', value='solid'), column_labels_border_bottom_width=OptionsInfo(scss=True, category='column_labels', type='px', value='2px'), column_labels_border_bottom_color=OptionsInfo(scss=True, category='column_labels', type='value', value='#D3D3D3'), column_labels_border_lr_style=OptionsInfo(scss=True, category='column_labels', type='value', value='none'), column_labels_border_lr_width=OptionsInfo(scss=True, category='column_labels', type='px', value='1px'), column_labels_border_lr_color=OptionsInfo(scss=True, category='column_labels', type='value', value='#D3D3D3'), column_labels_hidden=OptionsInfo(scss=False, category='column_labels', type='boolean', value=False), row_group_background_color=OptionsInfo(scss=True, category='row_group', type='value', value=None), row_group_font_size=OptionsInfo(scss=True, category='row_group', type='px', value='100%'), row_group_font_weight=OptionsInfo(scss=True, category='row_group', type='value', value='initial'), row_group_text_transform=OptionsInfo(scss=True, category='row_group', type='value', value='inherit'), row_group_padding=OptionsInfo(scss=True, category='row_group', type='px', value='8px'), row_group_padding_horizontal=OptionsInfo(scss=True, category='row_group', type='px', value='5px'), row_group_border_top_style=OptionsInfo(scss=True, category='row_group', type='value', value='solid'), row_group_border_top_width=OptionsInfo(scss=True, category='row_group', type='px', value='2px'), row_group_border_top_color=OptionsInfo(scss=True, category='row_group', type='value', value='#D3D3D3'), row_group_border_right_style=OptionsInfo(scss=True, category='row_group', type='value', value='none'), row_group_border_right_width=OptionsInfo(scss=True, category='row_group', type='px', value='1px'), row_group_border_right_color=OptionsInfo(scss=True, category='row_group', type='value', value='#D3D3D3'), row_group_border_bottom_style=OptionsInfo(scss=True, category='row_group', type='value', value='solid'), row_group_border_bottom_width=OptionsInfo(scss=True, category='row_group', type='px', value='2px'), row_group_border_bottom_color=OptionsInfo(scss=True, category='row_group', type='value', value='#D3D3D3'), row_group_border_left_style=OptionsInfo(scss=True, category='row_group', type='value', value='none'), row_group_border_left_width=OptionsInfo(scss=True, category='row_group', type='px', value='1px'), row_group_border_left_color=OptionsInfo(scss=True, category='row_group', type='value', value='#D3D3D3'), row_group_as_column=OptionsInfo(scss=False, category='row_group', type='boolean', value=False), table_body_hlines_style=OptionsInfo(scss=True, category='table_body', type='value', value='solid'), table_body_hlines_width=OptionsInfo(scss=True, category='table_body', type='px', value='1px'), table_body_hlines_color=OptionsInfo(scss=True, category='table_body', type='value', value='#D3D3D3'), table_body_vlines_style=OptionsInfo(scss=True, category='table_body', type='value', value='none'), table_body_vlines_width=OptionsInfo(scss=True, category='table_body', type='px', value='1px'), table_body_vlines_color=OptionsInfo(scss=True, category='table_body', type='value', value='#D3D3D3'), table_body_border_top_style=OptionsInfo(scss=True, category='table_body', type='value', value='solid'), table_body_border_top_width=OptionsInfo(scss=True, category='table_body', type='px', value='2px'), table_body_border_top_color=OptionsInfo(scss=True, category='table_body', type='value', value='#D3D3D3'), table_body_border_bottom_style=OptionsInfo(scss=True, category='table_body', type='value', value='solid'), table_body_border_bottom_width=OptionsInfo(scss=True, category='table_body', type='px', value='2px'), table_body_border_bottom_color=OptionsInfo(scss=True, category='table_body', type='value', value='#D3D3D3'), data_row_padding=OptionsInfo(scss=True, category='data_row', type='px', value='8px'), data_row_padding_horizontal=OptionsInfo(scss=True, category='data_row', type='px', value='5px'), stub_background_color=OptionsInfo(scss=True, category='stub', type='value', value=None), stub_font_size=OptionsInfo(scss=True, category='stub', type='px', value='100%'), stub_font_weight=OptionsInfo(scss=True, category='stub', type='value', value='initial'), stub_text_transform=OptionsInfo(scss=True, category='stub', type='value', value='inherit'), stub_border_style=OptionsInfo(scss=True, category='stub', type='value', value='solid'), stub_border_width=OptionsInfo(scss=True, category='stub', type='px', value='2px'), stub_border_color=OptionsInfo(scss=True, category='stub', type='value', value='#D3D3D3'), stub_indent_length=OptionsInfo(scss=True, category='stub', type='px', value='5px'), stub_row_group_background_color=OptionsInfo(scss=True, category='stub', type='value', value=None), stub_row_group_font_size=OptionsInfo(scss=True, category='stub', type='px', value='100%'), stub_row_group_font_weight=OptionsInfo(scss=True, category='stub', type='value', value='initial'), stub_row_group_text_transform=OptionsInfo(scss=True, category='stub', type='value', value='inherit'), stub_row_group_border_style=OptionsInfo(scss=True, category='stub', type='value', value='solid'), stub_row_group_border_width=OptionsInfo(scss=True, category='stub', type='px', value='2px'), stub_row_group_border_color=OptionsInfo(scss=True, category='stub', type='value', value='#D3D3D3'), summary_row_padding=OptionsInfo(scss=True, category='summary_row', type='px', value='8px'), summary_row_padding_horizontal=OptionsInfo(scss=True, category='summary_row', type='px', value='5px'), summary_row_background_color=OptionsInfo(scss=True, category='summary_row', type='value', value=None), summary_row_text_transform=OptionsInfo(scss=True, category='summary_row', type='value', value='inherit'), summary_row_border_style=OptionsInfo(scss=True, category='summary_row', type='value', value='solid'), summary_row_border_width=OptionsInfo(scss=True, category='summary_row', type='px', value='2px'), summary_row_border_color=OptionsInfo(scss=True, category='summary_row', type='value', value='#D3D3D3'), grand_summary_row_padding=OptionsInfo(scss=True, category='grand_summary_row', type='px', value='8px'), grand_summary_row_padding_horizontal=OptionsInfo(scss=True, category='grand_summary_row', type='px', value='5px'), grand_summary_row_background_color=OptionsInfo(scss=True, category='grand_summary_row', type='value', value=None), grand_summary_row_text_transform=OptionsInfo(scss=True, category='grand_summary_row', type='value', value='inherit'), grand_summary_row_border_style=OptionsInfo(scss=True, category='grand_summary_row', type='value', value='double'), grand_summary_row_border_width=OptionsInfo(scss=True, category='grand_summary_row', type='px', value='6px'), grand_summary_row_border_color=OptionsInfo(scss=True, category='grand_summary_row', type='value', value='#D3D3D3'), footnotes_marks=OptionsInfo(scss=False, category='footnotes', type='values', value='numbers'), footnotes_spec_ref=OptionsInfo(scss=False, category='footnotes', type='value', value='^i'), footnotes_spec_ftr=OptionsInfo(scss=False, category='footnotes', type='value', value='^i'), footnotes_order=OptionsInfo(scss=False, category='footnotes', type='value', value='marks_last'), source_notes_padding=OptionsInfo(scss=True, category='source_notes', type='px', value='4px'), source_notes_padding_horizontal=OptionsInfo(scss=True, category='source_notes', type='px', value='5px'), source_notes_background_color=OptionsInfo(scss=True, category='source_notes', type='value', value=None), source_notes_font_size=OptionsInfo(scss=True, category='source_notes', type='px', value='90%'), source_notes_border_bottom_style=OptionsInfo(scss=True, category='source_notes', type='value', value='none'), source_notes_border_bottom_width=OptionsInfo(scss=True, category='source_notes', type='px', value='2px'), source_notes_border_bottom_color=OptionsInfo(scss=True, category='source_notes', type='value', value='#D3D3D3'), source_notes_border_lr_style=OptionsInfo(scss=True, category='source_notes', type='value', value='none'), source_notes_border_lr_width=OptionsInfo(scss=True, category='source_notes', type='px', value='2px'), source_notes_border_lr_color=OptionsInfo(scss=True, category='source_notes', type='value', value='#D3D3D3'), source_notes_multiline=OptionsInfo(scss=False, category='source_notes', type='boolean', value=True), source_notes_sep=OptionsInfo(scss=False, category='source_notes', type='value', value=' '), row_striping_background_color=OptionsInfo(scss=True, category='row', type='value', value='#F4F4F4'), row_striping_include_stub=OptionsInfo(scss=False, category='row', type='boolean', value=False), row_striping_include_table_body=OptionsInfo(scss=False, category='row', type='boolean', value=False), container_width=OptionsInfo(scss=False, category='container', type='px', value='auto'), container_height=OptionsInfo(scss=False, category='container', type='px', value='auto'), container_padding_x=OptionsInfo(scss=False, category='container', type='px', value='0px'), container_padding_y=OptionsInfo(scss=False, category='container', type='px', value='10px'), container_overflow_x=OptionsInfo(scss=False, category='container', type='overflow', value='auto'), container_overflow_y=OptionsInfo(scss=False, category='container', type='overflow', value='auto'), quarto_disable_processing=OptionsInfo(scss=False, category='quarto', type='logical', value=False), quarto_use_bootstrap=OptionsInfo(scss=False, category='quarto', type='logical', value=False), ihtml_active=OptionsInfo(scss=False, category='ihtml', type='boolean', value=False), ihtml_use_pagination=OptionsInfo(scss=False, category='ihtml', type='boolean', value=True), ihtml_use_pagination_info=OptionsInfo(scss=False, category='ihtml', type='boolean', value=True), ihtml_use_sorting=OptionsInfo(scss=False, category='ihtml', type='boolean', value=True), ihtml_use_search=OptionsInfo(scss=False, category='ihtml', type='boolean', value=False), ihtml_use_filters=OptionsInfo(scss=False, category='ihtml', type='boolean', value=False), ihtml_use_resizers=OptionsInfo(scss=False, category='ihtml', type='boolean', value=False), ihtml_use_highlight=OptionsInfo(scss=False, category='ihtml', type='boolean', value=False), ihtml_use_compact_mode=OptionsInfo(scss=False, category='ihtml', type='boolean', value=False), ihtml_use_text_wrapping=OptionsInfo(scss=False, category='ihtml', type='boolean', value=True), ihtml_use_page_size_select=OptionsInfo(scss=False, category='ihtml', type='boolean', value=False), ihtml_page_size_default=OptionsInfo(scss=False, category='ihtml', type='value', value=10), ihtml_page_size_values=OptionsInfo(scss=False, category='ihtml', type='values', value=[10, 25, 50, 100]), ihtml_pagination_type=OptionsInfo(scss=False, category='ihtml', type='value', value='numbers'), ihtml_height=OptionsInfo(scss=False, category='ihtml', type='value', value='auto'), ihtml_selection_mode=OptionsInfo(scss=False, category='ihtml', type='value', value=None)), _google_font_imports=GoogleFontImports(imports=frozenset()), _has_built=False)</w:t>
+        <w:t xml:space="preserve">6  C#5    vii° (Sensible)    73          554.37         1.8877, _body=&lt;great_tables._gt_data.Body object at 0xf94bce9e2690&gt;, _boxhead=Boxhead([ColInfo(var='Nota', type=&lt;ColInfoTypeEnum.default: 1&gt;, column_label='Nota', column_align='left', column_width=None, stub_level=None), ColInfo(var='Grado', type=&lt;ColInfoTypeEnum.default: 1&gt;, column_label='Grado', column_align='left', column_width=None, stub_level=None), ColInfo(var='MIDI', type=&lt;ColInfoTypeEnum.default: 1&gt;, column_label='MIDI', column_align='right', column_width=None, stub_level=None), ColInfo(var='Frecuencia (Hz)', type=&lt;ColInfoTypeEnum.default: 1&gt;, column_label='Frecuencia (Hz)', column_align='right', column_width=None, stub_level=None), ColInfo(var='Razón a Tónica', type=&lt;ColInfoTypeEnum.default: 1&gt;, column_label='Razón a Tónica', column_align='right', column_width=None, stub_level=None)]), _stub=&lt;great_tables._gt_data.Stub object at 0xf94bce99de50&gt;, _spanners=Spanners([]), _heading=Heading(title='Grados de la Escala Diatónica de Re Mayor', subtitle=None, preheader=None), _stubhead=None, _summary_rows=&lt;great_tables._gt_data.SummaryRows object at 0xf94bce99e210&gt;, _summary_rows_grand=&lt;great_tables._gt_data.SummaryRows object at 0xf94bce9322c0&gt;, _source_notes=[], _footnotes=[], _styles=[], _locale=&lt;great_tables._gt_data.Locale object at 0xf94bce99d590&gt;, _formats=[], _substitutions=[], _col_merge=[], _transforms=[], _options=Options(table_id=OptionsInfo(scss=False, category='table', type='value', value=None), table_caption=OptionsInfo(scss=False, category='table', type='value', value=None), table_width=OptionsInfo(scss=True, category='table', type='px', value='auto'), table_layout=OptionsInfo(scss=True, category='table', type='value', value='fixed'), table_margin_left=OptionsInfo(scss=True, category='table', type='px', value='auto'), table_margin_right=OptionsInfo(scss=True, category='table', type='px', value='auto'), table_background_color=OptionsInfo(scss=True, category='table', type='value', value='#FFFFFF'), table_additional_css=OptionsInfo(scss=False, category='table', type='values', value=[]), table_font_names=OptionsInfo(scss=False, category='table', type='values', value=['-apple-system', 'BlinkMacSystemFont', 'Segoe UI', 'Roboto', 'Oxygen', 'Ubuntu', 'Cantarell', 'Helvetica Neue', 'Fira Sans', 'Droid Sans', 'Arial', 'sans-serif']), table_font_size=OptionsInfo(scss=True, category='table', type='px', value='16px'), table_font_weight=OptionsInfo(scss=True, category='table', type='value', value='normal'), table_font_style=OptionsInfo(scss=True, category='table', type='value', value='normal'), table_font_color=OptionsInfo(scss=True, category='table', type='value', value='#333333'), table_font_color_light=OptionsInfo(scss=True, category='table', type='value', value='#FFFFFF'), table_border_top_include=OptionsInfo(scss=False, category='table', type='boolean', value=True), table_border_top_style=OptionsInfo(scss=True, category='table', type='value', value='solid'), table_border_top_width=OptionsInfo(scss=True, category='table', type='px', value='2px'), table_border_top_color=OptionsInfo(scss=True, category='table', type='value', value='#A8A8A8'), table_border_right_style=OptionsInfo(scss=True, category='table', type='value', value='none'), table_border_right_width=OptionsInfo(scss=True, category='table', type='px', value='2px'), table_border_right_color=OptionsInfo(scss=True, category='table', type='value', value='#D3D3D3'), table_border_bottom_include=OptionsInfo(scss=False, category='table', type='boolean', value=True), table_border_bottom_style=OptionsInfo(scss=True, category='table', type='value', value='solid'), table_border_bottom_width=OptionsInfo(scss=True, category='table', type='px', value='2px'), table_border_bottom_color=OptionsInfo(scss=True, category='table', type='value', value='#A8A8A8'), table_border_left_style=OptionsInfo(scss=True, category='table', type='value', value='none'), table_border_left_width=OptionsInfo(scss=True, category='table', type='px', value='2px'), table_border_left_color=OptionsInfo(scss=True, category='table', type='value', value='#D3D3D3'), heading_background_color=OptionsInfo(scss=True, category='heading', type='value', value=None), heading_align=OptionsInfo(scss=True, category='heading', type='value', value='center'), heading_title_font_size=OptionsInfo(scss=True, category='heading', type='px', value='125%'), heading_title_font_weight=OptionsInfo(scss=True, category='heading', type='value', value='initial'), heading_subtitle_font_size=OptionsInfo(scss=True, category='heading', type='px', value='85%'), heading_subtitle_font_weight=OptionsInfo(scss=True, category='heading', type='value', value='initial'), heading_padding=OptionsInfo(scss=True, category='heading', type='px', value='4px'), heading_padding_horizontal=OptionsInfo(scss=True, category='heading', type='px', value='5px'), heading_border_bottom_style=OptionsInfo(scss=True, category='heading', type='value', value='solid'), heading_border_bottom_width=OptionsInfo(scss=True, category='heading', type='px', value='2px'), heading_border_bottom_color=OptionsInfo(scss=True, category='heading', type='value', value='#D3D3D3'), heading_border_lr_style=OptionsInfo(scss=True, category='heading', type='value', value='none'), heading_border_lr_width=OptionsInfo(scss=True, category='heading', type='px', value='1px'), heading_border_lr_color=OptionsInfo(scss=True, category='heading', type='value', value='#D3D3D3'), column_labels_background_color=OptionsInfo(scss=True, category='column_labels', type='value', value=None), column_labels_font_size=OptionsInfo(scss=True, category='column_labels', type='px', value='100%'), column_labels_font_weight=OptionsInfo(scss=True, category='column_labels', type='value', value='normal'), column_labels_text_transform=OptionsInfo(scss=True, category='column_labels', type='value', value='inherit'), column_labels_padding=OptionsInfo(scss=True, category='column_labels', type='px', value='5px'), column_labels_padding_horizontal=OptionsInfo(scss=True, category='column_labels', type='px', value='5px'), column_labels_vlines_style=OptionsInfo(scss=True, category='table_body', type='value', value='none'), column_labels_vlines_width=OptionsInfo(scss=True, category='table_body', type='px', value='1px'), column_labels_vlines_color=OptionsInfo(scss=True, category='table_body', type='value', value='#D3D3D3'), column_labels_border_top_style=OptionsInfo(scss=True, category='column_labels', type='value', value='solid'), column_labels_border_top_width=OptionsInfo(scss=True, category='column_labels', type='px', value='2px'), column_labels_border_top_color=OptionsInfo(scss=True, category='column_labels', type='value', value='#D3D3D3'), column_labels_border_bottom_style=OptionsInfo(scss=True, category='column_labels', type='value', value='solid'), column_labels_border_bottom_width=OptionsInfo(scss=True, category='column_labels', type='px', value='2px'), column_labels_border_bottom_color=OptionsInfo(scss=True, category='column_labels', type='value', value='#D3D3D3'), column_labels_border_lr_style=OptionsInfo(scss=True, category='column_labels', type='value', value='none'), column_labels_border_lr_width=OptionsInfo(scss=True, category='column_labels', type='px', value='1px'), column_labels_border_lr_color=OptionsInfo(scss=True, category='column_labels', type='value', value='#D3D3D3'), column_labels_hidden=OptionsInfo(scss=False, category='column_labels', type='boolean', value=False), row_group_background_color=OptionsInfo(scss=True, category='row_group', type='value', value=None), row_group_font_size=OptionsInfo(scss=True, category='row_group', type='px', value='100%'), row_group_font_weight=OptionsInfo(scss=True, category='row_group', type='value', value='initial'), row_group_text_transform=OptionsInfo(scss=True, category='row_group', type='value', value='inherit'), row_group_padding=OptionsInfo(scss=True, category='row_group', type='px', value='8px'), row_group_padding_horizontal=OptionsInfo(scss=True, category='row_group', type='px', value='5px'), row_group_border_top_style=OptionsInfo(scss=True, category='row_group', type='value', value='solid'), row_group_border_top_width=OptionsInfo(scss=True, category='row_group', type='px', value='2px'), row_group_border_top_color=OptionsInfo(scss=True, category='row_group', type='value', value='#D3D3D3'), row_group_border_right_style=OptionsInfo(scss=True, category='row_group', type='value', value='none'), row_group_border_right_width=OptionsInfo(scss=True, category='row_group', type='px', value='1px'), row_group_border_right_color=OptionsInfo(scss=True, category='row_group', type='value', value='#D3D3D3'), row_group_border_bottom_style=OptionsInfo(scss=True, category='row_group', type='value', value='solid'), row_group_border_bottom_width=OptionsInfo(scss=True, category='row_group', type='px', value='2px'), row_group_border_bottom_color=OptionsInfo(scss=True, category='row_group', type='value', value='#D3D3D3'), row_group_border_left_style=OptionsInfo(scss=True, category='row_group', type='value', value='none'), row_group_border_left_width=OptionsInfo(scss=True, category='row_group', type='px', value='1px'), row_group_border_left_color=OptionsInfo(scss=True, category='row_group', type='value', value='#D3D3D3'), row_group_as_column=OptionsInfo(scss=False, category='row_group', type='boolean', value=False), table_body_hlines_style=OptionsInfo(scss=True, category='table_body', type='value', value='solid'), table_body_hlines_width=OptionsInfo(scss=True, category='table_body', type='px', value='1px'), table_body_hlines_color=OptionsInfo(scss=True, category='table_body', type='value', value='#D3D3D3'), table_body_vlines_style=OptionsInfo(scss=True, category='table_body', type='value', value='none'), table_body_vlines_width=OptionsInfo(scss=True, category='table_body', type='px', value='1px'), table_body_vlines_color=OptionsInfo(scss=True, category='table_body', type='value', value='#D3D3D3'), table_body_border_top_style=OptionsInfo(scss=True, category='table_body', type='value', value='solid'), table_body_border_top_width=OptionsInfo(scss=True, category='table_body', type='px', value='2px'), table_body_border_top_color=OptionsInfo(scss=True, category='table_body', type='value', value='#D3D3D3'), table_body_border_bottom_style=OptionsInfo(scss=True, category='table_body', type='value', value='solid'), table_body_border_bottom_width=OptionsInfo(scss=True, category='table_body', type='px', value='2px'), table_body_border_bottom_color=OptionsInfo(scss=True, category='table_body', type='value', value='#D3D3D3'), data_row_padding=OptionsInfo(scss=True, category='data_row', type='px', value='8px'), data_row_padding_horizontal=OptionsInfo(scss=True, category='data_row', type='px', value='5px'), stub_background_color=OptionsInfo(scss=True, category='stub', type='value', value=None), stub_font_size=OptionsInfo(scss=True, category='stub', type='px', value='100%'), stub_font_weight=OptionsInfo(scss=True, category='stub', type='value', value='initial'), stub_text_transform=OptionsInfo(scss=True, category='stub', type='value', value='inherit'), stub_border_style=OptionsInfo(scss=True, category='stub', type='value', value='solid'), stub_border_width=OptionsInfo(scss=True, category='stub', type='px', value='2px'), stub_border_color=OptionsInfo(scss=True, category='stub', type='value', value='#D3D3D3'), stub_indent_length=OptionsInfo(scss=True, category='stub', type='px', value='5px'), stub_row_group_background_color=OptionsInfo(scss=True, category='stub', type='value', value=None), stub_row_group_font_size=OptionsInfo(scss=True, category='stub', type='px', value='100%'), stub_row_group_font_weight=OptionsInfo(scss=True, category='stub', type='value', value='initial'), stub_row_group_text_transform=OptionsInfo(scss=True, category='stub', type='value', value='inherit'), stub_row_group_border_style=OptionsInfo(scss=True, category='stub', type='value', value='solid'), stub_row_group_border_width=OptionsInfo(scss=True, category='stub', type='px', value='2px'), stub_row_group_border_color=OptionsInfo(scss=True, category='stub', type='value', value='#D3D3D3'), summary_row_padding=OptionsInfo(scss=True, category='summary_row', type='px', value='8px'), summary_row_padding_horizontal=OptionsInfo(scss=True, category='summary_row', type='px', value='5px'), summary_row_background_color=OptionsInfo(scss=True, category='summary_row', type='value', value=None), summary_row_text_transform=OptionsInfo(scss=True, category='summary_row', type='value', value='inherit'), summary_row_border_style=OptionsInfo(scss=True, category='summary_row', type='value', value='solid'), summary_row_border_width=OptionsInfo(scss=True, category='summary_row', type='px', value='2px'), summary_row_border_color=OptionsInfo(scss=True, category='summary_row', type='value', value='#D3D3D3'), grand_summary_row_padding=OptionsInfo(scss=True, category='grand_summary_row', type='px', value='8px'), grand_summary_row_padding_horizontal=OptionsInfo(scss=True, category='grand_summary_row', type='px', value='5px'), grand_summary_row_background_color=OptionsInfo(scss=True, category='grand_summary_row', type='value', value=None), grand_summary_row_text_transform=OptionsInfo(scss=True, category='grand_summary_row', type='value', value='inherit'), grand_summary_row_border_style=OptionsInfo(scss=True, category='grand_summary_row', type='value', value='double'), grand_summary_row_border_width=OptionsInfo(scss=True, category='grand_summary_row', type='px', value='6px'), grand_summary_row_border_color=OptionsInfo(scss=True, category='grand_summary_row', type='value', value='#D3D3D3'), footnotes_marks=OptionsInfo(scss=False, category='footnotes', type='values', value='numbers'), footnotes_spec_ref=OptionsInfo(scss=False, category='footnotes', type='value', value='^i'), footnotes_spec_ftr=OptionsInfo(scss=False, category='footnotes', type='value', value='^i'), footnotes_order=OptionsInfo(scss=False, category='footnotes', type='value', value='marks_last'), source_notes_padding=OptionsInfo(scss=True, category='source_notes', type='px', value='4px'), source_notes_padding_horizontal=OptionsInfo(scss=True, category='source_notes', type='px', value='5px'), source_notes_background_color=OptionsInfo(scss=True, category='source_notes', type='value', value=None), source_notes_font_size=OptionsInfo(scss=True, category='source_notes', type='px', value='90%'), source_notes_border_bottom_style=OptionsInfo(scss=True, category='source_notes', type='value', value='none'), source_notes_border_bottom_width=OptionsInfo(scss=True, category='source_notes', type='px', value='2px'), source_notes_border_bottom_color=OptionsInfo(scss=True, category='source_notes', type='value', value='#D3D3D3'), source_notes_border_lr_style=OptionsInfo(scss=True, category='source_notes', type='value', value='none'), source_notes_border_lr_width=OptionsInfo(scss=True, category='source_notes', type='px', value='2px'), source_notes_border_lr_color=OptionsInfo(scss=True, category='source_notes', type='value', value='#D3D3D3'), source_notes_multiline=OptionsInfo(scss=False, category='source_notes', type='boolean', value=True), source_notes_sep=OptionsInfo(scss=False, category='source_notes', type='value', value=' '), row_striping_background_color=OptionsInfo(scss=True, category='row', type='value', value='#F4F4F4'), row_striping_include_stub=OptionsInfo(scss=False, category='row', type='boolean', value=False), row_striping_include_table_body=OptionsInfo(scss=False, category='row', type='boolean', value=False), container_width=OptionsInfo(scss=False, category='container', type='px', value='auto'), container_height=OptionsInfo(scss=False, category='container', type='px', value='auto'), container_padding_x=OptionsInfo(scss=False, category='container', type='px', value='0px'), container_padding_y=OptionsInfo(scss=False, category='container', type='px', value='10px'), container_overflow_x=OptionsInfo(scss=False, category='container', type='overflow', value='auto'), container_overflow_y=OptionsInfo(scss=False, category='container', type='overflow', value='auto'), quarto_disable_processing=OptionsInfo(scss=False, category='quarto', type='logical', value=False), quarto_use_bootstrap=OptionsInfo(scss=False, category='quarto', type='logical', value=False), ihtml_active=OptionsInfo(scss=False, category='ihtml', type='boolean', value=False), ihtml_use_pagination=OptionsInfo(scss=False, category='ihtml', type='boolean', value=True), ihtml_use_pagination_info=OptionsInfo(scss=False, category='ihtml', type='boolean', value=True), ihtml_use_sorting=OptionsInfo(scss=False, category='ihtml', type='boolean', value=True), ihtml_use_search=OptionsInfo(scss=False, category='ihtml', type='boolean', value=False), ihtml_use_filters=OptionsInfo(scss=False, category='ihtml', type='boolean', value=False), ihtml_use_resizers=OptionsInfo(scss=False, category='ihtml', type='boolean', value=False), ihtml_use_highlight=OptionsInfo(scss=False, category='ihtml', type='boolean', value=False), ihtml_use_compact_mode=OptionsInfo(scss=False, category='ihtml', type='boolean', value=False), ihtml_use_text_wrapping=OptionsInfo(scss=False, category='ihtml', type='boolean', value=True), ihtml_use_page_size_select=OptionsInfo(scss=False, category='ihtml', type='boolean', value=False), ihtml_page_size_default=OptionsInfo(scss=False, category='ihtml', type='value', value=10), ihtml_page_size_values=OptionsInfo(scss=False, category='ihtml', type='values', value=[10, 25, 50, 100]), ihtml_pagination_type=OptionsInfo(scss=False, category='ihtml', type='value', value='numbers'), ihtml_height=OptionsInfo(scss=False, category='ihtml', type='value', value='auto'), ihtml_selection_mode=OptionsInfo(scss=False, category='ihtml', type='value', value=None)), _google_font_imports=GoogleFontImports(imports=frozenset()), _has_built=False)</w:t>
       </w:r>
     </w:p>
     <w:bookmarkEnd w:id="16"/>
@@ -1431,7 +1431,65 @@
         <w:pStyle w:val="FirstParagraph"/>
       </w:pPr>
       <w:r>
-        <w:t xml:space="preserve">Como expuso el profesor Ricardo Peña en clase con el ejemplo de los registros de estudio de 20 días con 11 días de estudio, el conteo frecuentista simple (11 sobre 20) ignora el orden temporal. Mientras un registro responde a una regla estocástica (70% de estudiar si se estudió hoy), el otro proviene de un volado independiente (50 sobre 50). El análisis de bigramas permite estimar transiciones y revelar la dinámica subyacente.</w:t>
+        <w:t xml:space="preserve">Esta memoria nula se asemeja al juego de Serpientes y Escaleras visto en clase, donde la casilla futura depende solo de la casilla actual y el dado, a diferencia de extraer cartas de una baraja sin reemplazo donde la baraja cambia con cada extracción previa.</w:t>
+      </w:r>
+    </w:p>
+    <w:p>
+      <w:pPr>
+        <w:pStyle w:val="BodyText"/>
+      </w:pPr>
+      <w:r>
+        <w:t xml:space="preserve">Como expuso el profesor Ricardo Peña en clase con el ejemplo de los registros de 20 días con 11 días de estudio, el conteo frecuentista simple (11 sobre 20) ignora el orden temporal. Mientras un registro responde a una regla estocástica (70% de estudiar si se estudió hoy), el otro proviene de un volado independiente (50 sobre 50). El análisis de bigramas permite estimar transiciones y modelar la dependencia serial. Siguiendo el planteamiento de la actividad, por ejemplo, la probabilidad de cambiar a la nota SI (B4) dado que actualmente suena la nota RE (D4) se fija en</w:t>
+      </w:r>
+      <w:r>
+        <w:t xml:space="preserve"> </w:t>
+      </w:r>
+      <m:oMath>
+        <m:r>
+          <m:t>P</m:t>
+        </m:r>
+        <m:r>
+          <m:rPr>
+            <m:sty m:val="p"/>
+          </m:rPr>
+          <m:t>(</m:t>
+        </m:r>
+        <m:r>
+          <m:t>B</m:t>
+        </m:r>
+        <m:r>
+          <m:t>4</m:t>
+        </m:r>
+        <m:r>
+          <m:rPr>
+            <m:sty m:val="p"/>
+          </m:rPr>
+          <m:t>∣</m:t>
+        </m:r>
+        <m:r>
+          <m:t>D</m:t>
+        </m:r>
+        <m:r>
+          <m:t>4</m:t>
+        </m:r>
+        <m:r>
+          <m:rPr>
+            <m:sty m:val="p"/>
+          </m:rPr>
+          <m:t>)</m:t>
+        </m:r>
+        <m:r>
+          <m:rPr>
+            <m:sty m:val="p"/>
+          </m:rPr>
+          <m:t>=</m:t>
+        </m:r>
+        <m:r>
+          <m:t>0.10</m:t>
+        </m:r>
+      </m:oMath>
+      <w:r>
+        <w:t xml:space="preserve">.</w:t>
       </w:r>
     </w:p>
     <w:p>
@@ -1611,7 +1669,7 @@
         <w:rPr>
           <w:rStyle w:val="VerbatimChar"/>
         </w:rPr>
-        <w:t xml:space="preserve">6        C#5  0.70  0.10  0.05  0.00  0.10  0.05  0.00, _body=&lt;great_tables._gt_data.Body object at 0xeba88a81b4d0&gt;, _boxhead=Boxhead([ColInfo(var='Estado (t)', type=&lt;ColInfoTypeEnum.default: 1&gt;, column_label='Estado (t)', column_align='left', column_width=None, stub_level=None), ColInfo(var='D4', type=&lt;ColInfoTypeEnum.default: 1&gt;, column_label='D4', column_align='right', column_width=None, stub_level=None), ColInfo(var='E4', type=&lt;ColInfoTypeEnum.default: 1&gt;, column_label='E4', column_align='right', column_width=None, stub_level=None), ColInfo(var='F#4', type=&lt;ColInfoTypeEnum.default: 1&gt;, column_label='F#4', column_align='right', column_width=None, stub_level=None), ColInfo(var='G4', type=&lt;ColInfoTypeEnum.default: 1&gt;, column_label='G4', column_align='right', column_width=None, stub_level=None), ColInfo(var='A4', type=&lt;ColInfoTypeEnum.default: 1&gt;, column_label='A4', column_align='right', column_width=None, stub_level=None), ColInfo(var='B4', type=&lt;ColInfoTypeEnum.default: 1&gt;, column_label='B4', column_align='right', column_width=None, stub_level=None), ColInfo(var='C#5', type=&lt;ColInfoTypeEnum.default: 1&gt;, column_label='C#5', column_align='right', column_width=None, stub_level=None)]), _stub=&lt;great_tables._gt_data.Stub object at 0xeba88a85e850&gt;, _spanners=Spanners([]), _heading=Heading(title='Matriz de Probabilidades de Transición P', subtitle=None, preheader=None), _stubhead=None, _summary_rows=&lt;great_tables._gt_data.SummaryRows object at 0xeba88a7f23f0&gt;, _summary_rows_grand=&lt;great_tables._gt_data.SummaryRows object at 0xeba88a8a2f90&gt;, _source_notes=[], _footnotes=[], _styles=[], _locale=&lt;great_tables._gt_data.Locale object at 0xeba88a85ed50&gt;, _formats=[&lt;great_tables._gt_data.FormatInfo object at 0xeba88a3c0c20&gt;], _substitutions=[], _col_merge=[], _transforms=[], _options=Options(table_id=OptionsInfo(scss=False, category='table', type='value', value=None), table_caption=OptionsInfo(scss=False, category='table', type='value', value=None), table_width=OptionsInfo(scss=True, category='table', type='px', value='auto'), table_layout=OptionsInfo(scss=True, category='table', type='value', value='fixed'), table_margin_left=OptionsInfo(scss=True, category='table', type='px', value='auto'), table_margin_right=OptionsInfo(scss=True, category='table', type='px', value='auto'), table_background_color=OptionsInfo(scss=True, category='table', type='value', value='#FFFFFF'), table_additional_css=OptionsInfo(scss=False, category='table', type='values', value=[]), table_font_names=OptionsInfo(scss=False, category='table', type='values', value=['-apple-system', 'BlinkMacSystemFont', 'Segoe UI', 'Roboto', 'Oxygen', 'Ubuntu', 'Cantarell', 'Helvetica Neue', 'Fira Sans', 'Droid Sans', 'Arial', 'sans-serif']), table_font_size=OptionsInfo(scss=True, category='table', type='px', value='16px'), table_font_weight=OptionsInfo(scss=True, category='table', type='value', value='normal'), table_font_style=OptionsInfo(scss=True, category='table', type='value', value='normal'), table_font_color=OptionsInfo(scss=True, category='table', type='value', value='#333333'), table_font_color_light=OptionsInfo(scss=True, category='table', type='value', value='#FFFFFF'), table_border_top_include=OptionsInfo(scss=False, category='table', type='boolean', value=True), table_border_top_style=OptionsInfo(scss=True, category='table', type='value', value='solid'), table_border_top_width=OptionsInfo(scss=True, category='table', type='px', value='2px'), table_border_top_color=OptionsInfo(scss=True, category='table', type='value', value='#A8A8A8'), table_border_right_style=OptionsInfo(scss=True, category='table', type='value', value='none'), table_border_right_width=OptionsInfo(scss=True, category='table', type='px', value='2px'), table_border_right_color=OptionsInfo(scss=True, category='table', type='value', value='#D3D3D3'), table_border_bottom_include=OptionsInfo(scss=False, category='table', type='boolean', value=True), table_border_bottom_style=OptionsInfo(scss=True, category='table', type='value', value='solid'), table_border_bottom_width=OptionsInfo(scss=True, category='table', type='px', value='2px'), table_border_bottom_color=OptionsInfo(scss=True, category='table', type='value', value='#A8A8A8'), table_border_left_style=OptionsInfo(scss=True, category='table', type='value', value='none'), table_border_left_width=OptionsInfo(scss=True, category='table', type='px', value='2px'), table_border_left_color=OptionsInfo(scss=True, category='table', type='value', value='#D3D3D3'), heading_background_color=OptionsInfo(scss=True, category='heading', type='value', value=None), heading_align=OptionsInfo(scss=True, category='heading', type='value', value='center'), heading_title_font_size=OptionsInfo(scss=True, category='heading', type='px', value='125%'), heading_title_font_weight=OptionsInfo(scss=True, category='heading', type='value', value='initial'), heading_subtitle_font_size=OptionsInfo(scss=True, category='heading', type='px', value='85%'), heading_subtitle_font_weight=OptionsInfo(scss=True, category='heading', type='value', value='initial'), heading_padding=OptionsInfo(scss=True, category='heading', type='px', value='4px'), heading_padding_horizontal=OptionsInfo(scss=True, category='heading', type='px', value='5px'), heading_border_bottom_style=OptionsInfo(scss=True, category='heading', type='value', value='solid'), heading_border_bottom_width=OptionsInfo(scss=True, category='heading', type='px', value='2px'), heading_border_bottom_color=OptionsInfo(scss=True, category='heading', type='value', value='#D3D3D3'), heading_border_lr_style=OptionsInfo(scss=True, category='heading', type='value', value='none'), heading_border_lr_width=OptionsInfo(scss=True, category='heading', type='px', value='1px'), heading_border_lr_color=OptionsInfo(scss=True, category='heading', type='value', value='#D3D3D3'), column_labels_background_color=OptionsInfo(scss=True, category='column_labels', type='value', value=None), column_labels_font_size=OptionsInfo(scss=True, category='column_labels', type='px', value='100%'), column_labels_font_weight=OptionsInfo(scss=True, category='column_labels', type='value', value='normal'), column_labels_text_transform=OptionsInfo(scss=True, category='column_labels', type='value', value='inherit'), column_labels_padding=OptionsInfo(scss=True, category='column_labels', type='px', value='5px'), column_labels_padding_horizontal=OptionsInfo(scss=True, category='column_labels', type='px', value='5px'), column_labels_vlines_style=OptionsInfo(scss=True, category='table_body', type='value', value='none'), column_labels_vlines_width=OptionsInfo(scss=True, category='table_body', type='px', value='1px'), column_labels_vlines_color=OptionsInfo(scss=True, category='table_body', type='value', value='#D3D3D3'), column_labels_border_top_style=OptionsInfo(scss=True, category='column_labels', type='value', value='solid'), column_labels_border_top_width=OptionsInfo(scss=True, category='column_labels', type='px', value='2px'), column_labels_border_top_color=OptionsInfo(scss=True, category='column_labels', type='value', value='#D3D3D3'), column_labels_border_bottom_style=OptionsInfo(scss=True, category='column_labels', type='value', value='solid'), column_labels_border_bottom_width=OptionsInfo(scss=True, category='column_labels', type='px', value='2px'), column_labels_border_bottom_color=OptionsInfo(scss=True, category='column_labels', type='value', value='#D3D3D3'), column_labels_border_lr_style=OptionsInfo(scss=True, category='column_labels', type='value', value='none'), column_labels_border_lr_width=OptionsInfo(scss=True, category='column_labels', type='px', value='1px'), column_labels_border_lr_color=OptionsInfo(scss=True, category='column_labels', type='value', value='#D3D3D3'), column_labels_hidden=OptionsInfo(scss=False, category='column_labels', type='boolean', value=False), row_group_background_color=OptionsInfo(scss=True, category='row_group', type='value', value=None), row_group_font_size=OptionsInfo(scss=True, category='row_group', type='px', value='100%'), row_group_font_weight=OptionsInfo(scss=True, category='row_group', type='value', value='initial'), row_group_text_transform=OptionsInfo(scss=True, category='row_group', type='value', value='inherit'), row_group_padding=OptionsInfo(scss=True, category='row_group', type='px', value='8px'), row_group_padding_horizontal=OptionsInfo(scss=True, category='row_group', type='px', value='5px'), row_group_border_top_style=OptionsInfo(scss=True, category='row_group', type='value', value='solid'), row_group_border_top_width=OptionsInfo(scss=True, category='row_group', type='px', value='2px'), row_group_border_top_color=OptionsInfo(scss=True, category='row_group', type='value', value='#D3D3D3'), row_group_border_right_style=OptionsInfo(scss=True, category='row_group', type='value', value='none'), row_group_border_right_width=OptionsInfo(scss=True, category='row_group', type='px', value='1px'), row_group_border_right_color=OptionsInfo(scss=True, category='row_group', type='value', value='#D3D3D3'), row_group_border_bottom_style=OptionsInfo(scss=True, category='row_group', type='value', value='solid'), row_group_border_bottom_width=OptionsInfo(scss=True, category='row_group', type='px', value='2px'), row_group_border_bottom_color=OptionsInfo(scss=True, category='row_group', type='value', value='#D3D3D3'), row_group_border_left_style=OptionsInfo(scss=True, category='row_group', type='value', value='none'), row_group_border_left_width=OptionsInfo(scss=True, category='row_group', type='px', value='1px'), row_group_border_left_color=OptionsInfo(scss=True, category='row_group', type='value', value='#D3D3D3'), row_group_as_column=OptionsInfo(scss=False, category='row_group', type='boolean', value=False), table_body_hlines_style=OptionsInfo(scss=True, category='table_body', type='value', value='solid'), table_body_hlines_width=OptionsInfo(scss=True, category='table_body', type='px', value='1px'), table_body_hlines_color=OptionsInfo(scss=True, category='table_body', type='value', value='#D3D3D3'), table_body_vlines_style=OptionsInfo(scss=True, category='table_body', type='value', value='none'), table_body_vlines_width=OptionsInfo(scss=True, category='table_body', type='px', value='1px'), table_body_vlines_color=OptionsInfo(scss=True, category='table_body', type='value', value='#D3D3D3'), table_body_border_top_style=OptionsInfo(scss=True, category='table_body', type='value', value='solid'), table_body_border_top_width=OptionsInfo(scss=True, category='table_body', type='px', value='2px'), table_body_border_top_color=OptionsInfo(scss=True, category='table_body', type='value', value='#D3D3D3'), table_body_border_bottom_style=OptionsInfo(scss=True, category='table_body', type='value', value='solid'), table_body_border_bottom_width=OptionsInfo(scss=True, category='table_body', type='px', value='2px'), table_body_border_bottom_color=OptionsInfo(scss=True, category='table_body', type='value', value='#D3D3D3'), data_row_padding=OptionsInfo(scss=True, category='data_row', type='px', value='8px'), data_row_padding_horizontal=OptionsInfo(scss=True, category='data_row', type='px', value='5px'), stub_background_color=OptionsInfo(scss=True, category='stub', type='value', value=None), stub_font_size=OptionsInfo(scss=True, category='stub', type='px', value='100%'), stub_font_weight=OptionsInfo(scss=True, category='stub', type='value', value='initial'), stub_text_transform=OptionsInfo(scss=True, category='stub', type='value', value='inherit'), stub_border_style=OptionsInfo(scss=True, category='stub', type='value', value='solid'), stub_border_width=OptionsInfo(scss=True, category='stub', type='px', value='2px'), stub_border_color=OptionsInfo(scss=True, category='stub', type='value', value='#D3D3D3'), stub_indent_length=OptionsInfo(scss=True, category='stub', type='px', value='5px'), stub_row_group_background_color=OptionsInfo(scss=True, category='stub', type='value', value=None), stub_row_group_font_size=OptionsInfo(scss=True, category='stub', type='px', value='100%'), stub_row_group_font_weight=OptionsInfo(scss=True, category='stub', type='value', value='initial'), stub_row_group_text_transform=OptionsInfo(scss=True, category='stub', type='value', value='inherit'), stub_row_group_border_style=OptionsInfo(scss=True, category='stub', type='value', value='solid'), stub_row_group_border_width=OptionsInfo(scss=True, category='stub', type='px', value='2px'), stub_row_group_border_color=OptionsInfo(scss=True, category='stub', type='value', value='#D3D3D3'), summary_row_padding=OptionsInfo(scss=True, category='summary_row', type='px', value='8px'), summary_row_padding_horizontal=OptionsInfo(scss=True, category='summary_row', type='px', value='5px'), summary_row_background_color=OptionsInfo(scss=True, category='summary_row', type='value', value=None), summary_row_text_transform=OptionsInfo(scss=True, category='summary_row', type='value', value='inherit'), summary_row_border_style=OptionsInfo(scss=True, category='summary_row', type='value', value='solid'), summary_row_border_width=OptionsInfo(scss=True, category='summary_row', type='px', value='2px'), summary_row_border_color=OptionsInfo(scss=True, category='summary_row', type='value', value='#D3D3D3'), grand_summary_row_padding=OptionsInfo(scss=True, category='grand_summary_row', type='px', value='8px'), grand_summary_row_padding_horizontal=OptionsInfo(scss=True, category='grand_summary_row', type='px', value='5px'), grand_summary_row_background_color=OptionsInfo(scss=True, category='grand_summary_row', type='value', value=None), grand_summary_row_text_transform=OptionsInfo(scss=True, category='grand_summary_row', type='value', value='inherit'), grand_summary_row_border_style=OptionsInfo(scss=True, category='grand_summary_row', type='value', value='double'), grand_summary_row_border_width=OptionsInfo(scss=True, category='grand_summary_row', type='px', value='6px'), grand_summary_row_border_color=OptionsInfo(scss=True, category='grand_summary_row', type='value', value='#D3D3D3'), footnotes_marks=OptionsInfo(scss=False, category='footnotes', type='values', value='numbers'), footnotes_spec_ref=OptionsInfo(scss=False, category='footnotes', type='value', value='^i'), footnotes_spec_ftr=OptionsInfo(scss=False, category='footnotes', type='value', value='^i'), footnotes_order=OptionsInfo(scss=False, category='footnotes', type='value', value='marks_last'), source_notes_padding=OptionsInfo(scss=True, category='source_notes', type='px', value='4px'), source_notes_padding_horizontal=OptionsInfo(scss=True, category='source_notes', type='px', value='5px'), source_notes_background_color=OptionsInfo(scss=True, category='source_notes', type='value', value=None), source_notes_font_size=OptionsInfo(scss=True, category='source_notes', type='px', value='90%'), source_notes_border_bottom_style=OptionsInfo(scss=True, category='source_notes', type='value', value='none'), source_notes_border_bottom_width=OptionsInfo(scss=True, category='source_notes', type='px', value='2px'), source_notes_border_bottom_color=OptionsInfo(scss=True, category='source_notes', type='value', value='#D3D3D3'), source_notes_border_lr_style=OptionsInfo(scss=True, category='source_notes', type='value', value='none'), source_notes_border_lr_width=OptionsInfo(scss=True, category='source_notes', type='px', value='2px'), source_notes_border_lr_color=OptionsInfo(scss=True, category='source_notes', type='value', value='#D3D3D3'), source_notes_multiline=OptionsInfo(scss=False, category='source_notes', type='boolean', value=True), source_notes_sep=OptionsInfo(scss=False, category='source_notes', type='value', value=' '), row_striping_background_color=OptionsInfo(scss=True, category='row', type='value', value='#F4F4F4'), row_striping_include_stub=OptionsInfo(scss=False, category='row', type='boolean', value=False), row_striping_include_table_body=OptionsInfo(scss=False, category='row', type='boolean', value=False), container_width=OptionsInfo(scss=False, category='container', type='px', value='auto'), container_height=OptionsInfo(scss=False, category='container', type='px', value='auto'), container_padding_x=OptionsInfo(scss=False, category='container', type='px', value='0px'), container_padding_y=OptionsInfo(scss=False, category='container', type='px', value='10px'), container_overflow_x=OptionsInfo(scss=False, category='container', type='overflow', value='auto'), container_overflow_y=OptionsInfo(scss=False, category='container', type='overflow', value='auto'), quarto_disable_processing=OptionsInfo(scss=False, category='quarto', type='logical', value=False), quarto_use_bootstrap=OptionsInfo(scss=False, category='quarto', type='logical', value=False), ihtml_active=OptionsInfo(scss=False, category='ihtml', type='boolean', value=False), ihtml_use_pagination=OptionsInfo(scss=False, category='ihtml', type='boolean', value=True), ihtml_use_pagination_info=OptionsInfo(scss=False, category='ihtml', type='boolean', value=True), ihtml_use_sorting=OptionsInfo(scss=False, category='ihtml', type='boolean', value=True), ihtml_use_search=OptionsInfo(scss=False, category='ihtml', type='boolean', value=False), ihtml_use_filters=OptionsInfo(scss=False, category='ihtml', type='boolean', value=False), ihtml_use_resizers=OptionsInfo(scss=False, category='ihtml', type='boolean', value=False), ihtml_use_highlight=OptionsInfo(scss=False, category='ihtml', type='boolean', value=False), ihtml_use_compact_mode=OptionsInfo(scss=False, category='ihtml', type='boolean', value=False), ihtml_use_text_wrapping=OptionsInfo(scss=False, category='ihtml', type='boolean', value=True), ihtml_use_page_size_select=OptionsInfo(scss=False, category='ihtml', type='boolean', value=False), ihtml_page_size_default=OptionsInfo(scss=False, category='ihtml', type='value', value=10), ihtml_page_size_values=OptionsInfo(scss=False, category='ihtml', type='values', value=[10, 25, 50, 100]), ihtml_pagination_type=OptionsInfo(scss=False, category='ihtml', type='value', value='numbers'), ihtml_height=OptionsInfo(scss=False, category='ihtml', type='value', value='auto'), ihtml_selection_mode=OptionsInfo(scss=False, category='ihtml', type='value', value=None)), _google_font_imports=GoogleFontImports(imports=frozenset()), _has_built=False)</w:t>
+        <w:t xml:space="preserve">6        C#5  0.70  0.10  0.05  0.00  0.10  0.05  0.00, _body=&lt;great_tables._gt_data.Body object at 0xf94bce95b4d0&gt;, _boxhead=Boxhead([ColInfo(var='Estado (t)', type=&lt;ColInfoTypeEnum.default: 1&gt;, column_label='Estado (t)', column_align='left', column_width=None, stub_level=None), ColInfo(var='D4', type=&lt;ColInfoTypeEnum.default: 1&gt;, column_label='D4', column_align='right', column_width=None, stub_level=None), ColInfo(var='E4', type=&lt;ColInfoTypeEnum.default: 1&gt;, column_label='E4', column_align='right', column_width=None, stub_level=None), ColInfo(var='F#4', type=&lt;ColInfoTypeEnum.default: 1&gt;, column_label='F#4', column_align='right', column_width=None, stub_level=None), ColInfo(var='G4', type=&lt;ColInfoTypeEnum.default: 1&gt;, column_label='G4', column_align='right', column_width=None, stub_level=None), ColInfo(var='A4', type=&lt;ColInfoTypeEnum.default: 1&gt;, column_label='A4', column_align='right', column_width=None, stub_level=None), ColInfo(var='B4', type=&lt;ColInfoTypeEnum.default: 1&gt;, column_label='B4', column_align='right', column_width=None, stub_level=None), ColInfo(var='C#5', type=&lt;ColInfoTypeEnum.default: 1&gt;, column_label='C#5', column_align='right', column_width=None, stub_level=None)]), _stub=&lt;great_tables._gt_data.Stub object at 0xf94bce99e850&gt;, _spanners=Spanners([]), _heading=Heading(title='Matriz de Probabilidades de Transición P', subtitle=None, preheader=None), _stubhead=None, _summary_rows=&lt;great_tables._gt_data.SummaryRows object at 0xf94bce9323f0&gt;, _summary_rows_grand=&lt;great_tables._gt_data.SummaryRows object at 0xf94bce9e2f90&gt;, _source_notes=[], _footnotes=[], _styles=[], _locale=&lt;great_tables._gt_data.Locale object at 0xf94bce99ed50&gt;, _formats=[&lt;great_tables._gt_data.FormatInfo object at 0xf94bce500c20&gt;], _substitutions=[], _col_merge=[], _transforms=[], _options=Options(table_id=OptionsInfo(scss=False, category='table', type='value', value=None), table_caption=OptionsInfo(scss=False, category='table', type='value', value=None), table_width=OptionsInfo(scss=True, category='table', type='px', value='auto'), table_layout=OptionsInfo(scss=True, category='table', type='value', value='fixed'), table_margin_left=OptionsInfo(scss=True, category='table', type='px', value='auto'), table_margin_right=OptionsInfo(scss=True, category='table', type='px', value='auto'), table_background_color=OptionsInfo(scss=True, category='table', type='value', value='#FFFFFF'), table_additional_css=OptionsInfo(scss=False, category='table', type='values', value=[]), table_font_names=OptionsInfo(scss=False, category='table', type='values', value=['-apple-system', 'BlinkMacSystemFont', 'Segoe UI', 'Roboto', 'Oxygen', 'Ubuntu', 'Cantarell', 'Helvetica Neue', 'Fira Sans', 'Droid Sans', 'Arial', 'sans-serif']), table_font_size=OptionsInfo(scss=True, category='table', type='px', value='16px'), table_font_weight=OptionsInfo(scss=True, category='table', type='value', value='normal'), table_font_style=OptionsInfo(scss=True, category='table', type='value', value='normal'), table_font_color=OptionsInfo(scss=True, category='table', type='value', value='#333333'), table_font_color_light=OptionsInfo(scss=True, category='table', type='value', value='#FFFFFF'), table_border_top_include=OptionsInfo(scss=False, category='table', type='boolean', value=True), table_border_top_style=OptionsInfo(scss=True, category='table', type='value', value='solid'), table_border_top_width=OptionsInfo(scss=True, category='table', type='px', value='2px'), table_border_top_color=OptionsInfo(scss=True, category='table', type='value', value='#A8A8A8'), table_border_right_style=OptionsInfo(scss=True, category='table', type='value', value='none'), table_border_right_width=OptionsInfo(scss=True, category='table', type='px', value='2px'), table_border_right_color=OptionsInfo(scss=True, category='table', type='value', value='#D3D3D3'), table_border_bottom_include=OptionsInfo(scss=False, category='table', type='boolean', value=True), table_border_bottom_style=OptionsInfo(scss=True, category='table', type='value', value='solid'), table_border_bottom_width=OptionsInfo(scss=True, category='table', type='px', value='2px'), table_border_bottom_color=OptionsInfo(scss=True, category='table', type='value', value='#A8A8A8'), table_border_left_style=OptionsInfo(scss=True, category='table', type='value', value='none'), table_border_left_width=OptionsInfo(scss=True, category='table', type='px', value='2px'), table_border_left_color=OptionsInfo(scss=True, category='table', type='value', value='#D3D3D3'), heading_background_color=OptionsInfo(scss=True, category='heading', type='value', value=None), heading_align=OptionsInfo(scss=True, category='heading', type='value', value='center'), heading_title_font_size=OptionsInfo(scss=True, category='heading', type='px', value='125%'), heading_title_font_weight=OptionsInfo(scss=True, category='heading', type='value', value='initial'), heading_subtitle_font_size=OptionsInfo(scss=True, category='heading', type='px', value='85%'), heading_subtitle_font_weight=OptionsInfo(scss=True, category='heading', type='value', value='initial'), heading_padding=OptionsInfo(scss=True, category='heading', type='px', value='4px'), heading_padding_horizontal=OptionsInfo(scss=True, category='heading', type='px', value='5px'), heading_border_bottom_style=OptionsInfo(scss=True, category='heading', type='value', value='solid'), heading_border_bottom_width=OptionsInfo(scss=True, category='heading', type='px', value='2px'), heading_border_bottom_color=OptionsInfo(scss=True, category='heading', type='value', value='#D3D3D3'), heading_border_lr_style=OptionsInfo(scss=True, category='heading', type='value', value='none'), heading_border_lr_width=OptionsInfo(scss=True, category='heading', type='px', value='1px'), heading_border_lr_color=OptionsInfo(scss=True, category='heading', type='value', value='#D3D3D3'), column_labels_background_color=OptionsInfo(scss=True, category='column_labels', type='value', value=None), column_labels_font_size=OptionsInfo(scss=True, category='column_labels', type='px', value='100%'), column_labels_font_weight=OptionsInfo(scss=True, category='column_labels', type='value', value='normal'), column_labels_text_transform=OptionsInfo(scss=True, category='column_labels', type='value', value='inherit'), column_labels_padding=OptionsInfo(scss=True, category='column_labels', type='px', value='5px'), column_labels_padding_horizontal=OptionsInfo(scss=True, category='column_labels', type='px', value='5px'), column_labels_vlines_style=OptionsInfo(scss=True, category='table_body', type='value', value='none'), column_labels_vlines_width=OptionsInfo(scss=True, category='table_body', type='px', value='1px'), column_labels_vlines_color=OptionsInfo(scss=True, category='table_body', type='value', value='#D3D3D3'), column_labels_border_top_style=OptionsInfo(scss=True, category='column_labels', type='value', value='solid'), column_labels_border_top_width=OptionsInfo(scss=True, category='column_labels', type='px', value='2px'), column_labels_border_top_color=OptionsInfo(scss=True, category='column_labels', type='value', value='#D3D3D3'), column_labels_border_bottom_style=OptionsInfo(scss=True, category='column_labels', type='value', value='solid'), column_labels_border_bottom_width=OptionsInfo(scss=True, category='column_labels', type='px', value='2px'), column_labels_border_bottom_color=OptionsInfo(scss=True, category='column_labels', type='value', value='#D3D3D3'), column_labels_border_lr_style=OptionsInfo(scss=True, category='column_labels', type='value', value='none'), column_labels_border_lr_width=OptionsInfo(scss=True, category='column_labels', type='px', value='1px'), column_labels_border_lr_color=OptionsInfo(scss=True, category='column_labels', type='value', value='#D3D3D3'), column_labels_hidden=OptionsInfo(scss=False, category='column_labels', type='boolean', value=False), row_group_background_color=OptionsInfo(scss=True, category='row_group', type='value', value=None), row_group_font_size=OptionsInfo(scss=True, category='row_group', type='px', value='100%'), row_group_font_weight=OptionsInfo(scss=True, category='row_group', type='value', value='initial'), row_group_text_transform=OptionsInfo(scss=True, category='row_group', type='value', value='inherit'), row_group_padding=OptionsInfo(scss=True, category='row_group', type='px', value='8px'), row_group_padding_horizontal=OptionsInfo(scss=True, category='row_group', type='px', value='5px'), row_group_border_top_style=OptionsInfo(scss=True, category='row_group', type='value', value='solid'), row_group_border_top_width=OptionsInfo(scss=True, category='row_group', type='px', value='2px'), row_group_border_top_color=OptionsInfo(scss=True, category='row_group', type='value', value='#D3D3D3'), row_group_border_right_style=OptionsInfo(scss=True, category='row_group', type='value', value='none'), row_group_border_right_width=OptionsInfo(scss=True, category='row_group', type='px', value='1px'), row_group_border_right_color=OptionsInfo(scss=True, category='row_group', type='value', value='#D3D3D3'), row_group_border_bottom_style=OptionsInfo(scss=True, category='row_group', type='value', value='solid'), row_group_border_bottom_width=OptionsInfo(scss=True, category='row_group', type='px', value='2px'), row_group_border_bottom_color=OptionsInfo(scss=True, category='row_group', type='value', value='#D3D3D3'), row_group_border_left_style=OptionsInfo(scss=True, category='row_group', type='value', value='none'), row_group_border_left_width=OptionsInfo(scss=True, category='row_group', type='px', value='1px'), row_group_border_left_color=OptionsInfo(scss=True, category='row_group', type='value', value='#D3D3D3'), row_group_as_column=OptionsInfo(scss=False, category='row_group', type='boolean', value=False), table_body_hlines_style=OptionsInfo(scss=True, category='table_body', type='value', value='solid'), table_body_hlines_width=OptionsInfo(scss=True, category='table_body', type='px', value='1px'), table_body_hlines_color=OptionsInfo(scss=True, category='table_body', type='value', value='#D3D3D3'), table_body_vlines_style=OptionsInfo(scss=True, category='table_body', type='value', value='none'), table_body_vlines_width=OptionsInfo(scss=True, category='table_body', type='px', value='1px'), table_body_vlines_color=OptionsInfo(scss=True, category='table_body', type='value', value='#D3D3D3'), table_body_border_top_style=OptionsInfo(scss=True, category='table_body', type='value', value='solid'), table_body_border_top_width=OptionsInfo(scss=True, category='table_body', type='px', value='2px'), table_body_border_top_color=OptionsInfo(scss=True, category='table_body', type='value', value='#D3D3D3'), table_body_border_bottom_style=OptionsInfo(scss=True, category='table_body', type='value', value='solid'), table_body_border_bottom_width=OptionsInfo(scss=True, category='table_body', type='px', value='2px'), table_body_border_bottom_color=OptionsInfo(scss=True, category='table_body', type='value', value='#D3D3D3'), data_row_padding=OptionsInfo(scss=True, category='data_row', type='px', value='8px'), data_row_padding_horizontal=OptionsInfo(scss=True, category='data_row', type='px', value='5px'), stub_background_color=OptionsInfo(scss=True, category='stub', type='value', value=None), stub_font_size=OptionsInfo(scss=True, category='stub', type='px', value='100%'), stub_font_weight=OptionsInfo(scss=True, category='stub', type='value', value='initial'), stub_text_transform=OptionsInfo(scss=True, category='stub', type='value', value='inherit'), stub_border_style=OptionsInfo(scss=True, category='stub', type='value', value='solid'), stub_border_width=OptionsInfo(scss=True, category='stub', type='px', value='2px'), stub_border_color=OptionsInfo(scss=True, category='stub', type='value', value='#D3D3D3'), stub_indent_length=OptionsInfo(scss=True, category='stub', type='px', value='5px'), stub_row_group_background_color=OptionsInfo(scss=True, category='stub', type='value', value=None), stub_row_group_font_size=OptionsInfo(scss=True, category='stub', type='px', value='100%'), stub_row_group_font_weight=OptionsInfo(scss=True, category='stub', type='value', value='initial'), stub_row_group_text_transform=OptionsInfo(scss=True, category='stub', type='value', value='inherit'), stub_row_group_border_style=OptionsInfo(scss=True, category='stub', type='value', value='solid'), stub_row_group_border_width=OptionsInfo(scss=True, category='stub', type='px', value='2px'), stub_row_group_border_color=OptionsInfo(scss=True, category='stub', type='value', value='#D3D3D3'), summary_row_padding=OptionsInfo(scss=True, category='summary_row', type='px', value='8px'), summary_row_padding_horizontal=OptionsInfo(scss=True, category='summary_row', type='px', value='5px'), summary_row_background_color=OptionsInfo(scss=True, category='summary_row', type='value', value=None), summary_row_text_transform=OptionsInfo(scss=True, category='summary_row', type='value', value='inherit'), summary_row_border_style=OptionsInfo(scss=True, category='summary_row', type='value', value='solid'), summary_row_border_width=OptionsInfo(scss=True, category='summary_row', type='px', value='2px'), summary_row_border_color=OptionsInfo(scss=True, category='summary_row', type='value', value='#D3D3D3'), grand_summary_row_padding=OptionsInfo(scss=True, category='grand_summary_row', type='px', value='8px'), grand_summary_row_padding_horizontal=OptionsInfo(scss=True, category='grand_summary_row', type='px', value='5px'), grand_summary_row_background_color=OptionsInfo(scss=True, category='grand_summary_row', type='value', value=None), grand_summary_row_text_transform=OptionsInfo(scss=True, category='grand_summary_row', type='value', value='inherit'), grand_summary_row_border_style=OptionsInfo(scss=True, category='grand_summary_row', type='value', value='double'), grand_summary_row_border_width=OptionsInfo(scss=True, category='grand_summary_row', type='px', value='6px'), grand_summary_row_border_color=OptionsInfo(scss=True, category='grand_summary_row', type='value', value='#D3D3D3'), footnotes_marks=OptionsInfo(scss=False, category='footnotes', type='values', value='numbers'), footnotes_spec_ref=OptionsInfo(scss=False, category='footnotes', type='value', value='^i'), footnotes_spec_ftr=OptionsInfo(scss=False, category='footnotes', type='value', value='^i'), footnotes_order=OptionsInfo(scss=False, category='footnotes', type='value', value='marks_last'), source_notes_padding=OptionsInfo(scss=True, category='source_notes', type='px', value='4px'), source_notes_padding_horizontal=OptionsInfo(scss=True, category='source_notes', type='px', value='5px'), source_notes_background_color=OptionsInfo(scss=True, category='source_notes', type='value', value=None), source_notes_font_size=OptionsInfo(scss=True, category='source_notes', type='px', value='90%'), source_notes_border_bottom_style=OptionsInfo(scss=True, category='source_notes', type='value', value='none'), source_notes_border_bottom_width=OptionsInfo(scss=True, category='source_notes', type='px', value='2px'), source_notes_border_bottom_color=OptionsInfo(scss=True, category='source_notes', type='value', value='#D3D3D3'), source_notes_border_lr_style=OptionsInfo(scss=True, category='source_notes', type='value', value='none'), source_notes_border_lr_width=OptionsInfo(scss=True, category='source_notes', type='px', value='2px'), source_notes_border_lr_color=OptionsInfo(scss=True, category='source_notes', type='value', value='#D3D3D3'), source_notes_multiline=OptionsInfo(scss=False, category='source_notes', type='boolean', value=True), source_notes_sep=OptionsInfo(scss=False, category='source_notes', type='value', value=' '), row_striping_background_color=OptionsInfo(scss=True, category='row', type='value', value='#F4F4F4'), row_striping_include_stub=OptionsInfo(scss=False, category='row', type='boolean', value=False), row_striping_include_table_body=OptionsInfo(scss=False, category='row', type='boolean', value=False), container_width=OptionsInfo(scss=False, category='container', type='px', value='auto'), container_height=OptionsInfo(scss=False, category='container', type='px', value='auto'), container_padding_x=OptionsInfo(scss=False, category='container', type='px', value='0px'), container_padding_y=OptionsInfo(scss=False, category='container', type='px', value='10px'), container_overflow_x=OptionsInfo(scss=False, category='container', type='overflow', value='auto'), container_overflow_y=OptionsInfo(scss=False, category='container', type='overflow', value='auto'), quarto_disable_processing=OptionsInfo(scss=False, category='quarto', type='logical', value=False), quarto_use_bootstrap=OptionsInfo(scss=False, category='quarto', type='logical', value=False), ihtml_active=OptionsInfo(scss=False, category='ihtml', type='boolean', value=False), ihtml_use_pagination=OptionsInfo(scss=False, category='ihtml', type='boolean', value=True), ihtml_use_pagination_info=OptionsInfo(scss=False, category='ihtml', type='boolean', value=True), ihtml_use_sorting=OptionsInfo(scss=False, category='ihtml', type='boolean', value=True), ihtml_use_search=OptionsInfo(scss=False, category='ihtml', type='boolean', value=False), ihtml_use_filters=OptionsInfo(scss=False, category='ihtml', type='boolean', value=False), ihtml_use_resizers=OptionsInfo(scss=False, category='ihtml', type='boolean', value=False), ihtml_use_highlight=OptionsInfo(scss=False, category='ihtml', type='boolean', value=False), ihtml_use_compact_mode=OptionsInfo(scss=False, category='ihtml', type='boolean', value=False), ihtml_use_text_wrapping=OptionsInfo(scss=False, category='ihtml', type='boolean', value=True), ihtml_use_page_size_select=OptionsInfo(scss=False, category='ihtml', type='boolean', value=False), ihtml_page_size_default=OptionsInfo(scss=False, category='ihtml', type='value', value=10), ihtml_page_size_values=OptionsInfo(scss=False, category='ihtml', type='values', value=[10, 25, 50, 100]), ihtml_pagination_type=OptionsInfo(scss=False, category='ihtml', type='value', value='numbers'), ihtml_height=OptionsInfo(scss=False, category='ihtml', type='value', value='auto'), ihtml_selection_mode=OptionsInfo(scss=False, category='ihtml', type='value', value=None)), _google_font_imports=GoogleFontImports(imports=frozenset()), _has_built=False)</w:t>
       </w:r>
     </w:p>
     <w:bookmarkEnd w:id="19"/>
@@ -1974,7 +2032,7 @@
         <w:pStyle w:val="FirstParagraph"/>
       </w:pPr>
       <w:r>
-        <w:t xml:space="preserve">En el modelo de tres palabras presentado por Rodrigo Castellanos en clase ("él", "gato", "duerme"), la distribución evoluciona en cada paso y se estabiliza cerca de 20 transiciones. Esta distribución límite</w:t>
+        <w:t xml:space="preserve">En el modelo de lenguaje de tres palabras presentado por Rodrigo Castellanos en clase ("él", "gato", "duerme"), al partir de 100 textos iniciales distribuidos como [50, 40, 10], el vector evoluciona tras 2 pasos a [0.29, 0.33, 0.36] y se estabiliza cerca de 20 transiciones. Esta distribución límite</w:t>
       </w:r>
       <w:r>
         <w:t xml:space="preserve"> </w:t>
@@ -2215,7 +2273,7 @@
         <w:rPr>
           <w:rStyle w:val="VerbatimChar"/>
         </w:rPr>
-        <w:t xml:space="preserve">6  C#5    vii° (Sensible)              0.0437      4.37%, _body=&lt;great_tables._gt_data.Body object at 0xeba88a2bc410&gt;, _boxhead=Boxhead([ColInfo(var='Nota', type=&lt;ColInfoTypeEnum.default: 1&gt;, column_label='Nota', column_align='left', column_width=None, stub_level=None), ColInfo(var='Grado', type=&lt;ColInfoTypeEnum.default: 1&gt;, column_label='Grado', column_align='left', column_width=None, stub_level=None), ColInfo(var='Probabilidad límite', type=&lt;ColInfoTypeEnum.default: 1&gt;, column_label='Probabilidad límite', column_align='right', column_width=None, stub_level=None), ColInfo(var='Porcentaje', type=&lt;ColInfoTypeEnum.default: 1&gt;, column_label='Porcentaje', column_align='right', column_width=None, stub_level=None)]), _stub=&lt;great_tables._gt_data.Stub object at 0xeba88a7f2650&gt;, _spanners=Spanners([]), _heading=Heading(title='Distribución Estacionaria Asintótica', subtitle=None, preheader=None), _stubhead=None, _summary_rows=&lt;great_tables._gt_data.SummaryRows object at 0xeba88a4258c0&gt;, _summary_rows_grand=&lt;great_tables._gt_data.SummaryRows object at 0xeba88a4259d0&gt;, _source_notes=[], _footnotes=[], _styles=[], _locale=&lt;great_tables._gt_data.Locale object at 0xeba88a7f2c40&gt;, _formats=[], _substitutions=[], _col_merge=[], _transforms=[], _options=Options(table_id=OptionsInfo(scss=False, category='table', type='value', value=None), table_caption=OptionsInfo(scss=False, category='table', type='value', value=None), table_width=OptionsInfo(scss=True, category='table', type='px', value='auto'), table_layout=OptionsInfo(scss=True, category='table', type='value', value='fixed'), table_margin_left=OptionsInfo(scss=True, category='table', type='px', value='auto'), table_margin_right=OptionsInfo(scss=True, category='table', type='px', value='auto'), table_background_color=OptionsInfo(scss=True, category='table', type='value', value='#FFFFFF'), table_additional_css=OptionsInfo(scss=False, category='table', type='values', value=[]), table_font_names=OptionsInfo(scss=False, category='table', type='values', value=['-apple-system', 'BlinkMacSystemFont', 'Segoe UI', 'Roboto', 'Oxygen', 'Ubuntu', 'Cantarell', 'Helvetica Neue', 'Fira Sans', 'Droid Sans', 'Arial', 'sans-serif']), table_font_size=OptionsInfo(scss=True, category='table', type='px', value='16px'), table_font_weight=OptionsInfo(scss=True, category='table', type='value', value='normal'), table_font_style=OptionsInfo(scss=True, category='table', type='value', value='normal'), table_font_color=OptionsInfo(scss=True, category='table', type='value', value='#333333'), table_font_color_light=OptionsInfo(scss=True, category='table', type='value', value='#FFFFFF'), table_border_top_include=OptionsInfo(scss=False, category='table', type='boolean', value=True), table_border_top_style=OptionsInfo(scss=True, category='table', type='value', value='solid'), table_border_top_width=OptionsInfo(scss=True, category='table', type='px', value='2px'), table_border_top_color=OptionsInfo(scss=True, category='table', type='value', value='#A8A8A8'), table_border_right_style=OptionsInfo(scss=True, category='table', type='value', value='none'), table_border_right_width=OptionsInfo(scss=True, category='table', type='px', value='2px'), table_border_right_color=OptionsInfo(scss=True, category='table', type='value', value='#D3D3D3'), table_border_bottom_include=OptionsInfo(scss=False, category='table', type='boolean', value=True), table_border_bottom_style=OptionsInfo(scss=True, category='table', type='value', value='solid'), table_border_bottom_width=OptionsInfo(scss=True, category='table', type='px', value='2px'), table_border_bottom_color=OptionsInfo(scss=True, category='table', type='value', value='#A8A8A8'), table_border_left_style=OptionsInfo(scss=True, category='table', type='value', value='none'), table_border_left_width=OptionsInfo(scss=True, category='table', type='px', value='2px'), table_border_left_color=OptionsInfo(scss=True, category='table', type='value', value='#D3D3D3'), heading_background_color=OptionsInfo(scss=True, category='heading', type='value', value=None), heading_align=OptionsInfo(scss=True, category='heading', type='value', value='center'), heading_title_font_size=OptionsInfo(scss=True, category='heading', type='px', value='125%'), heading_title_font_weight=OptionsInfo(scss=True, category='heading', type='value', value='initial'), heading_subtitle_font_size=OptionsInfo(scss=True, category='heading', type='px', value='85%'), heading_subtitle_font_weight=OptionsInfo(scss=True, category='heading', type='value', value='initial'), heading_padding=OptionsInfo(scss=True, category='heading', type='px', value='4px'), heading_padding_horizontal=OptionsInfo(scss=True, category='heading', type='px', value='5px'), heading_border_bottom_style=OptionsInfo(scss=True, category='heading', type='value', value='solid'), heading_border_bottom_width=OptionsInfo(scss=True, category='heading', type='px', value='2px'), heading_border_bottom_color=OptionsInfo(scss=True, category='heading', type='value', value='#D3D3D3'), heading_border_lr_style=OptionsInfo(scss=True, category='heading', type='value', value='none'), heading_border_lr_width=OptionsInfo(scss=True, category='heading', type='px', value='1px'), heading_border_lr_color=OptionsInfo(scss=True, category='heading', type='value', value='#D3D3D3'), column_labels_background_color=OptionsInfo(scss=True, category='column_labels', type='value', value=None), column_labels_font_size=OptionsInfo(scss=True, category='column_labels', type='px', value='100%'), column_labels_font_weight=OptionsInfo(scss=True, category='column_labels', type='value', value='normal'), column_labels_text_transform=OptionsInfo(scss=True, category='column_labels', type='value', value='inherit'), column_labels_padding=OptionsInfo(scss=True, category='column_labels', type='px', value='5px'), column_labels_padding_horizontal=OptionsInfo(scss=True, category='column_labels', type='px', value='5px'), column_labels_vlines_style=OptionsInfo(scss=True, category='table_body', type='value', value='none'), column_labels_vlines_width=OptionsInfo(scss=True, category='table_body', type='px', value='1px'), column_labels_vlines_color=OptionsInfo(scss=True, category='table_body', type='value', value='#D3D3D3'), column_labels_border_top_style=OptionsInfo(scss=True, category='column_labels', type='value', value='solid'), column_labels_border_top_width=OptionsInfo(scss=True, category='column_labels', type='px', value='2px'), column_labels_border_top_color=OptionsInfo(scss=True, category='column_labels', type='value', value='#D3D3D3'), column_labels_border_bottom_style=OptionsInfo(scss=True, category='column_labels', type='value', value='solid'), column_labels_border_bottom_width=OptionsInfo(scss=True, category='column_labels', type='px', value='2px'), column_labels_border_bottom_color=OptionsInfo(scss=True, category='column_labels', type='value', value='#D3D3D3'), column_labels_border_lr_style=OptionsInfo(scss=True, category='column_labels', type='value', value='none'), column_labels_border_lr_width=OptionsInfo(scss=True, category='column_labels', type='px', value='1px'), column_labels_border_lr_color=OptionsInfo(scss=True, category='column_labels', type='value', value='#D3D3D3'), column_labels_hidden=OptionsInfo(scss=False, category='column_labels', type='boolean', value=False), row_group_background_color=OptionsInfo(scss=True, category='row_group', type='value', value=None), row_group_font_size=OptionsInfo(scss=True, category='row_group', type='px', value='100%'), row_group_font_weight=OptionsInfo(scss=True, category='row_group', type='value', value='initial'), row_group_text_transform=OptionsInfo(scss=True, category='row_group', type='value', value='inherit'), row_group_padding=OptionsInfo(scss=True, category='row_group', type='px', value='8px'), row_group_padding_horizontal=OptionsInfo(scss=True, category='row_group', type='px', value='5px'), row_group_border_top_style=OptionsInfo(scss=True, category='row_group', type='value', value='solid'), row_group_border_top_width=OptionsInfo(scss=True, category='row_group', type='px', value='2px'), row_group_border_top_color=OptionsInfo(scss=True, category='row_group', type='value', value='#D3D3D3'), row_group_border_right_style=OptionsInfo(scss=True, category='row_group', type='value', value='none'), row_group_border_right_width=OptionsInfo(scss=True, category='row_group', type='px', value='1px'), row_group_border_right_color=OptionsInfo(scss=True, category='row_group', type='value', value='#D3D3D3'), row_group_border_bottom_style=OptionsInfo(scss=True, category='row_group', type='value', value='solid'), row_group_border_bottom_width=OptionsInfo(scss=True, category='row_group', type='px', value='2px'), row_group_border_bottom_color=OptionsInfo(scss=True, category='row_group', type='value', value='#D3D3D3'), row_group_border_left_style=OptionsInfo(scss=True, category='row_group', type='value', value='none'), row_group_border_left_width=OptionsInfo(scss=True, category='row_group', type='px', value='1px'), row_group_border_left_color=OptionsInfo(scss=True, category='row_group', type='value', value='#D3D3D3'), row_group_as_column=OptionsInfo(scss=False, category='row_group', type='boolean', value=False), table_body_hlines_style=OptionsInfo(scss=True, category='table_body', type='value', value='solid'), table_body_hlines_width=OptionsInfo(scss=True, category='table_body', type='px', value='1px'), table_body_hlines_color=OptionsInfo(scss=True, category='table_body', type='value', value='#D3D3D3'), table_body_vlines_style=OptionsInfo(scss=True, category='table_body', type='value', value='none'), table_body_vlines_width=OptionsInfo(scss=True, category='table_body', type='px', value='1px'), table_body_vlines_color=OptionsInfo(scss=True, category='table_body', type='value', value='#D3D3D3'), table_body_border_top_style=OptionsInfo(scss=True, category='table_body', type='value', value='solid'), table_body_border_top_width=OptionsInfo(scss=True, category='table_body', type='px', value='2px'), table_body_border_top_color=OptionsInfo(scss=True, category='table_body', type='value', value='#D3D3D3'), table_body_border_bottom_style=OptionsInfo(scss=True, category='table_body', type='value', value='solid'), table_body_border_bottom_width=OptionsInfo(scss=True, category='table_body', type='px', value='2px'), table_body_border_bottom_color=OptionsInfo(scss=True, category='table_body', type='value', value='#D3D3D3'), data_row_padding=OptionsInfo(scss=True, category='data_row', type='px', value='8px'), data_row_padding_horizontal=OptionsInfo(scss=True, category='data_row', type='px', value='5px'), stub_background_color=OptionsInfo(scss=True, category='stub', type='value', value=None), stub_font_size=OptionsInfo(scss=True, category='stub', type='px', value='100%'), stub_font_weight=OptionsInfo(scss=True, category='stub', type='value', value='initial'), stub_text_transform=OptionsInfo(scss=True, category='stub', type='value', value='inherit'), stub_border_style=OptionsInfo(scss=True, category='stub', type='value', value='solid'), stub_border_width=OptionsInfo(scss=True, category='stub', type='px', value='2px'), stub_border_color=OptionsInfo(scss=True, category='stub', type='value', value='#D3D3D3'), stub_indent_length=OptionsInfo(scss=True, category='stub', type='px', value='5px'), stub_row_group_background_color=OptionsInfo(scss=True, category='stub', type='value', value=None), stub_row_group_font_size=OptionsInfo(scss=True, category='stub', type='px', value='100%'), stub_row_group_font_weight=OptionsInfo(scss=True, category='stub', type='value', value='initial'), stub_row_group_text_transform=OptionsInfo(scss=True, category='stub', type='value', value='inherit'), stub_row_group_border_style=OptionsInfo(scss=True, category='stub', type='value', value='solid'), stub_row_group_border_width=OptionsInfo(scss=True, category='stub', type='px', value='2px'), stub_row_group_border_color=OptionsInfo(scss=True, category='stub', type='value', value='#D3D3D3'), summary_row_padding=OptionsInfo(scss=True, category='summary_row', type='px', value='8px'), summary_row_padding_horizontal=OptionsInfo(scss=True, category='summary_row', type='px', value='5px'), summary_row_background_color=OptionsInfo(scss=True, category='summary_row', type='value', value=None), summary_row_text_transform=OptionsInfo(scss=True, category='summary_row', type='value', value='inherit'), summary_row_border_style=OptionsInfo(scss=True, category='summary_row', type='value', value='solid'), summary_row_border_width=OptionsInfo(scss=True, category='summary_row', type='px', value='2px'), summary_row_border_color=OptionsInfo(scss=True, category='summary_row', type='value', value='#D3D3D3'), grand_summary_row_padding=OptionsInfo(scss=True, category='grand_summary_row', type='px', value='8px'), grand_summary_row_padding_horizontal=OptionsInfo(scss=True, category='grand_summary_row', type='px', value='5px'), grand_summary_row_background_color=OptionsInfo(scss=True, category='grand_summary_row', type='value', value=None), grand_summary_row_text_transform=OptionsInfo(scss=True, category='grand_summary_row', type='value', value='inherit'), grand_summary_row_border_style=OptionsInfo(scss=True, category='grand_summary_row', type='value', value='double'), grand_summary_row_border_width=OptionsInfo(scss=True, category='grand_summary_row', type='px', value='6px'), grand_summary_row_border_color=OptionsInfo(scss=True, category='grand_summary_row', type='value', value='#D3D3D3'), footnotes_marks=OptionsInfo(scss=False, category='footnotes', type='values', value='numbers'), footnotes_spec_ref=OptionsInfo(scss=False, category='footnotes', type='value', value='^i'), footnotes_spec_ftr=OptionsInfo(scss=False, category='footnotes', type='value', value='^i'), footnotes_order=OptionsInfo(scss=False, category='footnotes', type='value', value='marks_last'), source_notes_padding=OptionsInfo(scss=True, category='source_notes', type='px', value='4px'), source_notes_padding_horizontal=OptionsInfo(scss=True, category='source_notes', type='px', value='5px'), source_notes_background_color=OptionsInfo(scss=True, category='source_notes', type='value', value=None), source_notes_font_size=OptionsInfo(scss=True, category='source_notes', type='px', value='90%'), source_notes_border_bottom_style=OptionsInfo(scss=True, category='source_notes', type='value', value='none'), source_notes_border_bottom_width=OptionsInfo(scss=True, category='source_notes', type='px', value='2px'), source_notes_border_bottom_color=OptionsInfo(scss=True, category='source_notes', type='value', value='#D3D3D3'), source_notes_border_lr_style=OptionsInfo(scss=True, category='source_notes', type='value', value='none'), source_notes_border_lr_width=OptionsInfo(scss=True, category='source_notes', type='px', value='2px'), source_notes_border_lr_color=OptionsInfo(scss=True, category='source_notes', type='value', value='#D3D3D3'), source_notes_multiline=OptionsInfo(scss=False, category='source_notes', type='boolean', value=True), source_notes_sep=OptionsInfo(scss=False, category='source_notes', type='value', value=' '), row_striping_background_color=OptionsInfo(scss=True, category='row', type='value', value='#F4F4F4'), row_striping_include_stub=OptionsInfo(scss=False, category='row', type='boolean', value=False), row_striping_include_table_body=OptionsInfo(scss=False, category='row', type='boolean', value=False), container_width=OptionsInfo(scss=False, category='container', type='px', value='auto'), container_height=OptionsInfo(scss=False, category='container', type='px', value='auto'), container_padding_x=OptionsInfo(scss=False, category='container', type='px', value='0px'), container_padding_y=OptionsInfo(scss=False, category='container', type='px', value='10px'), container_overflow_x=OptionsInfo(scss=False, category='container', type='overflow', value='auto'), container_overflow_y=OptionsInfo(scss=False, category='container', type='overflow', value='auto'), quarto_disable_processing=OptionsInfo(scss=False, category='quarto', type='logical', value=False), quarto_use_bootstrap=OptionsInfo(scss=False, category='quarto', type='logical', value=False), ihtml_active=OptionsInfo(scss=False, category='ihtml', type='boolean', value=False), ihtml_use_pagination=OptionsInfo(scss=False, category='ihtml', type='boolean', value=True), ihtml_use_pagination_info=OptionsInfo(scss=False, category='ihtml', type='boolean', value=True), ihtml_use_sorting=OptionsInfo(scss=False, category='ihtml', type='boolean', value=True), ihtml_use_search=OptionsInfo(scss=False, category='ihtml', type='boolean', value=False), ihtml_use_filters=OptionsInfo(scss=False, category='ihtml', type='boolean', value=False), ihtml_use_resizers=OptionsInfo(scss=False, category='ihtml', type='boolean', value=False), ihtml_use_highlight=OptionsInfo(scss=False, category='ihtml', type='boolean', value=False), ihtml_use_compact_mode=OptionsInfo(scss=False, category='ihtml', type='boolean', value=False), ihtml_use_text_wrapping=OptionsInfo(scss=False, category='ihtml', type='boolean', value=True), ihtml_use_page_size_select=OptionsInfo(scss=False, category='ihtml', type='boolean', value=False), ihtml_page_size_default=OptionsInfo(scss=False, category='ihtml', type='value', value=10), ihtml_page_size_values=OptionsInfo(scss=False, category='ihtml', type='values', value=[10, 25, 50, 100]), ihtml_pagination_type=OptionsInfo(scss=False, category='ihtml', type='value', value='numbers'), ihtml_height=OptionsInfo(scss=False, category='ihtml', type='value', value='auto'), ihtml_selection_mode=OptionsInfo(scss=False, category='ihtml', type='value', value=None)), _google_font_imports=GoogleFontImports(imports=frozenset()), _has_built=False)</w:t>
+        <w:t xml:space="preserve">6  C#5    vii° (Sensible)              0.0437      4.37%, _body=&lt;great_tables._gt_data.Body object at 0xf94bcc304410&gt;, _boxhead=Boxhead([ColInfo(var='Nota', type=&lt;ColInfoTypeEnum.default: 1&gt;, column_label='Nota', column_align='left', column_width=None, stub_level=None), ColInfo(var='Grado', type=&lt;ColInfoTypeEnum.default: 1&gt;, column_label='Grado', column_align='left', column_width=None, stub_level=None), ColInfo(var='Probabilidad límite', type=&lt;ColInfoTypeEnum.default: 1&gt;, column_label='Probabilidad límite', column_align='right', column_width=None, stub_level=None), ColInfo(var='Porcentaje', type=&lt;ColInfoTypeEnum.default: 1&gt;, column_label='Porcentaje', column_align='right', column_width=None, stub_level=None)]), _stub=&lt;great_tables._gt_data.Stub object at 0xf94bce932650&gt;, _spanners=Spanners([]), _heading=Heading(title='Distribución Estacionaria Asintótica', subtitle=None, preheader=None), _stubhead=None, _summary_rows=&lt;great_tables._gt_data.SummaryRows object at 0xf94bce5658c0&gt;, _summary_rows_grand=&lt;great_tables._gt_data.SummaryRows object at 0xf94bce5659d0&gt;, _source_notes=[], _footnotes=[], _styles=[], _locale=&lt;great_tables._gt_data.Locale object at 0xf94bce932c40&gt;, _formats=[], _substitutions=[], _col_merge=[], _transforms=[], _options=Options(table_id=OptionsInfo(scss=False, category='table', type='value', value=None), table_caption=OptionsInfo(scss=False, category='table', type='value', value=None), table_width=OptionsInfo(scss=True, category='table', type='px', value='auto'), table_layout=OptionsInfo(scss=True, category='table', type='value', value='fixed'), table_margin_left=OptionsInfo(scss=True, category='table', type='px', value='auto'), table_margin_right=OptionsInfo(scss=True, category='table', type='px', value='auto'), table_background_color=OptionsInfo(scss=True, category='table', type='value', value='#FFFFFF'), table_additional_css=OptionsInfo(scss=False, category='table', type='values', value=[]), table_font_names=OptionsInfo(scss=False, category='table', type='values', value=['-apple-system', 'BlinkMacSystemFont', 'Segoe UI', 'Roboto', 'Oxygen', 'Ubuntu', 'Cantarell', 'Helvetica Neue', 'Fira Sans', 'Droid Sans', 'Arial', 'sans-serif']), table_font_size=OptionsInfo(scss=True, category='table', type='px', value='16px'), table_font_weight=OptionsInfo(scss=True, category='table', type='value', value='normal'), table_font_style=OptionsInfo(scss=True, category='table', type='value', value='normal'), table_font_color=OptionsInfo(scss=True, category='table', type='value', value='#333333'), table_font_color_light=OptionsInfo(scss=True, category='table', type='value', value='#FFFFFF'), table_border_top_include=OptionsInfo(scss=False, category='table', type='boolean', value=True), table_border_top_style=OptionsInfo(scss=True, category='table', type='value', value='solid'), table_border_top_width=OptionsInfo(scss=True, category='table', type='px', value='2px'), table_border_top_color=OptionsInfo(scss=True, category='table', type='value', value='#A8A8A8'), table_border_right_style=OptionsInfo(scss=True, category='table', type='value', value='none'), table_border_right_width=OptionsInfo(scss=True, category='table', type='px', value='2px'), table_border_right_color=OptionsInfo(scss=True, category='table', type='value', value='#D3D3D3'), table_border_bottom_include=OptionsInfo(scss=False, category='table', type='boolean', value=True), table_border_bottom_style=OptionsInfo(scss=True, category='table', type='value', value='solid'), table_border_bottom_width=OptionsInfo(scss=True, category='table', type='px', value='2px'), table_border_bottom_color=OptionsInfo(scss=True, category='table', type='value', value='#A8A8A8'), table_border_left_style=OptionsInfo(scss=True, category='table', type='value', value='none'), table_border_left_width=OptionsInfo(scss=True, category='table', type='px', value='2px'), table_border_left_color=OptionsInfo(scss=True, category='table', type='value', value='#D3D3D3'), heading_background_color=OptionsInfo(scss=True, category='heading', type='value', value=None), heading_align=OptionsInfo(scss=True, category='heading', type='value', value='center'), heading_title_font_size=OptionsInfo(scss=True, category='heading', type='px', value='125%'), heading_title_font_weight=OptionsInfo(scss=True, category='heading', type='value', value='initial'), heading_subtitle_font_size=OptionsInfo(scss=True, category='heading', type='px', value='85%'), heading_subtitle_font_weight=OptionsInfo(scss=True, category='heading', type='value', value='initial'), heading_padding=OptionsInfo(scss=True, category='heading', type='px', value='4px'), heading_padding_horizontal=OptionsInfo(scss=True, category='heading', type='px', value='5px'), heading_border_bottom_style=OptionsInfo(scss=True, category='heading', type='value', value='solid'), heading_border_bottom_width=OptionsInfo(scss=True, category='heading', type='px', value='2px'), heading_border_bottom_color=OptionsInfo(scss=True, category='heading', type='value', value='#D3D3D3'), heading_border_lr_style=OptionsInfo(scss=True, category='heading', type='value', value='none'), heading_border_lr_width=OptionsInfo(scss=True, category='heading', type='px', value='1px'), heading_border_lr_color=OptionsInfo(scss=True, category='heading', type='value', value='#D3D3D3'), column_labels_background_color=OptionsInfo(scss=True, category='column_labels', type='value', value=None), column_labels_font_size=OptionsInfo(scss=True, category='column_labels', type='px', value='100%'), column_labels_font_weight=OptionsInfo(scss=True, category='column_labels', type='value', value='normal'), column_labels_text_transform=OptionsInfo(scss=True, category='column_labels', type='value', value='inherit'), column_labels_padding=OptionsInfo(scss=True, category='column_labels', type='px', value='5px'), column_labels_padding_horizontal=OptionsInfo(scss=True, category='column_labels', type='px', value='5px'), column_labels_vlines_style=OptionsInfo(scss=True, category='table_body', type='value', value='none'), column_labels_vlines_width=OptionsInfo(scss=True, category='table_body', type='px', value='1px'), column_labels_vlines_color=OptionsInfo(scss=True, category='table_body', type='value', value='#D3D3D3'), column_labels_border_top_style=OptionsInfo(scss=True, category='column_labels', type='value', value='solid'), column_labels_border_top_width=OptionsInfo(scss=True, category='column_labels', type='px', value='2px'), column_labels_border_top_color=OptionsInfo(scss=True, category='column_labels', type='value', value='#D3D3D3'), column_labels_border_bottom_style=OptionsInfo(scss=True, category='column_labels', type='value', value='solid'), column_labels_border_bottom_width=OptionsInfo(scss=True, category='column_labels', type='px', value='2px'), column_labels_border_bottom_color=OptionsInfo(scss=True, category='column_labels', type='value', value='#D3D3D3'), column_labels_border_lr_style=OptionsInfo(scss=True, category='column_labels', type='value', value='none'), column_labels_border_lr_width=OptionsInfo(scss=True, category='column_labels', type='px', value='1px'), column_labels_border_lr_color=OptionsInfo(scss=True, category='column_labels', type='value', value='#D3D3D3'), column_labels_hidden=OptionsInfo(scss=False, category='column_labels', type='boolean', value=False), row_group_background_color=OptionsInfo(scss=True, category='row_group', type='value', value=None), row_group_font_size=OptionsInfo(scss=True, category='row_group', type='px', value='100%'), row_group_font_weight=OptionsInfo(scss=True, category='row_group', type='value', value='initial'), row_group_text_transform=OptionsInfo(scss=True, category='row_group', type='value', value='inherit'), row_group_padding=OptionsInfo(scss=True, category='row_group', type='px', value='8px'), row_group_padding_horizontal=OptionsInfo(scss=True, category='row_group', type='px', value='5px'), row_group_border_top_style=OptionsInfo(scss=True, category='row_group', type='value', value='solid'), row_group_border_top_width=OptionsInfo(scss=True, category='row_group', type='px', value='2px'), row_group_border_top_color=OptionsInfo(scss=True, category='row_group', type='value', value='#D3D3D3'), row_group_border_right_style=OptionsInfo(scss=True, category='row_group', type='value', value='none'), row_group_border_right_width=OptionsInfo(scss=True, category='row_group', type='px', value='1px'), row_group_border_right_color=OptionsInfo(scss=True, category='row_group', type='value', value='#D3D3D3'), row_group_border_bottom_style=OptionsInfo(scss=True, category='row_group', type='value', value='solid'), row_group_border_bottom_width=OptionsInfo(scss=True, category='row_group', type='px', value='2px'), row_group_border_bottom_color=OptionsInfo(scss=True, category='row_group', type='value', value='#D3D3D3'), row_group_border_left_style=OptionsInfo(scss=True, category='row_group', type='value', value='none'), row_group_border_left_width=OptionsInfo(scss=True, category='row_group', type='px', value='1px'), row_group_border_left_color=OptionsInfo(scss=True, category='row_group', type='value', value='#D3D3D3'), row_group_as_column=OptionsInfo(scss=False, category='row_group', type='boolean', value=False), table_body_hlines_style=OptionsInfo(scss=True, category='table_body', type='value', value='solid'), table_body_hlines_width=OptionsInfo(scss=True, category='table_body', type='px', value='1px'), table_body_hlines_color=OptionsInfo(scss=True, category='table_body', type='value', value='#D3D3D3'), table_body_vlines_style=OptionsInfo(scss=True, category='table_body', type='value', value='none'), table_body_vlines_width=OptionsInfo(scss=True, category='table_body', type='px', value='1px'), table_body_vlines_color=OptionsInfo(scss=True, category='table_body', type='value', value='#D3D3D3'), table_body_border_top_style=OptionsInfo(scss=True, category='table_body', type='value', value='solid'), table_body_border_top_width=OptionsInfo(scss=True, category='table_body', type='px', value='2px'), table_body_border_top_color=OptionsInfo(scss=True, category='table_body', type='value', value='#D3D3D3'), table_body_border_bottom_style=OptionsInfo(scss=True, category='table_body', type='value', value='solid'), table_body_border_bottom_width=OptionsInfo(scss=True, category='table_body', type='px', value='2px'), table_body_border_bottom_color=OptionsInfo(scss=True, category='table_body', type='value', value='#D3D3D3'), data_row_padding=OptionsInfo(scss=True, category='data_row', type='px', value='8px'), data_row_padding_horizontal=OptionsInfo(scss=True, category='data_row', type='px', value='5px'), stub_background_color=OptionsInfo(scss=True, category='stub', type='value', value=None), stub_font_size=OptionsInfo(scss=True, category='stub', type='px', value='100%'), stub_font_weight=OptionsInfo(scss=True, category='stub', type='value', value='initial'), stub_text_transform=OptionsInfo(scss=True, category='stub', type='value', value='inherit'), stub_border_style=OptionsInfo(scss=True, category='stub', type='value', value='solid'), stub_border_width=OptionsInfo(scss=True, category='stub', type='px', value='2px'), stub_border_color=OptionsInfo(scss=True, category='stub', type='value', value='#D3D3D3'), stub_indent_length=OptionsInfo(scss=True, category='stub', type='px', value='5px'), stub_row_group_background_color=OptionsInfo(scss=True, category='stub', type='value', value=None), stub_row_group_font_size=OptionsInfo(scss=True, category='stub', type='px', value='100%'), stub_row_group_font_weight=OptionsInfo(scss=True, category='stub', type='value', value='initial'), stub_row_group_text_transform=OptionsInfo(scss=True, category='stub', type='value', value='inherit'), stub_row_group_border_style=OptionsInfo(scss=True, category='stub', type='value', value='solid'), stub_row_group_border_width=OptionsInfo(scss=True, category='stub', type='px', value='2px'), stub_row_group_border_color=OptionsInfo(scss=True, category='stub', type='value', value='#D3D3D3'), summary_row_padding=OptionsInfo(scss=True, category='summary_row', type='px', value='8px'), summary_row_padding_horizontal=OptionsInfo(scss=True, category='summary_row', type='px', value='5px'), summary_row_background_color=OptionsInfo(scss=True, category='summary_row', type='value', value=None), summary_row_text_transform=OptionsInfo(scss=True, category='summary_row', type='value', value='inherit'), summary_row_border_style=OptionsInfo(scss=True, category='summary_row', type='value', value='solid'), summary_row_border_width=OptionsInfo(scss=True, category='summary_row', type='px', value='2px'), summary_row_border_color=OptionsInfo(scss=True, category='summary_row', type='value', value='#D3D3D3'), grand_summary_row_padding=OptionsInfo(scss=True, category='grand_summary_row', type='px', value='8px'), grand_summary_row_padding_horizontal=OptionsInfo(scss=True, category='grand_summary_row', type='px', value='5px'), grand_summary_row_background_color=OptionsInfo(scss=True, category='grand_summary_row', type='value', value=None), grand_summary_row_text_transform=OptionsInfo(scss=True, category='grand_summary_row', type='value', value='inherit'), grand_summary_row_border_style=OptionsInfo(scss=True, category='grand_summary_row', type='value', value='double'), grand_summary_row_border_width=OptionsInfo(scss=True, category='grand_summary_row', type='px', value='6px'), grand_summary_row_border_color=OptionsInfo(scss=True, category='grand_summary_row', type='value', value='#D3D3D3'), footnotes_marks=OptionsInfo(scss=False, category='footnotes', type='values', value='numbers'), footnotes_spec_ref=OptionsInfo(scss=False, category='footnotes', type='value', value='^i'), footnotes_spec_ftr=OptionsInfo(scss=False, category='footnotes', type='value', value='^i'), footnotes_order=OptionsInfo(scss=False, category='footnotes', type='value', value='marks_last'), source_notes_padding=OptionsInfo(scss=True, category='source_notes', type='px', value='4px'), source_notes_padding_horizontal=OptionsInfo(scss=True, category='source_notes', type='px', value='5px'), source_notes_background_color=OptionsInfo(scss=True, category='source_notes', type='value', value=None), source_notes_font_size=OptionsInfo(scss=True, category='source_notes', type='px', value='90%'), source_notes_border_bottom_style=OptionsInfo(scss=True, category='source_notes', type='value', value='none'), source_notes_border_bottom_width=OptionsInfo(scss=True, category='source_notes', type='px', value='2px'), source_notes_border_bottom_color=OptionsInfo(scss=True, category='source_notes', type='value', value='#D3D3D3'), source_notes_border_lr_style=OptionsInfo(scss=True, category='source_notes', type='value', value='none'), source_notes_border_lr_width=OptionsInfo(scss=True, category='source_notes', type='px', value='2px'), source_notes_border_lr_color=OptionsInfo(scss=True, category='source_notes', type='value', value='#D3D3D3'), source_notes_multiline=OptionsInfo(scss=False, category='source_notes', type='boolean', value=True), source_notes_sep=OptionsInfo(scss=False, category='source_notes', type='value', value=' '), row_striping_background_color=OptionsInfo(scss=True, category='row', type='value', value='#F4F4F4'), row_striping_include_stub=OptionsInfo(scss=False, category='row', type='boolean', value=False), row_striping_include_table_body=OptionsInfo(scss=False, category='row', type='boolean', value=False), container_width=OptionsInfo(scss=False, category='container', type='px', value='auto'), container_height=OptionsInfo(scss=False, category='container', type='px', value='auto'), container_padding_x=OptionsInfo(scss=False, category='container', type='px', value='0px'), container_padding_y=OptionsInfo(scss=False, category='container', type='px', value='10px'), container_overflow_x=OptionsInfo(scss=False, category='container', type='overflow', value='auto'), container_overflow_y=OptionsInfo(scss=False, category='container', type='overflow', value='auto'), quarto_disable_processing=OptionsInfo(scss=False, category='quarto', type='logical', value=False), quarto_use_bootstrap=OptionsInfo(scss=False, category='quarto', type='logical', value=False), ihtml_active=OptionsInfo(scss=False, category='ihtml', type='boolean', value=False), ihtml_use_pagination=OptionsInfo(scss=False, category='ihtml', type='boolean', value=True), ihtml_use_pagination_info=OptionsInfo(scss=False, category='ihtml', type='boolean', value=True), ihtml_use_sorting=OptionsInfo(scss=False, category='ihtml', type='boolean', value=True), ihtml_use_search=OptionsInfo(scss=False, category='ihtml', type='boolean', value=False), ihtml_use_filters=OptionsInfo(scss=False, category='ihtml', type='boolean', value=False), ihtml_use_resizers=OptionsInfo(scss=False, category='ihtml', type='boolean', value=False), ihtml_use_highlight=OptionsInfo(scss=False, category='ihtml', type='boolean', value=False), ihtml_use_compact_mode=OptionsInfo(scss=False, category='ihtml', type='boolean', value=False), ihtml_use_text_wrapping=OptionsInfo(scss=False, category='ihtml', type='boolean', value=True), ihtml_use_page_size_select=OptionsInfo(scss=False, category='ihtml', type='boolean', value=False), ihtml_page_size_default=OptionsInfo(scss=False, category='ihtml', type='value', value=10), ihtml_page_size_values=OptionsInfo(scss=False, category='ihtml', type='values', value=[10, 25, 50, 100]), ihtml_pagination_type=OptionsInfo(scss=False, category='ihtml', type='value', value='numbers'), ihtml_height=OptionsInfo(scss=False, category='ihtml', type='value', value='auto'), ihtml_selection_mode=OptionsInfo(scss=False, category='ihtml', type='value', value=None)), _google_font_imports=GoogleFontImports(imports=frozenset()), _has_built=False)</w:t>
       </w:r>
     </w:p>
     <w:bookmarkEnd w:id="29"/>
@@ -2727,7 +2785,7 @@
         <w:rPr>
           <w:rStyle w:val="VerbatimChar"/>
         </w:rPr>
-        <w:t xml:space="preserve">16    16          A4   E4      329.63      1.00         10.25, _body=&lt;great_tables._gt_data.Body object at 0xeba88a8822b0&gt;, _boxhead=Boxhead([ColInfo(var='Paso', type=&lt;ColInfoTypeEnum.default: 1&gt;, column_label='Paso', column_align='center', column_width=None, stub_level=None), ColInfo(var='Estado ant.', type=&lt;ColInfoTypeEnum.default: 1&gt;, column_label='Estado ant.', column_align='left', column_width=None, stub_level=None), ColInfo(var='Nota', type=&lt;ColInfoTypeEnum.default: 1&gt;, column_label='Nota', column_align='left', column_width=None, stub_level=None), ColInfo(var='Frecuencia', type=&lt;ColInfoTypeEnum.default: 1&gt;, column_label='Frecuencia', column_align='right', column_width=None, stub_level=None), ColInfo(var='Duración', type=&lt;ColInfoTypeEnum.default: 1&gt;, column_label='Duración', column_align='right', column_width=None, stub_level=None), ColInfo(var='Tiempo acum.', type=&lt;ColInfoTypeEnum.default: 1&gt;, column_label='Tiempo acum.', column_align='right', column_width=None, stub_level=None)]), _stub=&lt;great_tables._gt_data.Stub object at 0xeba88a433490&gt;, _spanners=Spanners([]), _heading=Heading(title='Secuencia: 16 Transiciones', subtitle=None, preheader=None), _stubhead=None, _summary_rows=&lt;great_tables._gt_data.SummaryRows object at 0xeba88a413850&gt;, _summary_rows_grand=&lt;great_tables._gt_data.SummaryRows object at 0xeba88a413950&gt;, _source_notes=[], _footnotes=[], _styles=[], _locale=&lt;great_tables._gt_data.Locale object at 0xeba88a433bb0&gt;, _formats=[], _substitutions=[], _col_merge=[], _transforms=[], _options=Options(table_id=OptionsInfo(scss=False, category='table', type='value', value=None), table_caption=OptionsInfo(scss=False, category='table', type='value', value=None), table_width=OptionsInfo(scss=True, category='table', type='px', value='auto'), table_layout=OptionsInfo(scss=True, category='table', type='value', value='fixed'), table_margin_left=OptionsInfo(scss=True, category='table', type='px', value='auto'), table_margin_right=OptionsInfo(scss=True, category='table', type='px', value='auto'), table_background_color=OptionsInfo(scss=True, category='table', type='value', value='#FFFFFF'), table_additional_css=OptionsInfo(scss=False, category='table', type='values', value=[]), table_font_names=OptionsInfo(scss=False, category='table', type='values', value=['-apple-system', 'BlinkMacSystemFont', 'Segoe UI', 'Roboto', 'Oxygen', 'Ubuntu', 'Cantarell', 'Helvetica Neue', 'Fira Sans', 'Droid Sans', 'Arial', 'sans-serif']), table_font_size=OptionsInfo(scss=True, category='table', type='px', value='16px'), table_font_weight=OptionsInfo(scss=True, category='table', type='value', value='normal'), table_font_style=OptionsInfo(scss=True, category='table', type='value', value='normal'), table_font_color=OptionsInfo(scss=True, category='table', type='value', value='#333333'), table_font_color_light=OptionsInfo(scss=True, category='table', type='value', value='#FFFFFF'), table_border_top_include=OptionsInfo(scss=False, category='table', type='boolean', value=True), table_border_top_style=OptionsInfo(scss=True, category='table', type='value', value='solid'), table_border_top_width=OptionsInfo(scss=True, category='table', type='px', value='2px'), table_border_top_color=OptionsInfo(scss=True, category='table', type='value', value='#A8A8A8'), table_border_right_style=OptionsInfo(scss=True, category='table', type='value', value='none'), table_border_right_width=OptionsInfo(scss=True, category='table', type='px', value='2px'), table_border_right_color=OptionsInfo(scss=True, category='table', type='value', value='#D3D3D3'), table_border_bottom_include=OptionsInfo(scss=False, category='table', type='boolean', value=True), table_border_bottom_style=OptionsInfo(scss=True, category='table', type='value', value='solid'), table_border_bottom_width=OptionsInfo(scss=True, category='table', type='px', value='2px'), table_border_bottom_color=OptionsInfo(scss=True, category='table', type='value', value='#A8A8A8'), table_border_left_style=OptionsInfo(scss=True, category='table', type='value', value='none'), table_border_left_width=OptionsInfo(scss=True, category='table', type='px', value='2px'), table_border_left_color=OptionsInfo(scss=True, category='table', type='value', value='#D3D3D3'), heading_background_color=OptionsInfo(scss=True, category='heading', type='value', value=None), heading_align=OptionsInfo(scss=True, category='heading', type='value', value='center'), heading_title_font_size=OptionsInfo(scss=True, category='heading', type='px', value='125%'), heading_title_font_weight=OptionsInfo(scss=True, category='heading', type='value', value='initial'), heading_subtitle_font_size=OptionsInfo(scss=True, category='heading', type='px', value='85%'), heading_subtitle_font_weight=OptionsInfo(scss=True, category='heading', type='value', value='initial'), heading_padding=OptionsInfo(scss=True, category='heading', type='px', value='4px'), heading_padding_horizontal=OptionsInfo(scss=True, category='heading', type='px', value='5px'), heading_border_bottom_style=OptionsInfo(scss=True, category='heading', type='value', value='solid'), heading_border_bottom_width=OptionsInfo(scss=True, category='heading', type='px', value='2px'), heading_border_bottom_color=OptionsInfo(scss=True, category='heading', type='value', value='#D3D3D3'), heading_border_lr_style=OptionsInfo(scss=True, category='heading', type='value', value='none'), heading_border_lr_width=OptionsInfo(scss=True, category='heading', type='px', value='1px'), heading_border_lr_color=OptionsInfo(scss=True, category='heading', type='value', value='#D3D3D3'), column_labels_background_color=OptionsInfo(scss=True, category='column_labels', type='value', value=None), column_labels_font_size=OptionsInfo(scss=True, category='column_labels', type='px', value='100%'), column_labels_font_weight=OptionsInfo(scss=True, category='column_labels', type='value', value='normal'), column_labels_text_transform=OptionsInfo(scss=True, category='column_labels', type='value', value='inherit'), column_labels_padding=OptionsInfo(scss=True, category='column_labels', type='px', value='5px'), column_labels_padding_horizontal=OptionsInfo(scss=True, category='column_labels', type='px', value='5px'), column_labels_vlines_style=OptionsInfo(scss=True, category='table_body', type='value', value='none'), column_labels_vlines_width=OptionsInfo(scss=True, category='table_body', type='px', value='1px'), column_labels_vlines_color=OptionsInfo(scss=True, category='table_body', type='value', value='#D3D3D3'), column_labels_border_top_style=OptionsInfo(scss=True, category='column_labels', type='value', value='solid'), column_labels_border_top_width=OptionsInfo(scss=True, category='column_labels', type='px', value='2px'), column_labels_border_top_color=OptionsInfo(scss=True, category='column_labels', type='value', value='#D3D3D3'), column_labels_border_bottom_style=OptionsInfo(scss=True, category='column_labels', type='value', value='solid'), column_labels_border_bottom_width=OptionsInfo(scss=True, category='column_labels', type='px', value='2px'), column_labels_border_bottom_color=OptionsInfo(scss=True, category='column_labels', type='value', value='#D3D3D3'), column_labels_border_lr_style=OptionsInfo(scss=True, category='column_labels', type='value', value='none'), column_labels_border_lr_width=OptionsInfo(scss=True, category='column_labels', type='px', value='1px'), column_labels_border_lr_color=OptionsInfo(scss=True, category='column_labels', type='value', value='#D3D3D3'), column_labels_hidden=OptionsInfo(scss=False, category='column_labels', type='boolean', value=False), row_group_background_color=OptionsInfo(scss=True, category='row_group', type='value', value=None), row_group_font_size=OptionsInfo(scss=True, category='row_group', type='px', value='100%'), row_group_font_weight=OptionsInfo(scss=True, category='row_group', type='value', value='initial'), row_group_text_transform=OptionsInfo(scss=True, category='row_group', type='value', value='inherit'), row_group_padding=OptionsInfo(scss=True, category='row_group', type='px', value='8px'), row_group_padding_horizontal=OptionsInfo(scss=True, category='row_group', type='px', value='5px'), row_group_border_top_style=OptionsInfo(scss=True, category='row_group', type='value', value='solid'), row_group_border_top_width=OptionsInfo(scss=True, category='row_group', type='px', value='2px'), row_group_border_top_color=OptionsInfo(scss=True, category='row_group', type='value', value='#D3D3D3'), row_group_border_right_style=OptionsInfo(scss=True, category='row_group', type='value', value='none'), row_group_border_right_width=OptionsInfo(scss=True, category='row_group', type='px', value='1px'), row_group_border_right_color=OptionsInfo(scss=True, category='row_group', type='value', value='#D3D3D3'), row_group_border_bottom_style=OptionsInfo(scss=True, category='row_group', type='value', value='solid'), row_group_border_bottom_width=OptionsInfo(scss=True, category='row_group', type='px', value='2px'), row_group_border_bottom_color=OptionsInfo(scss=True, category='row_group', type='value', value='#D3D3D3'), row_group_border_left_style=OptionsInfo(scss=True, category='row_group', type='value', value='none'), row_group_border_left_width=OptionsInfo(scss=True, category='row_group', type='px', value='1px'), row_group_border_left_color=OptionsInfo(scss=True, category='row_group', type='value', value='#D3D3D3'), row_group_as_column=OptionsInfo(scss=False, category='row_group', type='boolean', value=False), table_body_hlines_style=OptionsInfo(scss=True, category='table_body', type='value', value='solid'), table_body_hlines_width=OptionsInfo(scss=True, category='table_body', type='px', value='1px'), table_body_hlines_color=OptionsInfo(scss=True, category='table_body', type='value', value='#D3D3D3'), table_body_vlines_style=OptionsInfo(scss=True, category='table_body', type='value', value='none'), table_body_vlines_width=OptionsInfo(scss=True, category='table_body', type='px', value='1px'), table_body_vlines_color=OptionsInfo(scss=True, category='table_body', type='value', value='#D3D3D3'), table_body_border_top_style=OptionsInfo(scss=True, category='table_body', type='value', value='solid'), table_body_border_top_width=OptionsInfo(scss=True, category='table_body', type='px', value='2px'), table_body_border_top_color=OptionsInfo(scss=True, category='table_body', type='value', value='#D3D3D3'), table_body_border_bottom_style=OptionsInfo(scss=True, category='table_body', type='value', value='solid'), table_body_border_bottom_width=OptionsInfo(scss=True, category='table_body', type='px', value='2px'), table_body_border_bottom_color=OptionsInfo(scss=True, category='table_body', type='value', value='#D3D3D3'), data_row_padding=OptionsInfo(scss=True, category='data_row', type='px', value='8px'), data_row_padding_horizontal=OptionsInfo(scss=True, category='data_row', type='px', value='5px'), stub_background_color=OptionsInfo(scss=True, category='stub', type='value', value=None), stub_font_size=OptionsInfo(scss=True, category='stub', type='px', value='100%'), stub_font_weight=OptionsInfo(scss=True, category='stub', type='value', value='initial'), stub_text_transform=OptionsInfo(scss=True, category='stub', type='value', value='inherit'), stub_border_style=OptionsInfo(scss=True, category='stub', type='value', value='solid'), stub_border_width=OptionsInfo(scss=True, category='stub', type='px', value='2px'), stub_border_color=OptionsInfo(scss=True, category='stub', type='value', value='#D3D3D3'), stub_indent_length=OptionsInfo(scss=True, category='stub', type='px', value='5px'), stub_row_group_background_color=OptionsInfo(scss=True, category='stub', type='value', value=None), stub_row_group_font_size=OptionsInfo(scss=True, category='stub', type='px', value='100%'), stub_row_group_font_weight=OptionsInfo(scss=True, category='stub', type='value', value='initial'), stub_row_group_text_transform=OptionsInfo(scss=True, category='stub', type='value', value='inherit'), stub_row_group_border_style=OptionsInfo(scss=True, category='stub', type='value', value='solid'), stub_row_group_border_width=OptionsInfo(scss=True, category='stub', type='px', value='2px'), stub_row_group_border_color=OptionsInfo(scss=True, category='stub', type='value', value='#D3D3D3'), summary_row_padding=OptionsInfo(scss=True, category='summary_row', type='px', value='8px'), summary_row_padding_horizontal=OptionsInfo(scss=True, category='summary_row', type='px', value='5px'), summary_row_background_color=OptionsInfo(scss=True, category='summary_row', type='value', value=None), summary_row_text_transform=OptionsInfo(scss=True, category='summary_row', type='value', value='inherit'), summary_row_border_style=OptionsInfo(scss=True, category='summary_row', type='value', value='solid'), summary_row_border_width=OptionsInfo(scss=True, category='summary_row', type='px', value='2px'), summary_row_border_color=OptionsInfo(scss=True, category='summary_row', type='value', value='#D3D3D3'), grand_summary_row_padding=OptionsInfo(scss=True, category='grand_summary_row', type='px', value='8px'), grand_summary_row_padding_horizontal=OptionsInfo(scss=True, category='grand_summary_row', type='px', value='5px'), grand_summary_row_background_color=OptionsInfo(scss=True, category='grand_summary_row', type='value', value=None), grand_summary_row_text_transform=OptionsInfo(scss=True, category='grand_summary_row', type='value', value='inherit'), grand_summary_row_border_style=OptionsInfo(scss=True, category='grand_summary_row', type='value', value='double'), grand_summary_row_border_width=OptionsInfo(scss=True, category='grand_summary_row', type='px', value='6px'), grand_summary_row_border_color=OptionsInfo(scss=True, category='grand_summary_row', type='value', value='#D3D3D3'), footnotes_marks=OptionsInfo(scss=False, category='footnotes', type='values', value='numbers'), footnotes_spec_ref=OptionsInfo(scss=False, category='footnotes', type='value', value='^i'), footnotes_spec_ftr=OptionsInfo(scss=False, category='footnotes', type='value', value='^i'), footnotes_order=OptionsInfo(scss=False, category='footnotes', type='value', value='marks_last'), source_notes_padding=OptionsInfo(scss=True, category='source_notes', type='px', value='4px'), source_notes_padding_horizontal=OptionsInfo(scss=True, category='source_notes', type='px', value='5px'), source_notes_background_color=OptionsInfo(scss=True, category='source_notes', type='value', value=None), source_notes_font_size=OptionsInfo(scss=True, category='source_notes', type='px', value='90%'), source_notes_border_bottom_style=OptionsInfo(scss=True, category='source_notes', type='value', value='none'), source_notes_border_bottom_width=OptionsInfo(scss=True, category='source_notes', type='px', value='2px'), source_notes_border_bottom_color=OptionsInfo(scss=True, category='source_notes', type='value', value='#D3D3D3'), source_notes_border_lr_style=OptionsInfo(scss=True, category='source_notes', type='value', value='none'), source_notes_border_lr_width=OptionsInfo(scss=True, category='source_notes', type='px', value='2px'), source_notes_border_lr_color=OptionsInfo(scss=True, category='source_notes', type='value', value='#D3D3D3'), source_notes_multiline=OptionsInfo(scss=False, category='source_notes', type='boolean', value=True), source_notes_sep=OptionsInfo(scss=False, category='source_notes', type='value', value=' '), row_striping_background_color=OptionsInfo(scss=True, category='row', type='value', value='#F4F4F4'), row_striping_include_stub=OptionsInfo(scss=False, category='row', type='boolean', value=False), row_striping_include_table_body=OptionsInfo(scss=False, category='row', type='boolean', value=False), container_width=OptionsInfo(scss=False, category='container', type='px', value='auto'), container_height=OptionsInfo(scss=False, category='container', type='px', value='auto'), container_padding_x=OptionsInfo(scss=False, category='container', type='px', value='0px'), container_padding_y=OptionsInfo(scss=False, category='container', type='px', value='10px'), container_overflow_x=OptionsInfo(scss=False, category='container', type='overflow', value='auto'), container_overflow_y=OptionsInfo(scss=False, category='container', type='overflow', value='auto'), quarto_disable_processing=OptionsInfo(scss=False, category='quarto', type='logical', value=False), quarto_use_bootstrap=OptionsInfo(scss=False, category='quarto', type='logical', value=False), ihtml_active=OptionsInfo(scss=False, category='ihtml', type='boolean', value=False), ihtml_use_pagination=OptionsInfo(scss=False, category='ihtml', type='boolean', value=True), ihtml_use_pagination_info=OptionsInfo(scss=False, category='ihtml', type='boolean', value=True), ihtml_use_sorting=OptionsInfo(scss=False, category='ihtml', type='boolean', value=True), ihtml_use_search=OptionsInfo(scss=False, category='ihtml', type='boolean', value=False), ihtml_use_filters=OptionsInfo(scss=False, category='ihtml', type='boolean', value=False), ihtml_use_resizers=OptionsInfo(scss=False, category='ihtml', type='boolean', value=False), ihtml_use_highlight=OptionsInfo(scss=False, category='ihtml', type='boolean', value=False), ihtml_use_compact_mode=OptionsInfo(scss=False, category='ihtml', type='boolean', value=False), ihtml_use_text_wrapping=OptionsInfo(scss=False, category='ihtml', type='boolean', value=True), ihtml_use_page_size_select=OptionsInfo(scss=False, category='ihtml', type='boolean', value=False), ihtml_page_size_default=OptionsInfo(scss=False, category='ihtml', type='value', value=10), ihtml_page_size_values=OptionsInfo(scss=False, category='ihtml', type='values', value=[10, 25, 50, 100]), ihtml_pagination_type=OptionsInfo(scss=False, category='ihtml', type='value', value='numbers'), ihtml_height=OptionsInfo(scss=False, category='ihtml', type='value', value='auto'), ihtml_selection_mode=OptionsInfo(scss=False, category='ihtml', type='value', value=None)), _google_font_imports=GoogleFontImports(imports=frozenset()), _has_built=False)</w:t>
+        <w:t xml:space="preserve">16    16          A4   E4      329.63      1.00         10.25, _body=&lt;great_tables._gt_data.Body object at 0xf94bce9c22b0&gt;, _boxhead=Boxhead([ColInfo(var='Paso', type=&lt;ColInfoTypeEnum.default: 1&gt;, column_label='Paso', column_align='center', column_width=None, stub_level=None), ColInfo(var='Estado ant.', type=&lt;ColInfoTypeEnum.default: 1&gt;, column_label='Estado ant.', column_align='left', column_width=None, stub_level=None), ColInfo(var='Nota', type=&lt;ColInfoTypeEnum.default: 1&gt;, column_label='Nota', column_align='left', column_width=None, stub_level=None), ColInfo(var='Frecuencia', type=&lt;ColInfoTypeEnum.default: 1&gt;, column_label='Frecuencia', column_align='right', column_width=None, stub_level=None), ColInfo(var='Duración', type=&lt;ColInfoTypeEnum.default: 1&gt;, column_label='Duración', column_align='right', column_width=None, stub_level=None), ColInfo(var='Tiempo acum.', type=&lt;ColInfoTypeEnum.default: 1&gt;, column_label='Tiempo acum.', column_align='right', column_width=None, stub_level=None)]), _stub=&lt;great_tables._gt_data.Stub object at 0xf94bce573490&gt;, _spanners=Spanners([]), _heading=Heading(title='Secuencia: 16 Transiciones', subtitle=None, preheader=None), _stubhead=None, _summary_rows=&lt;great_tables._gt_data.SummaryRows object at 0xf94bce553850&gt;, _summary_rows_grand=&lt;great_tables._gt_data.SummaryRows object at 0xf94bce553950&gt;, _source_notes=[], _footnotes=[], _styles=[], _locale=&lt;great_tables._gt_data.Locale object at 0xf94bce573bb0&gt;, _formats=[], _substitutions=[], _col_merge=[], _transforms=[], _options=Options(table_id=OptionsInfo(scss=False, category='table', type='value', value=None), table_caption=OptionsInfo(scss=False, category='table', type='value', value=None), table_width=OptionsInfo(scss=True, category='table', type='px', value='auto'), table_layout=OptionsInfo(scss=True, category='table', type='value', value='fixed'), table_margin_left=OptionsInfo(scss=True, category='table', type='px', value='auto'), table_margin_right=OptionsInfo(scss=True, category='table', type='px', value='auto'), table_background_color=OptionsInfo(scss=True, category='table', type='value', value='#FFFFFF'), table_additional_css=OptionsInfo(scss=False, category='table', type='values', value=[]), table_font_names=OptionsInfo(scss=False, category='table', type='values', value=['-apple-system', 'BlinkMacSystemFont', 'Segoe UI', 'Roboto', 'Oxygen', 'Ubuntu', 'Cantarell', 'Helvetica Neue', 'Fira Sans', 'Droid Sans', 'Arial', 'sans-serif']), table_font_size=OptionsInfo(scss=True, category='table', type='px', value='16px'), table_font_weight=OptionsInfo(scss=True, category='table', type='value', value='normal'), table_font_style=OptionsInfo(scss=True, category='table', type='value', value='normal'), table_font_color=OptionsInfo(scss=True, category='table', type='value', value='#333333'), table_font_color_light=OptionsInfo(scss=True, category='table', type='value', value='#FFFFFF'), table_border_top_include=OptionsInfo(scss=False, category='table', type='boolean', value=True), table_border_top_style=OptionsInfo(scss=True, category='table', type='value', value='solid'), table_border_top_width=OptionsInfo(scss=True, category='table', type='px', value='2px'), table_border_top_color=OptionsInfo(scss=True, category='table', type='value', value='#A8A8A8'), table_border_right_style=OptionsInfo(scss=True, category='table', type='value', value='none'), table_border_right_width=OptionsInfo(scss=True, category='table', type='px', value='2px'), table_border_right_color=OptionsInfo(scss=True, category='table', type='value', value='#D3D3D3'), table_border_bottom_include=OptionsInfo(scss=False, category='table', type='boolean', value=True), table_border_bottom_style=OptionsInfo(scss=True, category='table', type='value', value='solid'), table_border_bottom_width=OptionsInfo(scss=True, category='table', type='px', value='2px'), table_border_bottom_color=OptionsInfo(scss=True, category='table', type='value', value='#A8A8A8'), table_border_left_style=OptionsInfo(scss=True, category='table', type='value', value='none'), table_border_left_width=OptionsInfo(scss=True, category='table', type='px', value='2px'), table_border_left_color=OptionsInfo(scss=True, category='table', type='value', value='#D3D3D3'), heading_background_color=OptionsInfo(scss=True, category='heading', type='value', value=None), heading_align=OptionsInfo(scss=True, category='heading', type='value', value='center'), heading_title_font_size=OptionsInfo(scss=True, category='heading', type='px', value='125%'), heading_title_font_weight=OptionsInfo(scss=True, category='heading', type='value', value='initial'), heading_subtitle_font_size=OptionsInfo(scss=True, category='heading', type='px', value='85%'), heading_subtitle_font_weight=OptionsInfo(scss=True, category='heading', type='value', value='initial'), heading_padding=OptionsInfo(scss=True, category='heading', type='px', value='4px'), heading_padding_horizontal=OptionsInfo(scss=True, category='heading', type='px', value='5px'), heading_border_bottom_style=OptionsInfo(scss=True, category='heading', type='value', value='solid'), heading_border_bottom_width=OptionsInfo(scss=True, category='heading', type='px', value='2px'), heading_border_bottom_color=OptionsInfo(scss=True, category='heading', type='value', value='#D3D3D3'), heading_border_lr_style=OptionsInfo(scss=True, category='heading', type='value', value='none'), heading_border_lr_width=OptionsInfo(scss=True, category='heading', type='px', value='1px'), heading_border_lr_color=OptionsInfo(scss=True, category='heading', type='value', value='#D3D3D3'), column_labels_background_color=OptionsInfo(scss=True, category='column_labels', type='value', value=None), column_labels_font_size=OptionsInfo(scss=True, category='column_labels', type='px', value='100%'), column_labels_font_weight=OptionsInfo(scss=True, category='column_labels', type='value', value='normal'), column_labels_text_transform=OptionsInfo(scss=True, category='column_labels', type='value', value='inherit'), column_labels_padding=OptionsInfo(scss=True, category='column_labels', type='px', value='5px'), column_labels_padding_horizontal=OptionsInfo(scss=True, category='column_labels', type='px', value='5px'), column_labels_vlines_style=OptionsInfo(scss=True, category='table_body', type='value', value='none'), column_labels_vlines_width=OptionsInfo(scss=True, category='table_body', type='px', value='1px'), column_labels_vlines_color=OptionsInfo(scss=True, category='table_body', type='value', value='#D3D3D3'), column_labels_border_top_style=OptionsInfo(scss=True, category='column_labels', type='value', value='solid'), column_labels_border_top_width=OptionsInfo(scss=True, category='column_labels', type='px', value='2px'), column_labels_border_top_color=OptionsInfo(scss=True, category='column_labels', type='value', value='#D3D3D3'), column_labels_border_bottom_style=OptionsInfo(scss=True, category='column_labels', type='value', value='solid'), column_labels_border_bottom_width=OptionsInfo(scss=True, category='column_labels', type='px', value='2px'), column_labels_border_bottom_color=OptionsInfo(scss=True, category='column_labels', type='value', value='#D3D3D3'), column_labels_border_lr_style=OptionsInfo(scss=True, category='column_labels', type='value', value='none'), column_labels_border_lr_width=OptionsInfo(scss=True, category='column_labels', type='px', value='1px'), column_labels_border_lr_color=OptionsInfo(scss=True, category='column_labels', type='value', value='#D3D3D3'), column_labels_hidden=OptionsInfo(scss=False, category='column_labels', type='boolean', value=False), row_group_background_color=OptionsInfo(scss=True, category='row_group', type='value', value=None), row_group_font_size=OptionsInfo(scss=True, category='row_group', type='px', value='100%'), row_group_font_weight=OptionsInfo(scss=True, category='row_group', type='value', value='initial'), row_group_text_transform=OptionsInfo(scss=True, category='row_group', type='value', value='inherit'), row_group_padding=OptionsInfo(scss=True, category='row_group', type='px', value='8px'), row_group_padding_horizontal=OptionsInfo(scss=True, category='row_group', type='px', value='5px'), row_group_border_top_style=OptionsInfo(scss=True, category='row_group', type='value', value='solid'), row_group_border_top_width=OptionsInfo(scss=True, category='row_group', type='px', value='2px'), row_group_border_top_color=OptionsInfo(scss=True, category='row_group', type='value', value='#D3D3D3'), row_group_border_right_style=OptionsInfo(scss=True, category='row_group', type='value', value='none'), row_group_border_right_width=OptionsInfo(scss=True, category='row_group', type='px', value='1px'), row_group_border_right_color=OptionsInfo(scss=True, category='row_group', type='value', value='#D3D3D3'), row_group_border_bottom_style=OptionsInfo(scss=True, category='row_group', type='value', value='solid'), row_group_border_bottom_width=OptionsInfo(scss=True, category='row_group', type='px', value='2px'), row_group_border_bottom_color=OptionsInfo(scss=True, category='row_group', type='value', value='#D3D3D3'), row_group_border_left_style=OptionsInfo(scss=True, category='row_group', type='value', value='none'), row_group_border_left_width=OptionsInfo(scss=True, category='row_group', type='px', value='1px'), row_group_border_left_color=OptionsInfo(scss=True, category='row_group', type='value', value='#D3D3D3'), row_group_as_column=OptionsInfo(scss=False, category='row_group', type='boolean', value=False), table_body_hlines_style=OptionsInfo(scss=True, category='table_body', type='value', value='solid'), table_body_hlines_width=OptionsInfo(scss=True, category='table_body', type='px', value='1px'), table_body_hlines_color=OptionsInfo(scss=True, category='table_body', type='value', value='#D3D3D3'), table_body_vlines_style=OptionsInfo(scss=True, category='table_body', type='value', value='none'), table_body_vlines_width=OptionsInfo(scss=True, category='table_body', type='px', value='1px'), table_body_vlines_color=OptionsInfo(scss=True, category='table_body', type='value', value='#D3D3D3'), table_body_border_top_style=OptionsInfo(scss=True, category='table_body', type='value', value='solid'), table_body_border_top_width=OptionsInfo(scss=True, category='table_body', type='px', value='2px'), table_body_border_top_color=OptionsInfo(scss=True, category='table_body', type='value', value='#D3D3D3'), table_body_border_bottom_style=OptionsInfo(scss=True, category='table_body', type='value', value='solid'), table_body_border_bottom_width=OptionsInfo(scss=True, category='table_body', type='px', value='2px'), table_body_border_bottom_color=OptionsInfo(scss=True, category='table_body', type='value', value='#D3D3D3'), data_row_padding=OptionsInfo(scss=True, category='data_row', type='px', value='8px'), data_row_padding_horizontal=OptionsInfo(scss=True, category='data_row', type='px', value='5px'), stub_background_color=OptionsInfo(scss=True, category='stub', type='value', value=None), stub_font_size=OptionsInfo(scss=True, category='stub', type='px', value='100%'), stub_font_weight=OptionsInfo(scss=True, category='stub', type='value', value='initial'), stub_text_transform=OptionsInfo(scss=True, category='stub', type='value', value='inherit'), stub_border_style=OptionsInfo(scss=True, category='stub', type='value', value='solid'), stub_border_width=OptionsInfo(scss=True, category='stub', type='px', value='2px'), stub_border_color=OptionsInfo(scss=True, category='stub', type='value', value='#D3D3D3'), stub_indent_length=OptionsInfo(scss=True, category='stub', type='px', value='5px'), stub_row_group_background_color=OptionsInfo(scss=True, category='stub', type='value', value=None), stub_row_group_font_size=OptionsInfo(scss=True, category='stub', type='px', value='100%'), stub_row_group_font_weight=OptionsInfo(scss=True, category='stub', type='value', value='initial'), stub_row_group_text_transform=OptionsInfo(scss=True, category='stub', type='value', value='inherit'), stub_row_group_border_style=OptionsInfo(scss=True, category='stub', type='value', value='solid'), stub_row_group_border_width=OptionsInfo(scss=True, category='stub', type='px', value='2px'), stub_row_group_border_color=OptionsInfo(scss=True, category='stub', type='value', value='#D3D3D3'), summary_row_padding=OptionsInfo(scss=True, category='summary_row', type='px', value='8px'), summary_row_padding_horizontal=OptionsInfo(scss=True, category='summary_row', type='px', value='5px'), summary_row_background_color=OptionsInfo(scss=True, category='summary_row', type='value', value=None), summary_row_text_transform=OptionsInfo(scss=True, category='summary_row', type='value', value='inherit'), summary_row_border_style=OptionsInfo(scss=True, category='summary_row', type='value', value='solid'), summary_row_border_width=OptionsInfo(scss=True, category='summary_row', type='px', value='2px'), summary_row_border_color=OptionsInfo(scss=True, category='summary_row', type='value', value='#D3D3D3'), grand_summary_row_padding=OptionsInfo(scss=True, category='grand_summary_row', type='px', value='8px'), grand_summary_row_padding_horizontal=OptionsInfo(scss=True, category='grand_summary_row', type='px', value='5px'), grand_summary_row_background_color=OptionsInfo(scss=True, category='grand_summary_row', type='value', value=None), grand_summary_row_text_transform=OptionsInfo(scss=True, category='grand_summary_row', type='value', value='inherit'), grand_summary_row_border_style=OptionsInfo(scss=True, category='grand_summary_row', type='value', value='double'), grand_summary_row_border_width=OptionsInfo(scss=True, category='grand_summary_row', type='px', value='6px'), grand_summary_row_border_color=OptionsInfo(scss=True, category='grand_summary_row', type='value', value='#D3D3D3'), footnotes_marks=OptionsInfo(scss=False, category='footnotes', type='values', value='numbers'), footnotes_spec_ref=OptionsInfo(scss=False, category='footnotes', type='value', value='^i'), footnotes_spec_ftr=OptionsInfo(scss=False, category='footnotes', type='value', value='^i'), footnotes_order=OptionsInfo(scss=False, category='footnotes', type='value', value='marks_last'), source_notes_padding=OptionsInfo(scss=True, category='source_notes', type='px', value='4px'), source_notes_padding_horizontal=OptionsInfo(scss=True, category='source_notes', type='px', value='5px'), source_notes_background_color=OptionsInfo(scss=True, category='source_notes', type='value', value=None), source_notes_font_size=OptionsInfo(scss=True, category='source_notes', type='px', value='90%'), source_notes_border_bottom_style=OptionsInfo(scss=True, category='source_notes', type='value', value='none'), source_notes_border_bottom_width=OptionsInfo(scss=True, category='source_notes', type='px', value='2px'), source_notes_border_bottom_color=OptionsInfo(scss=True, category='source_notes', type='value', value='#D3D3D3'), source_notes_border_lr_style=OptionsInfo(scss=True, category='source_notes', type='value', value='none'), source_notes_border_lr_width=OptionsInfo(scss=True, category='source_notes', type='px', value='2px'), source_notes_border_lr_color=OptionsInfo(scss=True, category='source_notes', type='value', value='#D3D3D3'), source_notes_multiline=OptionsInfo(scss=False, category='source_notes', type='boolean', value=True), source_notes_sep=OptionsInfo(scss=False, category='source_notes', type='value', value=' '), row_striping_background_color=OptionsInfo(scss=True, category='row', type='value', value='#F4F4F4'), row_striping_include_stub=OptionsInfo(scss=False, category='row', type='boolean', value=False), row_striping_include_table_body=OptionsInfo(scss=False, category='row', type='boolean', value=False), container_width=OptionsInfo(scss=False, category='container', type='px', value='auto'), container_height=OptionsInfo(scss=False, category='container', type='px', value='auto'), container_padding_x=OptionsInfo(scss=False, category='container', type='px', value='0px'), container_padding_y=OptionsInfo(scss=False, category='container', type='px', value='10px'), container_overflow_x=OptionsInfo(scss=False, category='container', type='overflow', value='auto'), container_overflow_y=OptionsInfo(scss=False, category='container', type='overflow', value='auto'), quarto_disable_processing=OptionsInfo(scss=False, category='quarto', type='logical', value=False), quarto_use_bootstrap=OptionsInfo(scss=False, category='quarto', type='logical', value=False), ihtml_active=OptionsInfo(scss=False, category='ihtml', type='boolean', value=False), ihtml_use_pagination=OptionsInfo(scss=False, category='ihtml', type='boolean', value=True), ihtml_use_pagination_info=OptionsInfo(scss=False, category='ihtml', type='boolean', value=True), ihtml_use_sorting=OptionsInfo(scss=False, category='ihtml', type='boolean', value=True), ihtml_use_search=OptionsInfo(scss=False, category='ihtml', type='boolean', value=False), ihtml_use_filters=OptionsInfo(scss=False, category='ihtml', type='boolean', value=False), ihtml_use_resizers=OptionsInfo(scss=False, category='ihtml', type='boolean', value=False), ihtml_use_highlight=OptionsInfo(scss=False, category='ihtml', type='boolean', value=False), ihtml_use_compact_mode=OptionsInfo(scss=False, category='ihtml', type='boolean', value=False), ihtml_use_text_wrapping=OptionsInfo(scss=False, category='ihtml', type='boolean', value=True), ihtml_use_page_size_select=OptionsInfo(scss=False, category='ihtml', type='boolean', value=False), ihtml_page_size_default=OptionsInfo(scss=False, category='ihtml', type='value', value=10), ihtml_page_size_values=OptionsInfo(scss=False, category='ihtml', type='values', value=[10, 25, 50, 100]), ihtml_pagination_type=OptionsInfo(scss=False, category='ihtml', type='value', value='numbers'), ihtml_height=OptionsInfo(scss=False, category='ihtml', type='value', value='auto'), ihtml_selection_mode=OptionsInfo(scss=False, category='ihtml', type='value', value=None)), _google_font_imports=GoogleFontImports(imports=frozenset()), _has_built=False)</w:t>
       </w:r>
     </w:p>
     <w:bookmarkEnd w:id="38"/>
@@ -7822,6 +7880,90 @@
           <w:rStyle w:val="StringTok"/>
         </w:rPr>
         <w:t xml:space="preserve">"export"</w:t>
+      </w:r>
+      <w:r>
+        <w:rPr>
+          <w:rStyle w:val="NormalTok"/>
+        </w:rPr>
+        <w:t xml:space="preserve">)</w:t>
+      </w:r>
+      <w:r>
+        <w:br/>
+      </w:r>
+      <w:r>
+        <w:rPr>
+          <w:rStyle w:val="ControlFlowTok"/>
+        </w:rPr>
+        <w:t xml:space="preserve">if</w:t>
+      </w:r>
+      <w:r>
+        <w:rPr>
+          <w:rStyle w:val="NormalTok"/>
+        </w:rPr>
+        <w:t xml:space="preserve"> </w:t>
+      </w:r>
+      <w:r>
+        <w:rPr>
+          <w:rStyle w:val="KeywordTok"/>
+        </w:rPr>
+        <w:t xml:space="preserve">not</w:t>
+      </w:r>
+      <w:r>
+        <w:rPr>
+          <w:rStyle w:val="NormalTok"/>
+        </w:rPr>
+        <w:t xml:space="preserve"> export_dir.is_dir() </w:t>
+      </w:r>
+      <w:r>
+        <w:rPr>
+          <w:rStyle w:val="KeywordTok"/>
+        </w:rPr>
+        <w:t xml:space="preserve">and</w:t>
+      </w:r>
+      <w:r>
+        <w:rPr>
+          <w:rStyle w:val="NormalTok"/>
+        </w:rPr>
+        <w:t xml:space="preserve"> Path(</w:t>
+      </w:r>
+      <w:r>
+        <w:rPr>
+          <w:rStyle w:val="StringTok"/>
+        </w:rPr>
+        <w:t xml:space="preserve">"../export"</w:t>
+      </w:r>
+      <w:r>
+        <w:rPr>
+          <w:rStyle w:val="NormalTok"/>
+        </w:rPr>
+        <w:t xml:space="preserve">).is_dir():</w:t>
+      </w:r>
+      <w:r>
+        <w:br/>
+      </w:r>
+      <w:r>
+        <w:rPr>
+          <w:rStyle w:val="NormalTok"/>
+        </w:rPr>
+        <w:t xml:space="preserve">    export_dir </w:t>
+      </w:r>
+      <w:r>
+        <w:rPr>
+          <w:rStyle w:val="OperatorTok"/>
+        </w:rPr>
+        <w:t xml:space="preserve">=</w:t>
+      </w:r>
+      <w:r>
+        <w:rPr>
+          <w:rStyle w:val="NormalTok"/>
+        </w:rPr>
+        <w:t xml:space="preserve"> Path(</w:t>
+      </w:r>
+      <w:r>
+        <w:rPr>
+          <w:rStyle w:val="StringTok"/>
+        </w:rPr>
+        <w:t xml:space="preserve">"../export"</w:t>
       </w:r>
       <w:r>
         <w:rPr>

</xml_diff>

<commit_message>
feat(quant): route visualizations to assets and prune redundant files
</commit_message>
<xml_diff>
--- a/m4-quant/act 2/export/Actividad_4_2_A01750536.docx
+++ b/m4-quant/act 2/export/Actividad_4_2_A01750536.docx
@@ -330,7 +330,7 @@
         <w:rPr>
           <w:rStyle w:val="VerbatimChar"/>
         </w:rPr>
-        <w:t xml:space="preserve">6           Duraciones      4 figuras (120 BPM), _body=&lt;great_tables._gt_data.Body object at 0xf94bce907230&gt;, _boxhead=Boxhead([ColInfo(var='Parámetro', type=&lt;ColInfoTypeEnum.default: 1&gt;, column_label='Parámetro', column_align='left', column_width=None, stub_level=None), ColInfo(var='Valor', type=&lt;ColInfoTypeEnum.default: 1&gt;, column_label='Valor', column_align='right', column_width=None, stub_level=None)]), _stub=&lt;great_tables._gt_data.Stub object at 0xf94bce9070e0&gt;, _spanners=Spanners([]), _heading=Heading(title='Resumen del Sistema y Síntesis Acústica', subtitle=None, preheader=None), _stubhead=None, _summary_rows=&lt;great_tables._gt_data.SummaryRows object at 0xf94bce907770&gt;, _summary_rows_grand=&lt;great_tables._gt_data.SummaryRows object at 0xf94bce99d6d0&gt;, _source_notes=[], _footnotes=[], _styles=[], _locale=&lt;great_tables._gt_data.Locale object at 0xf94bce9078c0&gt;, _formats=[], _substitutions=[], _col_merge=[], _transforms=[], _options=Options(table_id=OptionsInfo(scss=False, category='table', type='value', value=None), table_caption=OptionsInfo(scss=False, category='table', type='value', value=None), table_width=OptionsInfo(scss=True, category='table', type='px', value='auto'), table_layout=OptionsInfo(scss=True, category='table', type='value', value='fixed'), table_margin_left=OptionsInfo(scss=True, category='table', type='px', value='auto'), table_margin_right=OptionsInfo(scss=True, category='table', type='px', value='auto'), table_background_color=OptionsInfo(scss=True, category='table', type='value', value='#FFFFFF'), table_additional_css=OptionsInfo(scss=False, category='table', type='values', value=[]), table_font_names=OptionsInfo(scss=False, category='table', type='values', value=['-apple-system', 'BlinkMacSystemFont', 'Segoe UI', 'Roboto', 'Oxygen', 'Ubuntu', 'Cantarell', 'Helvetica Neue', 'Fira Sans', 'Droid Sans', 'Arial', 'sans-serif']), table_font_size=OptionsInfo(scss=True, category='table', type='px', value='16px'), table_font_weight=OptionsInfo(scss=True, category='table', type='value', value='normal'), table_font_style=OptionsInfo(scss=True, category='table', type='value', value='normal'), table_font_color=OptionsInfo(scss=True, category='table', type='value', value='#333333'), table_font_color_light=OptionsInfo(scss=True, category='table', type='value', value='#FFFFFF'), table_border_top_include=OptionsInfo(scss=False, category='table', type='boolean', value=True), table_border_top_style=OptionsInfo(scss=True, category='table', type='value', value='solid'), table_border_top_width=OptionsInfo(scss=True, category='table', type='px', value='2px'), table_border_top_color=OptionsInfo(scss=True, category='table', type='value', value='#A8A8A8'), table_border_right_style=OptionsInfo(scss=True, category='table', type='value', value='none'), table_border_right_width=OptionsInfo(scss=True, category='table', type='px', value='2px'), table_border_right_color=OptionsInfo(scss=True, category='table', type='value', value='#D3D3D3'), table_border_bottom_include=OptionsInfo(scss=False, category='table', type='boolean', value=True), table_border_bottom_style=OptionsInfo(scss=True, category='table', type='value', value='solid'), table_border_bottom_width=OptionsInfo(scss=True, category='table', type='px', value='2px'), table_border_bottom_color=OptionsInfo(scss=True, category='table', type='value', value='#A8A8A8'), table_border_left_style=OptionsInfo(scss=True, category='table', type='value', value='none'), table_border_left_width=OptionsInfo(scss=True, category='table', type='px', value='2px'), table_border_left_color=OptionsInfo(scss=True, category='table', type='value', value='#D3D3D3'), heading_background_color=OptionsInfo(scss=True, category='heading', type='value', value=None), heading_align=OptionsInfo(scss=True, category='heading', type='value', value='center'), heading_title_font_size=OptionsInfo(scss=True, category='heading', type='px', value='125%'), heading_title_font_weight=OptionsInfo(scss=True, category='heading', type='value', value='initial'), heading_subtitle_font_size=OptionsInfo(scss=True, category='heading', type='px', value='85%'), heading_subtitle_font_weight=OptionsInfo(scss=True, category='heading', type='value', value='initial'), heading_padding=OptionsInfo(scss=True, category='heading', type='px', value='4px'), heading_padding_horizontal=OptionsInfo(scss=True, category='heading', type='px', value='5px'), heading_border_bottom_style=OptionsInfo(scss=True, category='heading', type='value', value='solid'), heading_border_bottom_width=OptionsInfo(scss=True, category='heading', type='px', value='2px'), heading_border_bottom_color=OptionsInfo(scss=True, category='heading', type='value', value='#D3D3D3'), heading_border_lr_style=OptionsInfo(scss=True, category='heading', type='value', value='none'), heading_border_lr_width=OptionsInfo(scss=True, category='heading', type='px', value='1px'), heading_border_lr_color=OptionsInfo(scss=True, category='heading', type='value', value='#D3D3D3'), column_labels_background_color=OptionsInfo(scss=True, category='column_labels', type='value', value=None), column_labels_font_size=OptionsInfo(scss=True, category='column_labels', type='px', value='100%'), column_labels_font_weight=OptionsInfo(scss=True, category='column_labels', type='value', value='normal'), column_labels_text_transform=OptionsInfo(scss=True, category='column_labels', type='value', value='inherit'), column_labels_padding=OptionsInfo(scss=True, category='column_labels', type='px', value='5px'), column_labels_padding_horizontal=OptionsInfo(scss=True, category='column_labels', type='px', value='5px'), column_labels_vlines_style=OptionsInfo(scss=True, category='table_body', type='value', value='none'), column_labels_vlines_width=OptionsInfo(scss=True, category='table_body', type='px', value='1px'), column_labels_vlines_color=OptionsInfo(scss=True, category='table_body', type='value', value='#D3D3D3'), column_labels_border_top_style=OptionsInfo(scss=True, category='column_labels', type='value', value='solid'), column_labels_border_top_width=OptionsInfo(scss=True, category='column_labels', type='px', value='2px'), column_labels_border_top_color=OptionsInfo(scss=True, category='column_labels', type='value', value='#D3D3D3'), column_labels_border_bottom_style=OptionsInfo(scss=True, category='column_labels', type='value', value='solid'), column_labels_border_bottom_width=OptionsInfo(scss=True, category='column_labels', type='px', value='2px'), column_labels_border_bottom_color=OptionsInfo(scss=True, category='column_labels', type='value', value='#D3D3D3'), column_labels_border_lr_style=OptionsInfo(scss=True, category='column_labels', type='value', value='none'), column_labels_border_lr_width=OptionsInfo(scss=True, category='column_labels', type='px', value='1px'), column_labels_border_lr_color=OptionsInfo(scss=True, category='column_labels', type='value', value='#D3D3D3'), column_labels_hidden=OptionsInfo(scss=False, category='column_labels', type='boolean', value=False), row_group_background_color=OptionsInfo(scss=True, category='row_group', type='value', value=None), row_group_font_size=OptionsInfo(scss=True, category='row_group', type='px', value='100%'), row_group_font_weight=OptionsInfo(scss=True, category='row_group', type='value', value='initial'), row_group_text_transform=OptionsInfo(scss=True, category='row_group', type='value', value='inherit'), row_group_padding=OptionsInfo(scss=True, category='row_group', type='px', value='8px'), row_group_padding_horizontal=OptionsInfo(scss=True, category='row_group', type='px', value='5px'), row_group_border_top_style=OptionsInfo(scss=True, category='row_group', type='value', value='solid'), row_group_border_top_width=OptionsInfo(scss=True, category='row_group', type='px', value='2px'), row_group_border_top_color=OptionsInfo(scss=True, category='row_group', type='value', value='#D3D3D3'), row_group_border_right_style=OptionsInfo(scss=True, category='row_group', type='value', value='none'), row_group_border_right_width=OptionsInfo(scss=True, category='row_group', type='px', value='1px'), row_group_border_right_color=OptionsInfo(scss=True, category='row_group', type='value', value='#D3D3D3'), row_group_border_bottom_style=OptionsInfo(scss=True, category='row_group', type='value', value='solid'), row_group_border_bottom_width=OptionsInfo(scss=True, category='row_group', type='px', value='2px'), row_group_border_bottom_color=OptionsInfo(scss=True, category='row_group', type='value', value='#D3D3D3'), row_group_border_left_style=OptionsInfo(scss=True, category='row_group', type='value', value='none'), row_group_border_left_width=OptionsInfo(scss=True, category='row_group', type='px', value='1px'), row_group_border_left_color=OptionsInfo(scss=True, category='row_group', type='value', value='#D3D3D3'), row_group_as_column=OptionsInfo(scss=False, category='row_group', type='boolean', value=False), table_body_hlines_style=OptionsInfo(scss=True, category='table_body', type='value', value='solid'), table_body_hlines_width=OptionsInfo(scss=True, category='table_body', type='px', value='1px'), table_body_hlines_color=OptionsInfo(scss=True, category='table_body', type='value', value='#D3D3D3'), table_body_vlines_style=OptionsInfo(scss=True, category='table_body', type='value', value='none'), table_body_vlines_width=OptionsInfo(scss=True, category='table_body', type='px', value='1px'), table_body_vlines_color=OptionsInfo(scss=True, category='table_body', type='value', value='#D3D3D3'), table_body_border_top_style=OptionsInfo(scss=True, category='table_body', type='value', value='solid'), table_body_border_top_width=OptionsInfo(scss=True, category='table_body', type='px', value='2px'), table_body_border_top_color=OptionsInfo(scss=True, category='table_body', type='value', value='#D3D3D3'), table_body_border_bottom_style=OptionsInfo(scss=True, category='table_body', type='value', value='solid'), table_body_border_bottom_width=OptionsInfo(scss=True, category='table_body', type='px', value='2px'), table_body_border_bottom_color=OptionsInfo(scss=True, category='table_body', type='value', value='#D3D3D3'), data_row_padding=OptionsInfo(scss=True, category='data_row', type='px', value='8px'), data_row_padding_horizontal=OptionsInfo(scss=True, category='data_row', type='px', value='5px'), stub_background_color=OptionsInfo(scss=True, category='stub', type='value', value=None), stub_font_size=OptionsInfo(scss=True, category='stub', type='px', value='100%'), stub_font_weight=OptionsInfo(scss=True, category='stub', type='value', value='initial'), stub_text_transform=OptionsInfo(scss=True, category='stub', type='value', value='inherit'), stub_border_style=OptionsInfo(scss=True, category='stub', type='value', value='solid'), stub_border_width=OptionsInfo(scss=True, category='stub', type='px', value='2px'), stub_border_color=OptionsInfo(scss=True, category='stub', type='value', value='#D3D3D3'), stub_indent_length=OptionsInfo(scss=True, category='stub', type='px', value='5px'), stub_row_group_background_color=OptionsInfo(scss=True, category='stub', type='value', value=None), stub_row_group_font_size=OptionsInfo(scss=True, category='stub', type='px', value='100%'), stub_row_group_font_weight=OptionsInfo(scss=True, category='stub', type='value', value='initial'), stub_row_group_text_transform=OptionsInfo(scss=True, category='stub', type='value', value='inherit'), stub_row_group_border_style=OptionsInfo(scss=True, category='stub', type='value', value='solid'), stub_row_group_border_width=OptionsInfo(scss=True, category='stub', type='px', value='2px'), stub_row_group_border_color=OptionsInfo(scss=True, category='stub', type='value', value='#D3D3D3'), summary_row_padding=OptionsInfo(scss=True, category='summary_row', type='px', value='8px'), summary_row_padding_horizontal=OptionsInfo(scss=True, category='summary_row', type='px', value='5px'), summary_row_background_color=OptionsInfo(scss=True, category='summary_row', type='value', value=None), summary_row_text_transform=OptionsInfo(scss=True, category='summary_row', type='value', value='inherit'), summary_row_border_style=OptionsInfo(scss=True, category='summary_row', type='value', value='solid'), summary_row_border_width=OptionsInfo(scss=True, category='summary_row', type='px', value='2px'), summary_row_border_color=OptionsInfo(scss=True, category='summary_row', type='value', value='#D3D3D3'), grand_summary_row_padding=OptionsInfo(scss=True, category='grand_summary_row', type='px', value='8px'), grand_summary_row_padding_horizontal=OptionsInfo(scss=True, category='grand_summary_row', type='px', value='5px'), grand_summary_row_background_color=OptionsInfo(scss=True, category='grand_summary_row', type='value', value=None), grand_summary_row_text_transform=OptionsInfo(scss=True, category='grand_summary_row', type='value', value='inherit'), grand_summary_row_border_style=OptionsInfo(scss=True, category='grand_summary_row', type='value', value='double'), grand_summary_row_border_width=OptionsInfo(scss=True, category='grand_summary_row', type='px', value='6px'), grand_summary_row_border_color=OptionsInfo(scss=True, category='grand_summary_row', type='value', value='#D3D3D3'), footnotes_marks=OptionsInfo(scss=False, category='footnotes', type='values', value='numbers'), footnotes_spec_ref=OptionsInfo(scss=False, category='footnotes', type='value', value='^i'), footnotes_spec_ftr=OptionsInfo(scss=False, category='footnotes', type='value', value='^i'), footnotes_order=OptionsInfo(scss=False, category='footnotes', type='value', value='marks_last'), source_notes_padding=OptionsInfo(scss=True, category='source_notes', type='px', value='4px'), source_notes_padding_horizontal=OptionsInfo(scss=True, category='source_notes', type='px', value='5px'), source_notes_background_color=OptionsInfo(scss=True, category='source_notes', type='value', value=None), source_notes_font_size=OptionsInfo(scss=True, category='source_notes', type='px', value='90%'), source_notes_border_bottom_style=OptionsInfo(scss=True, category='source_notes', type='value', value='none'), source_notes_border_bottom_width=OptionsInfo(scss=True, category='source_notes', type='px', value='2px'), source_notes_border_bottom_color=OptionsInfo(scss=True, category='source_notes', type='value', value='#D3D3D3'), source_notes_border_lr_style=OptionsInfo(scss=True, category='source_notes', type='value', value='none'), source_notes_border_lr_width=OptionsInfo(scss=True, category='source_notes', type='px', value='2px'), source_notes_border_lr_color=OptionsInfo(scss=True, category='source_notes', type='value', value='#D3D3D3'), source_notes_multiline=OptionsInfo(scss=False, category='source_notes', type='boolean', value=True), source_notes_sep=OptionsInfo(scss=False, category='source_notes', type='value', value=' '), row_striping_background_color=OptionsInfo(scss=True, category='row', type='value', value='#F4F4F4'), row_striping_include_stub=OptionsInfo(scss=False, category='row', type='boolean', value=False), row_striping_include_table_body=OptionsInfo(scss=False, category='row', type='boolean', value=False), container_width=OptionsInfo(scss=False, category='container', type='px', value='auto'), container_height=OptionsInfo(scss=False, category='container', type='px', value='auto'), container_padding_x=OptionsInfo(scss=False, category='container', type='px', value='0px'), container_padding_y=OptionsInfo(scss=False, category='container', type='px', value='10px'), container_overflow_x=OptionsInfo(scss=False, category='container', type='overflow', value='auto'), container_overflow_y=OptionsInfo(scss=False, category='container', type='overflow', value='auto'), quarto_disable_processing=OptionsInfo(scss=False, category='quarto', type='logical', value=False), quarto_use_bootstrap=OptionsInfo(scss=False, category='quarto', type='logical', value=False), ihtml_active=OptionsInfo(scss=False, category='ihtml', type='boolean', value=False), ihtml_use_pagination=OptionsInfo(scss=False, category='ihtml', type='boolean', value=True), ihtml_use_pagination_info=OptionsInfo(scss=False, category='ihtml', type='boolean', value=True), ihtml_use_sorting=OptionsInfo(scss=False, category='ihtml', type='boolean', value=True), ihtml_use_search=OptionsInfo(scss=False, category='ihtml', type='boolean', value=False), ihtml_use_filters=OptionsInfo(scss=False, category='ihtml', type='boolean', value=False), ihtml_use_resizers=OptionsInfo(scss=False, category='ihtml', type='boolean', value=False), ihtml_use_highlight=OptionsInfo(scss=False, category='ihtml', type='boolean', value=False), ihtml_use_compact_mode=OptionsInfo(scss=False, category='ihtml', type='boolean', value=False), ihtml_use_text_wrapping=OptionsInfo(scss=False, category='ihtml', type='boolean', value=True), ihtml_use_page_size_select=OptionsInfo(scss=False, category='ihtml', type='boolean', value=False), ihtml_page_size_default=OptionsInfo(scss=False, category='ihtml', type='value', value=10), ihtml_page_size_values=OptionsInfo(scss=False, category='ihtml', type='values', value=[10, 25, 50, 100]), ihtml_pagination_type=OptionsInfo(scss=False, category='ihtml', type='value', value='numbers'), ihtml_height=OptionsInfo(scss=False, category='ihtml', type='value', value='auto'), ihtml_selection_mode=OptionsInfo(scss=False, category='ihtml', type='value', value=None)), _google_font_imports=GoogleFontImports(imports=frozenset()), _has_built=False)</w:t>
+        <w:t xml:space="preserve">6           Duraciones      4 figuras (120 BPM), _body=&lt;great_tables._gt_data.Body object at 0xfe52a2903230&gt;, _boxhead=Boxhead([ColInfo(var='Parámetro', type=&lt;ColInfoTypeEnum.default: 1&gt;, column_label='Parámetro', column_align='left', column_width=None, stub_level=None), ColInfo(var='Valor', type=&lt;ColInfoTypeEnum.default: 1&gt;, column_label='Valor', column_align='right', column_width=None, stub_level=None)]), _stub=&lt;great_tables._gt_data.Stub object at 0xfe52a29030e0&gt;, _spanners=Spanners([]), _heading=Heading(title='Resumen del Sistema y Síntesis Acústica', subtitle=None, preheader=None), _stubhead=None, _summary_rows=&lt;great_tables._gt_data.SummaryRows object at 0xfe52a2903770&gt;, _summary_rows_grand=&lt;great_tables._gt_data.SummaryRows object at 0xfe52a29956d0&gt;, _source_notes=[], _footnotes=[], _styles=[], _locale=&lt;great_tables._gt_data.Locale object at 0xfe52a29038c0&gt;, _formats=[], _substitutions=[], _col_merge=[], _transforms=[], _options=Options(table_id=OptionsInfo(scss=False, category='table', type='value', value=None), table_caption=OptionsInfo(scss=False, category='table', type='value', value=None), table_width=OptionsInfo(scss=True, category='table', type='px', value='auto'), table_layout=OptionsInfo(scss=True, category='table', type='value', value='fixed'), table_margin_left=OptionsInfo(scss=True, category='table', type='px', value='auto'), table_margin_right=OptionsInfo(scss=True, category='table', type='px', value='auto'), table_background_color=OptionsInfo(scss=True, category='table', type='value', value='#FFFFFF'), table_additional_css=OptionsInfo(scss=False, category='table', type='values', value=[]), table_font_names=OptionsInfo(scss=False, category='table', type='values', value=['-apple-system', 'BlinkMacSystemFont', 'Segoe UI', 'Roboto', 'Oxygen', 'Ubuntu', 'Cantarell', 'Helvetica Neue', 'Fira Sans', 'Droid Sans', 'Arial', 'sans-serif']), table_font_size=OptionsInfo(scss=True, category='table', type='px', value='16px'), table_font_weight=OptionsInfo(scss=True, category='table', type='value', value='normal'), table_font_style=OptionsInfo(scss=True, category='table', type='value', value='normal'), table_font_color=OptionsInfo(scss=True, category='table', type='value', value='#333333'), table_font_color_light=OptionsInfo(scss=True, category='table', type='value', value='#FFFFFF'), table_border_top_include=OptionsInfo(scss=False, category='table', type='boolean', value=True), table_border_top_style=OptionsInfo(scss=True, category='table', type='value', value='solid'), table_border_top_width=OptionsInfo(scss=True, category='table', type='px', value='2px'), table_border_top_color=OptionsInfo(scss=True, category='table', type='value', value='#A8A8A8'), table_border_right_style=OptionsInfo(scss=True, category='table', type='value', value='none'), table_border_right_width=OptionsInfo(scss=True, category='table', type='px', value='2px'), table_border_right_color=OptionsInfo(scss=True, category='table', type='value', value='#D3D3D3'), table_border_bottom_include=OptionsInfo(scss=False, category='table', type='boolean', value=True), table_border_bottom_style=OptionsInfo(scss=True, category='table', type='value', value='solid'), table_border_bottom_width=OptionsInfo(scss=True, category='table', type='px', value='2px'), table_border_bottom_color=OptionsInfo(scss=True, category='table', type='value', value='#A8A8A8'), table_border_left_style=OptionsInfo(scss=True, category='table', type='value', value='none'), table_border_left_width=OptionsInfo(scss=True, category='table', type='px', value='2px'), table_border_left_color=OptionsInfo(scss=True, category='table', type='value', value='#D3D3D3'), heading_background_color=OptionsInfo(scss=True, category='heading', type='value', value=None), heading_align=OptionsInfo(scss=True, category='heading', type='value', value='center'), heading_title_font_size=OptionsInfo(scss=True, category='heading', type='px', value='125%'), heading_title_font_weight=OptionsInfo(scss=True, category='heading', type='value', value='initial'), heading_subtitle_font_size=OptionsInfo(scss=True, category='heading', type='px', value='85%'), heading_subtitle_font_weight=OptionsInfo(scss=True, category='heading', type='value', value='initial'), heading_padding=OptionsInfo(scss=True, category='heading', type='px', value='4px'), heading_padding_horizontal=OptionsInfo(scss=True, category='heading', type='px', value='5px'), heading_border_bottom_style=OptionsInfo(scss=True, category='heading', type='value', value='solid'), heading_border_bottom_width=OptionsInfo(scss=True, category='heading', type='px', value='2px'), heading_border_bottom_color=OptionsInfo(scss=True, category='heading', type='value', value='#D3D3D3'), heading_border_lr_style=OptionsInfo(scss=True, category='heading', type='value', value='none'), heading_border_lr_width=OptionsInfo(scss=True, category='heading', type='px', value='1px'), heading_border_lr_color=OptionsInfo(scss=True, category='heading', type='value', value='#D3D3D3'), column_labels_background_color=OptionsInfo(scss=True, category='column_labels', type='value', value=None), column_labels_font_size=OptionsInfo(scss=True, category='column_labels', type='px', value='100%'), column_labels_font_weight=OptionsInfo(scss=True, category='column_labels', type='value', value='normal'), column_labels_text_transform=OptionsInfo(scss=True, category='column_labels', type='value', value='inherit'), column_labels_padding=OptionsInfo(scss=True, category='column_labels', type='px', value='5px'), column_labels_padding_horizontal=OptionsInfo(scss=True, category='column_labels', type='px', value='5px'), column_labels_vlines_style=OptionsInfo(scss=True, category='table_body', type='value', value='none'), column_labels_vlines_width=OptionsInfo(scss=True, category='table_body', type='px', value='1px'), column_labels_vlines_color=OptionsInfo(scss=True, category='table_body', type='value', value='#D3D3D3'), column_labels_border_top_style=OptionsInfo(scss=True, category='column_labels', type='value', value='solid'), column_labels_border_top_width=OptionsInfo(scss=True, category='column_labels', type='px', value='2px'), column_labels_border_top_color=OptionsInfo(scss=True, category='column_labels', type='value', value='#D3D3D3'), column_labels_border_bottom_style=OptionsInfo(scss=True, category='column_labels', type='value', value='solid'), column_labels_border_bottom_width=OptionsInfo(scss=True, category='column_labels', type='px', value='2px'), column_labels_border_bottom_color=OptionsInfo(scss=True, category='column_labels', type='value', value='#D3D3D3'), column_labels_border_lr_style=OptionsInfo(scss=True, category='column_labels', type='value', value='none'), column_labels_border_lr_width=OptionsInfo(scss=True, category='column_labels', type='px', value='1px'), column_labels_border_lr_color=OptionsInfo(scss=True, category='column_labels', type='value', value='#D3D3D3'), column_labels_hidden=OptionsInfo(scss=False, category='column_labels', type='boolean', value=False), row_group_background_color=OptionsInfo(scss=True, category='row_group', type='value', value=None), row_group_font_size=OptionsInfo(scss=True, category='row_group', type='px', value='100%'), row_group_font_weight=OptionsInfo(scss=True, category='row_group', type='value', value='initial'), row_group_text_transform=OptionsInfo(scss=True, category='row_group', type='value', value='inherit'), row_group_padding=OptionsInfo(scss=True, category='row_group', type='px', value='8px'), row_group_padding_horizontal=OptionsInfo(scss=True, category='row_group', type='px', value='5px'), row_group_border_top_style=OptionsInfo(scss=True, category='row_group', type='value', value='solid'), row_group_border_top_width=OptionsInfo(scss=True, category='row_group', type='px', value='2px'), row_group_border_top_color=OptionsInfo(scss=True, category='row_group', type='value', value='#D3D3D3'), row_group_border_right_style=OptionsInfo(scss=True, category='row_group', type='value', value='none'), row_group_border_right_width=OptionsInfo(scss=True, category='row_group', type='px', value='1px'), row_group_border_right_color=OptionsInfo(scss=True, category='row_group', type='value', value='#D3D3D3'), row_group_border_bottom_style=OptionsInfo(scss=True, category='row_group', type='value', value='solid'), row_group_border_bottom_width=OptionsInfo(scss=True, category='row_group', type='px', value='2px'), row_group_border_bottom_color=OptionsInfo(scss=True, category='row_group', type='value', value='#D3D3D3'), row_group_border_left_style=OptionsInfo(scss=True, category='row_group', type='value', value='none'), row_group_border_left_width=OptionsInfo(scss=True, category='row_group', type='px', value='1px'), row_group_border_left_color=OptionsInfo(scss=True, category='row_group', type='value', value='#D3D3D3'), row_group_as_column=OptionsInfo(scss=False, category='row_group', type='boolean', value=False), table_body_hlines_style=OptionsInfo(scss=True, category='table_body', type='value', value='solid'), table_body_hlines_width=OptionsInfo(scss=True, category='table_body', type='px', value='1px'), table_body_hlines_color=OptionsInfo(scss=True, category='table_body', type='value', value='#D3D3D3'), table_body_vlines_style=OptionsInfo(scss=True, category='table_body', type='value', value='none'), table_body_vlines_width=OptionsInfo(scss=True, category='table_body', type='px', value='1px'), table_body_vlines_color=OptionsInfo(scss=True, category='table_body', type='value', value='#D3D3D3'), table_body_border_top_style=OptionsInfo(scss=True, category='table_body', type='value', value='solid'), table_body_border_top_width=OptionsInfo(scss=True, category='table_body', type='px', value='2px'), table_body_border_top_color=OptionsInfo(scss=True, category='table_body', type='value', value='#D3D3D3'), table_body_border_bottom_style=OptionsInfo(scss=True, category='table_body', type='value', value='solid'), table_body_border_bottom_width=OptionsInfo(scss=True, category='table_body', type='px', value='2px'), table_body_border_bottom_color=OptionsInfo(scss=True, category='table_body', type='value', value='#D3D3D3'), data_row_padding=OptionsInfo(scss=True, category='data_row', type='px', value='8px'), data_row_padding_horizontal=OptionsInfo(scss=True, category='data_row', type='px', value='5px'), stub_background_color=OptionsInfo(scss=True, category='stub', type='value', value=None), stub_font_size=OptionsInfo(scss=True, category='stub', type='px', value='100%'), stub_font_weight=OptionsInfo(scss=True, category='stub', type='value', value='initial'), stub_text_transform=OptionsInfo(scss=True, category='stub', type='value', value='inherit'), stub_border_style=OptionsInfo(scss=True, category='stub', type='value', value='solid'), stub_border_width=OptionsInfo(scss=True, category='stub', type='px', value='2px'), stub_border_color=OptionsInfo(scss=True, category='stub', type='value', value='#D3D3D3'), stub_indent_length=OptionsInfo(scss=True, category='stub', type='px', value='5px'), stub_row_group_background_color=OptionsInfo(scss=True, category='stub', type='value', value=None), stub_row_group_font_size=OptionsInfo(scss=True, category='stub', type='px', value='100%'), stub_row_group_font_weight=OptionsInfo(scss=True, category='stub', type='value', value='initial'), stub_row_group_text_transform=OptionsInfo(scss=True, category='stub', type='value', value='inherit'), stub_row_group_border_style=OptionsInfo(scss=True, category='stub', type='value', value='solid'), stub_row_group_border_width=OptionsInfo(scss=True, category='stub', type='px', value='2px'), stub_row_group_border_color=OptionsInfo(scss=True, category='stub', type='value', value='#D3D3D3'), summary_row_padding=OptionsInfo(scss=True, category='summary_row', type='px', value='8px'), summary_row_padding_horizontal=OptionsInfo(scss=True, category='summary_row', type='px', value='5px'), summary_row_background_color=OptionsInfo(scss=True, category='summary_row', type='value', value=None), summary_row_text_transform=OptionsInfo(scss=True, category='summary_row', type='value', value='inherit'), summary_row_border_style=OptionsInfo(scss=True, category='summary_row', type='value', value='solid'), summary_row_border_width=OptionsInfo(scss=True, category='summary_row', type='px', value='2px'), summary_row_border_color=OptionsInfo(scss=True, category='summary_row', type='value', value='#D3D3D3'), grand_summary_row_padding=OptionsInfo(scss=True, category='grand_summary_row', type='px', value='8px'), grand_summary_row_padding_horizontal=OptionsInfo(scss=True, category='grand_summary_row', type='px', value='5px'), grand_summary_row_background_color=OptionsInfo(scss=True, category='grand_summary_row', type='value', value=None), grand_summary_row_text_transform=OptionsInfo(scss=True, category='grand_summary_row', type='value', value='inherit'), grand_summary_row_border_style=OptionsInfo(scss=True, category='grand_summary_row', type='value', value='double'), grand_summary_row_border_width=OptionsInfo(scss=True, category='grand_summary_row', type='px', value='6px'), grand_summary_row_border_color=OptionsInfo(scss=True, category='grand_summary_row', type='value', value='#D3D3D3'), footnotes_marks=OptionsInfo(scss=False, category='footnotes', type='values', value='numbers'), footnotes_spec_ref=OptionsInfo(scss=False, category='footnotes', type='value', value='^i'), footnotes_spec_ftr=OptionsInfo(scss=False, category='footnotes', type='value', value='^i'), footnotes_order=OptionsInfo(scss=False, category='footnotes', type='value', value='marks_last'), source_notes_padding=OptionsInfo(scss=True, category='source_notes', type='px', value='4px'), source_notes_padding_horizontal=OptionsInfo(scss=True, category='source_notes', type='px', value='5px'), source_notes_background_color=OptionsInfo(scss=True, category='source_notes', type='value', value=None), source_notes_font_size=OptionsInfo(scss=True, category='source_notes', type='px', value='90%'), source_notes_border_bottom_style=OptionsInfo(scss=True, category='source_notes', type='value', value='none'), source_notes_border_bottom_width=OptionsInfo(scss=True, category='source_notes', type='px', value='2px'), source_notes_border_bottom_color=OptionsInfo(scss=True, category='source_notes', type='value', value='#D3D3D3'), source_notes_border_lr_style=OptionsInfo(scss=True, category='source_notes', type='value', value='none'), source_notes_border_lr_width=OptionsInfo(scss=True, category='source_notes', type='px', value='2px'), source_notes_border_lr_color=OptionsInfo(scss=True, category='source_notes', type='value', value='#D3D3D3'), source_notes_multiline=OptionsInfo(scss=False, category='source_notes', type='boolean', value=True), source_notes_sep=OptionsInfo(scss=False, category='source_notes', type='value', value=' '), row_striping_background_color=OptionsInfo(scss=True, category='row', type='value', value='#F4F4F4'), row_striping_include_stub=OptionsInfo(scss=False, category='row', type='boolean', value=False), row_striping_include_table_body=OptionsInfo(scss=False, category='row', type='boolean', value=False), container_width=OptionsInfo(scss=False, category='container', type='px', value='auto'), container_height=OptionsInfo(scss=False, category='container', type='px', value='auto'), container_padding_x=OptionsInfo(scss=False, category='container', type='px', value='0px'), container_padding_y=OptionsInfo(scss=False, category='container', type='px', value='10px'), container_overflow_x=OptionsInfo(scss=False, category='container', type='overflow', value='auto'), container_overflow_y=OptionsInfo(scss=False, category='container', type='overflow', value='auto'), quarto_disable_processing=OptionsInfo(scss=False, category='quarto', type='logical', value=False), quarto_use_bootstrap=OptionsInfo(scss=False, category='quarto', type='logical', value=False), ihtml_active=OptionsInfo(scss=False, category='ihtml', type='boolean', value=False), ihtml_use_pagination=OptionsInfo(scss=False, category='ihtml', type='boolean', value=True), ihtml_use_pagination_info=OptionsInfo(scss=False, category='ihtml', type='boolean', value=True), ihtml_use_sorting=OptionsInfo(scss=False, category='ihtml', type='boolean', value=True), ihtml_use_search=OptionsInfo(scss=False, category='ihtml', type='boolean', value=False), ihtml_use_filters=OptionsInfo(scss=False, category='ihtml', type='boolean', value=False), ihtml_use_resizers=OptionsInfo(scss=False, category='ihtml', type='boolean', value=False), ihtml_use_highlight=OptionsInfo(scss=False, category='ihtml', type='boolean', value=False), ihtml_use_compact_mode=OptionsInfo(scss=False, category='ihtml', type='boolean', value=False), ihtml_use_text_wrapping=OptionsInfo(scss=False, category='ihtml', type='boolean', value=True), ihtml_use_page_size_select=OptionsInfo(scss=False, category='ihtml', type='boolean', value=False), ihtml_page_size_default=OptionsInfo(scss=False, category='ihtml', type='value', value=10), ihtml_page_size_values=OptionsInfo(scss=False, category='ihtml', type='values', value=[10, 25, 50, 100]), ihtml_pagination_type=OptionsInfo(scss=False, category='ihtml', type='value', value='numbers'), ihtml_height=OptionsInfo(scss=False, category='ihtml', type='value', value='auto'), ihtml_selection_mode=OptionsInfo(scss=False, category='ihtml', type='value', value=None)), _google_font_imports=GoogleFontImports(imports=frozenset()), _has_built=False)</w:t>
       </w:r>
     </w:p>
     <w:bookmarkEnd w:id="12"/>
@@ -706,7 +706,7 @@
         <w:rPr>
           <w:rStyle w:val="VerbatimChar"/>
         </w:rPr>
-        <w:t xml:space="preserve">6  C#5    vii° (Sensible)    73          554.37         1.8877, _body=&lt;great_tables._gt_data.Body object at 0xf94bce9e2690&gt;, _boxhead=Boxhead([ColInfo(var='Nota', type=&lt;ColInfoTypeEnum.default: 1&gt;, column_label='Nota', column_align='left', column_width=None, stub_level=None), ColInfo(var='Grado', type=&lt;ColInfoTypeEnum.default: 1&gt;, column_label='Grado', column_align='left', column_width=None, stub_level=None), ColInfo(var='MIDI', type=&lt;ColInfoTypeEnum.default: 1&gt;, column_label='MIDI', column_align='right', column_width=None, stub_level=None), ColInfo(var='Frecuencia (Hz)', type=&lt;ColInfoTypeEnum.default: 1&gt;, column_label='Frecuencia (Hz)', column_align='right', column_width=None, stub_level=None), ColInfo(var='Razón a Tónica', type=&lt;ColInfoTypeEnum.default: 1&gt;, column_label='Razón a Tónica', column_align='right', column_width=None, stub_level=None)]), _stub=&lt;great_tables._gt_data.Stub object at 0xf94bce99de50&gt;, _spanners=Spanners([]), _heading=Heading(title='Grados de la Escala Diatónica de Re Mayor', subtitle=None, preheader=None), _stubhead=None, _summary_rows=&lt;great_tables._gt_data.SummaryRows object at 0xf94bce99e210&gt;, _summary_rows_grand=&lt;great_tables._gt_data.SummaryRows object at 0xf94bce9322c0&gt;, _source_notes=[], _footnotes=[], _styles=[], _locale=&lt;great_tables._gt_data.Locale object at 0xf94bce99d590&gt;, _formats=[], _substitutions=[], _col_merge=[], _transforms=[], _options=Options(table_id=OptionsInfo(scss=False, category='table', type='value', value=None), table_caption=OptionsInfo(scss=False, category='table', type='value', value=None), table_width=OptionsInfo(scss=True, category='table', type='px', value='auto'), table_layout=OptionsInfo(scss=True, category='table', type='value', value='fixed'), table_margin_left=OptionsInfo(scss=True, category='table', type='px', value='auto'), table_margin_right=OptionsInfo(scss=True, category='table', type='px', value='auto'), table_background_color=OptionsInfo(scss=True, category='table', type='value', value='#FFFFFF'), table_additional_css=OptionsInfo(scss=False, category='table', type='values', value=[]), table_font_names=OptionsInfo(scss=False, category='table', type='values', value=['-apple-system', 'BlinkMacSystemFont', 'Segoe UI', 'Roboto', 'Oxygen', 'Ubuntu', 'Cantarell', 'Helvetica Neue', 'Fira Sans', 'Droid Sans', 'Arial', 'sans-serif']), table_font_size=OptionsInfo(scss=True, category='table', type='px', value='16px'), table_font_weight=OptionsInfo(scss=True, category='table', type='value', value='normal'), table_font_style=OptionsInfo(scss=True, category='table', type='value', value='normal'), table_font_color=OptionsInfo(scss=True, category='table', type='value', value='#333333'), table_font_color_light=OptionsInfo(scss=True, category='table', type='value', value='#FFFFFF'), table_border_top_include=OptionsInfo(scss=False, category='table', type='boolean', value=True), table_border_top_style=OptionsInfo(scss=True, category='table', type='value', value='solid'), table_border_top_width=OptionsInfo(scss=True, category='table', type='px', value='2px'), table_border_top_color=OptionsInfo(scss=True, category='table', type='value', value='#A8A8A8'), table_border_right_style=OptionsInfo(scss=True, category='table', type='value', value='none'), table_border_right_width=OptionsInfo(scss=True, category='table', type='px', value='2px'), table_border_right_color=OptionsInfo(scss=True, category='table', type='value', value='#D3D3D3'), table_border_bottom_include=OptionsInfo(scss=False, category='table', type='boolean', value=True), table_border_bottom_style=OptionsInfo(scss=True, category='table', type='value', value='solid'), table_border_bottom_width=OptionsInfo(scss=True, category='table', type='px', value='2px'), table_border_bottom_color=OptionsInfo(scss=True, category='table', type='value', value='#A8A8A8'), table_border_left_style=OptionsInfo(scss=True, category='table', type='value', value='none'), table_border_left_width=OptionsInfo(scss=True, category='table', type='px', value='2px'), table_border_left_color=OptionsInfo(scss=True, category='table', type='value', value='#D3D3D3'), heading_background_color=OptionsInfo(scss=True, category='heading', type='value', value=None), heading_align=OptionsInfo(scss=True, category='heading', type='value', value='center'), heading_title_font_size=OptionsInfo(scss=True, category='heading', type='px', value='125%'), heading_title_font_weight=OptionsInfo(scss=True, category='heading', type='value', value='initial'), heading_subtitle_font_size=OptionsInfo(scss=True, category='heading', type='px', value='85%'), heading_subtitle_font_weight=OptionsInfo(scss=True, category='heading', type='value', value='initial'), heading_padding=OptionsInfo(scss=True, category='heading', type='px', value='4px'), heading_padding_horizontal=OptionsInfo(scss=True, category='heading', type='px', value='5px'), heading_border_bottom_style=OptionsInfo(scss=True, category='heading', type='value', value='solid'), heading_border_bottom_width=OptionsInfo(scss=True, category='heading', type='px', value='2px'), heading_border_bottom_color=OptionsInfo(scss=True, category='heading', type='value', value='#D3D3D3'), heading_border_lr_style=OptionsInfo(scss=True, category='heading', type='value', value='none'), heading_border_lr_width=OptionsInfo(scss=True, category='heading', type='px', value='1px'), heading_border_lr_color=OptionsInfo(scss=True, category='heading', type='value', value='#D3D3D3'), column_labels_background_color=OptionsInfo(scss=True, category='column_labels', type='value', value=None), column_labels_font_size=OptionsInfo(scss=True, category='column_labels', type='px', value='100%'), column_labels_font_weight=OptionsInfo(scss=True, category='column_labels', type='value', value='normal'), column_labels_text_transform=OptionsInfo(scss=True, category='column_labels', type='value', value='inherit'), column_labels_padding=OptionsInfo(scss=True, category='column_labels', type='px', value='5px'), column_labels_padding_horizontal=OptionsInfo(scss=True, category='column_labels', type='px', value='5px'), column_labels_vlines_style=OptionsInfo(scss=True, category='table_body', type='value', value='none'), column_labels_vlines_width=OptionsInfo(scss=True, category='table_body', type='px', value='1px'), column_labels_vlines_color=OptionsInfo(scss=True, category='table_body', type='value', value='#D3D3D3'), column_labels_border_top_style=OptionsInfo(scss=True, category='column_labels', type='value', value='solid'), column_labels_border_top_width=OptionsInfo(scss=True, category='column_labels', type='px', value='2px'), column_labels_border_top_color=OptionsInfo(scss=True, category='column_labels', type='value', value='#D3D3D3'), column_labels_border_bottom_style=OptionsInfo(scss=True, category='column_labels', type='value', value='solid'), column_labels_border_bottom_width=OptionsInfo(scss=True, category='column_labels', type='px', value='2px'), column_labels_border_bottom_color=OptionsInfo(scss=True, category='column_labels', type='value', value='#D3D3D3'), column_labels_border_lr_style=OptionsInfo(scss=True, category='column_labels', type='value', value='none'), column_labels_border_lr_width=OptionsInfo(scss=True, category='column_labels', type='px', value='1px'), column_labels_border_lr_color=OptionsInfo(scss=True, category='column_labels', type='value', value='#D3D3D3'), column_labels_hidden=OptionsInfo(scss=False, category='column_labels', type='boolean', value=False), row_group_background_color=OptionsInfo(scss=True, category='row_group', type='value', value=None), row_group_font_size=OptionsInfo(scss=True, category='row_group', type='px', value='100%'), row_group_font_weight=OptionsInfo(scss=True, category='row_group', type='value', value='initial'), row_group_text_transform=OptionsInfo(scss=True, category='row_group', type='value', value='inherit'), row_group_padding=OptionsInfo(scss=True, category='row_group', type='px', value='8px'), row_group_padding_horizontal=OptionsInfo(scss=True, category='row_group', type='px', value='5px'), row_group_border_top_style=OptionsInfo(scss=True, category='row_group', type='value', value='solid'), row_group_border_top_width=OptionsInfo(scss=True, category='row_group', type='px', value='2px'), row_group_border_top_color=OptionsInfo(scss=True, category='row_group', type='value', value='#D3D3D3'), row_group_border_right_style=OptionsInfo(scss=True, category='row_group', type='value', value='none'), row_group_border_right_width=OptionsInfo(scss=True, category='row_group', type='px', value='1px'), row_group_border_right_color=OptionsInfo(scss=True, category='row_group', type='value', value='#D3D3D3'), row_group_border_bottom_style=OptionsInfo(scss=True, category='row_group', type='value', value='solid'), row_group_border_bottom_width=OptionsInfo(scss=True, category='row_group', type='px', value='2px'), row_group_border_bottom_color=OptionsInfo(scss=True, category='row_group', type='value', value='#D3D3D3'), row_group_border_left_style=OptionsInfo(scss=True, category='row_group', type='value', value='none'), row_group_border_left_width=OptionsInfo(scss=True, category='row_group', type='px', value='1px'), row_group_border_left_color=OptionsInfo(scss=True, category='row_group', type='value', value='#D3D3D3'), row_group_as_column=OptionsInfo(scss=False, category='row_group', type='boolean', value=False), table_body_hlines_style=OptionsInfo(scss=True, category='table_body', type='value', value='solid'), table_body_hlines_width=OptionsInfo(scss=True, category='table_body', type='px', value='1px'), table_body_hlines_color=OptionsInfo(scss=True, category='table_body', type='value', value='#D3D3D3'), table_body_vlines_style=OptionsInfo(scss=True, category='table_body', type='value', value='none'), table_body_vlines_width=OptionsInfo(scss=True, category='table_body', type='px', value='1px'), table_body_vlines_color=OptionsInfo(scss=True, category='table_body', type='value', value='#D3D3D3'), table_body_border_top_style=OptionsInfo(scss=True, category='table_body', type='value', value='solid'), table_body_border_top_width=OptionsInfo(scss=True, category='table_body', type='px', value='2px'), table_body_border_top_color=OptionsInfo(scss=True, category='table_body', type='value', value='#D3D3D3'), table_body_border_bottom_style=OptionsInfo(scss=True, category='table_body', type='value', value='solid'), table_body_border_bottom_width=OptionsInfo(scss=True, category='table_body', type='px', value='2px'), table_body_border_bottom_color=OptionsInfo(scss=True, category='table_body', type='value', value='#D3D3D3'), data_row_padding=OptionsInfo(scss=True, category='data_row', type='px', value='8px'), data_row_padding_horizontal=OptionsInfo(scss=True, category='data_row', type='px', value='5px'), stub_background_color=OptionsInfo(scss=True, category='stub', type='value', value=None), stub_font_size=OptionsInfo(scss=True, category='stub', type='px', value='100%'), stub_font_weight=OptionsInfo(scss=True, category='stub', type='value', value='initial'), stub_text_transform=OptionsInfo(scss=True, category='stub', type='value', value='inherit'), stub_border_style=OptionsInfo(scss=True, category='stub', type='value', value='solid'), stub_border_width=OptionsInfo(scss=True, category='stub', type='px', value='2px'), stub_border_color=OptionsInfo(scss=True, category='stub', type='value', value='#D3D3D3'), stub_indent_length=OptionsInfo(scss=True, category='stub', type='px', value='5px'), stub_row_group_background_color=OptionsInfo(scss=True, category='stub', type='value', value=None), stub_row_group_font_size=OptionsInfo(scss=True, category='stub', type='px', value='100%'), stub_row_group_font_weight=OptionsInfo(scss=True, category='stub', type='value', value='initial'), stub_row_group_text_transform=OptionsInfo(scss=True, category='stub', type='value', value='inherit'), stub_row_group_border_style=OptionsInfo(scss=True, category='stub', type='value', value='solid'), stub_row_group_border_width=OptionsInfo(scss=True, category='stub', type='px', value='2px'), stub_row_group_border_color=OptionsInfo(scss=True, category='stub', type='value', value='#D3D3D3'), summary_row_padding=OptionsInfo(scss=True, category='summary_row', type='px', value='8px'), summary_row_padding_horizontal=OptionsInfo(scss=True, category='summary_row', type='px', value='5px'), summary_row_background_color=OptionsInfo(scss=True, category='summary_row', type='value', value=None), summary_row_text_transform=OptionsInfo(scss=True, category='summary_row', type='value', value='inherit'), summary_row_border_style=OptionsInfo(scss=True, category='summary_row', type='value', value='solid'), summary_row_border_width=OptionsInfo(scss=True, category='summary_row', type='px', value='2px'), summary_row_border_color=OptionsInfo(scss=True, category='summary_row', type='value', value='#D3D3D3'), grand_summary_row_padding=OptionsInfo(scss=True, category='grand_summary_row', type='px', value='8px'), grand_summary_row_padding_horizontal=OptionsInfo(scss=True, category='grand_summary_row', type='px', value='5px'), grand_summary_row_background_color=OptionsInfo(scss=True, category='grand_summary_row', type='value', value=None), grand_summary_row_text_transform=OptionsInfo(scss=True, category='grand_summary_row', type='value', value='inherit'), grand_summary_row_border_style=OptionsInfo(scss=True, category='grand_summary_row', type='value', value='double'), grand_summary_row_border_width=OptionsInfo(scss=True, category='grand_summary_row', type='px', value='6px'), grand_summary_row_border_color=OptionsInfo(scss=True, category='grand_summary_row', type='value', value='#D3D3D3'), footnotes_marks=OptionsInfo(scss=False, category='footnotes', type='values', value='numbers'), footnotes_spec_ref=OptionsInfo(scss=False, category='footnotes', type='value', value='^i'), footnotes_spec_ftr=OptionsInfo(scss=False, category='footnotes', type='value', value='^i'), footnotes_order=OptionsInfo(scss=False, category='footnotes', type='value', value='marks_last'), source_notes_padding=OptionsInfo(scss=True, category='source_notes', type='px', value='4px'), source_notes_padding_horizontal=OptionsInfo(scss=True, category='source_notes', type='px', value='5px'), source_notes_background_color=OptionsInfo(scss=True, category='source_notes', type='value', value=None), source_notes_font_size=OptionsInfo(scss=True, category='source_notes', type='px', value='90%'), source_notes_border_bottom_style=OptionsInfo(scss=True, category='source_notes', type='value', value='none'), source_notes_border_bottom_width=OptionsInfo(scss=True, category='source_notes', type='px', value='2px'), source_notes_border_bottom_color=OptionsInfo(scss=True, category='source_notes', type='value', value='#D3D3D3'), source_notes_border_lr_style=OptionsInfo(scss=True, category='source_notes', type='value', value='none'), source_notes_border_lr_width=OptionsInfo(scss=True, category='source_notes', type='px', value='2px'), source_notes_border_lr_color=OptionsInfo(scss=True, category='source_notes', type='value', value='#D3D3D3'), source_notes_multiline=OptionsInfo(scss=False, category='source_notes', type='boolean', value=True), source_notes_sep=OptionsInfo(scss=False, category='source_notes', type='value', value=' '), row_striping_background_color=OptionsInfo(scss=True, category='row', type='value', value='#F4F4F4'), row_striping_include_stub=OptionsInfo(scss=False, category='row', type='boolean', value=False), row_striping_include_table_body=OptionsInfo(scss=False, category='row', type='boolean', value=False), container_width=OptionsInfo(scss=False, category='container', type='px', value='auto'), container_height=OptionsInfo(scss=False, category='container', type='px', value='auto'), container_padding_x=OptionsInfo(scss=False, category='container', type='px', value='0px'), container_padding_y=OptionsInfo(scss=False, category='container', type='px', value='10px'), container_overflow_x=OptionsInfo(scss=False, category='container', type='overflow', value='auto'), container_overflow_y=OptionsInfo(scss=False, category='container', type='overflow', value='auto'), quarto_disable_processing=OptionsInfo(scss=False, category='quarto', type='logical', value=False), quarto_use_bootstrap=OptionsInfo(scss=False, category='quarto', type='logical', value=False), ihtml_active=OptionsInfo(scss=False, category='ihtml', type='boolean', value=False), ihtml_use_pagination=OptionsInfo(scss=False, category='ihtml', type='boolean', value=True), ihtml_use_pagination_info=OptionsInfo(scss=False, category='ihtml', type='boolean', value=True), ihtml_use_sorting=OptionsInfo(scss=False, category='ihtml', type='boolean', value=True), ihtml_use_search=OptionsInfo(scss=False, category='ihtml', type='boolean', value=False), ihtml_use_filters=OptionsInfo(scss=False, category='ihtml', type='boolean', value=False), ihtml_use_resizers=OptionsInfo(scss=False, category='ihtml', type='boolean', value=False), ihtml_use_highlight=OptionsInfo(scss=False, category='ihtml', type='boolean', value=False), ihtml_use_compact_mode=OptionsInfo(scss=False, category='ihtml', type='boolean', value=False), ihtml_use_text_wrapping=OptionsInfo(scss=False, category='ihtml', type='boolean', value=True), ihtml_use_page_size_select=OptionsInfo(scss=False, category='ihtml', type='boolean', value=False), ihtml_page_size_default=OptionsInfo(scss=False, category='ihtml', type='value', value=10), ihtml_page_size_values=OptionsInfo(scss=False, category='ihtml', type='values', value=[10, 25, 50, 100]), ihtml_pagination_type=OptionsInfo(scss=False, category='ihtml', type='value', value='numbers'), ihtml_height=OptionsInfo(scss=False, category='ihtml', type='value', value='auto'), ihtml_selection_mode=OptionsInfo(scss=False, category='ihtml', type='value', value=None)), _google_font_imports=GoogleFontImports(imports=frozenset()), _has_built=False)</w:t>
+        <w:t xml:space="preserve">6  C#5    vii° (Sensible)    73          554.37         1.8877, _body=&lt;great_tables._gt_data.Body object at 0xfe52a29d6690&gt;, _boxhead=Boxhead([ColInfo(var='Nota', type=&lt;ColInfoTypeEnum.default: 1&gt;, column_label='Nota', column_align='left', column_width=None, stub_level=None), ColInfo(var='Grado', type=&lt;ColInfoTypeEnum.default: 1&gt;, column_label='Grado', column_align='left', column_width=None, stub_level=None), ColInfo(var='MIDI', type=&lt;ColInfoTypeEnum.default: 1&gt;, column_label='MIDI', column_align='right', column_width=None, stub_level=None), ColInfo(var='Frecuencia (Hz)', type=&lt;ColInfoTypeEnum.default: 1&gt;, column_label='Frecuencia (Hz)', column_align='right', column_width=None, stub_level=None), ColInfo(var='Razón a Tónica', type=&lt;ColInfoTypeEnum.default: 1&gt;, column_label='Razón a Tónica', column_align='right', column_width=None, stub_level=None)]), _stub=&lt;great_tables._gt_data.Stub object at 0xfe52a2995e50&gt;, _spanners=Spanners([]), _heading=Heading(title='Grados de la Escala Diatónica de Re Mayor', subtitle=None, preheader=None), _stubhead=None, _summary_rows=&lt;great_tables._gt_data.SummaryRows object at 0xfe52a2996210&gt;, _summary_rows_grand=&lt;great_tables._gt_data.SummaryRows object at 0xfe52a29262c0&gt;, _source_notes=[], _footnotes=[], _styles=[], _locale=&lt;great_tables._gt_data.Locale object at 0xfe52a2995590&gt;, _formats=[], _substitutions=[], _col_merge=[], _transforms=[], _options=Options(table_id=OptionsInfo(scss=False, category='table', type='value', value=None), table_caption=OptionsInfo(scss=False, category='table', type='value', value=None), table_width=OptionsInfo(scss=True, category='table', type='px', value='auto'), table_layout=OptionsInfo(scss=True, category='table', type='value', value='fixed'), table_margin_left=OptionsInfo(scss=True, category='table', type='px', value='auto'), table_margin_right=OptionsInfo(scss=True, category='table', type='px', value='auto'), table_background_color=OptionsInfo(scss=True, category='table', type='value', value='#FFFFFF'), table_additional_css=OptionsInfo(scss=False, category='table', type='values', value=[]), table_font_names=OptionsInfo(scss=False, category='table', type='values', value=['-apple-system', 'BlinkMacSystemFont', 'Segoe UI', 'Roboto', 'Oxygen', 'Ubuntu', 'Cantarell', 'Helvetica Neue', 'Fira Sans', 'Droid Sans', 'Arial', 'sans-serif']), table_font_size=OptionsInfo(scss=True, category='table', type='px', value='16px'), table_font_weight=OptionsInfo(scss=True, category='table', type='value', value='normal'), table_font_style=OptionsInfo(scss=True, category='table', type='value', value='normal'), table_font_color=OptionsInfo(scss=True, category='table', type='value', value='#333333'), table_font_color_light=OptionsInfo(scss=True, category='table', type='value', value='#FFFFFF'), table_border_top_include=OptionsInfo(scss=False, category='table', type='boolean', value=True), table_border_top_style=OptionsInfo(scss=True, category='table', type='value', value='solid'), table_border_top_width=OptionsInfo(scss=True, category='table', type='px', value='2px'), table_border_top_color=OptionsInfo(scss=True, category='table', type='value', value='#A8A8A8'), table_border_right_style=OptionsInfo(scss=True, category='table', type='value', value='none'), table_border_right_width=OptionsInfo(scss=True, category='table', type='px', value='2px'), table_border_right_color=OptionsInfo(scss=True, category='table', type='value', value='#D3D3D3'), table_border_bottom_include=OptionsInfo(scss=False, category='table', type='boolean', value=True), table_border_bottom_style=OptionsInfo(scss=True, category='table', type='value', value='solid'), table_border_bottom_width=OptionsInfo(scss=True, category='table', type='px', value='2px'), table_border_bottom_color=OptionsInfo(scss=True, category='table', type='value', value='#A8A8A8'), table_border_left_style=OptionsInfo(scss=True, category='table', type='value', value='none'), table_border_left_width=OptionsInfo(scss=True, category='table', type='px', value='2px'), table_border_left_color=OptionsInfo(scss=True, category='table', type='value', value='#D3D3D3'), heading_background_color=OptionsInfo(scss=True, category='heading', type='value', value=None), heading_align=OptionsInfo(scss=True, category='heading', type='value', value='center'), heading_title_font_size=OptionsInfo(scss=True, category='heading', type='px', value='125%'), heading_title_font_weight=OptionsInfo(scss=True, category='heading', type='value', value='initial'), heading_subtitle_font_size=OptionsInfo(scss=True, category='heading', type='px', value='85%'), heading_subtitle_font_weight=OptionsInfo(scss=True, category='heading', type='value', value='initial'), heading_padding=OptionsInfo(scss=True, category='heading', type='px', value='4px'), heading_padding_horizontal=OptionsInfo(scss=True, category='heading', type='px', value='5px'), heading_border_bottom_style=OptionsInfo(scss=True, category='heading', type='value', value='solid'), heading_border_bottom_width=OptionsInfo(scss=True, category='heading', type='px', value='2px'), heading_border_bottom_color=OptionsInfo(scss=True, category='heading', type='value', value='#D3D3D3'), heading_border_lr_style=OptionsInfo(scss=True, category='heading', type='value', value='none'), heading_border_lr_width=OptionsInfo(scss=True, category='heading', type='px', value='1px'), heading_border_lr_color=OptionsInfo(scss=True, category='heading', type='value', value='#D3D3D3'), column_labels_background_color=OptionsInfo(scss=True, category='column_labels', type='value', value=None), column_labels_font_size=OptionsInfo(scss=True, category='column_labels', type='px', value='100%'), column_labels_font_weight=OptionsInfo(scss=True, category='column_labels', type='value', value='normal'), column_labels_text_transform=OptionsInfo(scss=True, category='column_labels', type='value', value='inherit'), column_labels_padding=OptionsInfo(scss=True, category='column_labels', type='px', value='5px'), column_labels_padding_horizontal=OptionsInfo(scss=True, category='column_labels', type='px', value='5px'), column_labels_vlines_style=OptionsInfo(scss=True, category='table_body', type='value', value='none'), column_labels_vlines_width=OptionsInfo(scss=True, category='table_body', type='px', value='1px'), column_labels_vlines_color=OptionsInfo(scss=True, category='table_body', type='value', value='#D3D3D3'), column_labels_border_top_style=OptionsInfo(scss=True, category='column_labels', type='value', value='solid'), column_labels_border_top_width=OptionsInfo(scss=True, category='column_labels', type='px', value='2px'), column_labels_border_top_color=OptionsInfo(scss=True, category='column_labels', type='value', value='#D3D3D3'), column_labels_border_bottom_style=OptionsInfo(scss=True, category='column_labels', type='value', value='solid'), column_labels_border_bottom_width=OptionsInfo(scss=True, category='column_labels', type='px', value='2px'), column_labels_border_bottom_color=OptionsInfo(scss=True, category='column_labels', type='value', value='#D3D3D3'), column_labels_border_lr_style=OptionsInfo(scss=True, category='column_labels', type='value', value='none'), column_labels_border_lr_width=OptionsInfo(scss=True, category='column_labels', type='px', value='1px'), column_labels_border_lr_color=OptionsInfo(scss=True, category='column_labels', type='value', value='#D3D3D3'), column_labels_hidden=OptionsInfo(scss=False, category='column_labels', type='boolean', value=False), row_group_background_color=OptionsInfo(scss=True, category='row_group', type='value', value=None), row_group_font_size=OptionsInfo(scss=True, category='row_group', type='px', value='100%'), row_group_font_weight=OptionsInfo(scss=True, category='row_group', type='value', value='initial'), row_group_text_transform=OptionsInfo(scss=True, category='row_group', type='value', value='inherit'), row_group_padding=OptionsInfo(scss=True, category='row_group', type='px', value='8px'), row_group_padding_horizontal=OptionsInfo(scss=True, category='row_group', type='px', value='5px'), row_group_border_top_style=OptionsInfo(scss=True, category='row_group', type='value', value='solid'), row_group_border_top_width=OptionsInfo(scss=True, category='row_group', type='px', value='2px'), row_group_border_top_color=OptionsInfo(scss=True, category='row_group', type='value', value='#D3D3D3'), row_group_border_right_style=OptionsInfo(scss=True, category='row_group', type='value', value='none'), row_group_border_right_width=OptionsInfo(scss=True, category='row_group', type='px', value='1px'), row_group_border_right_color=OptionsInfo(scss=True, category='row_group', type='value', value='#D3D3D3'), row_group_border_bottom_style=OptionsInfo(scss=True, category='row_group', type='value', value='solid'), row_group_border_bottom_width=OptionsInfo(scss=True, category='row_group', type='px', value='2px'), row_group_border_bottom_color=OptionsInfo(scss=True, category='row_group', type='value', value='#D3D3D3'), row_group_border_left_style=OptionsInfo(scss=True, category='row_group', type='value', value='none'), row_group_border_left_width=OptionsInfo(scss=True, category='row_group', type='px', value='1px'), row_group_border_left_color=OptionsInfo(scss=True, category='row_group', type='value', value='#D3D3D3'), row_group_as_column=OptionsInfo(scss=False, category='row_group', type='boolean', value=False), table_body_hlines_style=OptionsInfo(scss=True, category='table_body', type='value', value='solid'), table_body_hlines_width=OptionsInfo(scss=True, category='table_body', type='px', value='1px'), table_body_hlines_color=OptionsInfo(scss=True, category='table_body', type='value', value='#D3D3D3'), table_body_vlines_style=OptionsInfo(scss=True, category='table_body', type='value', value='none'), table_body_vlines_width=OptionsInfo(scss=True, category='table_body', type='px', value='1px'), table_body_vlines_color=OptionsInfo(scss=True, category='table_body', type='value', value='#D3D3D3'), table_body_border_top_style=OptionsInfo(scss=True, category='table_body', type='value', value='solid'), table_body_border_top_width=OptionsInfo(scss=True, category='table_body', type='px', value='2px'), table_body_border_top_color=OptionsInfo(scss=True, category='table_body', type='value', value='#D3D3D3'), table_body_border_bottom_style=OptionsInfo(scss=True, category='table_body', type='value', value='solid'), table_body_border_bottom_width=OptionsInfo(scss=True, category='table_body', type='px', value='2px'), table_body_border_bottom_color=OptionsInfo(scss=True, category='table_body', type='value', value='#D3D3D3'), data_row_padding=OptionsInfo(scss=True, category='data_row', type='px', value='8px'), data_row_padding_horizontal=OptionsInfo(scss=True, category='data_row', type='px', value='5px'), stub_background_color=OptionsInfo(scss=True, category='stub', type='value', value=None), stub_font_size=OptionsInfo(scss=True, category='stub', type='px', value='100%'), stub_font_weight=OptionsInfo(scss=True, category='stub', type='value', value='initial'), stub_text_transform=OptionsInfo(scss=True, category='stub', type='value', value='inherit'), stub_border_style=OptionsInfo(scss=True, category='stub', type='value', value='solid'), stub_border_width=OptionsInfo(scss=True, category='stub', type='px', value='2px'), stub_border_color=OptionsInfo(scss=True, category='stub', type='value', value='#D3D3D3'), stub_indent_length=OptionsInfo(scss=True, category='stub', type='px', value='5px'), stub_row_group_background_color=OptionsInfo(scss=True, category='stub', type='value', value=None), stub_row_group_font_size=OptionsInfo(scss=True, category='stub', type='px', value='100%'), stub_row_group_font_weight=OptionsInfo(scss=True, category='stub', type='value', value='initial'), stub_row_group_text_transform=OptionsInfo(scss=True, category='stub', type='value', value='inherit'), stub_row_group_border_style=OptionsInfo(scss=True, category='stub', type='value', value='solid'), stub_row_group_border_width=OptionsInfo(scss=True, category='stub', type='px', value='2px'), stub_row_group_border_color=OptionsInfo(scss=True, category='stub', type='value', value='#D3D3D3'), summary_row_padding=OptionsInfo(scss=True, category='summary_row', type='px', value='8px'), summary_row_padding_horizontal=OptionsInfo(scss=True, category='summary_row', type='px', value='5px'), summary_row_background_color=OptionsInfo(scss=True, category='summary_row', type='value', value=None), summary_row_text_transform=OptionsInfo(scss=True, category='summary_row', type='value', value='inherit'), summary_row_border_style=OptionsInfo(scss=True, category='summary_row', type='value', value='solid'), summary_row_border_width=OptionsInfo(scss=True, category='summary_row', type='px', value='2px'), summary_row_border_color=OptionsInfo(scss=True, category='summary_row', type='value', value='#D3D3D3'), grand_summary_row_padding=OptionsInfo(scss=True, category='grand_summary_row', type='px', value='8px'), grand_summary_row_padding_horizontal=OptionsInfo(scss=True, category='grand_summary_row', type='px', value='5px'), grand_summary_row_background_color=OptionsInfo(scss=True, category='grand_summary_row', type='value', value=None), grand_summary_row_text_transform=OptionsInfo(scss=True, category='grand_summary_row', type='value', value='inherit'), grand_summary_row_border_style=OptionsInfo(scss=True, category='grand_summary_row', type='value', value='double'), grand_summary_row_border_width=OptionsInfo(scss=True, category='grand_summary_row', type='px', value='6px'), grand_summary_row_border_color=OptionsInfo(scss=True, category='grand_summary_row', type='value', value='#D3D3D3'), footnotes_marks=OptionsInfo(scss=False, category='footnotes', type='values', value='numbers'), footnotes_spec_ref=OptionsInfo(scss=False, category='footnotes', type='value', value='^i'), footnotes_spec_ftr=OptionsInfo(scss=False, category='footnotes', type='value', value='^i'), footnotes_order=OptionsInfo(scss=False, category='footnotes', type='value', value='marks_last'), source_notes_padding=OptionsInfo(scss=True, category='source_notes', type='px', value='4px'), source_notes_padding_horizontal=OptionsInfo(scss=True, category='source_notes', type='px', value='5px'), source_notes_background_color=OptionsInfo(scss=True, category='source_notes', type='value', value=None), source_notes_font_size=OptionsInfo(scss=True, category='source_notes', type='px', value='90%'), source_notes_border_bottom_style=OptionsInfo(scss=True, category='source_notes', type='value', value='none'), source_notes_border_bottom_width=OptionsInfo(scss=True, category='source_notes', type='px', value='2px'), source_notes_border_bottom_color=OptionsInfo(scss=True, category='source_notes', type='value', value='#D3D3D3'), source_notes_border_lr_style=OptionsInfo(scss=True, category='source_notes', type='value', value='none'), source_notes_border_lr_width=OptionsInfo(scss=True, category='source_notes', type='px', value='2px'), source_notes_border_lr_color=OptionsInfo(scss=True, category='source_notes', type='value', value='#D3D3D3'), source_notes_multiline=OptionsInfo(scss=False, category='source_notes', type='boolean', value=True), source_notes_sep=OptionsInfo(scss=False, category='source_notes', type='value', value=' '), row_striping_background_color=OptionsInfo(scss=True, category='row', type='value', value='#F4F4F4'), row_striping_include_stub=OptionsInfo(scss=False, category='row', type='boolean', value=False), row_striping_include_table_body=OptionsInfo(scss=False, category='row', type='boolean', value=False), container_width=OptionsInfo(scss=False, category='container', type='px', value='auto'), container_height=OptionsInfo(scss=False, category='container', type='px', value='auto'), container_padding_x=OptionsInfo(scss=False, category='container', type='px', value='0px'), container_padding_y=OptionsInfo(scss=False, category='container', type='px', value='10px'), container_overflow_x=OptionsInfo(scss=False, category='container', type='overflow', value='auto'), container_overflow_y=OptionsInfo(scss=False, category='container', type='overflow', value='auto'), quarto_disable_processing=OptionsInfo(scss=False, category='quarto', type='logical', value=False), quarto_use_bootstrap=OptionsInfo(scss=False, category='quarto', type='logical', value=False), ihtml_active=OptionsInfo(scss=False, category='ihtml', type='boolean', value=False), ihtml_use_pagination=OptionsInfo(scss=False, category='ihtml', type='boolean', value=True), ihtml_use_pagination_info=OptionsInfo(scss=False, category='ihtml', type='boolean', value=True), ihtml_use_sorting=OptionsInfo(scss=False, category='ihtml', type='boolean', value=True), ihtml_use_search=OptionsInfo(scss=False, category='ihtml', type='boolean', value=False), ihtml_use_filters=OptionsInfo(scss=False, category='ihtml', type='boolean', value=False), ihtml_use_resizers=OptionsInfo(scss=False, category='ihtml', type='boolean', value=False), ihtml_use_highlight=OptionsInfo(scss=False, category='ihtml', type='boolean', value=False), ihtml_use_compact_mode=OptionsInfo(scss=False, category='ihtml', type='boolean', value=False), ihtml_use_text_wrapping=OptionsInfo(scss=False, category='ihtml', type='boolean', value=True), ihtml_use_page_size_select=OptionsInfo(scss=False, category='ihtml', type='boolean', value=False), ihtml_page_size_default=OptionsInfo(scss=False, category='ihtml', type='value', value=10), ihtml_page_size_values=OptionsInfo(scss=False, category='ihtml', type='values', value=[10, 25, 50, 100]), ihtml_pagination_type=OptionsInfo(scss=False, category='ihtml', type='value', value='numbers'), ihtml_height=OptionsInfo(scss=False, category='ihtml', type='value', value='auto'), ihtml_selection_mode=OptionsInfo(scss=False, category='ihtml', type='value', value=None)), _google_font_imports=GoogleFontImports(imports=frozenset()), _has_built=False)</w:t>
       </w:r>
     </w:p>
     <w:bookmarkEnd w:id="16"/>
@@ -1669,7 +1669,7 @@
         <w:rPr>
           <w:rStyle w:val="VerbatimChar"/>
         </w:rPr>
-        <w:t xml:space="preserve">6        C#5  0.70  0.10  0.05  0.00  0.10  0.05  0.00, _body=&lt;great_tables._gt_data.Body object at 0xf94bce95b4d0&gt;, _boxhead=Boxhead([ColInfo(var='Estado (t)', type=&lt;ColInfoTypeEnum.default: 1&gt;, column_label='Estado (t)', column_align='left', column_width=None, stub_level=None), ColInfo(var='D4', type=&lt;ColInfoTypeEnum.default: 1&gt;, column_label='D4', column_align='right', column_width=None, stub_level=None), ColInfo(var='E4', type=&lt;ColInfoTypeEnum.default: 1&gt;, column_label='E4', column_align='right', column_width=None, stub_level=None), ColInfo(var='F#4', type=&lt;ColInfoTypeEnum.default: 1&gt;, column_label='F#4', column_align='right', column_width=None, stub_level=None), ColInfo(var='G4', type=&lt;ColInfoTypeEnum.default: 1&gt;, column_label='G4', column_align='right', column_width=None, stub_level=None), ColInfo(var='A4', type=&lt;ColInfoTypeEnum.default: 1&gt;, column_label='A4', column_align='right', column_width=None, stub_level=None), ColInfo(var='B4', type=&lt;ColInfoTypeEnum.default: 1&gt;, column_label='B4', column_align='right', column_width=None, stub_level=None), ColInfo(var='C#5', type=&lt;ColInfoTypeEnum.default: 1&gt;, column_label='C#5', column_align='right', column_width=None, stub_level=None)]), _stub=&lt;great_tables._gt_data.Stub object at 0xf94bce99e850&gt;, _spanners=Spanners([]), _heading=Heading(title='Matriz de Probabilidades de Transición P', subtitle=None, preheader=None), _stubhead=None, _summary_rows=&lt;great_tables._gt_data.SummaryRows object at 0xf94bce9323f0&gt;, _summary_rows_grand=&lt;great_tables._gt_data.SummaryRows object at 0xf94bce9e2f90&gt;, _source_notes=[], _footnotes=[], _styles=[], _locale=&lt;great_tables._gt_data.Locale object at 0xf94bce99ed50&gt;, _formats=[&lt;great_tables._gt_data.FormatInfo object at 0xf94bce500c20&gt;], _substitutions=[], _col_merge=[], _transforms=[], _options=Options(table_id=OptionsInfo(scss=False, category='table', type='value', value=None), table_caption=OptionsInfo(scss=False, category='table', type='value', value=None), table_width=OptionsInfo(scss=True, category='table', type='px', value='auto'), table_layout=OptionsInfo(scss=True, category='table', type='value', value='fixed'), table_margin_left=OptionsInfo(scss=True, category='table', type='px', value='auto'), table_margin_right=OptionsInfo(scss=True, category='table', type='px', value='auto'), table_background_color=OptionsInfo(scss=True, category='table', type='value', value='#FFFFFF'), table_additional_css=OptionsInfo(scss=False, category='table', type='values', value=[]), table_font_names=OptionsInfo(scss=False, category='table', type='values', value=['-apple-system', 'BlinkMacSystemFont', 'Segoe UI', 'Roboto', 'Oxygen', 'Ubuntu', 'Cantarell', 'Helvetica Neue', 'Fira Sans', 'Droid Sans', 'Arial', 'sans-serif']), table_font_size=OptionsInfo(scss=True, category='table', type='px', value='16px'), table_font_weight=OptionsInfo(scss=True, category='table', type='value', value='normal'), table_font_style=OptionsInfo(scss=True, category='table', type='value', value='normal'), table_font_color=OptionsInfo(scss=True, category='table', type='value', value='#333333'), table_font_color_light=OptionsInfo(scss=True, category='table', type='value', value='#FFFFFF'), table_border_top_include=OptionsInfo(scss=False, category='table', type='boolean', value=True), table_border_top_style=OptionsInfo(scss=True, category='table', type='value', value='solid'), table_border_top_width=OptionsInfo(scss=True, category='table', type='px', value='2px'), table_border_top_color=OptionsInfo(scss=True, category='table', type='value', value='#A8A8A8'), table_border_right_style=OptionsInfo(scss=True, category='table', type='value', value='none'), table_border_right_width=OptionsInfo(scss=True, category='table', type='px', value='2px'), table_border_right_color=OptionsInfo(scss=True, category='table', type='value', value='#D3D3D3'), table_border_bottom_include=OptionsInfo(scss=False, category='table', type='boolean', value=True), table_border_bottom_style=OptionsInfo(scss=True, category='table', type='value', value='solid'), table_border_bottom_width=OptionsInfo(scss=True, category='table', type='px', value='2px'), table_border_bottom_color=OptionsInfo(scss=True, category='table', type='value', value='#A8A8A8'), table_border_left_style=OptionsInfo(scss=True, category='table', type='value', value='none'), table_border_left_width=OptionsInfo(scss=True, category='table', type='px', value='2px'), table_border_left_color=OptionsInfo(scss=True, category='table', type='value', value='#D3D3D3'), heading_background_color=OptionsInfo(scss=True, category='heading', type='value', value=None), heading_align=OptionsInfo(scss=True, category='heading', type='value', value='center'), heading_title_font_size=OptionsInfo(scss=True, category='heading', type='px', value='125%'), heading_title_font_weight=OptionsInfo(scss=True, category='heading', type='value', value='initial'), heading_subtitle_font_size=OptionsInfo(scss=True, category='heading', type='px', value='85%'), heading_subtitle_font_weight=OptionsInfo(scss=True, category='heading', type='value', value='initial'), heading_padding=OptionsInfo(scss=True, category='heading', type='px', value='4px'), heading_padding_horizontal=OptionsInfo(scss=True, category='heading', type='px', value='5px'), heading_border_bottom_style=OptionsInfo(scss=True, category='heading', type='value', value='solid'), heading_border_bottom_width=OptionsInfo(scss=True, category='heading', type='px', value='2px'), heading_border_bottom_color=OptionsInfo(scss=True, category='heading', type='value', value='#D3D3D3'), heading_border_lr_style=OptionsInfo(scss=True, category='heading', type='value', value='none'), heading_border_lr_width=OptionsInfo(scss=True, category='heading', type='px', value='1px'), heading_border_lr_color=OptionsInfo(scss=True, category='heading', type='value', value='#D3D3D3'), column_labels_background_color=OptionsInfo(scss=True, category='column_labels', type='value', value=None), column_labels_font_size=OptionsInfo(scss=True, category='column_labels', type='px', value='100%'), column_labels_font_weight=OptionsInfo(scss=True, category='column_labels', type='value', value='normal'), column_labels_text_transform=OptionsInfo(scss=True, category='column_labels', type='value', value='inherit'), column_labels_padding=OptionsInfo(scss=True, category='column_labels', type='px', value='5px'), column_labels_padding_horizontal=OptionsInfo(scss=True, category='column_labels', type='px', value='5px'), column_labels_vlines_style=OptionsInfo(scss=True, category='table_body', type='value', value='none'), column_labels_vlines_width=OptionsInfo(scss=True, category='table_body', type='px', value='1px'), column_labels_vlines_color=OptionsInfo(scss=True, category='table_body', type='value', value='#D3D3D3'), column_labels_border_top_style=OptionsInfo(scss=True, category='column_labels', type='value', value='solid'), column_labels_border_top_width=OptionsInfo(scss=True, category='column_labels', type='px', value='2px'), column_labels_border_top_color=OptionsInfo(scss=True, category='column_labels', type='value', value='#D3D3D3'), column_labels_border_bottom_style=OptionsInfo(scss=True, category='column_labels', type='value', value='solid'), column_labels_border_bottom_width=OptionsInfo(scss=True, category='column_labels', type='px', value='2px'), column_labels_border_bottom_color=OptionsInfo(scss=True, category='column_labels', type='value', value='#D3D3D3'), column_labels_border_lr_style=OptionsInfo(scss=True, category='column_labels', type='value', value='none'), column_labels_border_lr_width=OptionsInfo(scss=True, category='column_labels', type='px', value='1px'), column_labels_border_lr_color=OptionsInfo(scss=True, category='column_labels', type='value', value='#D3D3D3'), column_labels_hidden=OptionsInfo(scss=False, category='column_labels', type='boolean', value=False), row_group_background_color=OptionsInfo(scss=True, category='row_group', type='value', value=None), row_group_font_size=OptionsInfo(scss=True, category='row_group', type='px', value='100%'), row_group_font_weight=OptionsInfo(scss=True, category='row_group', type='value', value='initial'), row_group_text_transform=OptionsInfo(scss=True, category='row_group', type='value', value='inherit'), row_group_padding=OptionsInfo(scss=True, category='row_group', type='px', value='8px'), row_group_padding_horizontal=OptionsInfo(scss=True, category='row_group', type='px', value='5px'), row_group_border_top_style=OptionsInfo(scss=True, category='row_group', type='value', value='solid'), row_group_border_top_width=OptionsInfo(scss=True, category='row_group', type='px', value='2px'), row_group_border_top_color=OptionsInfo(scss=True, category='row_group', type='value', value='#D3D3D3'), row_group_border_right_style=OptionsInfo(scss=True, category='row_group', type='value', value='none'), row_group_border_right_width=OptionsInfo(scss=True, category='row_group', type='px', value='1px'), row_group_border_right_color=OptionsInfo(scss=True, category='row_group', type='value', value='#D3D3D3'), row_group_border_bottom_style=OptionsInfo(scss=True, category='row_group', type='value', value='solid'), row_group_border_bottom_width=OptionsInfo(scss=True, category='row_group', type='px', value='2px'), row_group_border_bottom_color=OptionsInfo(scss=True, category='row_group', type='value', value='#D3D3D3'), row_group_border_left_style=OptionsInfo(scss=True, category='row_group', type='value', value='none'), row_group_border_left_width=OptionsInfo(scss=True, category='row_group', type='px', value='1px'), row_group_border_left_color=OptionsInfo(scss=True, category='row_group', type='value', value='#D3D3D3'), row_group_as_column=OptionsInfo(scss=False, category='row_group', type='boolean', value=False), table_body_hlines_style=OptionsInfo(scss=True, category='table_body', type='value', value='solid'), table_body_hlines_width=OptionsInfo(scss=True, category='table_body', type='px', value='1px'), table_body_hlines_color=OptionsInfo(scss=True, category='table_body', type='value', value='#D3D3D3'), table_body_vlines_style=OptionsInfo(scss=True, category='table_body', type='value', value='none'), table_body_vlines_width=OptionsInfo(scss=True, category='table_body', type='px', value='1px'), table_body_vlines_color=OptionsInfo(scss=True, category='table_body', type='value', value='#D3D3D3'), table_body_border_top_style=OptionsInfo(scss=True, category='table_body', type='value', value='solid'), table_body_border_top_width=OptionsInfo(scss=True, category='table_body', type='px', value='2px'), table_body_border_top_color=OptionsInfo(scss=True, category='table_body', type='value', value='#D3D3D3'), table_body_border_bottom_style=OptionsInfo(scss=True, category='table_body', type='value', value='solid'), table_body_border_bottom_width=OptionsInfo(scss=True, category='table_body', type='px', value='2px'), table_body_border_bottom_color=OptionsInfo(scss=True, category='table_body', type='value', value='#D3D3D3'), data_row_padding=OptionsInfo(scss=True, category='data_row', type='px', value='8px'), data_row_padding_horizontal=OptionsInfo(scss=True, category='data_row', type='px', value='5px'), stub_background_color=OptionsInfo(scss=True, category='stub', type='value', value=None), stub_font_size=OptionsInfo(scss=True, category='stub', type='px', value='100%'), stub_font_weight=OptionsInfo(scss=True, category='stub', type='value', value='initial'), stub_text_transform=OptionsInfo(scss=True, category='stub', type='value', value='inherit'), stub_border_style=OptionsInfo(scss=True, category='stub', type='value', value='solid'), stub_border_width=OptionsInfo(scss=True, category='stub', type='px', value='2px'), stub_border_color=OptionsInfo(scss=True, category='stub', type='value', value='#D3D3D3'), stub_indent_length=OptionsInfo(scss=True, category='stub', type='px', value='5px'), stub_row_group_background_color=OptionsInfo(scss=True, category='stub', type='value', value=None), stub_row_group_font_size=OptionsInfo(scss=True, category='stub', type='px', value='100%'), stub_row_group_font_weight=OptionsInfo(scss=True, category='stub', type='value', value='initial'), stub_row_group_text_transform=OptionsInfo(scss=True, category='stub', type='value', value='inherit'), stub_row_group_border_style=OptionsInfo(scss=True, category='stub', type='value', value='solid'), stub_row_group_border_width=OptionsInfo(scss=True, category='stub', type='px', value='2px'), stub_row_group_border_color=OptionsInfo(scss=True, category='stub', type='value', value='#D3D3D3'), summary_row_padding=OptionsInfo(scss=True, category='summary_row', type='px', value='8px'), summary_row_padding_horizontal=OptionsInfo(scss=True, category='summary_row', type='px', value='5px'), summary_row_background_color=OptionsInfo(scss=True, category='summary_row', type='value', value=None), summary_row_text_transform=OptionsInfo(scss=True, category='summary_row', type='value', value='inherit'), summary_row_border_style=OptionsInfo(scss=True, category='summary_row', type='value', value='solid'), summary_row_border_width=OptionsInfo(scss=True, category='summary_row', type='px', value='2px'), summary_row_border_color=OptionsInfo(scss=True, category='summary_row', type='value', value='#D3D3D3'), grand_summary_row_padding=OptionsInfo(scss=True, category='grand_summary_row', type='px', value='8px'), grand_summary_row_padding_horizontal=OptionsInfo(scss=True, category='grand_summary_row', type='px', value='5px'), grand_summary_row_background_color=OptionsInfo(scss=True, category='grand_summary_row', type='value', value=None), grand_summary_row_text_transform=OptionsInfo(scss=True, category='grand_summary_row', type='value', value='inherit'), grand_summary_row_border_style=OptionsInfo(scss=True, category='grand_summary_row', type='value', value='double'), grand_summary_row_border_width=OptionsInfo(scss=True, category='grand_summary_row', type='px', value='6px'), grand_summary_row_border_color=OptionsInfo(scss=True, category='grand_summary_row', type='value', value='#D3D3D3'), footnotes_marks=OptionsInfo(scss=False, category='footnotes', type='values', value='numbers'), footnotes_spec_ref=OptionsInfo(scss=False, category='footnotes', type='value', value='^i'), footnotes_spec_ftr=OptionsInfo(scss=False, category='footnotes', type='value', value='^i'), footnotes_order=OptionsInfo(scss=False, category='footnotes', type='value', value='marks_last'), source_notes_padding=OptionsInfo(scss=True, category='source_notes', type='px', value='4px'), source_notes_padding_horizontal=OptionsInfo(scss=True, category='source_notes', type='px', value='5px'), source_notes_background_color=OptionsInfo(scss=True, category='source_notes', type='value', value=None), source_notes_font_size=OptionsInfo(scss=True, category='source_notes', type='px', value='90%'), source_notes_border_bottom_style=OptionsInfo(scss=True, category='source_notes', type='value', value='none'), source_notes_border_bottom_width=OptionsInfo(scss=True, category='source_notes', type='px', value='2px'), source_notes_border_bottom_color=OptionsInfo(scss=True, category='source_notes', type='value', value='#D3D3D3'), source_notes_border_lr_style=OptionsInfo(scss=True, category='source_notes', type='value', value='none'), source_notes_border_lr_width=OptionsInfo(scss=True, category='source_notes', type='px', value='2px'), source_notes_border_lr_color=OptionsInfo(scss=True, category='source_notes', type='value', value='#D3D3D3'), source_notes_multiline=OptionsInfo(scss=False, category='source_notes', type='boolean', value=True), source_notes_sep=OptionsInfo(scss=False, category='source_notes', type='value', value=' '), row_striping_background_color=OptionsInfo(scss=True, category='row', type='value', value='#F4F4F4'), row_striping_include_stub=OptionsInfo(scss=False, category='row', type='boolean', value=False), row_striping_include_table_body=OptionsInfo(scss=False, category='row', type='boolean', value=False), container_width=OptionsInfo(scss=False, category='container', type='px', value='auto'), container_height=OptionsInfo(scss=False, category='container', type='px', value='auto'), container_padding_x=OptionsInfo(scss=False, category='container', type='px', value='0px'), container_padding_y=OptionsInfo(scss=False, category='container', type='px', value='10px'), container_overflow_x=OptionsInfo(scss=False, category='container', type='overflow', value='auto'), container_overflow_y=OptionsInfo(scss=False, category='container', type='overflow', value='auto'), quarto_disable_processing=OptionsInfo(scss=False, category='quarto', type='logical', value=False), quarto_use_bootstrap=OptionsInfo(scss=False, category='quarto', type='logical', value=False), ihtml_active=OptionsInfo(scss=False, category='ihtml', type='boolean', value=False), ihtml_use_pagination=OptionsInfo(scss=False, category='ihtml', type='boolean', value=True), ihtml_use_pagination_info=OptionsInfo(scss=False, category='ihtml', type='boolean', value=True), ihtml_use_sorting=OptionsInfo(scss=False, category='ihtml', type='boolean', value=True), ihtml_use_search=OptionsInfo(scss=False, category='ihtml', type='boolean', value=False), ihtml_use_filters=OptionsInfo(scss=False, category='ihtml', type='boolean', value=False), ihtml_use_resizers=OptionsInfo(scss=False, category='ihtml', type='boolean', value=False), ihtml_use_highlight=OptionsInfo(scss=False, category='ihtml', type='boolean', value=False), ihtml_use_compact_mode=OptionsInfo(scss=False, category='ihtml', type='boolean', value=False), ihtml_use_text_wrapping=OptionsInfo(scss=False, category='ihtml', type='boolean', value=True), ihtml_use_page_size_select=OptionsInfo(scss=False, category='ihtml', type='boolean', value=False), ihtml_page_size_default=OptionsInfo(scss=False, category='ihtml', type='value', value=10), ihtml_page_size_values=OptionsInfo(scss=False, category='ihtml', type='values', value=[10, 25, 50, 100]), ihtml_pagination_type=OptionsInfo(scss=False, category='ihtml', type='value', value='numbers'), ihtml_height=OptionsInfo(scss=False, category='ihtml', type='value', value='auto'), ihtml_selection_mode=OptionsInfo(scss=False, category='ihtml', type='value', value=None)), _google_font_imports=GoogleFontImports(imports=frozenset()), _has_built=False)</w:t>
+        <w:t xml:space="preserve">6        C#5  0.70  0.10  0.05  0.00  0.10  0.05  0.00, _body=&lt;great_tables._gt_data.Body object at 0xfe52a294f4d0&gt;, _boxhead=Boxhead([ColInfo(var='Estado (t)', type=&lt;ColInfoTypeEnum.default: 1&gt;, column_label='Estado (t)', column_align='left', column_width=None, stub_level=None), ColInfo(var='D4', type=&lt;ColInfoTypeEnum.default: 1&gt;, column_label='D4', column_align='right', column_width=None, stub_level=None), ColInfo(var='E4', type=&lt;ColInfoTypeEnum.default: 1&gt;, column_label='E4', column_align='right', column_width=None, stub_level=None), ColInfo(var='F#4', type=&lt;ColInfoTypeEnum.default: 1&gt;, column_label='F#4', column_align='right', column_width=None, stub_level=None), ColInfo(var='G4', type=&lt;ColInfoTypeEnum.default: 1&gt;, column_label='G4', column_align='right', column_width=None, stub_level=None), ColInfo(var='A4', type=&lt;ColInfoTypeEnum.default: 1&gt;, column_label='A4', column_align='right', column_width=None, stub_level=None), ColInfo(var='B4', type=&lt;ColInfoTypeEnum.default: 1&gt;, column_label='B4', column_align='right', column_width=None, stub_level=None), ColInfo(var='C#5', type=&lt;ColInfoTypeEnum.default: 1&gt;, column_label='C#5', column_align='right', column_width=None, stub_level=None)]), _stub=&lt;great_tables._gt_data.Stub object at 0xfe52a2996850&gt;, _spanners=Spanners([]), _heading=Heading(title='Matriz de Probabilidades de Transición P', subtitle=None, preheader=None), _stubhead=None, _summary_rows=&lt;great_tables._gt_data.SummaryRows object at 0xfe52a29263f0&gt;, _summary_rows_grand=&lt;great_tables._gt_data.SummaryRows object at 0xfe52a29d6f90&gt;, _source_notes=[], _footnotes=[], _styles=[], _locale=&lt;great_tables._gt_data.Locale object at 0xfe52a2996d50&gt;, _formats=[&lt;great_tables._gt_data.FormatInfo object at 0xfe52a29dcc20&gt;], _substitutions=[], _col_merge=[], _transforms=[], _options=Options(table_id=OptionsInfo(scss=False, category='table', type='value', value=None), table_caption=OptionsInfo(scss=False, category='table', type='value', value=None), table_width=OptionsInfo(scss=True, category='table', type='px', value='auto'), table_layout=OptionsInfo(scss=True, category='table', type='value', value='fixed'), table_margin_left=OptionsInfo(scss=True, category='table', type='px', value='auto'), table_margin_right=OptionsInfo(scss=True, category='table', type='px', value='auto'), table_background_color=OptionsInfo(scss=True, category='table', type='value', value='#FFFFFF'), table_additional_css=OptionsInfo(scss=False, category='table', type='values', value=[]), table_font_names=OptionsInfo(scss=False, category='table', type='values', value=['-apple-system', 'BlinkMacSystemFont', 'Segoe UI', 'Roboto', 'Oxygen', 'Ubuntu', 'Cantarell', 'Helvetica Neue', 'Fira Sans', 'Droid Sans', 'Arial', 'sans-serif']), table_font_size=OptionsInfo(scss=True, category='table', type='px', value='16px'), table_font_weight=OptionsInfo(scss=True, category='table', type='value', value='normal'), table_font_style=OptionsInfo(scss=True, category='table', type='value', value='normal'), table_font_color=OptionsInfo(scss=True, category='table', type='value', value='#333333'), table_font_color_light=OptionsInfo(scss=True, category='table', type='value', value='#FFFFFF'), table_border_top_include=OptionsInfo(scss=False, category='table', type='boolean', value=True), table_border_top_style=OptionsInfo(scss=True, category='table', type='value', value='solid'), table_border_top_width=OptionsInfo(scss=True, category='table', type='px', value='2px'), table_border_top_color=OptionsInfo(scss=True, category='table', type='value', value='#A8A8A8'), table_border_right_style=OptionsInfo(scss=True, category='table', type='value', value='none'), table_border_right_width=OptionsInfo(scss=True, category='table', type='px', value='2px'), table_border_right_color=OptionsInfo(scss=True, category='table', type='value', value='#D3D3D3'), table_border_bottom_include=OptionsInfo(scss=False, category='table', type='boolean', value=True), table_border_bottom_style=OptionsInfo(scss=True, category='table', type='value', value='solid'), table_border_bottom_width=OptionsInfo(scss=True, category='table', type='px', value='2px'), table_border_bottom_color=OptionsInfo(scss=True, category='table', type='value', value='#A8A8A8'), table_border_left_style=OptionsInfo(scss=True, category='table', type='value', value='none'), table_border_left_width=OptionsInfo(scss=True, category='table', type='px', value='2px'), table_border_left_color=OptionsInfo(scss=True, category='table', type='value', value='#D3D3D3'), heading_background_color=OptionsInfo(scss=True, category='heading', type='value', value=None), heading_align=OptionsInfo(scss=True, category='heading', type='value', value='center'), heading_title_font_size=OptionsInfo(scss=True, category='heading', type='px', value='125%'), heading_title_font_weight=OptionsInfo(scss=True, category='heading', type='value', value='initial'), heading_subtitle_font_size=OptionsInfo(scss=True, category='heading', type='px', value='85%'), heading_subtitle_font_weight=OptionsInfo(scss=True, category='heading', type='value', value='initial'), heading_padding=OptionsInfo(scss=True, category='heading', type='px', value='4px'), heading_padding_horizontal=OptionsInfo(scss=True, category='heading', type='px', value='5px'), heading_border_bottom_style=OptionsInfo(scss=True, category='heading', type='value', value='solid'), heading_border_bottom_width=OptionsInfo(scss=True, category='heading', type='px', value='2px'), heading_border_bottom_color=OptionsInfo(scss=True, category='heading', type='value', value='#D3D3D3'), heading_border_lr_style=OptionsInfo(scss=True, category='heading', type='value', value='none'), heading_border_lr_width=OptionsInfo(scss=True, category='heading', type='px', value='1px'), heading_border_lr_color=OptionsInfo(scss=True, category='heading', type='value', value='#D3D3D3'), column_labels_background_color=OptionsInfo(scss=True, category='column_labels', type='value', value=None), column_labels_font_size=OptionsInfo(scss=True, category='column_labels', type='px', value='100%'), column_labels_font_weight=OptionsInfo(scss=True, category='column_labels', type='value', value='normal'), column_labels_text_transform=OptionsInfo(scss=True, category='column_labels', type='value', value='inherit'), column_labels_padding=OptionsInfo(scss=True, category='column_labels', type='px', value='5px'), column_labels_padding_horizontal=OptionsInfo(scss=True, category='column_labels', type='px', value='5px'), column_labels_vlines_style=OptionsInfo(scss=True, category='table_body', type='value', value='none'), column_labels_vlines_width=OptionsInfo(scss=True, category='table_body', type='px', value='1px'), column_labels_vlines_color=OptionsInfo(scss=True, category='table_body', type='value', value='#D3D3D3'), column_labels_border_top_style=OptionsInfo(scss=True, category='column_labels', type='value', value='solid'), column_labels_border_top_width=OptionsInfo(scss=True, category='column_labels', type='px', value='2px'), column_labels_border_top_color=OptionsInfo(scss=True, category='column_labels', type='value', value='#D3D3D3'), column_labels_border_bottom_style=OptionsInfo(scss=True, category='column_labels', type='value', value='solid'), column_labels_border_bottom_width=OptionsInfo(scss=True, category='column_labels', type='px', value='2px'), column_labels_border_bottom_color=OptionsInfo(scss=True, category='column_labels', type='value', value='#D3D3D3'), column_labels_border_lr_style=OptionsInfo(scss=True, category='column_labels', type='value', value='none'), column_labels_border_lr_width=OptionsInfo(scss=True, category='column_labels', type='px', value='1px'), column_labels_border_lr_color=OptionsInfo(scss=True, category='column_labels', type='value', value='#D3D3D3'), column_labels_hidden=OptionsInfo(scss=False, category='column_labels', type='boolean', value=False), row_group_background_color=OptionsInfo(scss=True, category='row_group', type='value', value=None), row_group_font_size=OptionsInfo(scss=True, category='row_group', type='px', value='100%'), row_group_font_weight=OptionsInfo(scss=True, category='row_group', type='value', value='initial'), row_group_text_transform=OptionsInfo(scss=True, category='row_group', type='value', value='inherit'), row_group_padding=OptionsInfo(scss=True, category='row_group', type='px', value='8px'), row_group_padding_horizontal=OptionsInfo(scss=True, category='row_group', type='px', value='5px'), row_group_border_top_style=OptionsInfo(scss=True, category='row_group', type='value', value='solid'), row_group_border_top_width=OptionsInfo(scss=True, category='row_group', type='px', value='2px'), row_group_border_top_color=OptionsInfo(scss=True, category='row_group', type='value', value='#D3D3D3'), row_group_border_right_style=OptionsInfo(scss=True, category='row_group', type='value', value='none'), row_group_border_right_width=OptionsInfo(scss=True, category='row_group', type='px', value='1px'), row_group_border_right_color=OptionsInfo(scss=True, category='row_group', type='value', value='#D3D3D3'), row_group_border_bottom_style=OptionsInfo(scss=True, category='row_group', type='value', value='solid'), row_group_border_bottom_width=OptionsInfo(scss=True, category='row_group', type='px', value='2px'), row_group_border_bottom_color=OptionsInfo(scss=True, category='row_group', type='value', value='#D3D3D3'), row_group_border_left_style=OptionsInfo(scss=True, category='row_group', type='value', value='none'), row_group_border_left_width=OptionsInfo(scss=True, category='row_group', type='px', value='1px'), row_group_border_left_color=OptionsInfo(scss=True, category='row_group', type='value', value='#D3D3D3'), row_group_as_column=OptionsInfo(scss=False, category='row_group', type='boolean', value=False), table_body_hlines_style=OptionsInfo(scss=True, category='table_body', type='value', value='solid'), table_body_hlines_width=OptionsInfo(scss=True, category='table_body', type='px', value='1px'), table_body_hlines_color=OptionsInfo(scss=True, category='table_body', type='value', value='#D3D3D3'), table_body_vlines_style=OptionsInfo(scss=True, category='table_body', type='value', value='none'), table_body_vlines_width=OptionsInfo(scss=True, category='table_body', type='px', value='1px'), table_body_vlines_color=OptionsInfo(scss=True, category='table_body', type='value', value='#D3D3D3'), table_body_border_top_style=OptionsInfo(scss=True, category='table_body', type='value', value='solid'), table_body_border_top_width=OptionsInfo(scss=True, category='table_body', type='px', value='2px'), table_body_border_top_color=OptionsInfo(scss=True, category='table_body', type='value', value='#D3D3D3'), table_body_border_bottom_style=OptionsInfo(scss=True, category='table_body', type='value', value='solid'), table_body_border_bottom_width=OptionsInfo(scss=True, category='table_body', type='px', value='2px'), table_body_border_bottom_color=OptionsInfo(scss=True, category='table_body', type='value', value='#D3D3D3'), data_row_padding=OptionsInfo(scss=True, category='data_row', type='px', value='8px'), data_row_padding_horizontal=OptionsInfo(scss=True, category='data_row', type='px', value='5px'), stub_background_color=OptionsInfo(scss=True, category='stub', type='value', value=None), stub_font_size=OptionsInfo(scss=True, category='stub', type='px', value='100%'), stub_font_weight=OptionsInfo(scss=True, category='stub', type='value', value='initial'), stub_text_transform=OptionsInfo(scss=True, category='stub', type='value', value='inherit'), stub_border_style=OptionsInfo(scss=True, category='stub', type='value', value='solid'), stub_border_width=OptionsInfo(scss=True, category='stub', type='px', value='2px'), stub_border_color=OptionsInfo(scss=True, category='stub', type='value', value='#D3D3D3'), stub_indent_length=OptionsInfo(scss=True, category='stub', type='px', value='5px'), stub_row_group_background_color=OptionsInfo(scss=True, category='stub', type='value', value=None), stub_row_group_font_size=OptionsInfo(scss=True, category='stub', type='px', value='100%'), stub_row_group_font_weight=OptionsInfo(scss=True, category='stub', type='value', value='initial'), stub_row_group_text_transform=OptionsInfo(scss=True, category='stub', type='value', value='inherit'), stub_row_group_border_style=OptionsInfo(scss=True, category='stub', type='value', value='solid'), stub_row_group_border_width=OptionsInfo(scss=True, category='stub', type='px', value='2px'), stub_row_group_border_color=OptionsInfo(scss=True, category='stub', type='value', value='#D3D3D3'), summary_row_padding=OptionsInfo(scss=True, category='summary_row', type='px', value='8px'), summary_row_padding_horizontal=OptionsInfo(scss=True, category='summary_row', type='px', value='5px'), summary_row_background_color=OptionsInfo(scss=True, category='summary_row', type='value', value=None), summary_row_text_transform=OptionsInfo(scss=True, category='summary_row', type='value', value='inherit'), summary_row_border_style=OptionsInfo(scss=True, category='summary_row', type='value', value='solid'), summary_row_border_width=OptionsInfo(scss=True, category='summary_row', type='px', value='2px'), summary_row_border_color=OptionsInfo(scss=True, category='summary_row', type='value', value='#D3D3D3'), grand_summary_row_padding=OptionsInfo(scss=True, category='grand_summary_row', type='px', value='8px'), grand_summary_row_padding_horizontal=OptionsInfo(scss=True, category='grand_summary_row', type='px', value='5px'), grand_summary_row_background_color=OptionsInfo(scss=True, category='grand_summary_row', type='value', value=None), grand_summary_row_text_transform=OptionsInfo(scss=True, category='grand_summary_row', type='value', value='inherit'), grand_summary_row_border_style=OptionsInfo(scss=True, category='grand_summary_row', type='value', value='double'), grand_summary_row_border_width=OptionsInfo(scss=True, category='grand_summary_row', type='px', value='6px'), grand_summary_row_border_color=OptionsInfo(scss=True, category='grand_summary_row', type='value', value='#D3D3D3'), footnotes_marks=OptionsInfo(scss=False, category='footnotes', type='values', value='numbers'), footnotes_spec_ref=OptionsInfo(scss=False, category='footnotes', type='value', value='^i'), footnotes_spec_ftr=OptionsInfo(scss=False, category='footnotes', type='value', value='^i'), footnotes_order=OptionsInfo(scss=False, category='footnotes', type='value', value='marks_last'), source_notes_padding=OptionsInfo(scss=True, category='source_notes', type='px', value='4px'), source_notes_padding_horizontal=OptionsInfo(scss=True, category='source_notes', type='px', value='5px'), source_notes_background_color=OptionsInfo(scss=True, category='source_notes', type='value', value=None), source_notes_font_size=OptionsInfo(scss=True, category='source_notes', type='px', value='90%'), source_notes_border_bottom_style=OptionsInfo(scss=True, category='source_notes', type='value', value='none'), source_notes_border_bottom_width=OptionsInfo(scss=True, category='source_notes', type='px', value='2px'), source_notes_border_bottom_color=OptionsInfo(scss=True, category='source_notes', type='value', value='#D3D3D3'), source_notes_border_lr_style=OptionsInfo(scss=True, category='source_notes', type='value', value='none'), source_notes_border_lr_width=OptionsInfo(scss=True, category='source_notes', type='px', value='2px'), source_notes_border_lr_color=OptionsInfo(scss=True, category='source_notes', type='value', value='#D3D3D3'), source_notes_multiline=OptionsInfo(scss=False, category='source_notes', type='boolean', value=True), source_notes_sep=OptionsInfo(scss=False, category='source_notes', type='value', value=' '), row_striping_background_color=OptionsInfo(scss=True, category='row', type='value', value='#F4F4F4'), row_striping_include_stub=OptionsInfo(scss=False, category='row', type='boolean', value=False), row_striping_include_table_body=OptionsInfo(scss=False, category='row', type='boolean', value=False), container_width=OptionsInfo(scss=False, category='container', type='px', value='auto'), container_height=OptionsInfo(scss=False, category='container', type='px', value='auto'), container_padding_x=OptionsInfo(scss=False, category='container', type='px', value='0px'), container_padding_y=OptionsInfo(scss=False, category='container', type='px', value='10px'), container_overflow_x=OptionsInfo(scss=False, category='container', type='overflow', value='auto'), container_overflow_y=OptionsInfo(scss=False, category='container', type='overflow', value='auto'), quarto_disable_processing=OptionsInfo(scss=False, category='quarto', type='logical', value=False), quarto_use_bootstrap=OptionsInfo(scss=False, category='quarto', type='logical', value=False), ihtml_active=OptionsInfo(scss=False, category='ihtml', type='boolean', value=False), ihtml_use_pagination=OptionsInfo(scss=False, category='ihtml', type='boolean', value=True), ihtml_use_pagination_info=OptionsInfo(scss=False, category='ihtml', type='boolean', value=True), ihtml_use_sorting=OptionsInfo(scss=False, category='ihtml', type='boolean', value=True), ihtml_use_search=OptionsInfo(scss=False, category='ihtml', type='boolean', value=False), ihtml_use_filters=OptionsInfo(scss=False, category='ihtml', type='boolean', value=False), ihtml_use_resizers=OptionsInfo(scss=False, category='ihtml', type='boolean', value=False), ihtml_use_highlight=OptionsInfo(scss=False, category='ihtml', type='boolean', value=False), ihtml_use_compact_mode=OptionsInfo(scss=False, category='ihtml', type='boolean', value=False), ihtml_use_text_wrapping=OptionsInfo(scss=False, category='ihtml', type='boolean', value=True), ihtml_use_page_size_select=OptionsInfo(scss=False, category='ihtml', type='boolean', value=False), ihtml_page_size_default=OptionsInfo(scss=False, category='ihtml', type='value', value=10), ihtml_page_size_values=OptionsInfo(scss=False, category='ihtml', type='values', value=[10, 25, 50, 100]), ihtml_pagination_type=OptionsInfo(scss=False, category='ihtml', type='value', value='numbers'), ihtml_height=OptionsInfo(scss=False, category='ihtml', type='value', value='auto'), ihtml_selection_mode=OptionsInfo(scss=False, category='ihtml', type='value', value=None)), _google_font_imports=GoogleFontImports(imports=frozenset()), _has_built=False)</w:t>
       </w:r>
     </w:p>
     <w:bookmarkEnd w:id="19"/>
@@ -2273,7 +2273,7 @@
         <w:rPr>
           <w:rStyle w:val="VerbatimChar"/>
         </w:rPr>
-        <w:t xml:space="preserve">6  C#5    vii° (Sensible)              0.0437      4.37%, _body=&lt;great_tables._gt_data.Body object at 0xf94bcc304410&gt;, _boxhead=Boxhead([ColInfo(var='Nota', type=&lt;ColInfoTypeEnum.default: 1&gt;, column_label='Nota', column_align='left', column_width=None, stub_level=None), ColInfo(var='Grado', type=&lt;ColInfoTypeEnum.default: 1&gt;, column_label='Grado', column_align='left', column_width=None, stub_level=None), ColInfo(var='Probabilidad límite', type=&lt;ColInfoTypeEnum.default: 1&gt;, column_label='Probabilidad límite', column_align='right', column_width=None, stub_level=None), ColInfo(var='Porcentaje', type=&lt;ColInfoTypeEnum.default: 1&gt;, column_label='Porcentaje', column_align='right', column_width=None, stub_level=None)]), _stub=&lt;great_tables._gt_data.Stub object at 0xf94bce932650&gt;, _spanners=Spanners([]), _heading=Heading(title='Distribución Estacionaria Asintótica', subtitle=None, preheader=None), _stubhead=None, _summary_rows=&lt;great_tables._gt_data.SummaryRows object at 0xf94bce5658c0&gt;, _summary_rows_grand=&lt;great_tables._gt_data.SummaryRows object at 0xf94bce5659d0&gt;, _source_notes=[], _footnotes=[], _styles=[], _locale=&lt;great_tables._gt_data.Locale object at 0xf94bce932c40&gt;, _formats=[], _substitutions=[], _col_merge=[], _transforms=[], _options=Options(table_id=OptionsInfo(scss=False, category='table', type='value', value=None), table_caption=OptionsInfo(scss=False, category='table', type='value', value=None), table_width=OptionsInfo(scss=True, category='table', type='px', value='auto'), table_layout=OptionsInfo(scss=True, category='table', type='value', value='fixed'), table_margin_left=OptionsInfo(scss=True, category='table', type='px', value='auto'), table_margin_right=OptionsInfo(scss=True, category='table', type='px', value='auto'), table_background_color=OptionsInfo(scss=True, category='table', type='value', value='#FFFFFF'), table_additional_css=OptionsInfo(scss=False, category='table', type='values', value=[]), table_font_names=OptionsInfo(scss=False, category='table', type='values', value=['-apple-system', 'BlinkMacSystemFont', 'Segoe UI', 'Roboto', 'Oxygen', 'Ubuntu', 'Cantarell', 'Helvetica Neue', 'Fira Sans', 'Droid Sans', 'Arial', 'sans-serif']), table_font_size=OptionsInfo(scss=True, category='table', type='px', value='16px'), table_font_weight=OptionsInfo(scss=True, category='table', type='value', value='normal'), table_font_style=OptionsInfo(scss=True, category='table', type='value', value='normal'), table_font_color=OptionsInfo(scss=True, category='table', type='value', value='#333333'), table_font_color_light=OptionsInfo(scss=True, category='table', type='value', value='#FFFFFF'), table_border_top_include=OptionsInfo(scss=False, category='table', type='boolean', value=True), table_border_top_style=OptionsInfo(scss=True, category='table', type='value', value='solid'), table_border_top_width=OptionsInfo(scss=True, category='table', type='px', value='2px'), table_border_top_color=OptionsInfo(scss=True, category='table', type='value', value='#A8A8A8'), table_border_right_style=OptionsInfo(scss=True, category='table', type='value', value='none'), table_border_right_width=OptionsInfo(scss=True, category='table', type='px', value='2px'), table_border_right_color=OptionsInfo(scss=True, category='table', type='value', value='#D3D3D3'), table_border_bottom_include=OptionsInfo(scss=False, category='table', type='boolean', value=True), table_border_bottom_style=OptionsInfo(scss=True, category='table', type='value', value='solid'), table_border_bottom_width=OptionsInfo(scss=True, category='table', type='px', value='2px'), table_border_bottom_color=OptionsInfo(scss=True, category='table', type='value', value='#A8A8A8'), table_border_left_style=OptionsInfo(scss=True, category='table', type='value', value='none'), table_border_left_width=OptionsInfo(scss=True, category='table', type='px', value='2px'), table_border_left_color=OptionsInfo(scss=True, category='table', type='value', value='#D3D3D3'), heading_background_color=OptionsInfo(scss=True, category='heading', type='value', value=None), heading_align=OptionsInfo(scss=True, category='heading', type='value', value='center'), heading_title_font_size=OptionsInfo(scss=True, category='heading', type='px', value='125%'), heading_title_font_weight=OptionsInfo(scss=True, category='heading', type='value', value='initial'), heading_subtitle_font_size=OptionsInfo(scss=True, category='heading', type='px', value='85%'), heading_subtitle_font_weight=OptionsInfo(scss=True, category='heading', type='value', value='initial'), heading_padding=OptionsInfo(scss=True, category='heading', type='px', value='4px'), heading_padding_horizontal=OptionsInfo(scss=True, category='heading', type='px', value='5px'), heading_border_bottom_style=OptionsInfo(scss=True, category='heading', type='value', value='solid'), heading_border_bottom_width=OptionsInfo(scss=True, category='heading', type='px', value='2px'), heading_border_bottom_color=OptionsInfo(scss=True, category='heading', type='value', value='#D3D3D3'), heading_border_lr_style=OptionsInfo(scss=True, category='heading', type='value', value='none'), heading_border_lr_width=OptionsInfo(scss=True, category='heading', type='px', value='1px'), heading_border_lr_color=OptionsInfo(scss=True, category='heading', type='value', value='#D3D3D3'), column_labels_background_color=OptionsInfo(scss=True, category='column_labels', type='value', value=None), column_labels_font_size=OptionsInfo(scss=True, category='column_labels', type='px', value='100%'), column_labels_font_weight=OptionsInfo(scss=True, category='column_labels', type='value', value='normal'), column_labels_text_transform=OptionsInfo(scss=True, category='column_labels', type='value', value='inherit'), column_labels_padding=OptionsInfo(scss=True, category='column_labels', type='px', value='5px'), column_labels_padding_horizontal=OptionsInfo(scss=True, category='column_labels', type='px', value='5px'), column_labels_vlines_style=OptionsInfo(scss=True, category='table_body', type='value', value='none'), column_labels_vlines_width=OptionsInfo(scss=True, category='table_body', type='px', value='1px'), column_labels_vlines_color=OptionsInfo(scss=True, category='table_body', type='value', value='#D3D3D3'), column_labels_border_top_style=OptionsInfo(scss=True, category='column_labels', type='value', value='solid'), column_labels_border_top_width=OptionsInfo(scss=True, category='column_labels', type='px', value='2px'), column_labels_border_top_color=OptionsInfo(scss=True, category='column_labels', type='value', value='#D3D3D3'), column_labels_border_bottom_style=OptionsInfo(scss=True, category='column_labels', type='value', value='solid'), column_labels_border_bottom_width=OptionsInfo(scss=True, category='column_labels', type='px', value='2px'), column_labels_border_bottom_color=OptionsInfo(scss=True, category='column_labels', type='value', value='#D3D3D3'), column_labels_border_lr_style=OptionsInfo(scss=True, category='column_labels', type='value', value='none'), column_labels_border_lr_width=OptionsInfo(scss=True, category='column_labels', type='px', value='1px'), column_labels_border_lr_color=OptionsInfo(scss=True, category='column_labels', type='value', value='#D3D3D3'), column_labels_hidden=OptionsInfo(scss=False, category='column_labels', type='boolean', value=False), row_group_background_color=OptionsInfo(scss=True, category='row_group', type='value', value=None), row_group_font_size=OptionsInfo(scss=True, category='row_group', type='px', value='100%'), row_group_font_weight=OptionsInfo(scss=True, category='row_group', type='value', value='initial'), row_group_text_transform=OptionsInfo(scss=True, category='row_group', type='value', value='inherit'), row_group_padding=OptionsInfo(scss=True, category='row_group', type='px', value='8px'), row_group_padding_horizontal=OptionsInfo(scss=True, category='row_group', type='px', value='5px'), row_group_border_top_style=OptionsInfo(scss=True, category='row_group', type='value', value='solid'), row_group_border_top_width=OptionsInfo(scss=True, category='row_group', type='px', value='2px'), row_group_border_top_color=OptionsInfo(scss=True, category='row_group', type='value', value='#D3D3D3'), row_group_border_right_style=OptionsInfo(scss=True, category='row_group', type='value', value='none'), row_group_border_right_width=OptionsInfo(scss=True, category='row_group', type='px', value='1px'), row_group_border_right_color=OptionsInfo(scss=True, category='row_group', type='value', value='#D3D3D3'), row_group_border_bottom_style=OptionsInfo(scss=True, category='row_group', type='value', value='solid'), row_group_border_bottom_width=OptionsInfo(scss=True, category='row_group', type='px', value='2px'), row_group_border_bottom_color=OptionsInfo(scss=True, category='row_group', type='value', value='#D3D3D3'), row_group_border_left_style=OptionsInfo(scss=True, category='row_group', type='value', value='none'), row_group_border_left_width=OptionsInfo(scss=True, category='row_group', type='px', value='1px'), row_group_border_left_color=OptionsInfo(scss=True, category='row_group', type='value', value='#D3D3D3'), row_group_as_column=OptionsInfo(scss=False, category='row_group', type='boolean', value=False), table_body_hlines_style=OptionsInfo(scss=True, category='table_body', type='value', value='solid'), table_body_hlines_width=OptionsInfo(scss=True, category='table_body', type='px', value='1px'), table_body_hlines_color=OptionsInfo(scss=True, category='table_body', type='value', value='#D3D3D3'), table_body_vlines_style=OptionsInfo(scss=True, category='table_body', type='value', value='none'), table_body_vlines_width=OptionsInfo(scss=True, category='table_body', type='px', value='1px'), table_body_vlines_color=OptionsInfo(scss=True, category='table_body', type='value', value='#D3D3D3'), table_body_border_top_style=OptionsInfo(scss=True, category='table_body', type='value', value='solid'), table_body_border_top_width=OptionsInfo(scss=True, category='table_body', type='px', value='2px'), table_body_border_top_color=OptionsInfo(scss=True, category='table_body', type='value', value='#D3D3D3'), table_body_border_bottom_style=OptionsInfo(scss=True, category='table_body', type='value', value='solid'), table_body_border_bottom_width=OptionsInfo(scss=True, category='table_body', type='px', value='2px'), table_body_border_bottom_color=OptionsInfo(scss=True, category='table_body', type='value', value='#D3D3D3'), data_row_padding=OptionsInfo(scss=True, category='data_row', type='px', value='8px'), data_row_padding_horizontal=OptionsInfo(scss=True, category='data_row', type='px', value='5px'), stub_background_color=OptionsInfo(scss=True, category='stub', type='value', value=None), stub_font_size=OptionsInfo(scss=True, category='stub', type='px', value='100%'), stub_font_weight=OptionsInfo(scss=True, category='stub', type='value', value='initial'), stub_text_transform=OptionsInfo(scss=True, category='stub', type='value', value='inherit'), stub_border_style=OptionsInfo(scss=True, category='stub', type='value', value='solid'), stub_border_width=OptionsInfo(scss=True, category='stub', type='px', value='2px'), stub_border_color=OptionsInfo(scss=True, category='stub', type='value', value='#D3D3D3'), stub_indent_length=OptionsInfo(scss=True, category='stub', type='px', value='5px'), stub_row_group_background_color=OptionsInfo(scss=True, category='stub', type='value', value=None), stub_row_group_font_size=OptionsInfo(scss=True, category='stub', type='px', value='100%'), stub_row_group_font_weight=OptionsInfo(scss=True, category='stub', type='value', value='initial'), stub_row_group_text_transform=OptionsInfo(scss=True, category='stub', type='value', value='inherit'), stub_row_group_border_style=OptionsInfo(scss=True, category='stub', type='value', value='solid'), stub_row_group_border_width=OptionsInfo(scss=True, category='stub', type='px', value='2px'), stub_row_group_border_color=OptionsInfo(scss=True, category='stub', type='value', value='#D3D3D3'), summary_row_padding=OptionsInfo(scss=True, category='summary_row', type='px', value='8px'), summary_row_padding_horizontal=OptionsInfo(scss=True, category='summary_row', type='px', value='5px'), summary_row_background_color=OptionsInfo(scss=True, category='summary_row', type='value', value=None), summary_row_text_transform=OptionsInfo(scss=True, category='summary_row', type='value', value='inherit'), summary_row_border_style=OptionsInfo(scss=True, category='summary_row', type='value', value='solid'), summary_row_border_width=OptionsInfo(scss=True, category='summary_row', type='px', value='2px'), summary_row_border_color=OptionsInfo(scss=True, category='summary_row', type='value', value='#D3D3D3'), grand_summary_row_padding=OptionsInfo(scss=True, category='grand_summary_row', type='px', value='8px'), grand_summary_row_padding_horizontal=OptionsInfo(scss=True, category='grand_summary_row', type='px', value='5px'), grand_summary_row_background_color=OptionsInfo(scss=True, category='grand_summary_row', type='value', value=None), grand_summary_row_text_transform=OptionsInfo(scss=True, category='grand_summary_row', type='value', value='inherit'), grand_summary_row_border_style=OptionsInfo(scss=True, category='grand_summary_row', type='value', value='double'), grand_summary_row_border_width=OptionsInfo(scss=True, category='grand_summary_row', type='px', value='6px'), grand_summary_row_border_color=OptionsInfo(scss=True, category='grand_summary_row', type='value', value='#D3D3D3'), footnotes_marks=OptionsInfo(scss=False, category='footnotes', type='values', value='numbers'), footnotes_spec_ref=OptionsInfo(scss=False, category='footnotes', type='value', value='^i'), footnotes_spec_ftr=OptionsInfo(scss=False, category='footnotes', type='value', value='^i'), footnotes_order=OptionsInfo(scss=False, category='footnotes', type='value', value='marks_last'), source_notes_padding=OptionsInfo(scss=True, category='source_notes', type='px', value='4px'), source_notes_padding_horizontal=OptionsInfo(scss=True, category='source_notes', type='px', value='5px'), source_notes_background_color=OptionsInfo(scss=True, category='source_notes', type='value', value=None), source_notes_font_size=OptionsInfo(scss=True, category='source_notes', type='px', value='90%'), source_notes_border_bottom_style=OptionsInfo(scss=True, category='source_notes', type='value', value='none'), source_notes_border_bottom_width=OptionsInfo(scss=True, category='source_notes', type='px', value='2px'), source_notes_border_bottom_color=OptionsInfo(scss=True, category='source_notes', type='value', value='#D3D3D3'), source_notes_border_lr_style=OptionsInfo(scss=True, category='source_notes', type='value', value='none'), source_notes_border_lr_width=OptionsInfo(scss=True, category='source_notes', type='px', value='2px'), source_notes_border_lr_color=OptionsInfo(scss=True, category='source_notes', type='value', value='#D3D3D3'), source_notes_multiline=OptionsInfo(scss=False, category='source_notes', type='boolean', value=True), source_notes_sep=OptionsInfo(scss=False, category='source_notes', type='value', value=' '), row_striping_background_color=OptionsInfo(scss=True, category='row', type='value', value='#F4F4F4'), row_striping_include_stub=OptionsInfo(scss=False, category='row', type='boolean', value=False), row_striping_include_table_body=OptionsInfo(scss=False, category='row', type='boolean', value=False), container_width=OptionsInfo(scss=False, category='container', type='px', value='auto'), container_height=OptionsInfo(scss=False, category='container', type='px', value='auto'), container_padding_x=OptionsInfo(scss=False, category='container', type='px', value='0px'), container_padding_y=OptionsInfo(scss=False, category='container', type='px', value='10px'), container_overflow_x=OptionsInfo(scss=False, category='container', type='overflow', value='auto'), container_overflow_y=OptionsInfo(scss=False, category='container', type='overflow', value='auto'), quarto_disable_processing=OptionsInfo(scss=False, category='quarto', type='logical', value=False), quarto_use_bootstrap=OptionsInfo(scss=False, category='quarto', type='logical', value=False), ihtml_active=OptionsInfo(scss=False, category='ihtml', type='boolean', value=False), ihtml_use_pagination=OptionsInfo(scss=False, category='ihtml', type='boolean', value=True), ihtml_use_pagination_info=OptionsInfo(scss=False, category='ihtml', type='boolean', value=True), ihtml_use_sorting=OptionsInfo(scss=False, category='ihtml', type='boolean', value=True), ihtml_use_search=OptionsInfo(scss=False, category='ihtml', type='boolean', value=False), ihtml_use_filters=OptionsInfo(scss=False, category='ihtml', type='boolean', value=False), ihtml_use_resizers=OptionsInfo(scss=False, category='ihtml', type='boolean', value=False), ihtml_use_highlight=OptionsInfo(scss=False, category='ihtml', type='boolean', value=False), ihtml_use_compact_mode=OptionsInfo(scss=False, category='ihtml', type='boolean', value=False), ihtml_use_text_wrapping=OptionsInfo(scss=False, category='ihtml', type='boolean', value=True), ihtml_use_page_size_select=OptionsInfo(scss=False, category='ihtml', type='boolean', value=False), ihtml_page_size_default=OptionsInfo(scss=False, category='ihtml', type='value', value=10), ihtml_page_size_values=OptionsInfo(scss=False, category='ihtml', type='values', value=[10, 25, 50, 100]), ihtml_pagination_type=OptionsInfo(scss=False, category='ihtml', type='value', value='numbers'), ihtml_height=OptionsInfo(scss=False, category='ihtml', type='value', value='auto'), ihtml_selection_mode=OptionsInfo(scss=False, category='ihtml', type='value', value=None)), _google_font_imports=GoogleFontImports(imports=frozenset()), _has_built=False)</w:t>
+        <w:t xml:space="preserve">6  C#5    vii° (Sensible)              0.0437      4.37%, _body=&lt;great_tables._gt_data.Body object at 0xfe52a25f0410&gt;, _boxhead=Boxhead([ColInfo(var='Nota', type=&lt;ColInfoTypeEnum.default: 1&gt;, column_label='Nota', column_align='left', column_width=None, stub_level=None), ColInfo(var='Grado', type=&lt;ColInfoTypeEnum.default: 1&gt;, column_label='Grado', column_align='left', column_width=None, stub_level=None), ColInfo(var='Probabilidad límite', type=&lt;ColInfoTypeEnum.default: 1&gt;, column_label='Probabilidad límite', column_align='right', column_width=None, stub_level=None), ColInfo(var='Porcentaje', type=&lt;ColInfoTypeEnum.default: 1&gt;, column_label='Porcentaje', column_align='right', column_width=None, stub_level=None)]), _stub=&lt;great_tables._gt_data.Stub object at 0xfe52a2926650&gt;, _spanners=Spanners([]), _heading=Heading(title='Distribución Estacionaria Asintótica', subtitle=None, preheader=None), _stubhead=None, _summary_rows=&lt;great_tables._gt_data.SummaryRows object at 0xfe52a2558af0&gt;, _summary_rows_grand=&lt;great_tables._gt_data.SummaryRows object at 0xfe52a25599d0&gt;, _source_notes=[], _footnotes=[], _styles=[], _locale=&lt;great_tables._gt_data.Locale object at 0xfe52a2926d70&gt;, _formats=[], _substitutions=[], _col_merge=[], _transforms=[], _options=Options(table_id=OptionsInfo(scss=False, category='table', type='value', value=None), table_caption=OptionsInfo(scss=False, category='table', type='value', value=None), table_width=OptionsInfo(scss=True, category='table', type='px', value='auto'), table_layout=OptionsInfo(scss=True, category='table', type='value', value='fixed'), table_margin_left=OptionsInfo(scss=True, category='table', type='px', value='auto'), table_margin_right=OptionsInfo(scss=True, category='table', type='px', value='auto'), table_background_color=OptionsInfo(scss=True, category='table', type='value', value='#FFFFFF'), table_additional_css=OptionsInfo(scss=False, category='table', type='values', value=[]), table_font_names=OptionsInfo(scss=False, category='table', type='values', value=['-apple-system', 'BlinkMacSystemFont', 'Segoe UI', 'Roboto', 'Oxygen', 'Ubuntu', 'Cantarell', 'Helvetica Neue', 'Fira Sans', 'Droid Sans', 'Arial', 'sans-serif']), table_font_size=OptionsInfo(scss=True, category='table', type='px', value='16px'), table_font_weight=OptionsInfo(scss=True, category='table', type='value', value='normal'), table_font_style=OptionsInfo(scss=True, category='table', type='value', value='normal'), table_font_color=OptionsInfo(scss=True, category='table', type='value', value='#333333'), table_font_color_light=OptionsInfo(scss=True, category='table', type='value', value='#FFFFFF'), table_border_top_include=OptionsInfo(scss=False, category='table', type='boolean', value=True), table_border_top_style=OptionsInfo(scss=True, category='table', type='value', value='solid'), table_border_top_width=OptionsInfo(scss=True, category='table', type='px', value='2px'), table_border_top_color=OptionsInfo(scss=True, category='table', type='value', value='#A8A8A8'), table_border_right_style=OptionsInfo(scss=True, category='table', type='value', value='none'), table_border_right_width=OptionsInfo(scss=True, category='table', type='px', value='2px'), table_border_right_color=OptionsInfo(scss=True, category='table', type='value', value='#D3D3D3'), table_border_bottom_include=OptionsInfo(scss=False, category='table', type='boolean', value=True), table_border_bottom_style=OptionsInfo(scss=True, category='table', type='value', value='solid'), table_border_bottom_width=OptionsInfo(scss=True, category='table', type='px', value='2px'), table_border_bottom_color=OptionsInfo(scss=True, category='table', type='value', value='#A8A8A8'), table_border_left_style=OptionsInfo(scss=True, category='table', type='value', value='none'), table_border_left_width=OptionsInfo(scss=True, category='table', type='px', value='2px'), table_border_left_color=OptionsInfo(scss=True, category='table', type='value', value='#D3D3D3'), heading_background_color=OptionsInfo(scss=True, category='heading', type='value', value=None), heading_align=OptionsInfo(scss=True, category='heading', type='value', value='center'), heading_title_font_size=OptionsInfo(scss=True, category='heading', type='px', value='125%'), heading_title_font_weight=OptionsInfo(scss=True, category='heading', type='value', value='initial'), heading_subtitle_font_size=OptionsInfo(scss=True, category='heading', type='px', value='85%'), heading_subtitle_font_weight=OptionsInfo(scss=True, category='heading', type='value', value='initial'), heading_padding=OptionsInfo(scss=True, category='heading', type='px', value='4px'), heading_padding_horizontal=OptionsInfo(scss=True, category='heading', type='px', value='5px'), heading_border_bottom_style=OptionsInfo(scss=True, category='heading', type='value', value='solid'), heading_border_bottom_width=OptionsInfo(scss=True, category='heading', type='px', value='2px'), heading_border_bottom_color=OptionsInfo(scss=True, category='heading', type='value', value='#D3D3D3'), heading_border_lr_style=OptionsInfo(scss=True, category='heading', type='value', value='none'), heading_border_lr_width=OptionsInfo(scss=True, category='heading', type='px', value='1px'), heading_border_lr_color=OptionsInfo(scss=True, category='heading', type='value', value='#D3D3D3'), column_labels_background_color=OptionsInfo(scss=True, category='column_labels', type='value', value=None), column_labels_font_size=OptionsInfo(scss=True, category='column_labels', type='px', value='100%'), column_labels_font_weight=OptionsInfo(scss=True, category='column_labels', type='value', value='normal'), column_labels_text_transform=OptionsInfo(scss=True, category='column_labels', type='value', value='inherit'), column_labels_padding=OptionsInfo(scss=True, category='column_labels', type='px', value='5px'), column_labels_padding_horizontal=OptionsInfo(scss=True, category='column_labels', type='px', value='5px'), column_labels_vlines_style=OptionsInfo(scss=True, category='table_body', type='value', value='none'), column_labels_vlines_width=OptionsInfo(scss=True, category='table_body', type='px', value='1px'), column_labels_vlines_color=OptionsInfo(scss=True, category='table_body', type='value', value='#D3D3D3'), column_labels_border_top_style=OptionsInfo(scss=True, category='column_labels', type='value', value='solid'), column_labels_border_top_width=OptionsInfo(scss=True, category='column_labels', type='px', value='2px'), column_labels_border_top_color=OptionsInfo(scss=True, category='column_labels', type='value', value='#D3D3D3'), column_labels_border_bottom_style=OptionsInfo(scss=True, category='column_labels', type='value', value='solid'), column_labels_border_bottom_width=OptionsInfo(scss=True, category='column_labels', type='px', value='2px'), column_labels_border_bottom_color=OptionsInfo(scss=True, category='column_labels', type='value', value='#D3D3D3'), column_labels_border_lr_style=OptionsInfo(scss=True, category='column_labels', type='value', value='none'), column_labels_border_lr_width=OptionsInfo(scss=True, category='column_labels', type='px', value='1px'), column_labels_border_lr_color=OptionsInfo(scss=True, category='column_labels', type='value', value='#D3D3D3'), column_labels_hidden=OptionsInfo(scss=False, category='column_labels', type='boolean', value=False), row_group_background_color=OptionsInfo(scss=True, category='row_group', type='value', value=None), row_group_font_size=OptionsInfo(scss=True, category='row_group', type='px', value='100%'), row_group_font_weight=OptionsInfo(scss=True, category='row_group', type='value', value='initial'), row_group_text_transform=OptionsInfo(scss=True, category='row_group', type='value', value='inherit'), row_group_padding=OptionsInfo(scss=True, category='row_group', type='px', value='8px'), row_group_padding_horizontal=OptionsInfo(scss=True, category='row_group', type='px', value='5px'), row_group_border_top_style=OptionsInfo(scss=True, category='row_group', type='value', value='solid'), row_group_border_top_width=OptionsInfo(scss=True, category='row_group', type='px', value='2px'), row_group_border_top_color=OptionsInfo(scss=True, category='row_group', type='value', value='#D3D3D3'), row_group_border_right_style=OptionsInfo(scss=True, category='row_group', type='value', value='none'), row_group_border_right_width=OptionsInfo(scss=True, category='row_group', type='px', value='1px'), row_group_border_right_color=OptionsInfo(scss=True, category='row_group', type='value', value='#D3D3D3'), row_group_border_bottom_style=OptionsInfo(scss=True, category='row_group', type='value', value='solid'), row_group_border_bottom_width=OptionsInfo(scss=True, category='row_group', type='px', value='2px'), row_group_border_bottom_color=OptionsInfo(scss=True, category='row_group', type='value', value='#D3D3D3'), row_group_border_left_style=OptionsInfo(scss=True, category='row_group', type='value', value='none'), row_group_border_left_width=OptionsInfo(scss=True, category='row_group', type='px', value='1px'), row_group_border_left_color=OptionsInfo(scss=True, category='row_group', type='value', value='#D3D3D3'), row_group_as_column=OptionsInfo(scss=False, category='row_group', type='boolean', value=False), table_body_hlines_style=OptionsInfo(scss=True, category='table_body', type='value', value='solid'), table_body_hlines_width=OptionsInfo(scss=True, category='table_body', type='px', value='1px'), table_body_hlines_color=OptionsInfo(scss=True, category='table_body', type='value', value='#D3D3D3'), table_body_vlines_style=OptionsInfo(scss=True, category='table_body', type='value', value='none'), table_body_vlines_width=OptionsInfo(scss=True, category='table_body', type='px', value='1px'), table_body_vlines_color=OptionsInfo(scss=True, category='table_body', type='value', value='#D3D3D3'), table_body_border_top_style=OptionsInfo(scss=True, category='table_body', type='value', value='solid'), table_body_border_top_width=OptionsInfo(scss=True, category='table_body', type='px', value='2px'), table_body_border_top_color=OptionsInfo(scss=True, category='table_body', type='value', value='#D3D3D3'), table_body_border_bottom_style=OptionsInfo(scss=True, category='table_body', type='value', value='solid'), table_body_border_bottom_width=OptionsInfo(scss=True, category='table_body', type='px', value='2px'), table_body_border_bottom_color=OptionsInfo(scss=True, category='table_body', type='value', value='#D3D3D3'), data_row_padding=OptionsInfo(scss=True, category='data_row', type='px', value='8px'), data_row_padding_horizontal=OptionsInfo(scss=True, category='data_row', type='px', value='5px'), stub_background_color=OptionsInfo(scss=True, category='stub', type='value', value=None), stub_font_size=OptionsInfo(scss=True, category='stub', type='px', value='100%'), stub_font_weight=OptionsInfo(scss=True, category='stub', type='value', value='initial'), stub_text_transform=OptionsInfo(scss=True, category='stub', type='value', value='inherit'), stub_border_style=OptionsInfo(scss=True, category='stub', type='value', value='solid'), stub_border_width=OptionsInfo(scss=True, category='stub', type='px', value='2px'), stub_border_color=OptionsInfo(scss=True, category='stub', type='value', value='#D3D3D3'), stub_indent_length=OptionsInfo(scss=True, category='stub', type='px', value='5px'), stub_row_group_background_color=OptionsInfo(scss=True, category='stub', type='value', value=None), stub_row_group_font_size=OptionsInfo(scss=True, category='stub', type='px', value='100%'), stub_row_group_font_weight=OptionsInfo(scss=True, category='stub', type='value', value='initial'), stub_row_group_text_transform=OptionsInfo(scss=True, category='stub', type='value', value='inherit'), stub_row_group_border_style=OptionsInfo(scss=True, category='stub', type='value', value='solid'), stub_row_group_border_width=OptionsInfo(scss=True, category='stub', type='px', value='2px'), stub_row_group_border_color=OptionsInfo(scss=True, category='stub', type='value', value='#D3D3D3'), summary_row_padding=OptionsInfo(scss=True, category='summary_row', type='px', value='8px'), summary_row_padding_horizontal=OptionsInfo(scss=True, category='summary_row', type='px', value='5px'), summary_row_background_color=OptionsInfo(scss=True, category='summary_row', type='value', value=None), summary_row_text_transform=OptionsInfo(scss=True, category='summary_row', type='value', value='inherit'), summary_row_border_style=OptionsInfo(scss=True, category='summary_row', type='value', value='solid'), summary_row_border_width=OptionsInfo(scss=True, category='summary_row', type='px', value='2px'), summary_row_border_color=OptionsInfo(scss=True, category='summary_row', type='value', value='#D3D3D3'), grand_summary_row_padding=OptionsInfo(scss=True, category='grand_summary_row', type='px', value='8px'), grand_summary_row_padding_horizontal=OptionsInfo(scss=True, category='grand_summary_row', type='px', value='5px'), grand_summary_row_background_color=OptionsInfo(scss=True, category='grand_summary_row', type='value', value=None), grand_summary_row_text_transform=OptionsInfo(scss=True, category='grand_summary_row', type='value', value='inherit'), grand_summary_row_border_style=OptionsInfo(scss=True, category='grand_summary_row', type='value', value='double'), grand_summary_row_border_width=OptionsInfo(scss=True, category='grand_summary_row', type='px', value='6px'), grand_summary_row_border_color=OptionsInfo(scss=True, category='grand_summary_row', type='value', value='#D3D3D3'), footnotes_marks=OptionsInfo(scss=False, category='footnotes', type='values', value='numbers'), footnotes_spec_ref=OptionsInfo(scss=False, category='footnotes', type='value', value='^i'), footnotes_spec_ftr=OptionsInfo(scss=False, category='footnotes', type='value', value='^i'), footnotes_order=OptionsInfo(scss=False, category='footnotes', type='value', value='marks_last'), source_notes_padding=OptionsInfo(scss=True, category='source_notes', type='px', value='4px'), source_notes_padding_horizontal=OptionsInfo(scss=True, category='source_notes', type='px', value='5px'), source_notes_background_color=OptionsInfo(scss=True, category='source_notes', type='value', value=None), source_notes_font_size=OptionsInfo(scss=True, category='source_notes', type='px', value='90%'), source_notes_border_bottom_style=OptionsInfo(scss=True, category='source_notes', type='value', value='none'), source_notes_border_bottom_width=OptionsInfo(scss=True, category='source_notes', type='px', value='2px'), source_notes_border_bottom_color=OptionsInfo(scss=True, category='source_notes', type='value', value='#D3D3D3'), source_notes_border_lr_style=OptionsInfo(scss=True, category='source_notes', type='value', value='none'), source_notes_border_lr_width=OptionsInfo(scss=True, category='source_notes', type='px', value='2px'), source_notes_border_lr_color=OptionsInfo(scss=True, category='source_notes', type='value', value='#D3D3D3'), source_notes_multiline=OptionsInfo(scss=False, category='source_notes', type='boolean', value=True), source_notes_sep=OptionsInfo(scss=False, category='source_notes', type='value', value=' '), row_striping_background_color=OptionsInfo(scss=True, category='row', type='value', value='#F4F4F4'), row_striping_include_stub=OptionsInfo(scss=False, category='row', type='boolean', value=False), row_striping_include_table_body=OptionsInfo(scss=False, category='row', type='boolean', value=False), container_width=OptionsInfo(scss=False, category='container', type='px', value='auto'), container_height=OptionsInfo(scss=False, category='container', type='px', value='auto'), container_padding_x=OptionsInfo(scss=False, category='container', type='px', value='0px'), container_padding_y=OptionsInfo(scss=False, category='container', type='px', value='10px'), container_overflow_x=OptionsInfo(scss=False, category='container', type='overflow', value='auto'), container_overflow_y=OptionsInfo(scss=False, category='container', type='overflow', value='auto'), quarto_disable_processing=OptionsInfo(scss=False, category='quarto', type='logical', value=False), quarto_use_bootstrap=OptionsInfo(scss=False, category='quarto', type='logical', value=False), ihtml_active=OptionsInfo(scss=False, category='ihtml', type='boolean', value=False), ihtml_use_pagination=OptionsInfo(scss=False, category='ihtml', type='boolean', value=True), ihtml_use_pagination_info=OptionsInfo(scss=False, category='ihtml', type='boolean', value=True), ihtml_use_sorting=OptionsInfo(scss=False, category='ihtml', type='boolean', value=True), ihtml_use_search=OptionsInfo(scss=False, category='ihtml', type='boolean', value=False), ihtml_use_filters=OptionsInfo(scss=False, category='ihtml', type='boolean', value=False), ihtml_use_resizers=OptionsInfo(scss=False, category='ihtml', type='boolean', value=False), ihtml_use_highlight=OptionsInfo(scss=False, category='ihtml', type='boolean', value=False), ihtml_use_compact_mode=OptionsInfo(scss=False, category='ihtml', type='boolean', value=False), ihtml_use_text_wrapping=OptionsInfo(scss=False, category='ihtml', type='boolean', value=True), ihtml_use_page_size_select=OptionsInfo(scss=False, category='ihtml', type='boolean', value=False), ihtml_page_size_default=OptionsInfo(scss=False, category='ihtml', type='value', value=10), ihtml_page_size_values=OptionsInfo(scss=False, category='ihtml', type='values', value=[10, 25, 50, 100]), ihtml_pagination_type=OptionsInfo(scss=False, category='ihtml', type='value', value='numbers'), ihtml_height=OptionsInfo(scss=False, category='ihtml', type='value', value='auto'), ihtml_selection_mode=OptionsInfo(scss=False, category='ihtml', type='value', value=None)), _google_font_imports=GoogleFontImports(imports=frozenset()), _has_built=False)</w:t>
       </w:r>
     </w:p>
     <w:bookmarkEnd w:id="29"/>
@@ -2785,7 +2785,7 @@
         <w:rPr>
           <w:rStyle w:val="VerbatimChar"/>
         </w:rPr>
-        <w:t xml:space="preserve">16    16          A4   E4      329.63      1.00         10.25, _body=&lt;great_tables._gt_data.Body object at 0xf94bce9c22b0&gt;, _boxhead=Boxhead([ColInfo(var='Paso', type=&lt;ColInfoTypeEnum.default: 1&gt;, column_label='Paso', column_align='center', column_width=None, stub_level=None), ColInfo(var='Estado ant.', type=&lt;ColInfoTypeEnum.default: 1&gt;, column_label='Estado ant.', column_align='left', column_width=None, stub_level=None), ColInfo(var='Nota', type=&lt;ColInfoTypeEnum.default: 1&gt;, column_label='Nota', column_align='left', column_width=None, stub_level=None), ColInfo(var='Frecuencia', type=&lt;ColInfoTypeEnum.default: 1&gt;, column_label='Frecuencia', column_align='right', column_width=None, stub_level=None), ColInfo(var='Duración', type=&lt;ColInfoTypeEnum.default: 1&gt;, column_label='Duración', column_align='right', column_width=None, stub_level=None), ColInfo(var='Tiempo acum.', type=&lt;ColInfoTypeEnum.default: 1&gt;, column_label='Tiempo acum.', column_align='right', column_width=None, stub_level=None)]), _stub=&lt;great_tables._gt_data.Stub object at 0xf94bce573490&gt;, _spanners=Spanners([]), _heading=Heading(title='Secuencia: 16 Transiciones', subtitle=None, preheader=None), _stubhead=None, _summary_rows=&lt;great_tables._gt_data.SummaryRows object at 0xf94bce553850&gt;, _summary_rows_grand=&lt;great_tables._gt_data.SummaryRows object at 0xf94bce553950&gt;, _source_notes=[], _footnotes=[], _styles=[], _locale=&lt;great_tables._gt_data.Locale object at 0xf94bce573bb0&gt;, _formats=[], _substitutions=[], _col_merge=[], _transforms=[], _options=Options(table_id=OptionsInfo(scss=False, category='table', type='value', value=None), table_caption=OptionsInfo(scss=False, category='table', type='value', value=None), table_width=OptionsInfo(scss=True, category='table', type='px', value='auto'), table_layout=OptionsInfo(scss=True, category='table', type='value', value='fixed'), table_margin_left=OptionsInfo(scss=True, category='table', type='px', value='auto'), table_margin_right=OptionsInfo(scss=True, category='table', type='px', value='auto'), table_background_color=OptionsInfo(scss=True, category='table', type='value', value='#FFFFFF'), table_additional_css=OptionsInfo(scss=False, category='table', type='values', value=[]), table_font_names=OptionsInfo(scss=False, category='table', type='values', value=['-apple-system', 'BlinkMacSystemFont', 'Segoe UI', 'Roboto', 'Oxygen', 'Ubuntu', 'Cantarell', 'Helvetica Neue', 'Fira Sans', 'Droid Sans', 'Arial', 'sans-serif']), table_font_size=OptionsInfo(scss=True, category='table', type='px', value='16px'), table_font_weight=OptionsInfo(scss=True, category='table', type='value', value='normal'), table_font_style=OptionsInfo(scss=True, category='table', type='value', value='normal'), table_font_color=OptionsInfo(scss=True, category='table', type='value', value='#333333'), table_font_color_light=OptionsInfo(scss=True, category='table', type='value', value='#FFFFFF'), table_border_top_include=OptionsInfo(scss=False, category='table', type='boolean', value=True), table_border_top_style=OptionsInfo(scss=True, category='table', type='value', value='solid'), table_border_top_width=OptionsInfo(scss=True, category='table', type='px', value='2px'), table_border_top_color=OptionsInfo(scss=True, category='table', type='value', value='#A8A8A8'), table_border_right_style=OptionsInfo(scss=True, category='table', type='value', value='none'), table_border_right_width=OptionsInfo(scss=True, category='table', type='px', value='2px'), table_border_right_color=OptionsInfo(scss=True, category='table', type='value', value='#D3D3D3'), table_border_bottom_include=OptionsInfo(scss=False, category='table', type='boolean', value=True), table_border_bottom_style=OptionsInfo(scss=True, category='table', type='value', value='solid'), table_border_bottom_width=OptionsInfo(scss=True, category='table', type='px', value='2px'), table_border_bottom_color=OptionsInfo(scss=True, category='table', type='value', value='#A8A8A8'), table_border_left_style=OptionsInfo(scss=True, category='table', type='value', value='none'), table_border_left_width=OptionsInfo(scss=True, category='table', type='px', value='2px'), table_border_left_color=OptionsInfo(scss=True, category='table', type='value', value='#D3D3D3'), heading_background_color=OptionsInfo(scss=True, category='heading', type='value', value=None), heading_align=OptionsInfo(scss=True, category='heading', type='value', value='center'), heading_title_font_size=OptionsInfo(scss=True, category='heading', type='px', value='125%'), heading_title_font_weight=OptionsInfo(scss=True, category='heading', type='value', value='initial'), heading_subtitle_font_size=OptionsInfo(scss=True, category='heading', type='px', value='85%'), heading_subtitle_font_weight=OptionsInfo(scss=True, category='heading', type='value', value='initial'), heading_padding=OptionsInfo(scss=True, category='heading', type='px', value='4px'), heading_padding_horizontal=OptionsInfo(scss=True, category='heading', type='px', value='5px'), heading_border_bottom_style=OptionsInfo(scss=True, category='heading', type='value', value='solid'), heading_border_bottom_width=OptionsInfo(scss=True, category='heading', type='px', value='2px'), heading_border_bottom_color=OptionsInfo(scss=True, category='heading', type='value', value='#D3D3D3'), heading_border_lr_style=OptionsInfo(scss=True, category='heading', type='value', value='none'), heading_border_lr_width=OptionsInfo(scss=True, category='heading', type='px', value='1px'), heading_border_lr_color=OptionsInfo(scss=True, category='heading', type='value', value='#D3D3D3'), column_labels_background_color=OptionsInfo(scss=True, category='column_labels', type='value', value=None), column_labels_font_size=OptionsInfo(scss=True, category='column_labels', type='px', value='100%'), column_labels_font_weight=OptionsInfo(scss=True, category='column_labels', type='value', value='normal'), column_labels_text_transform=OptionsInfo(scss=True, category='column_labels', type='value', value='inherit'), column_labels_padding=OptionsInfo(scss=True, category='column_labels', type='px', value='5px'), column_labels_padding_horizontal=OptionsInfo(scss=True, category='column_labels', type='px', value='5px'), column_labels_vlines_style=OptionsInfo(scss=True, category='table_body', type='value', value='none'), column_labels_vlines_width=OptionsInfo(scss=True, category='table_body', type='px', value='1px'), column_labels_vlines_color=OptionsInfo(scss=True, category='table_body', type='value', value='#D3D3D3'), column_labels_border_top_style=OptionsInfo(scss=True, category='column_labels', type='value', value='solid'), column_labels_border_top_width=OptionsInfo(scss=True, category='column_labels', type='px', value='2px'), column_labels_border_top_color=OptionsInfo(scss=True, category='column_labels', type='value', value='#D3D3D3'), column_labels_border_bottom_style=OptionsInfo(scss=True, category='column_labels', type='value', value='solid'), column_labels_border_bottom_width=OptionsInfo(scss=True, category='column_labels', type='px', value='2px'), column_labels_border_bottom_color=OptionsInfo(scss=True, category='column_labels', type='value', value='#D3D3D3'), column_labels_border_lr_style=OptionsInfo(scss=True, category='column_labels', type='value', value='none'), column_labels_border_lr_width=OptionsInfo(scss=True, category='column_labels', type='px', value='1px'), column_labels_border_lr_color=OptionsInfo(scss=True, category='column_labels', type='value', value='#D3D3D3'), column_labels_hidden=OptionsInfo(scss=False, category='column_labels', type='boolean', value=False), row_group_background_color=OptionsInfo(scss=True, category='row_group', type='value', value=None), row_group_font_size=OptionsInfo(scss=True, category='row_group', type='px', value='100%'), row_group_font_weight=OptionsInfo(scss=True, category='row_group', type='value', value='initial'), row_group_text_transform=OptionsInfo(scss=True, category='row_group', type='value', value='inherit'), row_group_padding=OptionsInfo(scss=True, category='row_group', type='px', value='8px'), row_group_padding_horizontal=OptionsInfo(scss=True, category='row_group', type='px', value='5px'), row_group_border_top_style=OptionsInfo(scss=True, category='row_group', type='value', value='solid'), row_group_border_top_width=OptionsInfo(scss=True, category='row_group', type='px', value='2px'), row_group_border_top_color=OptionsInfo(scss=True, category='row_group', type='value', value='#D3D3D3'), row_group_border_right_style=OptionsInfo(scss=True, category='row_group', type='value', value='none'), row_group_border_right_width=OptionsInfo(scss=True, category='row_group', type='px', value='1px'), row_group_border_right_color=OptionsInfo(scss=True, category='row_group', type='value', value='#D3D3D3'), row_group_border_bottom_style=OptionsInfo(scss=True, category='row_group', type='value', value='solid'), row_group_border_bottom_width=OptionsInfo(scss=True, category='row_group', type='px', value='2px'), row_group_border_bottom_color=OptionsInfo(scss=True, category='row_group', type='value', value='#D3D3D3'), row_group_border_left_style=OptionsInfo(scss=True, category='row_group', type='value', value='none'), row_group_border_left_width=OptionsInfo(scss=True, category='row_group', type='px', value='1px'), row_group_border_left_color=OptionsInfo(scss=True, category='row_group', type='value', value='#D3D3D3'), row_group_as_column=OptionsInfo(scss=False, category='row_group', type='boolean', value=False), table_body_hlines_style=OptionsInfo(scss=True, category='table_body', type='value', value='solid'), table_body_hlines_width=OptionsInfo(scss=True, category='table_body', type='px', value='1px'), table_body_hlines_color=OptionsInfo(scss=True, category='table_body', type='value', value='#D3D3D3'), table_body_vlines_style=OptionsInfo(scss=True, category='table_body', type='value', value='none'), table_body_vlines_width=OptionsInfo(scss=True, category='table_body', type='px', value='1px'), table_body_vlines_color=OptionsInfo(scss=True, category='table_body', type='value', value='#D3D3D3'), table_body_border_top_style=OptionsInfo(scss=True, category='table_body', type='value', value='solid'), table_body_border_top_width=OptionsInfo(scss=True, category='table_body', type='px', value='2px'), table_body_border_top_color=OptionsInfo(scss=True, category='table_body', type='value', value='#D3D3D3'), table_body_border_bottom_style=OptionsInfo(scss=True, category='table_body', type='value', value='solid'), table_body_border_bottom_width=OptionsInfo(scss=True, category='table_body', type='px', value='2px'), table_body_border_bottom_color=OptionsInfo(scss=True, category='table_body', type='value', value='#D3D3D3'), data_row_padding=OptionsInfo(scss=True, category='data_row', type='px', value='8px'), data_row_padding_horizontal=OptionsInfo(scss=True, category='data_row', type='px', value='5px'), stub_background_color=OptionsInfo(scss=True, category='stub', type='value', value=None), stub_font_size=OptionsInfo(scss=True, category='stub', type='px', value='100%'), stub_font_weight=OptionsInfo(scss=True, category='stub', type='value', value='initial'), stub_text_transform=OptionsInfo(scss=True, category='stub', type='value', value='inherit'), stub_border_style=OptionsInfo(scss=True, category='stub', type='value', value='solid'), stub_border_width=OptionsInfo(scss=True, category='stub', type='px', value='2px'), stub_border_color=OptionsInfo(scss=True, category='stub', type='value', value='#D3D3D3'), stub_indent_length=OptionsInfo(scss=True, category='stub', type='px', value='5px'), stub_row_group_background_color=OptionsInfo(scss=True, category='stub', type='value', value=None), stub_row_group_font_size=OptionsInfo(scss=True, category='stub', type='px', value='100%'), stub_row_group_font_weight=OptionsInfo(scss=True, category='stub', type='value', value='initial'), stub_row_group_text_transform=OptionsInfo(scss=True, category='stub', type='value', value='inherit'), stub_row_group_border_style=OptionsInfo(scss=True, category='stub', type='value', value='solid'), stub_row_group_border_width=OptionsInfo(scss=True, category='stub', type='px', value='2px'), stub_row_group_border_color=OptionsInfo(scss=True, category='stub', type='value', value='#D3D3D3'), summary_row_padding=OptionsInfo(scss=True, category='summary_row', type='px', value='8px'), summary_row_padding_horizontal=OptionsInfo(scss=True, category='summary_row', type='px', value='5px'), summary_row_background_color=OptionsInfo(scss=True, category='summary_row', type='value', value=None), summary_row_text_transform=OptionsInfo(scss=True, category='summary_row', type='value', value='inherit'), summary_row_border_style=OptionsInfo(scss=True, category='summary_row', type='value', value='solid'), summary_row_border_width=OptionsInfo(scss=True, category='summary_row', type='px', value='2px'), summary_row_border_color=OptionsInfo(scss=True, category='summary_row', type='value', value='#D3D3D3'), grand_summary_row_padding=OptionsInfo(scss=True, category='grand_summary_row', type='px', value='8px'), grand_summary_row_padding_horizontal=OptionsInfo(scss=True, category='grand_summary_row', type='px', value='5px'), grand_summary_row_background_color=OptionsInfo(scss=True, category='grand_summary_row', type='value', value=None), grand_summary_row_text_transform=OptionsInfo(scss=True, category='grand_summary_row', type='value', value='inherit'), grand_summary_row_border_style=OptionsInfo(scss=True, category='grand_summary_row', type='value', value='double'), grand_summary_row_border_width=OptionsInfo(scss=True, category='grand_summary_row', type='px', value='6px'), grand_summary_row_border_color=OptionsInfo(scss=True, category='grand_summary_row', type='value', value='#D3D3D3'), footnotes_marks=OptionsInfo(scss=False, category='footnotes', type='values', value='numbers'), footnotes_spec_ref=OptionsInfo(scss=False, category='footnotes', type='value', value='^i'), footnotes_spec_ftr=OptionsInfo(scss=False, category='footnotes', type='value', value='^i'), footnotes_order=OptionsInfo(scss=False, category='footnotes', type='value', value='marks_last'), source_notes_padding=OptionsInfo(scss=True, category='source_notes', type='px', value='4px'), source_notes_padding_horizontal=OptionsInfo(scss=True, category='source_notes', type='px', value='5px'), source_notes_background_color=OptionsInfo(scss=True, category='source_notes', type='value', value=None), source_notes_font_size=OptionsInfo(scss=True, category='source_notes', type='px', value='90%'), source_notes_border_bottom_style=OptionsInfo(scss=True, category='source_notes', type='value', value='none'), source_notes_border_bottom_width=OptionsInfo(scss=True, category='source_notes', type='px', value='2px'), source_notes_border_bottom_color=OptionsInfo(scss=True, category='source_notes', type='value', value='#D3D3D3'), source_notes_border_lr_style=OptionsInfo(scss=True, category='source_notes', type='value', value='none'), source_notes_border_lr_width=OptionsInfo(scss=True, category='source_notes', type='px', value='2px'), source_notes_border_lr_color=OptionsInfo(scss=True, category='source_notes', type='value', value='#D3D3D3'), source_notes_multiline=OptionsInfo(scss=False, category='source_notes', type='boolean', value=True), source_notes_sep=OptionsInfo(scss=False, category='source_notes', type='value', value=' '), row_striping_background_color=OptionsInfo(scss=True, category='row', type='value', value='#F4F4F4'), row_striping_include_stub=OptionsInfo(scss=False, category='row', type='boolean', value=False), row_striping_include_table_body=OptionsInfo(scss=False, category='row', type='boolean', value=False), container_width=OptionsInfo(scss=False, category='container', type='px', value='auto'), container_height=OptionsInfo(scss=False, category='container', type='px', value='auto'), container_padding_x=OptionsInfo(scss=False, category='container', type='px', value='0px'), container_padding_y=OptionsInfo(scss=False, category='container', type='px', value='10px'), container_overflow_x=OptionsInfo(scss=False, category='container', type='overflow', value='auto'), container_overflow_y=OptionsInfo(scss=False, category='container', type='overflow', value='auto'), quarto_disable_processing=OptionsInfo(scss=False, category='quarto', type='logical', value=False), quarto_use_bootstrap=OptionsInfo(scss=False, category='quarto', type='logical', value=False), ihtml_active=OptionsInfo(scss=False, category='ihtml', type='boolean', value=False), ihtml_use_pagination=OptionsInfo(scss=False, category='ihtml', type='boolean', value=True), ihtml_use_pagination_info=OptionsInfo(scss=False, category='ihtml', type='boolean', value=True), ihtml_use_sorting=OptionsInfo(scss=False, category='ihtml', type='boolean', value=True), ihtml_use_search=OptionsInfo(scss=False, category='ihtml', type='boolean', value=False), ihtml_use_filters=OptionsInfo(scss=False, category='ihtml', type='boolean', value=False), ihtml_use_resizers=OptionsInfo(scss=False, category='ihtml', type='boolean', value=False), ihtml_use_highlight=OptionsInfo(scss=False, category='ihtml', type='boolean', value=False), ihtml_use_compact_mode=OptionsInfo(scss=False, category='ihtml', type='boolean', value=False), ihtml_use_text_wrapping=OptionsInfo(scss=False, category='ihtml', type='boolean', value=True), ihtml_use_page_size_select=OptionsInfo(scss=False, category='ihtml', type='boolean', value=False), ihtml_page_size_default=OptionsInfo(scss=False, category='ihtml', type='value', value=10), ihtml_page_size_values=OptionsInfo(scss=False, category='ihtml', type='values', value=[10, 25, 50, 100]), ihtml_pagination_type=OptionsInfo(scss=False, category='ihtml', type='value', value='numbers'), ihtml_height=OptionsInfo(scss=False, category='ihtml', type='value', value='auto'), ihtml_selection_mode=OptionsInfo(scss=False, category='ihtml', type='value', value=None)), _google_font_imports=GoogleFontImports(imports=frozenset()), _has_built=False)</w:t>
+        <w:t xml:space="preserve">16    16          A4   E4      329.63      1.00         10.25, _body=&lt;great_tables._gt_data.Body object at 0xfe52a03e7cf0&gt;, _boxhead=Boxhead([ColInfo(var='Paso', type=&lt;ColInfoTypeEnum.default: 1&gt;, column_label='Paso', column_align='center', column_width=None, stub_level=None), ColInfo(var='Estado ant.', type=&lt;ColInfoTypeEnum.default: 1&gt;, column_label='Estado ant.', column_align='left', column_width=None, stub_level=None), ColInfo(var='Nota', type=&lt;ColInfoTypeEnum.default: 1&gt;, column_label='Nota', column_align='left', column_width=None, stub_level=None), ColInfo(var='Frecuencia', type=&lt;ColInfoTypeEnum.default: 1&gt;, column_label='Frecuencia', column_align='right', column_width=None, stub_level=None), ColInfo(var='Duración', type=&lt;ColInfoTypeEnum.default: 1&gt;, column_label='Duración', column_align='right', column_width=None, stub_level=None), ColInfo(var='Tiempo acum.', type=&lt;ColInfoTypeEnum.default: 1&gt;, column_label='Tiempo acum.', column_align='right', column_width=None, stub_level=None)]), _stub=&lt;great_tables._gt_data.Stub object at 0xfe52a29269e0&gt;, _spanners=Spanners([]), _heading=Heading(title='Secuencia: 16 Transiciones', subtitle=None, preheader=None), _stubhead=None, _summary_rows=&lt;great_tables._gt_data.SummaryRows object at 0xfe52a2547850&gt;, _summary_rows_grand=&lt;great_tables._gt_data.SummaryRows object at 0xfe52a2547950&gt;, _source_notes=[], _footnotes=[], _styles=[], _locale=&lt;great_tables._gt_data.Locale object at 0xfe52a2563a80&gt;, _formats=[], _substitutions=[], _col_merge=[], _transforms=[], _options=Options(table_id=OptionsInfo(scss=False, category='table', type='value', value=None), table_caption=OptionsInfo(scss=False, category='table', type='value', value=None), table_width=OptionsInfo(scss=True, category='table', type='px', value='auto'), table_layout=OptionsInfo(scss=True, category='table', type='value', value='fixed'), table_margin_left=OptionsInfo(scss=True, category='table', type='px', value='auto'), table_margin_right=OptionsInfo(scss=True, category='table', type='px', value='auto'), table_background_color=OptionsInfo(scss=True, category='table', type='value', value='#FFFFFF'), table_additional_css=OptionsInfo(scss=False, category='table', type='values', value=[]), table_font_names=OptionsInfo(scss=False, category='table', type='values', value=['-apple-system', 'BlinkMacSystemFont', 'Segoe UI', 'Roboto', 'Oxygen', 'Ubuntu', 'Cantarell', 'Helvetica Neue', 'Fira Sans', 'Droid Sans', 'Arial', 'sans-serif']), table_font_size=OptionsInfo(scss=True, category='table', type='px', value='16px'), table_font_weight=OptionsInfo(scss=True, category='table', type='value', value='normal'), table_font_style=OptionsInfo(scss=True, category='table', type='value', value='normal'), table_font_color=OptionsInfo(scss=True, category='table', type='value', value='#333333'), table_font_color_light=OptionsInfo(scss=True, category='table', type='value', value='#FFFFFF'), table_border_top_include=OptionsInfo(scss=False, category='table', type='boolean', value=True), table_border_top_style=OptionsInfo(scss=True, category='table', type='value', value='solid'), table_border_top_width=OptionsInfo(scss=True, category='table', type='px', value='2px'), table_border_top_color=OptionsInfo(scss=True, category='table', type='value', value='#A8A8A8'), table_border_right_style=OptionsInfo(scss=True, category='table', type='value', value='none'), table_border_right_width=OptionsInfo(scss=True, category='table', type='px', value='2px'), table_border_right_color=OptionsInfo(scss=True, category='table', type='value', value='#D3D3D3'), table_border_bottom_include=OptionsInfo(scss=False, category='table', type='boolean', value=True), table_border_bottom_style=OptionsInfo(scss=True, category='table', type='value', value='solid'), table_border_bottom_width=OptionsInfo(scss=True, category='table', type='px', value='2px'), table_border_bottom_color=OptionsInfo(scss=True, category='table', type='value', value='#A8A8A8'), table_border_left_style=OptionsInfo(scss=True, category='table', type='value', value='none'), table_border_left_width=OptionsInfo(scss=True, category='table', type='px', value='2px'), table_border_left_color=OptionsInfo(scss=True, category='table', type='value', value='#D3D3D3'), heading_background_color=OptionsInfo(scss=True, category='heading', type='value', value=None), heading_align=OptionsInfo(scss=True, category='heading', type='value', value='center'), heading_title_font_size=OptionsInfo(scss=True, category='heading', type='px', value='125%'), heading_title_font_weight=OptionsInfo(scss=True, category='heading', type='value', value='initial'), heading_subtitle_font_size=OptionsInfo(scss=True, category='heading', type='px', value='85%'), heading_subtitle_font_weight=OptionsInfo(scss=True, category='heading', type='value', value='initial'), heading_padding=OptionsInfo(scss=True, category='heading', type='px', value='4px'), heading_padding_horizontal=OptionsInfo(scss=True, category='heading', type='px', value='5px'), heading_border_bottom_style=OptionsInfo(scss=True, category='heading', type='value', value='solid'), heading_border_bottom_width=OptionsInfo(scss=True, category='heading', type='px', value='2px'), heading_border_bottom_color=OptionsInfo(scss=True, category='heading', type='value', value='#D3D3D3'), heading_border_lr_style=OptionsInfo(scss=True, category='heading', type='value', value='none'), heading_border_lr_width=OptionsInfo(scss=True, category='heading', type='px', value='1px'), heading_border_lr_color=OptionsInfo(scss=True, category='heading', type='value', value='#D3D3D3'), column_labels_background_color=OptionsInfo(scss=True, category='column_labels', type='value', value=None), column_labels_font_size=OptionsInfo(scss=True, category='column_labels', type='px', value='100%'), column_labels_font_weight=OptionsInfo(scss=True, category='column_labels', type='value', value='normal'), column_labels_text_transform=OptionsInfo(scss=True, category='column_labels', type='value', value='inherit'), column_labels_padding=OptionsInfo(scss=True, category='column_labels', type='px', value='5px'), column_labels_padding_horizontal=OptionsInfo(scss=True, category='column_labels', type='px', value='5px'), column_labels_vlines_style=OptionsInfo(scss=True, category='table_body', type='value', value='none'), column_labels_vlines_width=OptionsInfo(scss=True, category='table_body', type='px', value='1px'), column_labels_vlines_color=OptionsInfo(scss=True, category='table_body', type='value', value='#D3D3D3'), column_labels_border_top_style=OptionsInfo(scss=True, category='column_labels', type='value', value='solid'), column_labels_border_top_width=OptionsInfo(scss=True, category='column_labels', type='px', value='2px'), column_labels_border_top_color=OptionsInfo(scss=True, category='column_labels', type='value', value='#D3D3D3'), column_labels_border_bottom_style=OptionsInfo(scss=True, category='column_labels', type='value', value='solid'), column_labels_border_bottom_width=OptionsInfo(scss=True, category='column_labels', type='px', value='2px'), column_labels_border_bottom_color=OptionsInfo(scss=True, category='column_labels', type='value', value='#D3D3D3'), column_labels_border_lr_style=OptionsInfo(scss=True, category='column_labels', type='value', value='none'), column_labels_border_lr_width=OptionsInfo(scss=True, category='column_labels', type='px', value='1px'), column_labels_border_lr_color=OptionsInfo(scss=True, category='column_labels', type='value', value='#D3D3D3'), column_labels_hidden=OptionsInfo(scss=False, category='column_labels', type='boolean', value=False), row_group_background_color=OptionsInfo(scss=True, category='row_group', type='value', value=None), row_group_font_size=OptionsInfo(scss=True, category='row_group', type='px', value='100%'), row_group_font_weight=OptionsInfo(scss=True, category='row_group', type='value', value='initial'), row_group_text_transform=OptionsInfo(scss=True, category='row_group', type='value', value='inherit'), row_group_padding=OptionsInfo(scss=True, category='row_group', type='px', value='8px'), row_group_padding_horizontal=OptionsInfo(scss=True, category='row_group', type='px', value='5px'), row_group_border_top_style=OptionsInfo(scss=True, category='row_group', type='value', value='solid'), row_group_border_top_width=OptionsInfo(scss=True, category='row_group', type='px', value='2px'), row_group_border_top_color=OptionsInfo(scss=True, category='row_group', type='value', value='#D3D3D3'), row_group_border_right_style=OptionsInfo(scss=True, category='row_group', type='value', value='none'), row_group_border_right_width=OptionsInfo(scss=True, category='row_group', type='px', value='1px'), row_group_border_right_color=OptionsInfo(scss=True, category='row_group', type='value', value='#D3D3D3'), row_group_border_bottom_style=OptionsInfo(scss=True, category='row_group', type='value', value='solid'), row_group_border_bottom_width=OptionsInfo(scss=True, category='row_group', type='px', value='2px'), row_group_border_bottom_color=OptionsInfo(scss=True, category='row_group', type='value', value='#D3D3D3'), row_group_border_left_style=OptionsInfo(scss=True, category='row_group', type='value', value='none'), row_group_border_left_width=OptionsInfo(scss=True, category='row_group', type='px', value='1px'), row_group_border_left_color=OptionsInfo(scss=True, category='row_group', type='value', value='#D3D3D3'), row_group_as_column=OptionsInfo(scss=False, category='row_group', type='boolean', value=False), table_body_hlines_style=OptionsInfo(scss=True, category='table_body', type='value', value='solid'), table_body_hlines_width=OptionsInfo(scss=True, category='table_body', type='px', value='1px'), table_body_hlines_color=OptionsInfo(scss=True, category='table_body', type='value', value='#D3D3D3'), table_body_vlines_style=OptionsInfo(scss=True, category='table_body', type='value', value='none'), table_body_vlines_width=OptionsInfo(scss=True, category='table_body', type='px', value='1px'), table_body_vlines_color=OptionsInfo(scss=True, category='table_body', type='value', value='#D3D3D3'), table_body_border_top_style=OptionsInfo(scss=True, category='table_body', type='value', value='solid'), table_body_border_top_width=OptionsInfo(scss=True, category='table_body', type='px', value='2px'), table_body_border_top_color=OptionsInfo(scss=True, category='table_body', type='value', value='#D3D3D3'), table_body_border_bottom_style=OptionsInfo(scss=True, category='table_body', type='value', value='solid'), table_body_border_bottom_width=OptionsInfo(scss=True, category='table_body', type='px', value='2px'), table_body_border_bottom_color=OptionsInfo(scss=True, category='table_body', type='value', value='#D3D3D3'), data_row_padding=OptionsInfo(scss=True, category='data_row', type='px', value='8px'), data_row_padding_horizontal=OptionsInfo(scss=True, category='data_row', type='px', value='5px'), stub_background_color=OptionsInfo(scss=True, category='stub', type='value', value=None), stub_font_size=OptionsInfo(scss=True, category='stub', type='px', value='100%'), stub_font_weight=OptionsInfo(scss=True, category='stub', type='value', value='initial'), stub_text_transform=OptionsInfo(scss=True, category='stub', type='value', value='inherit'), stub_border_style=OptionsInfo(scss=True, category='stub', type='value', value='solid'), stub_border_width=OptionsInfo(scss=True, category='stub', type='px', value='2px'), stub_border_color=OptionsInfo(scss=True, category='stub', type='value', value='#D3D3D3'), stub_indent_length=OptionsInfo(scss=True, category='stub', type='px', value='5px'), stub_row_group_background_color=OptionsInfo(scss=True, category='stub', type='value', value=None), stub_row_group_font_size=OptionsInfo(scss=True, category='stub', type='px', value='100%'), stub_row_group_font_weight=OptionsInfo(scss=True, category='stub', type='value', value='initial'), stub_row_group_text_transform=OptionsInfo(scss=True, category='stub', type='value', value='inherit'), stub_row_group_border_style=OptionsInfo(scss=True, category='stub', type='value', value='solid'), stub_row_group_border_width=OptionsInfo(scss=True, category='stub', type='px', value='2px'), stub_row_group_border_color=OptionsInfo(scss=True, category='stub', type='value', value='#D3D3D3'), summary_row_padding=OptionsInfo(scss=True, category='summary_row', type='px', value='8px'), summary_row_padding_horizontal=OptionsInfo(scss=True, category='summary_row', type='px', value='5px'), summary_row_background_color=OptionsInfo(scss=True, category='summary_row', type='value', value=None), summary_row_text_transform=OptionsInfo(scss=True, category='summary_row', type='value', value='inherit'), summary_row_border_style=OptionsInfo(scss=True, category='summary_row', type='value', value='solid'), summary_row_border_width=OptionsInfo(scss=True, category='summary_row', type='px', value='2px'), summary_row_border_color=OptionsInfo(scss=True, category='summary_row', type='value', value='#D3D3D3'), grand_summary_row_padding=OptionsInfo(scss=True, category='grand_summary_row', type='px', value='8px'), grand_summary_row_padding_horizontal=OptionsInfo(scss=True, category='grand_summary_row', type='px', value='5px'), grand_summary_row_background_color=OptionsInfo(scss=True, category='grand_summary_row', type='value', value=None), grand_summary_row_text_transform=OptionsInfo(scss=True, category='grand_summary_row', type='value', value='inherit'), grand_summary_row_border_style=OptionsInfo(scss=True, category='grand_summary_row', type='value', value='double'), grand_summary_row_border_width=OptionsInfo(scss=True, category='grand_summary_row', type='px', value='6px'), grand_summary_row_border_color=OptionsInfo(scss=True, category='grand_summary_row', type='value', value='#D3D3D3'), footnotes_marks=OptionsInfo(scss=False, category='footnotes', type='values', value='numbers'), footnotes_spec_ref=OptionsInfo(scss=False, category='footnotes', type='value', value='^i'), footnotes_spec_ftr=OptionsInfo(scss=False, category='footnotes', type='value', value='^i'), footnotes_order=OptionsInfo(scss=False, category='footnotes', type='value', value='marks_last'), source_notes_padding=OptionsInfo(scss=True, category='source_notes', type='px', value='4px'), source_notes_padding_horizontal=OptionsInfo(scss=True, category='source_notes', type='px', value='5px'), source_notes_background_color=OptionsInfo(scss=True, category='source_notes', type='value', value=None), source_notes_font_size=OptionsInfo(scss=True, category='source_notes', type='px', value='90%'), source_notes_border_bottom_style=OptionsInfo(scss=True, category='source_notes', type='value', value='none'), source_notes_border_bottom_width=OptionsInfo(scss=True, category='source_notes', type='px', value='2px'), source_notes_border_bottom_color=OptionsInfo(scss=True, category='source_notes', type='value', value='#D3D3D3'), source_notes_border_lr_style=OptionsInfo(scss=True, category='source_notes', type='value', value='none'), source_notes_border_lr_width=OptionsInfo(scss=True, category='source_notes', type='px', value='2px'), source_notes_border_lr_color=OptionsInfo(scss=True, category='source_notes', type='value', value='#D3D3D3'), source_notes_multiline=OptionsInfo(scss=False, category='source_notes', type='boolean', value=True), source_notes_sep=OptionsInfo(scss=False, category='source_notes', type='value', value=' '), row_striping_background_color=OptionsInfo(scss=True, category='row', type='value', value='#F4F4F4'), row_striping_include_stub=OptionsInfo(scss=False, category='row', type='boolean', value=False), row_striping_include_table_body=OptionsInfo(scss=False, category='row', type='boolean', value=False), container_width=OptionsInfo(scss=False, category='container', type='px', value='auto'), container_height=OptionsInfo(scss=False, category='container', type='px', value='auto'), container_padding_x=OptionsInfo(scss=False, category='container', type='px', value='0px'), container_padding_y=OptionsInfo(scss=False, category='container', type='px', value='10px'), container_overflow_x=OptionsInfo(scss=False, category='container', type='overflow', value='auto'), container_overflow_y=OptionsInfo(scss=False, category='container', type='overflow', value='auto'), quarto_disable_processing=OptionsInfo(scss=False, category='quarto', type='logical', value=False), quarto_use_bootstrap=OptionsInfo(scss=False, category='quarto', type='logical', value=False), ihtml_active=OptionsInfo(scss=False, category='ihtml', type='boolean', value=False), ihtml_use_pagination=OptionsInfo(scss=False, category='ihtml', type='boolean', value=True), ihtml_use_pagination_info=OptionsInfo(scss=False, category='ihtml', type='boolean', value=True), ihtml_use_sorting=OptionsInfo(scss=False, category='ihtml', type='boolean', value=True), ihtml_use_search=OptionsInfo(scss=False, category='ihtml', type='boolean', value=False), ihtml_use_filters=OptionsInfo(scss=False, category='ihtml', type='boolean', value=False), ihtml_use_resizers=OptionsInfo(scss=False, category='ihtml', type='boolean', value=False), ihtml_use_highlight=OptionsInfo(scss=False, category='ihtml', type='boolean', value=False), ihtml_use_compact_mode=OptionsInfo(scss=False, category='ihtml', type='boolean', value=False), ihtml_use_text_wrapping=OptionsInfo(scss=False, category='ihtml', type='boolean', value=True), ihtml_use_page_size_select=OptionsInfo(scss=False, category='ihtml', type='boolean', value=False), ihtml_page_size_default=OptionsInfo(scss=False, category='ihtml', type='value', value=10), ihtml_page_size_values=OptionsInfo(scss=False, category='ihtml', type='values', value=[10, 25, 50, 100]), ihtml_pagination_type=OptionsInfo(scss=False, category='ihtml', type='value', value='numbers'), ihtml_height=OptionsInfo(scss=False, category='ihtml', type='value', value='auto'), ihtml_selection_mode=OptionsInfo(scss=False, category='ihtml', type='value', value=None)), _google_font_imports=GoogleFontImports(imports=frozenset()), _has_built=False)</w:t>
       </w:r>
     </w:p>
     <w:bookmarkEnd w:id="38"/>
@@ -3290,6 +3290,135 @@
       </w:r>
       <w:r>
         <w:rPr>
+          <w:rStyle w:val="NormalTok"/>
+        </w:rPr>
+        <w:t xml:space="preserve">assets_dir </w:t>
+      </w:r>
+      <w:r>
+        <w:rPr>
+          <w:rStyle w:val="OperatorTok"/>
+        </w:rPr>
+        <w:t xml:space="preserve">=</w:t>
+      </w:r>
+      <w:r>
+        <w:rPr>
+          <w:rStyle w:val="NormalTok"/>
+        </w:rPr>
+        <w:t xml:space="preserve"> Path(</w:t>
+      </w:r>
+      <w:r>
+        <w:rPr>
+          <w:rStyle w:val="StringTok"/>
+        </w:rPr>
+        <w:t xml:space="preserve">"assets"</w:t>
+      </w:r>
+      <w:r>
+        <w:rPr>
+          <w:rStyle w:val="NormalTok"/>
+        </w:rPr>
+        <w:t xml:space="preserve">) </w:t>
+      </w:r>
+      <w:r>
+        <w:rPr>
+          <w:rStyle w:val="ControlFlowTok"/>
+        </w:rPr>
+        <w:t xml:space="preserve">if</w:t>
+      </w:r>
+      <w:r>
+        <w:rPr>
+          <w:rStyle w:val="NormalTok"/>
+        </w:rPr>
+        <w:t xml:space="preserve"> Path(</w:t>
+      </w:r>
+      <w:r>
+        <w:rPr>
+          <w:rStyle w:val="StringTok"/>
+        </w:rPr>
+        <w:t xml:space="preserve">"assets"</w:t>
+      </w:r>
+      <w:r>
+        <w:rPr>
+          <w:rStyle w:val="NormalTok"/>
+        </w:rPr>
+        <w:t xml:space="preserve">).is_dir() </w:t>
+      </w:r>
+      <w:r>
+        <w:rPr>
+          <w:rStyle w:val="ControlFlowTok"/>
+        </w:rPr>
+        <w:t xml:space="preserve">else</w:t>
+      </w:r>
+      <w:r>
+        <w:rPr>
+          <w:rStyle w:val="NormalTok"/>
+        </w:rPr>
+        <w:t xml:space="preserve"> Path(</w:t>
+      </w:r>
+      <w:r>
+        <w:rPr>
+          <w:rStyle w:val="StringTok"/>
+        </w:rPr>
+        <w:t xml:space="preserve">"../assets"</w:t>
+      </w:r>
+      <w:r>
+        <w:rPr>
+          <w:rStyle w:val="NormalTok"/>
+        </w:rPr>
+        <w:t xml:space="preserve">)</w:t>
+      </w:r>
+      <w:r>
+        <w:br/>
+      </w:r>
+      <w:r>
+        <w:rPr>
+          <w:rStyle w:val="NormalTok"/>
+        </w:rPr>
+        <w:t xml:space="preserve">assets_dir.mkdir(parents</w:t>
+      </w:r>
+      <w:r>
+        <w:rPr>
+          <w:rStyle w:val="OperatorTok"/>
+        </w:rPr>
+        <w:t xml:space="preserve">=</w:t>
+      </w:r>
+      <w:r>
+        <w:rPr>
+          <w:rStyle w:val="VariableTok"/>
+        </w:rPr>
+        <w:t xml:space="preserve">True</w:t>
+      </w:r>
+      <w:r>
+        <w:rPr>
+          <w:rStyle w:val="NormalTok"/>
+        </w:rPr>
+        <w:t xml:space="preserve">, exist_ok</w:t>
+      </w:r>
+      <w:r>
+        <w:rPr>
+          <w:rStyle w:val="OperatorTok"/>
+        </w:rPr>
+        <w:t xml:space="preserve">=</w:t>
+      </w:r>
+      <w:r>
+        <w:rPr>
+          <w:rStyle w:val="VariableTok"/>
+        </w:rPr>
+        <w:t xml:space="preserve">True</w:t>
+      </w:r>
+      <w:r>
+        <w:rPr>
+          <w:rStyle w:val="NormalTok"/>
+        </w:rPr>
+        <w:t xml:space="preserve">)</w:t>
+      </w:r>
+      <w:r>
+        <w:br/>
+      </w:r>
+      <w:r>
+        <w:br/>
+      </w:r>
+      <w:r>
+        <w:rPr>
           <w:rStyle w:val="KeywordTok"/>
         </w:rPr>
         <w:t xml:space="preserve">def</w:t>
@@ -6835,6 +6964,105 @@
         <w:rPr>
           <w:rStyle w:val="NormalTok"/>
         </w:rPr>
+        <w:t xml:space="preserve">fig_heatmap.savefig(</w:t>
+      </w:r>
+      <w:r>
+        <w:br/>
+      </w:r>
+      <w:r>
+        <w:rPr>
+          <w:rStyle w:val="NormalTok"/>
+        </w:rPr>
+        <w:t xml:space="preserve">    assets_dir </w:t>
+      </w:r>
+      <w:r>
+        <w:rPr>
+          <w:rStyle w:val="OperatorTok"/>
+        </w:rPr>
+        <w:t xml:space="preserve">/</w:t>
+      </w:r>
+      <w:r>
+        <w:rPr>
+          <w:rStyle w:val="NormalTok"/>
+        </w:rPr>
+        <w:t xml:space="preserve"> </w:t>
+      </w:r>
+      <w:r>
+        <w:rPr>
+          <w:rStyle w:val="StringTok"/>
+        </w:rPr>
+        <w:t xml:space="preserve">"mapa_calor_transiciones.png"</w:t>
+      </w:r>
+      <w:r>
+        <w:rPr>
+          <w:rStyle w:val="NormalTok"/>
+        </w:rPr>
+        <w:t xml:space="preserve">,</w:t>
+      </w:r>
+      <w:r>
+        <w:br/>
+      </w:r>
+      <w:r>
+        <w:rPr>
+          <w:rStyle w:val="NormalTok"/>
+        </w:rPr>
+        <w:t xml:space="preserve">    dpi</w:t>
+      </w:r>
+      <w:r>
+        <w:rPr>
+          <w:rStyle w:val="OperatorTok"/>
+        </w:rPr>
+        <w:t xml:space="preserve">=</w:t>
+      </w:r>
+      <w:r>
+        <w:rPr>
+          <w:rStyle w:val="DecValTok"/>
+        </w:rPr>
+        <w:t xml:space="preserve">200</w:t>
+      </w:r>
+      <w:r>
+        <w:rPr>
+          <w:rStyle w:val="NormalTok"/>
+        </w:rPr>
+        <w:t xml:space="preserve">,</w:t>
+      </w:r>
+      <w:r>
+        <w:br/>
+      </w:r>
+      <w:r>
+        <w:rPr>
+          <w:rStyle w:val="NormalTok"/>
+        </w:rPr>
+        <w:t xml:space="preserve">    bbox_inches</w:t>
+      </w:r>
+      <w:r>
+        <w:rPr>
+          <w:rStyle w:val="OperatorTok"/>
+        </w:rPr>
+        <w:t xml:space="preserve">=</w:t>
+      </w:r>
+      <w:r>
+        <w:rPr>
+          <w:rStyle w:val="StringTok"/>
+        </w:rPr>
+        <w:t xml:space="preserve">"tight"</w:t>
+      </w:r>
+      <w:r>
+        <w:br/>
+      </w:r>
+      <w:r>
+        <w:rPr>
+          <w:rStyle w:val="NormalTok"/>
+        </w:rPr>
+        <w:t xml:space="preserve">)</w:t>
+      </w:r>
+      <w:r>
+        <w:br/>
+      </w:r>
+      <w:r>
+        <w:rPr>
+          <w:rStyle w:val="NormalTok"/>
+        </w:rPr>
         <w:t xml:space="preserve">plt.show()</w:t>
       </w:r>
       <w:r>
@@ -7631,6 +7859,105 @@
           <w:rStyle w:val="StringTok"/>
         </w:rPr>
         <w:t xml:space="preserve">"Ocupación Límite Asintótica en Estado Estacionario"</w:t>
+      </w:r>
+      <w:r>
+        <w:br/>
+      </w:r>
+      <w:r>
+        <w:rPr>
+          <w:rStyle w:val="NormalTok"/>
+        </w:rPr>
+        <w:t xml:space="preserve">)</w:t>
+      </w:r>
+      <w:r>
+        <w:br/>
+      </w:r>
+      <w:r>
+        <w:rPr>
+          <w:rStyle w:val="NormalTok"/>
+        </w:rPr>
+        <w:t xml:space="preserve">fig_stat.savefig(</w:t>
+      </w:r>
+      <w:r>
+        <w:br/>
+      </w:r>
+      <w:r>
+        <w:rPr>
+          <w:rStyle w:val="NormalTok"/>
+        </w:rPr>
+        <w:t xml:space="preserve">    assets_dir </w:t>
+      </w:r>
+      <w:r>
+        <w:rPr>
+          <w:rStyle w:val="OperatorTok"/>
+        </w:rPr>
+        <w:t xml:space="preserve">/</w:t>
+      </w:r>
+      <w:r>
+        <w:rPr>
+          <w:rStyle w:val="NormalTok"/>
+        </w:rPr>
+        <w:t xml:space="preserve"> </w:t>
+      </w:r>
+      <w:r>
+        <w:rPr>
+          <w:rStyle w:val="StringTok"/>
+        </w:rPr>
+        <w:t xml:space="preserve">"distribucion_estacionaria.png"</w:t>
+      </w:r>
+      <w:r>
+        <w:rPr>
+          <w:rStyle w:val="NormalTok"/>
+        </w:rPr>
+        <w:t xml:space="preserve">,</w:t>
+      </w:r>
+      <w:r>
+        <w:br/>
+      </w:r>
+      <w:r>
+        <w:rPr>
+          <w:rStyle w:val="NormalTok"/>
+        </w:rPr>
+        <w:t xml:space="preserve">    dpi</w:t>
+      </w:r>
+      <w:r>
+        <w:rPr>
+          <w:rStyle w:val="OperatorTok"/>
+        </w:rPr>
+        <w:t xml:space="preserve">=</w:t>
+      </w:r>
+      <w:r>
+        <w:rPr>
+          <w:rStyle w:val="DecValTok"/>
+        </w:rPr>
+        <w:t xml:space="preserve">200</w:t>
+      </w:r>
+      <w:r>
+        <w:rPr>
+          <w:rStyle w:val="NormalTok"/>
+        </w:rPr>
+        <w:t xml:space="preserve">,</w:t>
+      </w:r>
+      <w:r>
+        <w:br/>
+      </w:r>
+      <w:r>
+        <w:rPr>
+          <w:rStyle w:val="NormalTok"/>
+        </w:rPr>
+        <w:t xml:space="preserve">    bbox_inches</w:t>
+      </w:r>
+      <w:r>
+        <w:rPr>
+          <w:rStyle w:val="OperatorTok"/>
+        </w:rPr>
+        <w:t xml:space="preserve">=</w:t>
+      </w:r>
+      <w:r>
+        <w:rPr>
+          <w:rStyle w:val="StringTok"/>
+        </w:rPr>
+        <w:t xml:space="preserve">"tight"</w:t>
       </w:r>
       <w:r>
         <w:br/>
@@ -8915,6 +9242,105 @@
           <w:rStyle w:val="StringTok"/>
         </w:rPr>
         <w:t xml:space="preserve">"Trayectoria Melódica Estocástica (16 pasos en Re Mayor)"</w:t>
+      </w:r>
+      <w:r>
+        <w:br/>
+      </w:r>
+      <w:r>
+        <w:rPr>
+          <w:rStyle w:val="NormalTok"/>
+        </w:rPr>
+        <w:t xml:space="preserve">)</w:t>
+      </w:r>
+      <w:r>
+        <w:br/>
+      </w:r>
+      <w:r>
+        <w:rPr>
+          <w:rStyle w:val="NormalTok"/>
+        </w:rPr>
+        <w:t xml:space="preserve">fig_roll.savefig(</w:t>
+      </w:r>
+      <w:r>
+        <w:br/>
+      </w:r>
+      <w:r>
+        <w:rPr>
+          <w:rStyle w:val="NormalTok"/>
+        </w:rPr>
+        <w:t xml:space="preserve">    assets_dir </w:t>
+      </w:r>
+      <w:r>
+        <w:rPr>
+          <w:rStyle w:val="OperatorTok"/>
+        </w:rPr>
+        <w:t xml:space="preserve">/</w:t>
+      </w:r>
+      <w:r>
+        <w:rPr>
+          <w:rStyle w:val="NormalTok"/>
+        </w:rPr>
+        <w:t xml:space="preserve"> </w:t>
+      </w:r>
+      <w:r>
+        <w:rPr>
+          <w:rStyle w:val="StringTok"/>
+        </w:rPr>
+        <w:t xml:space="preserve">"trayectoria_melodica_16.png"</w:t>
+      </w:r>
+      <w:r>
+        <w:rPr>
+          <w:rStyle w:val="NormalTok"/>
+        </w:rPr>
+        <w:t xml:space="preserve">,</w:t>
+      </w:r>
+      <w:r>
+        <w:br/>
+      </w:r>
+      <w:r>
+        <w:rPr>
+          <w:rStyle w:val="NormalTok"/>
+        </w:rPr>
+        <w:t xml:space="preserve">    dpi</w:t>
+      </w:r>
+      <w:r>
+        <w:rPr>
+          <w:rStyle w:val="OperatorTok"/>
+        </w:rPr>
+        <w:t xml:space="preserve">=</w:t>
+      </w:r>
+      <w:r>
+        <w:rPr>
+          <w:rStyle w:val="DecValTok"/>
+        </w:rPr>
+        <w:t xml:space="preserve">200</w:t>
+      </w:r>
+      <w:r>
+        <w:rPr>
+          <w:rStyle w:val="NormalTok"/>
+        </w:rPr>
+        <w:t xml:space="preserve">,</w:t>
+      </w:r>
+      <w:r>
+        <w:br/>
+      </w:r>
+      <w:r>
+        <w:rPr>
+          <w:rStyle w:val="NormalTok"/>
+        </w:rPr>
+        <w:t xml:space="preserve">    bbox_inches</w:t>
+      </w:r>
+      <w:r>
+        <w:rPr>
+          <w:rStyle w:val="OperatorTok"/>
+        </w:rPr>
+        <w:t xml:space="preserve">=</w:t>
+      </w:r>
+      <w:r>
+        <w:rPr>
+          <w:rStyle w:val="StringTok"/>
+        </w:rPr>
+        <w:t xml:space="preserve">"tight"</w:t>
       </w:r>
       <w:r>
         <w:br/>

</xml_diff>

<commit_message>
feat(quant): remove student names and conversational class references
</commit_message>
<xml_diff>
--- a/m4-quant/act 2/export/Actividad_4_2_A01750536.docx
+++ b/m4-quant/act 2/export/Actividad_4_2_A01750536.docx
@@ -330,7 +330,7 @@
         <w:rPr>
           <w:rStyle w:val="VerbatimChar"/>
         </w:rPr>
-        <w:t xml:space="preserve">6           Duraciones      4 figuras (120 BPM), _body=&lt;great_tables._gt_data.Body object at 0xfe52a2903230&gt;, _boxhead=Boxhead([ColInfo(var='Parámetro', type=&lt;ColInfoTypeEnum.default: 1&gt;, column_label='Parámetro', column_align='left', column_width=None, stub_level=None), ColInfo(var='Valor', type=&lt;ColInfoTypeEnum.default: 1&gt;, column_label='Valor', column_align='right', column_width=None, stub_level=None)]), _stub=&lt;great_tables._gt_data.Stub object at 0xfe52a29030e0&gt;, _spanners=Spanners([]), _heading=Heading(title='Resumen del Sistema y Síntesis Acústica', subtitle=None, preheader=None), _stubhead=None, _summary_rows=&lt;great_tables._gt_data.SummaryRows object at 0xfe52a2903770&gt;, _summary_rows_grand=&lt;great_tables._gt_data.SummaryRows object at 0xfe52a29956d0&gt;, _source_notes=[], _footnotes=[], _styles=[], _locale=&lt;great_tables._gt_data.Locale object at 0xfe52a29038c0&gt;, _formats=[], _substitutions=[], _col_merge=[], _transforms=[], _options=Options(table_id=OptionsInfo(scss=False, category='table', type='value', value=None), table_caption=OptionsInfo(scss=False, category='table', type='value', value=None), table_width=OptionsInfo(scss=True, category='table', type='px', value='auto'), table_layout=OptionsInfo(scss=True, category='table', type='value', value='fixed'), table_margin_left=OptionsInfo(scss=True, category='table', type='px', value='auto'), table_margin_right=OptionsInfo(scss=True, category='table', type='px', value='auto'), table_background_color=OptionsInfo(scss=True, category='table', type='value', value='#FFFFFF'), table_additional_css=OptionsInfo(scss=False, category='table', type='values', value=[]), table_font_names=OptionsInfo(scss=False, category='table', type='values', value=['-apple-system', 'BlinkMacSystemFont', 'Segoe UI', 'Roboto', 'Oxygen', 'Ubuntu', 'Cantarell', 'Helvetica Neue', 'Fira Sans', 'Droid Sans', 'Arial', 'sans-serif']), table_font_size=OptionsInfo(scss=True, category='table', type='px', value='16px'), table_font_weight=OptionsInfo(scss=True, category='table', type='value', value='normal'), table_font_style=OptionsInfo(scss=True, category='table', type='value', value='normal'), table_font_color=OptionsInfo(scss=True, category='table', type='value', value='#333333'), table_font_color_light=OptionsInfo(scss=True, category='table', type='value', value='#FFFFFF'), table_border_top_include=OptionsInfo(scss=False, category='table', type='boolean', value=True), table_border_top_style=OptionsInfo(scss=True, category='table', type='value', value='solid'), table_border_top_width=OptionsInfo(scss=True, category='table', type='px', value='2px'), table_border_top_color=OptionsInfo(scss=True, category='table', type='value', value='#A8A8A8'), table_border_right_style=OptionsInfo(scss=True, category='table', type='value', value='none'), table_border_right_width=OptionsInfo(scss=True, category='table', type='px', value='2px'), table_border_right_color=OptionsInfo(scss=True, category='table', type='value', value='#D3D3D3'), table_border_bottom_include=OptionsInfo(scss=False, category='table', type='boolean', value=True), table_border_bottom_style=OptionsInfo(scss=True, category='table', type='value', value='solid'), table_border_bottom_width=OptionsInfo(scss=True, category='table', type='px', value='2px'), table_border_bottom_color=OptionsInfo(scss=True, category='table', type='value', value='#A8A8A8'), table_border_left_style=OptionsInfo(scss=True, category='table', type='value', value='none'), table_border_left_width=OptionsInfo(scss=True, category='table', type='px', value='2px'), table_border_left_color=OptionsInfo(scss=True, category='table', type='value', value='#D3D3D3'), heading_background_color=OptionsInfo(scss=True, category='heading', type='value', value=None), heading_align=OptionsInfo(scss=True, category='heading', type='value', value='center'), heading_title_font_size=OptionsInfo(scss=True, category='heading', type='px', value='125%'), heading_title_font_weight=OptionsInfo(scss=True, category='heading', type='value', value='initial'), heading_subtitle_font_size=OptionsInfo(scss=True, category='heading', type='px', value='85%'), heading_subtitle_font_weight=OptionsInfo(scss=True, category='heading', type='value', value='initial'), heading_padding=OptionsInfo(scss=True, category='heading', type='px', value='4px'), heading_padding_horizontal=OptionsInfo(scss=True, category='heading', type='px', value='5px'), heading_border_bottom_style=OptionsInfo(scss=True, category='heading', type='value', value='solid'), heading_border_bottom_width=OptionsInfo(scss=True, category='heading', type='px', value='2px'), heading_border_bottom_color=OptionsInfo(scss=True, category='heading', type='value', value='#D3D3D3'), heading_border_lr_style=OptionsInfo(scss=True, category='heading', type='value', value='none'), heading_border_lr_width=OptionsInfo(scss=True, category='heading', type='px', value='1px'), heading_border_lr_color=OptionsInfo(scss=True, category='heading', type='value', value='#D3D3D3'), column_labels_background_color=OptionsInfo(scss=True, category='column_labels', type='value', value=None), column_labels_font_size=OptionsInfo(scss=True, category='column_labels', type='px', value='100%'), column_labels_font_weight=OptionsInfo(scss=True, category='column_labels', type='value', value='normal'), column_labels_text_transform=OptionsInfo(scss=True, category='column_labels', type='value', value='inherit'), column_labels_padding=OptionsInfo(scss=True, category='column_labels', type='px', value='5px'), column_labels_padding_horizontal=OptionsInfo(scss=True, category='column_labels', type='px', value='5px'), column_labels_vlines_style=OptionsInfo(scss=True, category='table_body', type='value', value='none'), column_labels_vlines_width=OptionsInfo(scss=True, category='table_body', type='px', value='1px'), column_labels_vlines_color=OptionsInfo(scss=True, category='table_body', type='value', value='#D3D3D3'), column_labels_border_top_style=OptionsInfo(scss=True, category='column_labels', type='value', value='solid'), column_labels_border_top_width=OptionsInfo(scss=True, category='column_labels', type='px', value='2px'), column_labels_border_top_color=OptionsInfo(scss=True, category='column_labels', type='value', value='#D3D3D3'), column_labels_border_bottom_style=OptionsInfo(scss=True, category='column_labels', type='value', value='solid'), column_labels_border_bottom_width=OptionsInfo(scss=True, category='column_labels', type='px', value='2px'), column_labels_border_bottom_color=OptionsInfo(scss=True, category='column_labels', type='value', value='#D3D3D3'), column_labels_border_lr_style=OptionsInfo(scss=True, category='column_labels', type='value', value='none'), column_labels_border_lr_width=OptionsInfo(scss=True, category='column_labels', type='px', value='1px'), column_labels_border_lr_color=OptionsInfo(scss=True, category='column_labels', type='value', value='#D3D3D3'), column_labels_hidden=OptionsInfo(scss=False, category='column_labels', type='boolean', value=False), row_group_background_color=OptionsInfo(scss=True, category='row_group', type='value', value=None), row_group_font_size=OptionsInfo(scss=True, category='row_group', type='px', value='100%'), row_group_font_weight=OptionsInfo(scss=True, category='row_group', type='value', value='initial'), row_group_text_transform=OptionsInfo(scss=True, category='row_group', type='value', value='inherit'), row_group_padding=OptionsInfo(scss=True, category='row_group', type='px', value='8px'), row_group_padding_horizontal=OptionsInfo(scss=True, category='row_group', type='px', value='5px'), row_group_border_top_style=OptionsInfo(scss=True, category='row_group', type='value', value='solid'), row_group_border_top_width=OptionsInfo(scss=True, category='row_group', type='px', value='2px'), row_group_border_top_color=OptionsInfo(scss=True, category='row_group', type='value', value='#D3D3D3'), row_group_border_right_style=OptionsInfo(scss=True, category='row_group', type='value', value='none'), row_group_border_right_width=OptionsInfo(scss=True, category='row_group', type='px', value='1px'), row_group_border_right_color=OptionsInfo(scss=True, category='row_group', type='value', value='#D3D3D3'), row_group_border_bottom_style=OptionsInfo(scss=True, category='row_group', type='value', value='solid'), row_group_border_bottom_width=OptionsInfo(scss=True, category='row_group', type='px', value='2px'), row_group_border_bottom_color=OptionsInfo(scss=True, category='row_group', type='value', value='#D3D3D3'), row_group_border_left_style=OptionsInfo(scss=True, category='row_group', type='value', value='none'), row_group_border_left_width=OptionsInfo(scss=True, category='row_group', type='px', value='1px'), row_group_border_left_color=OptionsInfo(scss=True, category='row_group', type='value', value='#D3D3D3'), row_group_as_column=OptionsInfo(scss=False, category='row_group', type='boolean', value=False), table_body_hlines_style=OptionsInfo(scss=True, category='table_body', type='value', value='solid'), table_body_hlines_width=OptionsInfo(scss=True, category='table_body', type='px', value='1px'), table_body_hlines_color=OptionsInfo(scss=True, category='table_body', type='value', value='#D3D3D3'), table_body_vlines_style=OptionsInfo(scss=True, category='table_body', type='value', value='none'), table_body_vlines_width=OptionsInfo(scss=True, category='table_body', type='px', value='1px'), table_body_vlines_color=OptionsInfo(scss=True, category='table_body', type='value', value='#D3D3D3'), table_body_border_top_style=OptionsInfo(scss=True, category='table_body', type='value', value='solid'), table_body_border_top_width=OptionsInfo(scss=True, category='table_body', type='px', value='2px'), table_body_border_top_color=OptionsInfo(scss=True, category='table_body', type='value', value='#D3D3D3'), table_body_border_bottom_style=OptionsInfo(scss=True, category='table_body', type='value', value='solid'), table_body_border_bottom_width=OptionsInfo(scss=True, category='table_body', type='px', value='2px'), table_body_border_bottom_color=OptionsInfo(scss=True, category='table_body', type='value', value='#D3D3D3'), data_row_padding=OptionsInfo(scss=True, category='data_row', type='px', value='8px'), data_row_padding_horizontal=OptionsInfo(scss=True, category='data_row', type='px', value='5px'), stub_background_color=OptionsInfo(scss=True, category='stub', type='value', value=None), stub_font_size=OptionsInfo(scss=True, category='stub', type='px', value='100%'), stub_font_weight=OptionsInfo(scss=True, category='stub', type='value', value='initial'), stub_text_transform=OptionsInfo(scss=True, category='stub', type='value', value='inherit'), stub_border_style=OptionsInfo(scss=True, category='stub', type='value', value='solid'), stub_border_width=OptionsInfo(scss=True, category='stub', type='px', value='2px'), stub_border_color=OptionsInfo(scss=True, category='stub', type='value', value='#D3D3D3'), stub_indent_length=OptionsInfo(scss=True, category='stub', type='px', value='5px'), stub_row_group_background_color=OptionsInfo(scss=True, category='stub', type='value', value=None), stub_row_group_font_size=OptionsInfo(scss=True, category='stub', type='px', value='100%'), stub_row_group_font_weight=OptionsInfo(scss=True, category='stub', type='value', value='initial'), stub_row_group_text_transform=OptionsInfo(scss=True, category='stub', type='value', value='inherit'), stub_row_group_border_style=OptionsInfo(scss=True, category='stub', type='value', value='solid'), stub_row_group_border_width=OptionsInfo(scss=True, category='stub', type='px', value='2px'), stub_row_group_border_color=OptionsInfo(scss=True, category='stub', type='value', value='#D3D3D3'), summary_row_padding=OptionsInfo(scss=True, category='summary_row', type='px', value='8px'), summary_row_padding_horizontal=OptionsInfo(scss=True, category='summary_row', type='px', value='5px'), summary_row_background_color=OptionsInfo(scss=True, category='summary_row', type='value', value=None), summary_row_text_transform=OptionsInfo(scss=True, category='summary_row', type='value', value='inherit'), summary_row_border_style=OptionsInfo(scss=True, category='summary_row', type='value', value='solid'), summary_row_border_width=OptionsInfo(scss=True, category='summary_row', type='px', value='2px'), summary_row_border_color=OptionsInfo(scss=True, category='summary_row', type='value', value='#D3D3D3'), grand_summary_row_padding=OptionsInfo(scss=True, category='grand_summary_row', type='px', value='8px'), grand_summary_row_padding_horizontal=OptionsInfo(scss=True, category='grand_summary_row', type='px', value='5px'), grand_summary_row_background_color=OptionsInfo(scss=True, category='grand_summary_row', type='value', value=None), grand_summary_row_text_transform=OptionsInfo(scss=True, category='grand_summary_row', type='value', value='inherit'), grand_summary_row_border_style=OptionsInfo(scss=True, category='grand_summary_row', type='value', value='double'), grand_summary_row_border_width=OptionsInfo(scss=True, category='grand_summary_row', type='px', value='6px'), grand_summary_row_border_color=OptionsInfo(scss=True, category='grand_summary_row', type='value', value='#D3D3D3'), footnotes_marks=OptionsInfo(scss=False, category='footnotes', type='values', value='numbers'), footnotes_spec_ref=OptionsInfo(scss=False, category='footnotes', type='value', value='^i'), footnotes_spec_ftr=OptionsInfo(scss=False, category='footnotes', type='value', value='^i'), footnotes_order=OptionsInfo(scss=False, category='footnotes', type='value', value='marks_last'), source_notes_padding=OptionsInfo(scss=True, category='source_notes', type='px', value='4px'), source_notes_padding_horizontal=OptionsInfo(scss=True, category='source_notes', type='px', value='5px'), source_notes_background_color=OptionsInfo(scss=True, category='source_notes', type='value', value=None), source_notes_font_size=OptionsInfo(scss=True, category='source_notes', type='px', value='90%'), source_notes_border_bottom_style=OptionsInfo(scss=True, category='source_notes', type='value', value='none'), source_notes_border_bottom_width=OptionsInfo(scss=True, category='source_notes', type='px', value='2px'), source_notes_border_bottom_color=OptionsInfo(scss=True, category='source_notes', type='value', value='#D3D3D3'), source_notes_border_lr_style=OptionsInfo(scss=True, category='source_notes', type='value', value='none'), source_notes_border_lr_width=OptionsInfo(scss=True, category='source_notes', type='px', value='2px'), source_notes_border_lr_color=OptionsInfo(scss=True, category='source_notes', type='value', value='#D3D3D3'), source_notes_multiline=OptionsInfo(scss=False, category='source_notes', type='boolean', value=True), source_notes_sep=OptionsInfo(scss=False, category='source_notes', type='value', value=' '), row_striping_background_color=OptionsInfo(scss=True, category='row', type='value', value='#F4F4F4'), row_striping_include_stub=OptionsInfo(scss=False, category='row', type='boolean', value=False), row_striping_include_table_body=OptionsInfo(scss=False, category='row', type='boolean', value=False), container_width=OptionsInfo(scss=False, category='container', type='px', value='auto'), container_height=OptionsInfo(scss=False, category='container', type='px', value='auto'), container_padding_x=OptionsInfo(scss=False, category='container', type='px', value='0px'), container_padding_y=OptionsInfo(scss=False, category='container', type='px', value='10px'), container_overflow_x=OptionsInfo(scss=False, category='container', type='overflow', value='auto'), container_overflow_y=OptionsInfo(scss=False, category='container', type='overflow', value='auto'), quarto_disable_processing=OptionsInfo(scss=False, category='quarto', type='logical', value=False), quarto_use_bootstrap=OptionsInfo(scss=False, category='quarto', type='logical', value=False), ihtml_active=OptionsInfo(scss=False, category='ihtml', type='boolean', value=False), ihtml_use_pagination=OptionsInfo(scss=False, category='ihtml', type='boolean', value=True), ihtml_use_pagination_info=OptionsInfo(scss=False, category='ihtml', type='boolean', value=True), ihtml_use_sorting=OptionsInfo(scss=False, category='ihtml', type='boolean', value=True), ihtml_use_search=OptionsInfo(scss=False, category='ihtml', type='boolean', value=False), ihtml_use_filters=OptionsInfo(scss=False, category='ihtml', type='boolean', value=False), ihtml_use_resizers=OptionsInfo(scss=False, category='ihtml', type='boolean', value=False), ihtml_use_highlight=OptionsInfo(scss=False, category='ihtml', type='boolean', value=False), ihtml_use_compact_mode=OptionsInfo(scss=False, category='ihtml', type='boolean', value=False), ihtml_use_text_wrapping=OptionsInfo(scss=False, category='ihtml', type='boolean', value=True), ihtml_use_page_size_select=OptionsInfo(scss=False, category='ihtml', type='boolean', value=False), ihtml_page_size_default=OptionsInfo(scss=False, category='ihtml', type='value', value=10), ihtml_page_size_values=OptionsInfo(scss=False, category='ihtml', type='values', value=[10, 25, 50, 100]), ihtml_pagination_type=OptionsInfo(scss=False, category='ihtml', type='value', value='numbers'), ihtml_height=OptionsInfo(scss=False, category='ihtml', type='value', value='auto'), ihtml_selection_mode=OptionsInfo(scss=False, category='ihtml', type='value', value=None)), _google_font_imports=GoogleFontImports(imports=frozenset()), _has_built=False)</w:t>
+        <w:t xml:space="preserve">6           Duraciones      4 figuras (120 BPM), _body=&lt;great_tables._gt_data.Body object at 0xf0828830b230&gt;, _boxhead=Boxhead([ColInfo(var='Parámetro', type=&lt;ColInfoTypeEnum.default: 1&gt;, column_label='Parámetro', column_align='left', column_width=None, stub_level=None), ColInfo(var='Valor', type=&lt;ColInfoTypeEnum.default: 1&gt;, column_label='Valor', column_align='right', column_width=None, stub_level=None)]), _stub=&lt;great_tables._gt_data.Stub object at 0xf0828830b0e0&gt;, _spanners=Spanners([]), _heading=Heading(title='Resumen del Sistema y Síntesis Acústica', subtitle=None, preheader=None), _stubhead=None, _summary_rows=&lt;great_tables._gt_data.SummaryRows object at 0xf0828830b770&gt;, _summary_rows_grand=&lt;great_tables._gt_data.SummaryRows object at 0xf0828839d6d0&gt;, _source_notes=[], _footnotes=[], _styles=[], _locale=&lt;great_tables._gt_data.Locale object at 0xf0828830b8c0&gt;, _formats=[], _substitutions=[], _col_merge=[], _transforms=[], _options=Options(table_id=OptionsInfo(scss=False, category='table', type='value', value=None), table_caption=OptionsInfo(scss=False, category='table', type='value', value=None), table_width=OptionsInfo(scss=True, category='table', type='px', value='auto'), table_layout=OptionsInfo(scss=True, category='table', type='value', value='fixed'), table_margin_left=OptionsInfo(scss=True, category='table', type='px', value='auto'), table_margin_right=OptionsInfo(scss=True, category='table', type='px', value='auto'), table_background_color=OptionsInfo(scss=True, category='table', type='value', value='#FFFFFF'), table_additional_css=OptionsInfo(scss=False, category='table', type='values', value=[]), table_font_names=OptionsInfo(scss=False, category='table', type='values', value=['-apple-system', 'BlinkMacSystemFont', 'Segoe UI', 'Roboto', 'Oxygen', 'Ubuntu', 'Cantarell', 'Helvetica Neue', 'Fira Sans', 'Droid Sans', 'Arial', 'sans-serif']), table_font_size=OptionsInfo(scss=True, category='table', type='px', value='16px'), table_font_weight=OptionsInfo(scss=True, category='table', type='value', value='normal'), table_font_style=OptionsInfo(scss=True, category='table', type='value', value='normal'), table_font_color=OptionsInfo(scss=True, category='table', type='value', value='#333333'), table_font_color_light=OptionsInfo(scss=True, category='table', type='value', value='#FFFFFF'), table_border_top_include=OptionsInfo(scss=False, category='table', type='boolean', value=True), table_border_top_style=OptionsInfo(scss=True, category='table', type='value', value='solid'), table_border_top_width=OptionsInfo(scss=True, category='table', type='px', value='2px'), table_border_top_color=OptionsInfo(scss=True, category='table', type='value', value='#A8A8A8'), table_border_right_style=OptionsInfo(scss=True, category='table', type='value', value='none'), table_border_right_width=OptionsInfo(scss=True, category='table', type='px', value='2px'), table_border_right_color=OptionsInfo(scss=True, category='table', type='value', value='#D3D3D3'), table_border_bottom_include=OptionsInfo(scss=False, category='table', type='boolean', value=True), table_border_bottom_style=OptionsInfo(scss=True, category='table', type='value', value='solid'), table_border_bottom_width=OptionsInfo(scss=True, category='table', type='px', value='2px'), table_border_bottom_color=OptionsInfo(scss=True, category='table', type='value', value='#A8A8A8'), table_border_left_style=OptionsInfo(scss=True, category='table', type='value', value='none'), table_border_left_width=OptionsInfo(scss=True, category='table', type='px', value='2px'), table_border_left_color=OptionsInfo(scss=True, category='table', type='value', value='#D3D3D3'), heading_background_color=OptionsInfo(scss=True, category='heading', type='value', value=None), heading_align=OptionsInfo(scss=True, category='heading', type='value', value='center'), heading_title_font_size=OptionsInfo(scss=True, category='heading', type='px', value='125%'), heading_title_font_weight=OptionsInfo(scss=True, category='heading', type='value', value='initial'), heading_subtitle_font_size=OptionsInfo(scss=True, category='heading', type='px', value='85%'), heading_subtitle_font_weight=OptionsInfo(scss=True, category='heading', type='value', value='initial'), heading_padding=OptionsInfo(scss=True, category='heading', type='px', value='4px'), heading_padding_horizontal=OptionsInfo(scss=True, category='heading', type='px', value='5px'), heading_border_bottom_style=OptionsInfo(scss=True, category='heading', type='value', value='solid'), heading_border_bottom_width=OptionsInfo(scss=True, category='heading', type='px', value='2px'), heading_border_bottom_color=OptionsInfo(scss=True, category='heading', type='value', value='#D3D3D3'), heading_border_lr_style=OptionsInfo(scss=True, category='heading', type='value', value='none'), heading_border_lr_width=OptionsInfo(scss=True, category='heading', type='px', value='1px'), heading_border_lr_color=OptionsInfo(scss=True, category='heading', type='value', value='#D3D3D3'), column_labels_background_color=OptionsInfo(scss=True, category='column_labels', type='value', value=None), column_labels_font_size=OptionsInfo(scss=True, category='column_labels', type='px', value='100%'), column_labels_font_weight=OptionsInfo(scss=True, category='column_labels', type='value', value='normal'), column_labels_text_transform=OptionsInfo(scss=True, category='column_labels', type='value', value='inherit'), column_labels_padding=OptionsInfo(scss=True, category='column_labels', type='px', value='5px'), column_labels_padding_horizontal=OptionsInfo(scss=True, category='column_labels', type='px', value='5px'), column_labels_vlines_style=OptionsInfo(scss=True, category='table_body', type='value', value='none'), column_labels_vlines_width=OptionsInfo(scss=True, category='table_body', type='px', value='1px'), column_labels_vlines_color=OptionsInfo(scss=True, category='table_body', type='value', value='#D3D3D3'), column_labels_border_top_style=OptionsInfo(scss=True, category='column_labels', type='value', value='solid'), column_labels_border_top_width=OptionsInfo(scss=True, category='column_labels', type='px', value='2px'), column_labels_border_top_color=OptionsInfo(scss=True, category='column_labels', type='value', value='#D3D3D3'), column_labels_border_bottom_style=OptionsInfo(scss=True, category='column_labels', type='value', value='solid'), column_labels_border_bottom_width=OptionsInfo(scss=True, category='column_labels', type='px', value='2px'), column_labels_border_bottom_color=OptionsInfo(scss=True, category='column_labels', type='value', value='#D3D3D3'), column_labels_border_lr_style=OptionsInfo(scss=True, category='column_labels', type='value', value='none'), column_labels_border_lr_width=OptionsInfo(scss=True, category='column_labels', type='px', value='1px'), column_labels_border_lr_color=OptionsInfo(scss=True, category='column_labels', type='value', value='#D3D3D3'), column_labels_hidden=OptionsInfo(scss=False, category='column_labels', type='boolean', value=False), row_group_background_color=OptionsInfo(scss=True, category='row_group', type='value', value=None), row_group_font_size=OptionsInfo(scss=True, category='row_group', type='px', value='100%'), row_group_font_weight=OptionsInfo(scss=True, category='row_group', type='value', value='initial'), row_group_text_transform=OptionsInfo(scss=True, category='row_group', type='value', value='inherit'), row_group_padding=OptionsInfo(scss=True, category='row_group', type='px', value='8px'), row_group_padding_horizontal=OptionsInfo(scss=True, category='row_group', type='px', value='5px'), row_group_border_top_style=OptionsInfo(scss=True, category='row_group', type='value', value='solid'), row_group_border_top_width=OptionsInfo(scss=True, category='row_group', type='px', value='2px'), row_group_border_top_color=OptionsInfo(scss=True, category='row_group', type='value', value='#D3D3D3'), row_group_border_right_style=OptionsInfo(scss=True, category='row_group', type='value', value='none'), row_group_border_right_width=OptionsInfo(scss=True, category='row_group', type='px', value='1px'), row_group_border_right_color=OptionsInfo(scss=True, category='row_group', type='value', value='#D3D3D3'), row_group_border_bottom_style=OptionsInfo(scss=True, category='row_group', type='value', value='solid'), row_group_border_bottom_width=OptionsInfo(scss=True, category='row_group', type='px', value='2px'), row_group_border_bottom_color=OptionsInfo(scss=True, category='row_group', type='value', value='#D3D3D3'), row_group_border_left_style=OptionsInfo(scss=True, category='row_group', type='value', value='none'), row_group_border_left_width=OptionsInfo(scss=True, category='row_group', type='px', value='1px'), row_group_border_left_color=OptionsInfo(scss=True, category='row_group', type='value', value='#D3D3D3'), row_group_as_column=OptionsInfo(scss=False, category='row_group', type='boolean', value=False), table_body_hlines_style=OptionsInfo(scss=True, category='table_body', type='value', value='solid'), table_body_hlines_width=OptionsInfo(scss=True, category='table_body', type='px', value='1px'), table_body_hlines_color=OptionsInfo(scss=True, category='table_body', type='value', value='#D3D3D3'), table_body_vlines_style=OptionsInfo(scss=True, category='table_body', type='value', value='none'), table_body_vlines_width=OptionsInfo(scss=True, category='table_body', type='px', value='1px'), table_body_vlines_color=OptionsInfo(scss=True, category='table_body', type='value', value='#D3D3D3'), table_body_border_top_style=OptionsInfo(scss=True, category='table_body', type='value', value='solid'), table_body_border_top_width=OptionsInfo(scss=True, category='table_body', type='px', value='2px'), table_body_border_top_color=OptionsInfo(scss=True, category='table_body', type='value', value='#D3D3D3'), table_body_border_bottom_style=OptionsInfo(scss=True, category='table_body', type='value', value='solid'), table_body_border_bottom_width=OptionsInfo(scss=True, category='table_body', type='px', value='2px'), table_body_border_bottom_color=OptionsInfo(scss=True, category='table_body', type='value', value='#D3D3D3'), data_row_padding=OptionsInfo(scss=True, category='data_row', type='px', value='8px'), data_row_padding_horizontal=OptionsInfo(scss=True, category='data_row', type='px', value='5px'), stub_background_color=OptionsInfo(scss=True, category='stub', type='value', value=None), stub_font_size=OptionsInfo(scss=True, category='stub', type='px', value='100%'), stub_font_weight=OptionsInfo(scss=True, category='stub', type='value', value='initial'), stub_text_transform=OptionsInfo(scss=True, category='stub', type='value', value='inherit'), stub_border_style=OptionsInfo(scss=True, category='stub', type='value', value='solid'), stub_border_width=OptionsInfo(scss=True, category='stub', type='px', value='2px'), stub_border_color=OptionsInfo(scss=True, category='stub', type='value', value='#D3D3D3'), stub_indent_length=OptionsInfo(scss=True, category='stub', type='px', value='5px'), stub_row_group_background_color=OptionsInfo(scss=True, category='stub', type='value', value=None), stub_row_group_font_size=OptionsInfo(scss=True, category='stub', type='px', value='100%'), stub_row_group_font_weight=OptionsInfo(scss=True, category='stub', type='value', value='initial'), stub_row_group_text_transform=OptionsInfo(scss=True, category='stub', type='value', value='inherit'), stub_row_group_border_style=OptionsInfo(scss=True, category='stub', type='value', value='solid'), stub_row_group_border_width=OptionsInfo(scss=True, category='stub', type='px', value='2px'), stub_row_group_border_color=OptionsInfo(scss=True, category='stub', type='value', value='#D3D3D3'), summary_row_padding=OptionsInfo(scss=True, category='summary_row', type='px', value='8px'), summary_row_padding_horizontal=OptionsInfo(scss=True, category='summary_row', type='px', value='5px'), summary_row_background_color=OptionsInfo(scss=True, category='summary_row', type='value', value=None), summary_row_text_transform=OptionsInfo(scss=True, category='summary_row', type='value', value='inherit'), summary_row_border_style=OptionsInfo(scss=True, category='summary_row', type='value', value='solid'), summary_row_border_width=OptionsInfo(scss=True, category='summary_row', type='px', value='2px'), summary_row_border_color=OptionsInfo(scss=True, category='summary_row', type='value', value='#D3D3D3'), grand_summary_row_padding=OptionsInfo(scss=True, category='grand_summary_row', type='px', value='8px'), grand_summary_row_padding_horizontal=OptionsInfo(scss=True, category='grand_summary_row', type='px', value='5px'), grand_summary_row_background_color=OptionsInfo(scss=True, category='grand_summary_row', type='value', value=None), grand_summary_row_text_transform=OptionsInfo(scss=True, category='grand_summary_row', type='value', value='inherit'), grand_summary_row_border_style=OptionsInfo(scss=True, category='grand_summary_row', type='value', value='double'), grand_summary_row_border_width=OptionsInfo(scss=True, category='grand_summary_row', type='px', value='6px'), grand_summary_row_border_color=OptionsInfo(scss=True, category='grand_summary_row', type='value', value='#D3D3D3'), footnotes_marks=OptionsInfo(scss=False, category='footnotes', type='values', value='numbers'), footnotes_spec_ref=OptionsInfo(scss=False, category='footnotes', type='value', value='^i'), footnotes_spec_ftr=OptionsInfo(scss=False, category='footnotes', type='value', value='^i'), footnotes_order=OptionsInfo(scss=False, category='footnotes', type='value', value='marks_last'), source_notes_padding=OptionsInfo(scss=True, category='source_notes', type='px', value='4px'), source_notes_padding_horizontal=OptionsInfo(scss=True, category='source_notes', type='px', value='5px'), source_notes_background_color=OptionsInfo(scss=True, category='source_notes', type='value', value=None), source_notes_font_size=OptionsInfo(scss=True, category='source_notes', type='px', value='90%'), source_notes_border_bottom_style=OptionsInfo(scss=True, category='source_notes', type='value', value='none'), source_notes_border_bottom_width=OptionsInfo(scss=True, category='source_notes', type='px', value='2px'), source_notes_border_bottom_color=OptionsInfo(scss=True, category='source_notes', type='value', value='#D3D3D3'), source_notes_border_lr_style=OptionsInfo(scss=True, category='source_notes', type='value', value='none'), source_notes_border_lr_width=OptionsInfo(scss=True, category='source_notes', type='px', value='2px'), source_notes_border_lr_color=OptionsInfo(scss=True, category='source_notes', type='value', value='#D3D3D3'), source_notes_multiline=OptionsInfo(scss=False, category='source_notes', type='boolean', value=True), source_notes_sep=OptionsInfo(scss=False, category='source_notes', type='value', value=' '), row_striping_background_color=OptionsInfo(scss=True, category='row', type='value', value='#F4F4F4'), row_striping_include_stub=OptionsInfo(scss=False, category='row', type='boolean', value=False), row_striping_include_table_body=OptionsInfo(scss=False, category='row', type='boolean', value=False), container_width=OptionsInfo(scss=False, category='container', type='px', value='auto'), container_height=OptionsInfo(scss=False, category='container', type='px', value='auto'), container_padding_x=OptionsInfo(scss=False, category='container', type='px', value='0px'), container_padding_y=OptionsInfo(scss=False, category='container', type='px', value='10px'), container_overflow_x=OptionsInfo(scss=False, category='container', type='overflow', value='auto'), container_overflow_y=OptionsInfo(scss=False, category='container', type='overflow', value='auto'), quarto_disable_processing=OptionsInfo(scss=False, category='quarto', type='logical', value=False), quarto_use_bootstrap=OptionsInfo(scss=False, category='quarto', type='logical', value=False), ihtml_active=OptionsInfo(scss=False, category='ihtml', type='boolean', value=False), ihtml_use_pagination=OptionsInfo(scss=False, category='ihtml', type='boolean', value=True), ihtml_use_pagination_info=OptionsInfo(scss=False, category='ihtml', type='boolean', value=True), ihtml_use_sorting=OptionsInfo(scss=False, category='ihtml', type='boolean', value=True), ihtml_use_search=OptionsInfo(scss=False, category='ihtml', type='boolean', value=False), ihtml_use_filters=OptionsInfo(scss=False, category='ihtml', type='boolean', value=False), ihtml_use_resizers=OptionsInfo(scss=False, category='ihtml', type='boolean', value=False), ihtml_use_highlight=OptionsInfo(scss=False, category='ihtml', type='boolean', value=False), ihtml_use_compact_mode=OptionsInfo(scss=False, category='ihtml', type='boolean', value=False), ihtml_use_text_wrapping=OptionsInfo(scss=False, category='ihtml', type='boolean', value=True), ihtml_use_page_size_select=OptionsInfo(scss=False, category='ihtml', type='boolean', value=False), ihtml_page_size_default=OptionsInfo(scss=False, category='ihtml', type='value', value=10), ihtml_page_size_values=OptionsInfo(scss=False, category='ihtml', type='values', value=[10, 25, 50, 100]), ihtml_pagination_type=OptionsInfo(scss=False, category='ihtml', type='value', value='numbers'), ihtml_height=OptionsInfo(scss=False, category='ihtml', type='value', value='auto'), ihtml_selection_mode=OptionsInfo(scss=False, category='ihtml', type='value', value=None)), _google_font_imports=GoogleFontImports(imports=frozenset()), _has_built=False)</w:t>
       </w:r>
     </w:p>
     <w:bookmarkEnd w:id="12"/>
@@ -706,7 +706,7 @@
         <w:rPr>
           <w:rStyle w:val="VerbatimChar"/>
         </w:rPr>
-        <w:t xml:space="preserve">6  C#5    vii° (Sensible)    73          554.37         1.8877, _body=&lt;great_tables._gt_data.Body object at 0xfe52a29d6690&gt;, _boxhead=Boxhead([ColInfo(var='Nota', type=&lt;ColInfoTypeEnum.default: 1&gt;, column_label='Nota', column_align='left', column_width=None, stub_level=None), ColInfo(var='Grado', type=&lt;ColInfoTypeEnum.default: 1&gt;, column_label='Grado', column_align='left', column_width=None, stub_level=None), ColInfo(var='MIDI', type=&lt;ColInfoTypeEnum.default: 1&gt;, column_label='MIDI', column_align='right', column_width=None, stub_level=None), ColInfo(var='Frecuencia (Hz)', type=&lt;ColInfoTypeEnum.default: 1&gt;, column_label='Frecuencia (Hz)', column_align='right', column_width=None, stub_level=None), ColInfo(var='Razón a Tónica', type=&lt;ColInfoTypeEnum.default: 1&gt;, column_label='Razón a Tónica', column_align='right', column_width=None, stub_level=None)]), _stub=&lt;great_tables._gt_data.Stub object at 0xfe52a2995e50&gt;, _spanners=Spanners([]), _heading=Heading(title='Grados de la Escala Diatónica de Re Mayor', subtitle=None, preheader=None), _stubhead=None, _summary_rows=&lt;great_tables._gt_data.SummaryRows object at 0xfe52a2996210&gt;, _summary_rows_grand=&lt;great_tables._gt_data.SummaryRows object at 0xfe52a29262c0&gt;, _source_notes=[], _footnotes=[], _styles=[], _locale=&lt;great_tables._gt_data.Locale object at 0xfe52a2995590&gt;, _formats=[], _substitutions=[], _col_merge=[], _transforms=[], _options=Options(table_id=OptionsInfo(scss=False, category='table', type='value', value=None), table_caption=OptionsInfo(scss=False, category='table', type='value', value=None), table_width=OptionsInfo(scss=True, category='table', type='px', value='auto'), table_layout=OptionsInfo(scss=True, category='table', type='value', value='fixed'), table_margin_left=OptionsInfo(scss=True, category='table', type='px', value='auto'), table_margin_right=OptionsInfo(scss=True, category='table', type='px', value='auto'), table_background_color=OptionsInfo(scss=True, category='table', type='value', value='#FFFFFF'), table_additional_css=OptionsInfo(scss=False, category='table', type='values', value=[]), table_font_names=OptionsInfo(scss=False, category='table', type='values', value=['-apple-system', 'BlinkMacSystemFont', 'Segoe UI', 'Roboto', 'Oxygen', 'Ubuntu', 'Cantarell', 'Helvetica Neue', 'Fira Sans', 'Droid Sans', 'Arial', 'sans-serif']), table_font_size=OptionsInfo(scss=True, category='table', type='px', value='16px'), table_font_weight=OptionsInfo(scss=True, category='table', type='value', value='normal'), table_font_style=OptionsInfo(scss=True, category='table', type='value', value='normal'), table_font_color=OptionsInfo(scss=True, category='table', type='value', value='#333333'), table_font_color_light=OptionsInfo(scss=True, category='table', type='value', value='#FFFFFF'), table_border_top_include=OptionsInfo(scss=False, category='table', type='boolean', value=True), table_border_top_style=OptionsInfo(scss=True, category='table', type='value', value='solid'), table_border_top_width=OptionsInfo(scss=True, category='table', type='px', value='2px'), table_border_top_color=OptionsInfo(scss=True, category='table', type='value', value='#A8A8A8'), table_border_right_style=OptionsInfo(scss=True, category='table', type='value', value='none'), table_border_right_width=OptionsInfo(scss=True, category='table', type='px', value='2px'), table_border_right_color=OptionsInfo(scss=True, category='table', type='value', value='#D3D3D3'), table_border_bottom_include=OptionsInfo(scss=False, category='table', type='boolean', value=True), table_border_bottom_style=OptionsInfo(scss=True, category='table', type='value', value='solid'), table_border_bottom_width=OptionsInfo(scss=True, category='table', type='px', value='2px'), table_border_bottom_color=OptionsInfo(scss=True, category='table', type='value', value='#A8A8A8'), table_border_left_style=OptionsInfo(scss=True, category='table', type='value', value='none'), table_border_left_width=OptionsInfo(scss=True, category='table', type='px', value='2px'), table_border_left_color=OptionsInfo(scss=True, category='table', type='value', value='#D3D3D3'), heading_background_color=OptionsInfo(scss=True, category='heading', type='value', value=None), heading_align=OptionsInfo(scss=True, category='heading', type='value', value='center'), heading_title_font_size=OptionsInfo(scss=True, category='heading', type='px', value='125%'), heading_title_font_weight=OptionsInfo(scss=True, category='heading', type='value', value='initial'), heading_subtitle_font_size=OptionsInfo(scss=True, category='heading', type='px', value='85%'), heading_subtitle_font_weight=OptionsInfo(scss=True, category='heading', type='value', value='initial'), heading_padding=OptionsInfo(scss=True, category='heading', type='px', value='4px'), heading_padding_horizontal=OptionsInfo(scss=True, category='heading', type='px', value='5px'), heading_border_bottom_style=OptionsInfo(scss=True, category='heading', type='value', value='solid'), heading_border_bottom_width=OptionsInfo(scss=True, category='heading', type='px', value='2px'), heading_border_bottom_color=OptionsInfo(scss=True, category='heading', type='value', value='#D3D3D3'), heading_border_lr_style=OptionsInfo(scss=True, category='heading', type='value', value='none'), heading_border_lr_width=OptionsInfo(scss=True, category='heading', type='px', value='1px'), heading_border_lr_color=OptionsInfo(scss=True, category='heading', type='value', value='#D3D3D3'), column_labels_background_color=OptionsInfo(scss=True, category='column_labels', type='value', value=None), column_labels_font_size=OptionsInfo(scss=True, category='column_labels', type='px', value='100%'), column_labels_font_weight=OptionsInfo(scss=True, category='column_labels', type='value', value='normal'), column_labels_text_transform=OptionsInfo(scss=True, category='column_labels', type='value', value='inherit'), column_labels_padding=OptionsInfo(scss=True, category='column_labels', type='px', value='5px'), column_labels_padding_horizontal=OptionsInfo(scss=True, category='column_labels', type='px', value='5px'), column_labels_vlines_style=OptionsInfo(scss=True, category='table_body', type='value', value='none'), column_labels_vlines_width=OptionsInfo(scss=True, category='table_body', type='px', value='1px'), column_labels_vlines_color=OptionsInfo(scss=True, category='table_body', type='value', value='#D3D3D3'), column_labels_border_top_style=OptionsInfo(scss=True, category='column_labels', type='value', value='solid'), column_labels_border_top_width=OptionsInfo(scss=True, category='column_labels', type='px', value='2px'), column_labels_border_top_color=OptionsInfo(scss=True, category='column_labels', type='value', value='#D3D3D3'), column_labels_border_bottom_style=OptionsInfo(scss=True, category='column_labels', type='value', value='solid'), column_labels_border_bottom_width=OptionsInfo(scss=True, category='column_labels', type='px', value='2px'), column_labels_border_bottom_color=OptionsInfo(scss=True, category='column_labels', type='value', value='#D3D3D3'), column_labels_border_lr_style=OptionsInfo(scss=True, category='column_labels', type='value', value='none'), column_labels_border_lr_width=OptionsInfo(scss=True, category='column_labels', type='px', value='1px'), column_labels_border_lr_color=OptionsInfo(scss=True, category='column_labels', type='value', value='#D3D3D3'), column_labels_hidden=OptionsInfo(scss=False, category='column_labels', type='boolean', value=False), row_group_background_color=OptionsInfo(scss=True, category='row_group', type='value', value=None), row_group_font_size=OptionsInfo(scss=True, category='row_group', type='px', value='100%'), row_group_font_weight=OptionsInfo(scss=True, category='row_group', type='value', value='initial'), row_group_text_transform=OptionsInfo(scss=True, category='row_group', type='value', value='inherit'), row_group_padding=OptionsInfo(scss=True, category='row_group', type='px', value='8px'), row_group_padding_horizontal=OptionsInfo(scss=True, category='row_group', type='px', value='5px'), row_group_border_top_style=OptionsInfo(scss=True, category='row_group', type='value', value='solid'), row_group_border_top_width=OptionsInfo(scss=True, category='row_group', type='px', value='2px'), row_group_border_top_color=OptionsInfo(scss=True, category='row_group', type='value', value='#D3D3D3'), row_group_border_right_style=OptionsInfo(scss=True, category='row_group', type='value', value='none'), row_group_border_right_width=OptionsInfo(scss=True, category='row_group', type='px', value='1px'), row_group_border_right_color=OptionsInfo(scss=True, category='row_group', type='value', value='#D3D3D3'), row_group_border_bottom_style=OptionsInfo(scss=True, category='row_group', type='value', value='solid'), row_group_border_bottom_width=OptionsInfo(scss=True, category='row_group', type='px', value='2px'), row_group_border_bottom_color=OptionsInfo(scss=True, category='row_group', type='value', value='#D3D3D3'), row_group_border_left_style=OptionsInfo(scss=True, category='row_group', type='value', value='none'), row_group_border_left_width=OptionsInfo(scss=True, category='row_group', type='px', value='1px'), row_group_border_left_color=OptionsInfo(scss=True, category='row_group', type='value', value='#D3D3D3'), row_group_as_column=OptionsInfo(scss=False, category='row_group', type='boolean', value=False), table_body_hlines_style=OptionsInfo(scss=True, category='table_body', type='value', value='solid'), table_body_hlines_width=OptionsInfo(scss=True, category='table_body', type='px', value='1px'), table_body_hlines_color=OptionsInfo(scss=True, category='table_body', type='value', value='#D3D3D3'), table_body_vlines_style=OptionsInfo(scss=True, category='table_body', type='value', value='none'), table_body_vlines_width=OptionsInfo(scss=True, category='table_body', type='px', value='1px'), table_body_vlines_color=OptionsInfo(scss=True, category='table_body', type='value', value='#D3D3D3'), table_body_border_top_style=OptionsInfo(scss=True, category='table_body', type='value', value='solid'), table_body_border_top_width=OptionsInfo(scss=True, category='table_body', type='px', value='2px'), table_body_border_top_color=OptionsInfo(scss=True, category='table_body', type='value', value='#D3D3D3'), table_body_border_bottom_style=OptionsInfo(scss=True, category='table_body', type='value', value='solid'), table_body_border_bottom_width=OptionsInfo(scss=True, category='table_body', type='px', value='2px'), table_body_border_bottom_color=OptionsInfo(scss=True, category='table_body', type='value', value='#D3D3D3'), data_row_padding=OptionsInfo(scss=True, category='data_row', type='px', value='8px'), data_row_padding_horizontal=OptionsInfo(scss=True, category='data_row', type='px', value='5px'), stub_background_color=OptionsInfo(scss=True, category='stub', type='value', value=None), stub_font_size=OptionsInfo(scss=True, category='stub', type='px', value='100%'), stub_font_weight=OptionsInfo(scss=True, category='stub', type='value', value='initial'), stub_text_transform=OptionsInfo(scss=True, category='stub', type='value', value='inherit'), stub_border_style=OptionsInfo(scss=True, category='stub', type='value', value='solid'), stub_border_width=OptionsInfo(scss=True, category='stub', type='px', value='2px'), stub_border_color=OptionsInfo(scss=True, category='stub', type='value', value='#D3D3D3'), stub_indent_length=OptionsInfo(scss=True, category='stub', type='px', value='5px'), stub_row_group_background_color=OptionsInfo(scss=True, category='stub', type='value', value=None), stub_row_group_font_size=OptionsInfo(scss=True, category='stub', type='px', value='100%'), stub_row_group_font_weight=OptionsInfo(scss=True, category='stub', type='value', value='initial'), stub_row_group_text_transform=OptionsInfo(scss=True, category='stub', type='value', value='inherit'), stub_row_group_border_style=OptionsInfo(scss=True, category='stub', type='value', value='solid'), stub_row_group_border_width=OptionsInfo(scss=True, category='stub', type='px', value='2px'), stub_row_group_border_color=OptionsInfo(scss=True, category='stub', type='value', value='#D3D3D3'), summary_row_padding=OptionsInfo(scss=True, category='summary_row', type='px', value='8px'), summary_row_padding_horizontal=OptionsInfo(scss=True, category='summary_row', type='px', value='5px'), summary_row_background_color=OptionsInfo(scss=True, category='summary_row', type='value', value=None), summary_row_text_transform=OptionsInfo(scss=True, category='summary_row', type='value', value='inherit'), summary_row_border_style=OptionsInfo(scss=True, category='summary_row', type='value', value='solid'), summary_row_border_width=OptionsInfo(scss=True, category='summary_row', type='px', value='2px'), summary_row_border_color=OptionsInfo(scss=True, category='summary_row', type='value', value='#D3D3D3'), grand_summary_row_padding=OptionsInfo(scss=True, category='grand_summary_row', type='px', value='8px'), grand_summary_row_padding_horizontal=OptionsInfo(scss=True, category='grand_summary_row', type='px', value='5px'), grand_summary_row_background_color=OptionsInfo(scss=True, category='grand_summary_row', type='value', value=None), grand_summary_row_text_transform=OptionsInfo(scss=True, category='grand_summary_row', type='value', value='inherit'), grand_summary_row_border_style=OptionsInfo(scss=True, category='grand_summary_row', type='value', value='double'), grand_summary_row_border_width=OptionsInfo(scss=True, category='grand_summary_row', type='px', value='6px'), grand_summary_row_border_color=OptionsInfo(scss=True, category='grand_summary_row', type='value', value='#D3D3D3'), footnotes_marks=OptionsInfo(scss=False, category='footnotes', type='values', value='numbers'), footnotes_spec_ref=OptionsInfo(scss=False, category='footnotes', type='value', value='^i'), footnotes_spec_ftr=OptionsInfo(scss=False, category='footnotes', type='value', value='^i'), footnotes_order=OptionsInfo(scss=False, category='footnotes', type='value', value='marks_last'), source_notes_padding=OptionsInfo(scss=True, category='source_notes', type='px', value='4px'), source_notes_padding_horizontal=OptionsInfo(scss=True, category='source_notes', type='px', value='5px'), source_notes_background_color=OptionsInfo(scss=True, category='source_notes', type='value', value=None), source_notes_font_size=OptionsInfo(scss=True, category='source_notes', type='px', value='90%'), source_notes_border_bottom_style=OptionsInfo(scss=True, category='source_notes', type='value', value='none'), source_notes_border_bottom_width=OptionsInfo(scss=True, category='source_notes', type='px', value='2px'), source_notes_border_bottom_color=OptionsInfo(scss=True, category='source_notes', type='value', value='#D3D3D3'), source_notes_border_lr_style=OptionsInfo(scss=True, category='source_notes', type='value', value='none'), source_notes_border_lr_width=OptionsInfo(scss=True, category='source_notes', type='px', value='2px'), source_notes_border_lr_color=OptionsInfo(scss=True, category='source_notes', type='value', value='#D3D3D3'), source_notes_multiline=OptionsInfo(scss=False, category='source_notes', type='boolean', value=True), source_notes_sep=OptionsInfo(scss=False, category='source_notes', type='value', value=' '), row_striping_background_color=OptionsInfo(scss=True, category='row', type='value', value='#F4F4F4'), row_striping_include_stub=OptionsInfo(scss=False, category='row', type='boolean', value=False), row_striping_include_table_body=OptionsInfo(scss=False, category='row', type='boolean', value=False), container_width=OptionsInfo(scss=False, category='container', type='px', value='auto'), container_height=OptionsInfo(scss=False, category='container', type='px', value='auto'), container_padding_x=OptionsInfo(scss=False, category='container', type='px', value='0px'), container_padding_y=OptionsInfo(scss=False, category='container', type='px', value='10px'), container_overflow_x=OptionsInfo(scss=False, category='container', type='overflow', value='auto'), container_overflow_y=OptionsInfo(scss=False, category='container', type='overflow', value='auto'), quarto_disable_processing=OptionsInfo(scss=False, category='quarto', type='logical', value=False), quarto_use_bootstrap=OptionsInfo(scss=False, category='quarto', type='logical', value=False), ihtml_active=OptionsInfo(scss=False, category='ihtml', type='boolean', value=False), ihtml_use_pagination=OptionsInfo(scss=False, category='ihtml', type='boolean', value=True), ihtml_use_pagination_info=OptionsInfo(scss=False, category='ihtml', type='boolean', value=True), ihtml_use_sorting=OptionsInfo(scss=False, category='ihtml', type='boolean', value=True), ihtml_use_search=OptionsInfo(scss=False, category='ihtml', type='boolean', value=False), ihtml_use_filters=OptionsInfo(scss=False, category='ihtml', type='boolean', value=False), ihtml_use_resizers=OptionsInfo(scss=False, category='ihtml', type='boolean', value=False), ihtml_use_highlight=OptionsInfo(scss=False, category='ihtml', type='boolean', value=False), ihtml_use_compact_mode=OptionsInfo(scss=False, category='ihtml', type='boolean', value=False), ihtml_use_text_wrapping=OptionsInfo(scss=False, category='ihtml', type='boolean', value=True), ihtml_use_page_size_select=OptionsInfo(scss=False, category='ihtml', type='boolean', value=False), ihtml_page_size_default=OptionsInfo(scss=False, category='ihtml', type='value', value=10), ihtml_page_size_values=OptionsInfo(scss=False, category='ihtml', type='values', value=[10, 25, 50, 100]), ihtml_pagination_type=OptionsInfo(scss=False, category='ihtml', type='value', value='numbers'), ihtml_height=OptionsInfo(scss=False, category='ihtml', type='value', value='auto'), ihtml_selection_mode=OptionsInfo(scss=False, category='ihtml', type='value', value=None)), _google_font_imports=GoogleFontImports(imports=frozenset()), _has_built=False)</w:t>
+        <w:t xml:space="preserve">6  C#5    vii° (Sensible)    73          554.37         1.8877, _body=&lt;great_tables._gt_data.Body object at 0xf082883de690&gt;, _boxhead=Boxhead([ColInfo(var='Nota', type=&lt;ColInfoTypeEnum.default: 1&gt;, column_label='Nota', column_align='left', column_width=None, stub_level=None), ColInfo(var='Grado', type=&lt;ColInfoTypeEnum.default: 1&gt;, column_label='Grado', column_align='left', column_width=None, stub_level=None), ColInfo(var='MIDI', type=&lt;ColInfoTypeEnum.default: 1&gt;, column_label='MIDI', column_align='right', column_width=None, stub_level=None), ColInfo(var='Frecuencia (Hz)', type=&lt;ColInfoTypeEnum.default: 1&gt;, column_label='Frecuencia (Hz)', column_align='right', column_width=None, stub_level=None), ColInfo(var='Razón a Tónica', type=&lt;ColInfoTypeEnum.default: 1&gt;, column_label='Razón a Tónica', column_align='right', column_width=None, stub_level=None)]), _stub=&lt;great_tables._gt_data.Stub object at 0xf0828839de50&gt;, _spanners=Spanners([]), _heading=Heading(title='Grados de la Escala Diatónica de Re Mayor', subtitle=None, preheader=None), _stubhead=None, _summary_rows=&lt;great_tables._gt_data.SummaryRows object at 0xf0828839e210&gt;, _summary_rows_grand=&lt;great_tables._gt_data.SummaryRows object at 0xf0828832e2c0&gt;, _source_notes=[], _footnotes=[], _styles=[], _locale=&lt;great_tables._gt_data.Locale object at 0xf0828839d590&gt;, _formats=[], _substitutions=[], _col_merge=[], _transforms=[], _options=Options(table_id=OptionsInfo(scss=False, category='table', type='value', value=None), table_caption=OptionsInfo(scss=False, category='table', type='value', value=None), table_width=OptionsInfo(scss=True, category='table', type='px', value='auto'), table_layout=OptionsInfo(scss=True, category='table', type='value', value='fixed'), table_margin_left=OptionsInfo(scss=True, category='table', type='px', value='auto'), table_margin_right=OptionsInfo(scss=True, category='table', type='px', value='auto'), table_background_color=OptionsInfo(scss=True, category='table', type='value', value='#FFFFFF'), table_additional_css=OptionsInfo(scss=False, category='table', type='values', value=[]), table_font_names=OptionsInfo(scss=False, category='table', type='values', value=['-apple-system', 'BlinkMacSystemFont', 'Segoe UI', 'Roboto', 'Oxygen', 'Ubuntu', 'Cantarell', 'Helvetica Neue', 'Fira Sans', 'Droid Sans', 'Arial', 'sans-serif']), table_font_size=OptionsInfo(scss=True, category='table', type='px', value='16px'), table_font_weight=OptionsInfo(scss=True, category='table', type='value', value='normal'), table_font_style=OptionsInfo(scss=True, category='table', type='value', value='normal'), table_font_color=OptionsInfo(scss=True, category='table', type='value', value='#333333'), table_font_color_light=OptionsInfo(scss=True, category='table', type='value', value='#FFFFFF'), table_border_top_include=OptionsInfo(scss=False, category='table', type='boolean', value=True), table_border_top_style=OptionsInfo(scss=True, category='table', type='value', value='solid'), table_border_top_width=OptionsInfo(scss=True, category='table', type='px', value='2px'), table_border_top_color=OptionsInfo(scss=True, category='table', type='value', value='#A8A8A8'), table_border_right_style=OptionsInfo(scss=True, category='table', type='value', value='none'), table_border_right_width=OptionsInfo(scss=True, category='table', type='px', value='2px'), table_border_right_color=OptionsInfo(scss=True, category='table', type='value', value='#D3D3D3'), table_border_bottom_include=OptionsInfo(scss=False, category='table', type='boolean', value=True), table_border_bottom_style=OptionsInfo(scss=True, category='table', type='value', value='solid'), table_border_bottom_width=OptionsInfo(scss=True, category='table', type='px', value='2px'), table_border_bottom_color=OptionsInfo(scss=True, category='table', type='value', value='#A8A8A8'), table_border_left_style=OptionsInfo(scss=True, category='table', type='value', value='none'), table_border_left_width=OptionsInfo(scss=True, category='table', type='px', value='2px'), table_border_left_color=OptionsInfo(scss=True, category='table', type='value', value='#D3D3D3'), heading_background_color=OptionsInfo(scss=True, category='heading', type='value', value=None), heading_align=OptionsInfo(scss=True, category='heading', type='value', value='center'), heading_title_font_size=OptionsInfo(scss=True, category='heading', type='px', value='125%'), heading_title_font_weight=OptionsInfo(scss=True, category='heading', type='value', value='initial'), heading_subtitle_font_size=OptionsInfo(scss=True, category='heading', type='px', value='85%'), heading_subtitle_font_weight=OptionsInfo(scss=True, category='heading', type='value', value='initial'), heading_padding=OptionsInfo(scss=True, category='heading', type='px', value='4px'), heading_padding_horizontal=OptionsInfo(scss=True, category='heading', type='px', value='5px'), heading_border_bottom_style=OptionsInfo(scss=True, category='heading', type='value', value='solid'), heading_border_bottom_width=OptionsInfo(scss=True, category='heading', type='px', value='2px'), heading_border_bottom_color=OptionsInfo(scss=True, category='heading', type='value', value='#D3D3D3'), heading_border_lr_style=OptionsInfo(scss=True, category='heading', type='value', value='none'), heading_border_lr_width=OptionsInfo(scss=True, category='heading', type='px', value='1px'), heading_border_lr_color=OptionsInfo(scss=True, category='heading', type='value', value='#D3D3D3'), column_labels_background_color=OptionsInfo(scss=True, category='column_labels', type='value', value=None), column_labels_font_size=OptionsInfo(scss=True, category='column_labels', type='px', value='100%'), column_labels_font_weight=OptionsInfo(scss=True, category='column_labels', type='value', value='normal'), column_labels_text_transform=OptionsInfo(scss=True, category='column_labels', type='value', value='inherit'), column_labels_padding=OptionsInfo(scss=True, category='column_labels', type='px', value='5px'), column_labels_padding_horizontal=OptionsInfo(scss=True, category='column_labels', type='px', value='5px'), column_labels_vlines_style=OptionsInfo(scss=True, category='table_body', type='value', value='none'), column_labels_vlines_width=OptionsInfo(scss=True, category='table_body', type='px', value='1px'), column_labels_vlines_color=OptionsInfo(scss=True, category='table_body', type='value', value='#D3D3D3'), column_labels_border_top_style=OptionsInfo(scss=True, category='column_labels', type='value', value='solid'), column_labels_border_top_width=OptionsInfo(scss=True, category='column_labels', type='px', value='2px'), column_labels_border_top_color=OptionsInfo(scss=True, category='column_labels', type='value', value='#D3D3D3'), column_labels_border_bottom_style=OptionsInfo(scss=True, category='column_labels', type='value', value='solid'), column_labels_border_bottom_width=OptionsInfo(scss=True, category='column_labels', type='px', value='2px'), column_labels_border_bottom_color=OptionsInfo(scss=True, category='column_labels', type='value', value='#D3D3D3'), column_labels_border_lr_style=OptionsInfo(scss=True, category='column_labels', type='value', value='none'), column_labels_border_lr_width=OptionsInfo(scss=True, category='column_labels', type='px', value='1px'), column_labels_border_lr_color=OptionsInfo(scss=True, category='column_labels', type='value', value='#D3D3D3'), column_labels_hidden=OptionsInfo(scss=False, category='column_labels', type='boolean', value=False), row_group_background_color=OptionsInfo(scss=True, category='row_group', type='value', value=None), row_group_font_size=OptionsInfo(scss=True, category='row_group', type='px', value='100%'), row_group_font_weight=OptionsInfo(scss=True, category='row_group', type='value', value='initial'), row_group_text_transform=OptionsInfo(scss=True, category='row_group', type='value', value='inherit'), row_group_padding=OptionsInfo(scss=True, category='row_group', type='px', value='8px'), row_group_padding_horizontal=OptionsInfo(scss=True, category='row_group', type='px', value='5px'), row_group_border_top_style=OptionsInfo(scss=True, category='row_group', type='value', value='solid'), row_group_border_top_width=OptionsInfo(scss=True, category='row_group', type='px', value='2px'), row_group_border_top_color=OptionsInfo(scss=True, category='row_group', type='value', value='#D3D3D3'), row_group_border_right_style=OptionsInfo(scss=True, category='row_group', type='value', value='none'), row_group_border_right_width=OptionsInfo(scss=True, category='row_group', type='px', value='1px'), row_group_border_right_color=OptionsInfo(scss=True, category='row_group', type='value', value='#D3D3D3'), row_group_border_bottom_style=OptionsInfo(scss=True, category='row_group', type='value', value='solid'), row_group_border_bottom_width=OptionsInfo(scss=True, category='row_group', type='px', value='2px'), row_group_border_bottom_color=OptionsInfo(scss=True, category='row_group', type='value', value='#D3D3D3'), row_group_border_left_style=OptionsInfo(scss=True, category='row_group', type='value', value='none'), row_group_border_left_width=OptionsInfo(scss=True, category='row_group', type='px', value='1px'), row_group_border_left_color=OptionsInfo(scss=True, category='row_group', type='value', value='#D3D3D3'), row_group_as_column=OptionsInfo(scss=False, category='row_group', type='boolean', value=False), table_body_hlines_style=OptionsInfo(scss=True, category='table_body', type='value', value='solid'), table_body_hlines_width=OptionsInfo(scss=True, category='table_body', type='px', value='1px'), table_body_hlines_color=OptionsInfo(scss=True, category='table_body', type='value', value='#D3D3D3'), table_body_vlines_style=OptionsInfo(scss=True, category='table_body', type='value', value='none'), table_body_vlines_width=OptionsInfo(scss=True, category='table_body', type='px', value='1px'), table_body_vlines_color=OptionsInfo(scss=True, category='table_body', type='value', value='#D3D3D3'), table_body_border_top_style=OptionsInfo(scss=True, category='table_body', type='value', value='solid'), table_body_border_top_width=OptionsInfo(scss=True, category='table_body', type='px', value='2px'), table_body_border_top_color=OptionsInfo(scss=True, category='table_body', type='value', value='#D3D3D3'), table_body_border_bottom_style=OptionsInfo(scss=True, category='table_body', type='value', value='solid'), table_body_border_bottom_width=OptionsInfo(scss=True, category='table_body', type='px', value='2px'), table_body_border_bottom_color=OptionsInfo(scss=True, category='table_body', type='value', value='#D3D3D3'), data_row_padding=OptionsInfo(scss=True, category='data_row', type='px', value='8px'), data_row_padding_horizontal=OptionsInfo(scss=True, category='data_row', type='px', value='5px'), stub_background_color=OptionsInfo(scss=True, category='stub', type='value', value=None), stub_font_size=OptionsInfo(scss=True, category='stub', type='px', value='100%'), stub_font_weight=OptionsInfo(scss=True, category='stub', type='value', value='initial'), stub_text_transform=OptionsInfo(scss=True, category='stub', type='value', value='inherit'), stub_border_style=OptionsInfo(scss=True, category='stub', type='value', value='solid'), stub_border_width=OptionsInfo(scss=True, category='stub', type='px', value='2px'), stub_border_color=OptionsInfo(scss=True, category='stub', type='value', value='#D3D3D3'), stub_indent_length=OptionsInfo(scss=True, category='stub', type='px', value='5px'), stub_row_group_background_color=OptionsInfo(scss=True, category='stub', type='value', value=None), stub_row_group_font_size=OptionsInfo(scss=True, category='stub', type='px', value='100%'), stub_row_group_font_weight=OptionsInfo(scss=True, category='stub', type='value', value='initial'), stub_row_group_text_transform=OptionsInfo(scss=True, category='stub', type='value', value='inherit'), stub_row_group_border_style=OptionsInfo(scss=True, category='stub', type='value', value='solid'), stub_row_group_border_width=OptionsInfo(scss=True, category='stub', type='px', value='2px'), stub_row_group_border_color=OptionsInfo(scss=True, category='stub', type='value', value='#D3D3D3'), summary_row_padding=OptionsInfo(scss=True, category='summary_row', type='px', value='8px'), summary_row_padding_horizontal=OptionsInfo(scss=True, category='summary_row', type='px', value='5px'), summary_row_background_color=OptionsInfo(scss=True, category='summary_row', type='value', value=None), summary_row_text_transform=OptionsInfo(scss=True, category='summary_row', type='value', value='inherit'), summary_row_border_style=OptionsInfo(scss=True, category='summary_row', type='value', value='solid'), summary_row_border_width=OptionsInfo(scss=True, category='summary_row', type='px', value='2px'), summary_row_border_color=OptionsInfo(scss=True, category='summary_row', type='value', value='#D3D3D3'), grand_summary_row_padding=OptionsInfo(scss=True, category='grand_summary_row', type='px', value='8px'), grand_summary_row_padding_horizontal=OptionsInfo(scss=True, category='grand_summary_row', type='px', value='5px'), grand_summary_row_background_color=OptionsInfo(scss=True, category='grand_summary_row', type='value', value=None), grand_summary_row_text_transform=OptionsInfo(scss=True, category='grand_summary_row', type='value', value='inherit'), grand_summary_row_border_style=OptionsInfo(scss=True, category='grand_summary_row', type='value', value='double'), grand_summary_row_border_width=OptionsInfo(scss=True, category='grand_summary_row', type='px', value='6px'), grand_summary_row_border_color=OptionsInfo(scss=True, category='grand_summary_row', type='value', value='#D3D3D3'), footnotes_marks=OptionsInfo(scss=False, category='footnotes', type='values', value='numbers'), footnotes_spec_ref=OptionsInfo(scss=False, category='footnotes', type='value', value='^i'), footnotes_spec_ftr=OptionsInfo(scss=False, category='footnotes', type='value', value='^i'), footnotes_order=OptionsInfo(scss=False, category='footnotes', type='value', value='marks_last'), source_notes_padding=OptionsInfo(scss=True, category='source_notes', type='px', value='4px'), source_notes_padding_horizontal=OptionsInfo(scss=True, category='source_notes', type='px', value='5px'), source_notes_background_color=OptionsInfo(scss=True, category='source_notes', type='value', value=None), source_notes_font_size=OptionsInfo(scss=True, category='source_notes', type='px', value='90%'), source_notes_border_bottom_style=OptionsInfo(scss=True, category='source_notes', type='value', value='none'), source_notes_border_bottom_width=OptionsInfo(scss=True, category='source_notes', type='px', value='2px'), source_notes_border_bottom_color=OptionsInfo(scss=True, category='source_notes', type='value', value='#D3D3D3'), source_notes_border_lr_style=OptionsInfo(scss=True, category='source_notes', type='value', value='none'), source_notes_border_lr_width=OptionsInfo(scss=True, category='source_notes', type='px', value='2px'), source_notes_border_lr_color=OptionsInfo(scss=True, category='source_notes', type='value', value='#D3D3D3'), source_notes_multiline=OptionsInfo(scss=False, category='source_notes', type='boolean', value=True), source_notes_sep=OptionsInfo(scss=False, category='source_notes', type='value', value=' '), row_striping_background_color=OptionsInfo(scss=True, category='row', type='value', value='#F4F4F4'), row_striping_include_stub=OptionsInfo(scss=False, category='row', type='boolean', value=False), row_striping_include_table_body=OptionsInfo(scss=False, category='row', type='boolean', value=False), container_width=OptionsInfo(scss=False, category='container', type='px', value='auto'), container_height=OptionsInfo(scss=False, category='container', type='px', value='auto'), container_padding_x=OptionsInfo(scss=False, category='container', type='px', value='0px'), container_padding_y=OptionsInfo(scss=False, category='container', type='px', value='10px'), container_overflow_x=OptionsInfo(scss=False, category='container', type='overflow', value='auto'), container_overflow_y=OptionsInfo(scss=False, category='container', type='overflow', value='auto'), quarto_disable_processing=OptionsInfo(scss=False, category='quarto', type='logical', value=False), quarto_use_bootstrap=OptionsInfo(scss=False, category='quarto', type='logical', value=False), ihtml_active=OptionsInfo(scss=False, category='ihtml', type='boolean', value=False), ihtml_use_pagination=OptionsInfo(scss=False, category='ihtml', type='boolean', value=True), ihtml_use_pagination_info=OptionsInfo(scss=False, category='ihtml', type='boolean', value=True), ihtml_use_sorting=OptionsInfo(scss=False, category='ihtml', type='boolean', value=True), ihtml_use_search=OptionsInfo(scss=False, category='ihtml', type='boolean', value=False), ihtml_use_filters=OptionsInfo(scss=False, category='ihtml', type='boolean', value=False), ihtml_use_resizers=OptionsInfo(scss=False, category='ihtml', type='boolean', value=False), ihtml_use_highlight=OptionsInfo(scss=False, category='ihtml', type='boolean', value=False), ihtml_use_compact_mode=OptionsInfo(scss=False, category='ihtml', type='boolean', value=False), ihtml_use_text_wrapping=OptionsInfo(scss=False, category='ihtml', type='boolean', value=True), ihtml_use_page_size_select=OptionsInfo(scss=False, category='ihtml', type='boolean', value=False), ihtml_page_size_default=OptionsInfo(scss=False, category='ihtml', type='value', value=10), ihtml_page_size_values=OptionsInfo(scss=False, category='ihtml', type='values', value=[10, 25, 50, 100]), ihtml_pagination_type=OptionsInfo(scss=False, category='ihtml', type='value', value='numbers'), ihtml_height=OptionsInfo(scss=False, category='ihtml', type='value', value='auto'), ihtml_selection_mode=OptionsInfo(scss=False, category='ihtml', type='value', value=None)), _google_font_imports=GoogleFontImports(imports=frozenset()), _has_built=False)</w:t>
       </w:r>
     </w:p>
     <w:bookmarkEnd w:id="16"/>
@@ -1431,7 +1431,7 @@
         <w:pStyle w:val="FirstParagraph"/>
       </w:pPr>
       <w:r>
-        <w:t xml:space="preserve">Esta memoria nula se asemeja al juego de Serpientes y Escaleras visto en clase, donde la casilla futura depende solo de la casilla actual y el dado, a diferencia de extraer cartas de una baraja sin reemplazo donde la baraja cambia con cada extracción previa.</w:t>
+        <w:t xml:space="preserve">Esta memoria nula se asemeja al juego de Serpientes y Escaleras, donde la casilla futura depende solo de la casilla actual y el dado, a diferencia de extraer cartas de una baraja sin reemplazo donde la baraja cambia con cada extracción previa.</w:t>
       </w:r>
     </w:p>
     <w:p>
@@ -1439,7 +1439,7 @@
         <w:pStyle w:val="BodyText"/>
       </w:pPr>
       <w:r>
-        <w:t xml:space="preserve">Como expuso el profesor Ricardo Peña en clase con el ejemplo de los registros de 20 días con 11 días de estudio, el conteo frecuentista simple (11 sobre 20) ignora el orden temporal. Mientras un registro responde a una regla estocástica (70% de estudiar si se estudió hoy), el otro proviene de un volado independiente (50 sobre 50). El análisis de bigramas permite estimar transiciones y modelar la dependencia serial. Siguiendo el planteamiento de la actividad, por ejemplo, la probabilidad de cambiar a la nota SI (B4) dado que actualmente suena la nota RE (D4) se fija en</w:t>
+        <w:t xml:space="preserve">En el modelado estocástico, el análisis frecuentista simple sobre registros temporales ignora el orden serial. Por ejemplo, en un registro de 20 días con 11 días de actividad, el promedio marginal no distingue entre un proceso condicionado (70% de probabilidad condicionada) y un volado independiente (50 sobre 50). El análisis de bigramas permite estimar transiciones y modelar la dependencia serial. Siguiendo el planteamiento de la actividad, por ejemplo, la probabilidad de cambiar a la nota SI (B4) dado que actualmente suena la nota RE (D4) se fija en</w:t>
       </w:r>
       <w:r>
         <w:t xml:space="preserve"> </w:t>
@@ -1669,7 +1669,7 @@
         <w:rPr>
           <w:rStyle w:val="VerbatimChar"/>
         </w:rPr>
-        <w:t xml:space="preserve">6        C#5  0.70  0.10  0.05  0.00  0.10  0.05  0.00, _body=&lt;great_tables._gt_data.Body object at 0xfe52a294f4d0&gt;, _boxhead=Boxhead([ColInfo(var='Estado (t)', type=&lt;ColInfoTypeEnum.default: 1&gt;, column_label='Estado (t)', column_align='left', column_width=None, stub_level=None), ColInfo(var='D4', type=&lt;ColInfoTypeEnum.default: 1&gt;, column_label='D4', column_align='right', column_width=None, stub_level=None), ColInfo(var='E4', type=&lt;ColInfoTypeEnum.default: 1&gt;, column_label='E4', column_align='right', column_width=None, stub_level=None), ColInfo(var='F#4', type=&lt;ColInfoTypeEnum.default: 1&gt;, column_label='F#4', column_align='right', column_width=None, stub_level=None), ColInfo(var='G4', type=&lt;ColInfoTypeEnum.default: 1&gt;, column_label='G4', column_align='right', column_width=None, stub_level=None), ColInfo(var='A4', type=&lt;ColInfoTypeEnum.default: 1&gt;, column_label='A4', column_align='right', column_width=None, stub_level=None), ColInfo(var='B4', type=&lt;ColInfoTypeEnum.default: 1&gt;, column_label='B4', column_align='right', column_width=None, stub_level=None), ColInfo(var='C#5', type=&lt;ColInfoTypeEnum.default: 1&gt;, column_label='C#5', column_align='right', column_width=None, stub_level=None)]), _stub=&lt;great_tables._gt_data.Stub object at 0xfe52a2996850&gt;, _spanners=Spanners([]), _heading=Heading(title='Matriz de Probabilidades de Transición P', subtitle=None, preheader=None), _stubhead=None, _summary_rows=&lt;great_tables._gt_data.SummaryRows object at 0xfe52a29263f0&gt;, _summary_rows_grand=&lt;great_tables._gt_data.SummaryRows object at 0xfe52a29d6f90&gt;, _source_notes=[], _footnotes=[], _styles=[], _locale=&lt;great_tables._gt_data.Locale object at 0xfe52a2996d50&gt;, _formats=[&lt;great_tables._gt_data.FormatInfo object at 0xfe52a29dcc20&gt;], _substitutions=[], _col_merge=[], _transforms=[], _options=Options(table_id=OptionsInfo(scss=False, category='table', type='value', value=None), table_caption=OptionsInfo(scss=False, category='table', type='value', value=None), table_width=OptionsInfo(scss=True, category='table', type='px', value='auto'), table_layout=OptionsInfo(scss=True, category='table', type='value', value='fixed'), table_margin_left=OptionsInfo(scss=True, category='table', type='px', value='auto'), table_margin_right=OptionsInfo(scss=True, category='table', type='px', value='auto'), table_background_color=OptionsInfo(scss=True, category='table', type='value', value='#FFFFFF'), table_additional_css=OptionsInfo(scss=False, category='table', type='values', value=[]), table_font_names=OptionsInfo(scss=False, category='table', type='values', value=['-apple-system', 'BlinkMacSystemFont', 'Segoe UI', 'Roboto', 'Oxygen', 'Ubuntu', 'Cantarell', 'Helvetica Neue', 'Fira Sans', 'Droid Sans', 'Arial', 'sans-serif']), table_font_size=OptionsInfo(scss=True, category='table', type='px', value='16px'), table_font_weight=OptionsInfo(scss=True, category='table', type='value', value='normal'), table_font_style=OptionsInfo(scss=True, category='table', type='value', value='normal'), table_font_color=OptionsInfo(scss=True, category='table', type='value', value='#333333'), table_font_color_light=OptionsInfo(scss=True, category='table', type='value', value='#FFFFFF'), table_border_top_include=OptionsInfo(scss=False, category='table', type='boolean', value=True), table_border_top_style=OptionsInfo(scss=True, category='table', type='value', value='solid'), table_border_top_width=OptionsInfo(scss=True, category='table', type='px', value='2px'), table_border_top_color=OptionsInfo(scss=True, category='table', type='value', value='#A8A8A8'), table_border_right_style=OptionsInfo(scss=True, category='table', type='value', value='none'), table_border_right_width=OptionsInfo(scss=True, category='table', type='px', value='2px'), table_border_right_color=OptionsInfo(scss=True, category='table', type='value', value='#D3D3D3'), table_border_bottom_include=OptionsInfo(scss=False, category='table', type='boolean', value=True), table_border_bottom_style=OptionsInfo(scss=True, category='table', type='value', value='solid'), table_border_bottom_width=OptionsInfo(scss=True, category='table', type='px', value='2px'), table_border_bottom_color=OptionsInfo(scss=True, category='table', type='value', value='#A8A8A8'), table_border_left_style=OptionsInfo(scss=True, category='table', type='value', value='none'), table_border_left_width=OptionsInfo(scss=True, category='table', type='px', value='2px'), table_border_left_color=OptionsInfo(scss=True, category='table', type='value', value='#D3D3D3'), heading_background_color=OptionsInfo(scss=True, category='heading', type='value', value=None), heading_align=OptionsInfo(scss=True, category='heading', type='value', value='center'), heading_title_font_size=OptionsInfo(scss=True, category='heading', type='px', value='125%'), heading_title_font_weight=OptionsInfo(scss=True, category='heading', type='value', value='initial'), heading_subtitle_font_size=OptionsInfo(scss=True, category='heading', type='px', value='85%'), heading_subtitle_font_weight=OptionsInfo(scss=True, category='heading', type='value', value='initial'), heading_padding=OptionsInfo(scss=True, category='heading', type='px', value='4px'), heading_padding_horizontal=OptionsInfo(scss=True, category='heading', type='px', value='5px'), heading_border_bottom_style=OptionsInfo(scss=True, category='heading', type='value', value='solid'), heading_border_bottom_width=OptionsInfo(scss=True, category='heading', type='px', value='2px'), heading_border_bottom_color=OptionsInfo(scss=True, category='heading', type='value', value='#D3D3D3'), heading_border_lr_style=OptionsInfo(scss=True, category='heading', type='value', value='none'), heading_border_lr_width=OptionsInfo(scss=True, category='heading', type='px', value='1px'), heading_border_lr_color=OptionsInfo(scss=True, category='heading', type='value', value='#D3D3D3'), column_labels_background_color=OptionsInfo(scss=True, category='column_labels', type='value', value=None), column_labels_font_size=OptionsInfo(scss=True, category='column_labels', type='px', value='100%'), column_labels_font_weight=OptionsInfo(scss=True, category='column_labels', type='value', value='normal'), column_labels_text_transform=OptionsInfo(scss=True, category='column_labels', type='value', value='inherit'), column_labels_padding=OptionsInfo(scss=True, category='column_labels', type='px', value='5px'), column_labels_padding_horizontal=OptionsInfo(scss=True, category='column_labels', type='px', value='5px'), column_labels_vlines_style=OptionsInfo(scss=True, category='table_body', type='value', value='none'), column_labels_vlines_width=OptionsInfo(scss=True, category='table_body', type='px', value='1px'), column_labels_vlines_color=OptionsInfo(scss=True, category='table_body', type='value', value='#D3D3D3'), column_labels_border_top_style=OptionsInfo(scss=True, category='column_labels', type='value', value='solid'), column_labels_border_top_width=OptionsInfo(scss=True, category='column_labels', type='px', value='2px'), column_labels_border_top_color=OptionsInfo(scss=True, category='column_labels', type='value', value='#D3D3D3'), column_labels_border_bottom_style=OptionsInfo(scss=True, category='column_labels', type='value', value='solid'), column_labels_border_bottom_width=OptionsInfo(scss=True, category='column_labels', type='px', value='2px'), column_labels_border_bottom_color=OptionsInfo(scss=True, category='column_labels', type='value', value='#D3D3D3'), column_labels_border_lr_style=OptionsInfo(scss=True, category='column_labels', type='value', value='none'), column_labels_border_lr_width=OptionsInfo(scss=True, category='column_labels', type='px', value='1px'), column_labels_border_lr_color=OptionsInfo(scss=True, category='column_labels', type='value', value='#D3D3D3'), column_labels_hidden=OptionsInfo(scss=False, category='column_labels', type='boolean', value=False), row_group_background_color=OptionsInfo(scss=True, category='row_group', type='value', value=None), row_group_font_size=OptionsInfo(scss=True, category='row_group', type='px', value='100%'), row_group_font_weight=OptionsInfo(scss=True, category='row_group', type='value', value='initial'), row_group_text_transform=OptionsInfo(scss=True, category='row_group', type='value', value='inherit'), row_group_padding=OptionsInfo(scss=True, category='row_group', type='px', value='8px'), row_group_padding_horizontal=OptionsInfo(scss=True, category='row_group', type='px', value='5px'), row_group_border_top_style=OptionsInfo(scss=True, category='row_group', type='value', value='solid'), row_group_border_top_width=OptionsInfo(scss=True, category='row_group', type='px', value='2px'), row_group_border_top_color=OptionsInfo(scss=True, category='row_group', type='value', value='#D3D3D3'), row_group_border_right_style=OptionsInfo(scss=True, category='row_group', type='value', value='none'), row_group_border_right_width=OptionsInfo(scss=True, category='row_group', type='px', value='1px'), row_group_border_right_color=OptionsInfo(scss=True, category='row_group', type='value', value='#D3D3D3'), row_group_border_bottom_style=OptionsInfo(scss=True, category='row_group', type='value', value='solid'), row_group_border_bottom_width=OptionsInfo(scss=True, category='row_group', type='px', value='2px'), row_group_border_bottom_color=OptionsInfo(scss=True, category='row_group', type='value', value='#D3D3D3'), row_group_border_left_style=OptionsInfo(scss=True, category='row_group', type='value', value='none'), row_group_border_left_width=OptionsInfo(scss=True, category='row_group', type='px', value='1px'), row_group_border_left_color=OptionsInfo(scss=True, category='row_group', type='value', value='#D3D3D3'), row_group_as_column=OptionsInfo(scss=False, category='row_group', type='boolean', value=False), table_body_hlines_style=OptionsInfo(scss=True, category='table_body', type='value', value='solid'), table_body_hlines_width=OptionsInfo(scss=True, category='table_body', type='px', value='1px'), table_body_hlines_color=OptionsInfo(scss=True, category='table_body', type='value', value='#D3D3D3'), table_body_vlines_style=OptionsInfo(scss=True, category='table_body', type='value', value='none'), table_body_vlines_width=OptionsInfo(scss=True, category='table_body', type='px', value='1px'), table_body_vlines_color=OptionsInfo(scss=True, category='table_body', type='value', value='#D3D3D3'), table_body_border_top_style=OptionsInfo(scss=True, category='table_body', type='value', value='solid'), table_body_border_top_width=OptionsInfo(scss=True, category='table_body', type='px', value='2px'), table_body_border_top_color=OptionsInfo(scss=True, category='table_body', type='value', value='#D3D3D3'), table_body_border_bottom_style=OptionsInfo(scss=True, category='table_body', type='value', value='solid'), table_body_border_bottom_width=OptionsInfo(scss=True, category='table_body', type='px', value='2px'), table_body_border_bottom_color=OptionsInfo(scss=True, category='table_body', type='value', value='#D3D3D3'), data_row_padding=OptionsInfo(scss=True, category='data_row', type='px', value='8px'), data_row_padding_horizontal=OptionsInfo(scss=True, category='data_row', type='px', value='5px'), stub_background_color=OptionsInfo(scss=True, category='stub', type='value', value=None), stub_font_size=OptionsInfo(scss=True, category='stub', type='px', value='100%'), stub_font_weight=OptionsInfo(scss=True, category='stub', type='value', value='initial'), stub_text_transform=OptionsInfo(scss=True, category='stub', type='value', value='inherit'), stub_border_style=OptionsInfo(scss=True, category='stub', type='value', value='solid'), stub_border_width=OptionsInfo(scss=True, category='stub', type='px', value='2px'), stub_border_color=OptionsInfo(scss=True, category='stub', type='value', value='#D3D3D3'), stub_indent_length=OptionsInfo(scss=True, category='stub', type='px', value='5px'), stub_row_group_background_color=OptionsInfo(scss=True, category='stub', type='value', value=None), stub_row_group_font_size=OptionsInfo(scss=True, category='stub', type='px', value='100%'), stub_row_group_font_weight=OptionsInfo(scss=True, category='stub', type='value', value='initial'), stub_row_group_text_transform=OptionsInfo(scss=True, category='stub', type='value', value='inherit'), stub_row_group_border_style=OptionsInfo(scss=True, category='stub', type='value', value='solid'), stub_row_group_border_width=OptionsInfo(scss=True, category='stub', type='px', value='2px'), stub_row_group_border_color=OptionsInfo(scss=True, category='stub', type='value', value='#D3D3D3'), summary_row_padding=OptionsInfo(scss=True, category='summary_row', type='px', value='8px'), summary_row_padding_horizontal=OptionsInfo(scss=True, category='summary_row', type='px', value='5px'), summary_row_background_color=OptionsInfo(scss=True, category='summary_row', type='value', value=None), summary_row_text_transform=OptionsInfo(scss=True, category='summary_row', type='value', value='inherit'), summary_row_border_style=OptionsInfo(scss=True, category='summary_row', type='value', value='solid'), summary_row_border_width=OptionsInfo(scss=True, category='summary_row', type='px', value='2px'), summary_row_border_color=OptionsInfo(scss=True, category='summary_row', type='value', value='#D3D3D3'), grand_summary_row_padding=OptionsInfo(scss=True, category='grand_summary_row', type='px', value='8px'), grand_summary_row_padding_horizontal=OptionsInfo(scss=True, category='grand_summary_row', type='px', value='5px'), grand_summary_row_background_color=OptionsInfo(scss=True, category='grand_summary_row', type='value', value=None), grand_summary_row_text_transform=OptionsInfo(scss=True, category='grand_summary_row', type='value', value='inherit'), grand_summary_row_border_style=OptionsInfo(scss=True, category='grand_summary_row', type='value', value='double'), grand_summary_row_border_width=OptionsInfo(scss=True, category='grand_summary_row', type='px', value='6px'), grand_summary_row_border_color=OptionsInfo(scss=True, category='grand_summary_row', type='value', value='#D3D3D3'), footnotes_marks=OptionsInfo(scss=False, category='footnotes', type='values', value='numbers'), footnotes_spec_ref=OptionsInfo(scss=False, category='footnotes', type='value', value='^i'), footnotes_spec_ftr=OptionsInfo(scss=False, category='footnotes', type='value', value='^i'), footnotes_order=OptionsInfo(scss=False, category='footnotes', type='value', value='marks_last'), source_notes_padding=OptionsInfo(scss=True, category='source_notes', type='px', value='4px'), source_notes_padding_horizontal=OptionsInfo(scss=True, category='source_notes', type='px', value='5px'), source_notes_background_color=OptionsInfo(scss=True, category='source_notes', type='value', value=None), source_notes_font_size=OptionsInfo(scss=True, category='source_notes', type='px', value='90%'), source_notes_border_bottom_style=OptionsInfo(scss=True, category='source_notes', type='value', value='none'), source_notes_border_bottom_width=OptionsInfo(scss=True, category='source_notes', type='px', value='2px'), source_notes_border_bottom_color=OptionsInfo(scss=True, category='source_notes', type='value', value='#D3D3D3'), source_notes_border_lr_style=OptionsInfo(scss=True, category='source_notes', type='value', value='none'), source_notes_border_lr_width=OptionsInfo(scss=True, category='source_notes', type='px', value='2px'), source_notes_border_lr_color=OptionsInfo(scss=True, category='source_notes', type='value', value='#D3D3D3'), source_notes_multiline=OptionsInfo(scss=False, category='source_notes', type='boolean', value=True), source_notes_sep=OptionsInfo(scss=False, category='source_notes', type='value', value=' '), row_striping_background_color=OptionsInfo(scss=True, category='row', type='value', value='#F4F4F4'), row_striping_include_stub=OptionsInfo(scss=False, category='row', type='boolean', value=False), row_striping_include_table_body=OptionsInfo(scss=False, category='row', type='boolean', value=False), container_width=OptionsInfo(scss=False, category='container', type='px', value='auto'), container_height=OptionsInfo(scss=False, category='container', type='px', value='auto'), container_padding_x=OptionsInfo(scss=False, category='container', type='px', value='0px'), container_padding_y=OptionsInfo(scss=False, category='container', type='px', value='10px'), container_overflow_x=OptionsInfo(scss=False, category='container', type='overflow', value='auto'), container_overflow_y=OptionsInfo(scss=False, category='container', type='overflow', value='auto'), quarto_disable_processing=OptionsInfo(scss=False, category='quarto', type='logical', value=False), quarto_use_bootstrap=OptionsInfo(scss=False, category='quarto', type='logical', value=False), ihtml_active=OptionsInfo(scss=False, category='ihtml', type='boolean', value=False), ihtml_use_pagination=OptionsInfo(scss=False, category='ihtml', type='boolean', value=True), ihtml_use_pagination_info=OptionsInfo(scss=False, category='ihtml', type='boolean', value=True), ihtml_use_sorting=OptionsInfo(scss=False, category='ihtml', type='boolean', value=True), ihtml_use_search=OptionsInfo(scss=False, category='ihtml', type='boolean', value=False), ihtml_use_filters=OptionsInfo(scss=False, category='ihtml', type='boolean', value=False), ihtml_use_resizers=OptionsInfo(scss=False, category='ihtml', type='boolean', value=False), ihtml_use_highlight=OptionsInfo(scss=False, category='ihtml', type='boolean', value=False), ihtml_use_compact_mode=OptionsInfo(scss=False, category='ihtml', type='boolean', value=False), ihtml_use_text_wrapping=OptionsInfo(scss=False, category='ihtml', type='boolean', value=True), ihtml_use_page_size_select=OptionsInfo(scss=False, category='ihtml', type='boolean', value=False), ihtml_page_size_default=OptionsInfo(scss=False, category='ihtml', type='value', value=10), ihtml_page_size_values=OptionsInfo(scss=False, category='ihtml', type='values', value=[10, 25, 50, 100]), ihtml_pagination_type=OptionsInfo(scss=False, category='ihtml', type='value', value='numbers'), ihtml_height=OptionsInfo(scss=False, category='ihtml', type='value', value='auto'), ihtml_selection_mode=OptionsInfo(scss=False, category='ihtml', type='value', value=None)), _google_font_imports=GoogleFontImports(imports=frozenset()), _has_built=False)</w:t>
+        <w:t xml:space="preserve">6        C#5  0.70  0.10  0.05  0.00  0.10  0.05  0.00, _body=&lt;great_tables._gt_data.Body object at 0xf082883574d0&gt;, _boxhead=Boxhead([ColInfo(var='Estado (t)', type=&lt;ColInfoTypeEnum.default: 1&gt;, column_label='Estado (t)', column_align='left', column_width=None, stub_level=None), ColInfo(var='D4', type=&lt;ColInfoTypeEnum.default: 1&gt;, column_label='D4', column_align='right', column_width=None, stub_level=None), ColInfo(var='E4', type=&lt;ColInfoTypeEnum.default: 1&gt;, column_label='E4', column_align='right', column_width=None, stub_level=None), ColInfo(var='F#4', type=&lt;ColInfoTypeEnum.default: 1&gt;, column_label='F#4', column_align='right', column_width=None, stub_level=None), ColInfo(var='G4', type=&lt;ColInfoTypeEnum.default: 1&gt;, column_label='G4', column_align='right', column_width=None, stub_level=None), ColInfo(var='A4', type=&lt;ColInfoTypeEnum.default: 1&gt;, column_label='A4', column_align='right', column_width=None, stub_level=None), ColInfo(var='B4', type=&lt;ColInfoTypeEnum.default: 1&gt;, column_label='B4', column_align='right', column_width=None, stub_level=None), ColInfo(var='C#5', type=&lt;ColInfoTypeEnum.default: 1&gt;, column_label='C#5', column_align='right', column_width=None, stub_level=None)]), _stub=&lt;great_tables._gt_data.Stub object at 0xf0828839e850&gt;, _spanners=Spanners([]), _heading=Heading(title='Matriz de Probabilidades de Transición P', subtitle=None, preheader=None), _stubhead=None, _summary_rows=&lt;great_tables._gt_data.SummaryRows object at 0xf0828832e3f0&gt;, _summary_rows_grand=&lt;great_tables._gt_data.SummaryRows object at 0xf082883def90&gt;, _source_notes=[], _footnotes=[], _styles=[], _locale=&lt;great_tables._gt_data.Locale object at 0xf0828839ed50&gt;, _formats=[&lt;great_tables._gt_data.FormatInfo object at 0xf082883ecc20&gt;], _substitutions=[], _col_merge=[], _transforms=[], _options=Options(table_id=OptionsInfo(scss=False, category='table', type='value', value=None), table_caption=OptionsInfo(scss=False, category='table', type='value', value=None), table_width=OptionsInfo(scss=True, category='table', type='px', value='auto'), table_layout=OptionsInfo(scss=True, category='table', type='value', value='fixed'), table_margin_left=OptionsInfo(scss=True, category='table', type='px', value='auto'), table_margin_right=OptionsInfo(scss=True, category='table', type='px', value='auto'), table_background_color=OptionsInfo(scss=True, category='table', type='value', value='#FFFFFF'), table_additional_css=OptionsInfo(scss=False, category='table', type='values', value=[]), table_font_names=OptionsInfo(scss=False, category='table', type='values', value=['-apple-system', 'BlinkMacSystemFont', 'Segoe UI', 'Roboto', 'Oxygen', 'Ubuntu', 'Cantarell', 'Helvetica Neue', 'Fira Sans', 'Droid Sans', 'Arial', 'sans-serif']), table_font_size=OptionsInfo(scss=True, category='table', type='px', value='16px'), table_font_weight=OptionsInfo(scss=True, category='table', type='value', value='normal'), table_font_style=OptionsInfo(scss=True, category='table', type='value', value='normal'), table_font_color=OptionsInfo(scss=True, category='table', type='value', value='#333333'), table_font_color_light=OptionsInfo(scss=True, category='table', type='value', value='#FFFFFF'), table_border_top_include=OptionsInfo(scss=False, category='table', type='boolean', value=True), table_border_top_style=OptionsInfo(scss=True, category='table', type='value', value='solid'), table_border_top_width=OptionsInfo(scss=True, category='table', type='px', value='2px'), table_border_top_color=OptionsInfo(scss=True, category='table', type='value', value='#A8A8A8'), table_border_right_style=OptionsInfo(scss=True, category='table', type='value', value='none'), table_border_right_width=OptionsInfo(scss=True, category='table', type='px', value='2px'), table_border_right_color=OptionsInfo(scss=True, category='table', type='value', value='#D3D3D3'), table_border_bottom_include=OptionsInfo(scss=False, category='table', type='boolean', value=True), table_border_bottom_style=OptionsInfo(scss=True, category='table', type='value', value='solid'), table_border_bottom_width=OptionsInfo(scss=True, category='table', type='px', value='2px'), table_border_bottom_color=OptionsInfo(scss=True, category='table', type='value', value='#A8A8A8'), table_border_left_style=OptionsInfo(scss=True, category='table', type='value', value='none'), table_border_left_width=OptionsInfo(scss=True, category='table', type='px', value='2px'), table_border_left_color=OptionsInfo(scss=True, category='table', type='value', value='#D3D3D3'), heading_background_color=OptionsInfo(scss=True, category='heading', type='value', value=None), heading_align=OptionsInfo(scss=True, category='heading', type='value', value='center'), heading_title_font_size=OptionsInfo(scss=True, category='heading', type='px', value='125%'), heading_title_font_weight=OptionsInfo(scss=True, category='heading', type='value', value='initial'), heading_subtitle_font_size=OptionsInfo(scss=True, category='heading', type='px', value='85%'), heading_subtitle_font_weight=OptionsInfo(scss=True, category='heading', type='value', value='initial'), heading_padding=OptionsInfo(scss=True, category='heading', type='px', value='4px'), heading_padding_horizontal=OptionsInfo(scss=True, category='heading', type='px', value='5px'), heading_border_bottom_style=OptionsInfo(scss=True, category='heading', type='value', value='solid'), heading_border_bottom_width=OptionsInfo(scss=True, category='heading', type='px', value='2px'), heading_border_bottom_color=OptionsInfo(scss=True, category='heading', type='value', value='#D3D3D3'), heading_border_lr_style=OptionsInfo(scss=True, category='heading', type='value', value='none'), heading_border_lr_width=OptionsInfo(scss=True, category='heading', type='px', value='1px'), heading_border_lr_color=OptionsInfo(scss=True, category='heading', type='value', value='#D3D3D3'), column_labels_background_color=OptionsInfo(scss=True, category='column_labels', type='value', value=None), column_labels_font_size=OptionsInfo(scss=True, category='column_labels', type='px', value='100%'), column_labels_font_weight=OptionsInfo(scss=True, category='column_labels', type='value', value='normal'), column_labels_text_transform=OptionsInfo(scss=True, category='column_labels', type='value', value='inherit'), column_labels_padding=OptionsInfo(scss=True, category='column_labels', type='px', value='5px'), column_labels_padding_horizontal=OptionsInfo(scss=True, category='column_labels', type='px', value='5px'), column_labels_vlines_style=OptionsInfo(scss=True, category='table_body', type='value', value='none'), column_labels_vlines_width=OptionsInfo(scss=True, category='table_body', type='px', value='1px'), column_labels_vlines_color=OptionsInfo(scss=True, category='table_body', type='value', value='#D3D3D3'), column_labels_border_top_style=OptionsInfo(scss=True, category='column_labels', type='value', value='solid'), column_labels_border_top_width=OptionsInfo(scss=True, category='column_labels', type='px', value='2px'), column_labels_border_top_color=OptionsInfo(scss=True, category='column_labels', type='value', value='#D3D3D3'), column_labels_border_bottom_style=OptionsInfo(scss=True, category='column_labels', type='value', value='solid'), column_labels_border_bottom_width=OptionsInfo(scss=True, category='column_labels', type='px', value='2px'), column_labels_border_bottom_color=OptionsInfo(scss=True, category='column_labels', type='value', value='#D3D3D3'), column_labels_border_lr_style=OptionsInfo(scss=True, category='column_labels', type='value', value='none'), column_labels_border_lr_width=OptionsInfo(scss=True, category='column_labels', type='px', value='1px'), column_labels_border_lr_color=OptionsInfo(scss=True, category='column_labels', type='value', value='#D3D3D3'), column_labels_hidden=OptionsInfo(scss=False, category='column_labels', type='boolean', value=False), row_group_background_color=OptionsInfo(scss=True, category='row_group', type='value', value=None), row_group_font_size=OptionsInfo(scss=True, category='row_group', type='px', value='100%'), row_group_font_weight=OptionsInfo(scss=True, category='row_group', type='value', value='initial'), row_group_text_transform=OptionsInfo(scss=True, category='row_group', type='value', value='inherit'), row_group_padding=OptionsInfo(scss=True, category='row_group', type='px', value='8px'), row_group_padding_horizontal=OptionsInfo(scss=True, category='row_group', type='px', value='5px'), row_group_border_top_style=OptionsInfo(scss=True, category='row_group', type='value', value='solid'), row_group_border_top_width=OptionsInfo(scss=True, category='row_group', type='px', value='2px'), row_group_border_top_color=OptionsInfo(scss=True, category='row_group', type='value', value='#D3D3D3'), row_group_border_right_style=OptionsInfo(scss=True, category='row_group', type='value', value='none'), row_group_border_right_width=OptionsInfo(scss=True, category='row_group', type='px', value='1px'), row_group_border_right_color=OptionsInfo(scss=True, category='row_group', type='value', value='#D3D3D3'), row_group_border_bottom_style=OptionsInfo(scss=True, category='row_group', type='value', value='solid'), row_group_border_bottom_width=OptionsInfo(scss=True, category='row_group', type='px', value='2px'), row_group_border_bottom_color=OptionsInfo(scss=True, category='row_group', type='value', value='#D3D3D3'), row_group_border_left_style=OptionsInfo(scss=True, category='row_group', type='value', value='none'), row_group_border_left_width=OptionsInfo(scss=True, category='row_group', type='px', value='1px'), row_group_border_left_color=OptionsInfo(scss=True, category='row_group', type='value', value='#D3D3D3'), row_group_as_column=OptionsInfo(scss=False, category='row_group', type='boolean', value=False), table_body_hlines_style=OptionsInfo(scss=True, category='table_body', type='value', value='solid'), table_body_hlines_width=OptionsInfo(scss=True, category='table_body', type='px', value='1px'), table_body_hlines_color=OptionsInfo(scss=True, category='table_body', type='value', value='#D3D3D3'), table_body_vlines_style=OptionsInfo(scss=True, category='table_body', type='value', value='none'), table_body_vlines_width=OptionsInfo(scss=True, category='table_body', type='px', value='1px'), table_body_vlines_color=OptionsInfo(scss=True, category='table_body', type='value', value='#D3D3D3'), table_body_border_top_style=OptionsInfo(scss=True, category='table_body', type='value', value='solid'), table_body_border_top_width=OptionsInfo(scss=True, category='table_body', type='px', value='2px'), table_body_border_top_color=OptionsInfo(scss=True, category='table_body', type='value', value='#D3D3D3'), table_body_border_bottom_style=OptionsInfo(scss=True, category='table_body', type='value', value='solid'), table_body_border_bottom_width=OptionsInfo(scss=True, category='table_body', type='px', value='2px'), table_body_border_bottom_color=OptionsInfo(scss=True, category='table_body', type='value', value='#D3D3D3'), data_row_padding=OptionsInfo(scss=True, category='data_row', type='px', value='8px'), data_row_padding_horizontal=OptionsInfo(scss=True, category='data_row', type='px', value='5px'), stub_background_color=OptionsInfo(scss=True, category='stub', type='value', value=None), stub_font_size=OptionsInfo(scss=True, category='stub', type='px', value='100%'), stub_font_weight=OptionsInfo(scss=True, category='stub', type='value', value='initial'), stub_text_transform=OptionsInfo(scss=True, category='stub', type='value', value='inherit'), stub_border_style=OptionsInfo(scss=True, category='stub', type='value', value='solid'), stub_border_width=OptionsInfo(scss=True, category='stub', type='px', value='2px'), stub_border_color=OptionsInfo(scss=True, category='stub', type='value', value='#D3D3D3'), stub_indent_length=OptionsInfo(scss=True, category='stub', type='px', value='5px'), stub_row_group_background_color=OptionsInfo(scss=True, category='stub', type='value', value=None), stub_row_group_font_size=OptionsInfo(scss=True, category='stub', type='px', value='100%'), stub_row_group_font_weight=OptionsInfo(scss=True, category='stub', type='value', value='initial'), stub_row_group_text_transform=OptionsInfo(scss=True, category='stub', type='value', value='inherit'), stub_row_group_border_style=OptionsInfo(scss=True, category='stub', type='value', value='solid'), stub_row_group_border_width=OptionsInfo(scss=True, category='stub', type='px', value='2px'), stub_row_group_border_color=OptionsInfo(scss=True, category='stub', type='value', value='#D3D3D3'), summary_row_padding=OptionsInfo(scss=True, category='summary_row', type='px', value='8px'), summary_row_padding_horizontal=OptionsInfo(scss=True, category='summary_row', type='px', value='5px'), summary_row_background_color=OptionsInfo(scss=True, category='summary_row', type='value', value=None), summary_row_text_transform=OptionsInfo(scss=True, category='summary_row', type='value', value='inherit'), summary_row_border_style=OptionsInfo(scss=True, category='summary_row', type='value', value='solid'), summary_row_border_width=OptionsInfo(scss=True, category='summary_row', type='px', value='2px'), summary_row_border_color=OptionsInfo(scss=True, category='summary_row', type='value', value='#D3D3D3'), grand_summary_row_padding=OptionsInfo(scss=True, category='grand_summary_row', type='px', value='8px'), grand_summary_row_padding_horizontal=OptionsInfo(scss=True, category='grand_summary_row', type='px', value='5px'), grand_summary_row_background_color=OptionsInfo(scss=True, category='grand_summary_row', type='value', value=None), grand_summary_row_text_transform=OptionsInfo(scss=True, category='grand_summary_row', type='value', value='inherit'), grand_summary_row_border_style=OptionsInfo(scss=True, category='grand_summary_row', type='value', value='double'), grand_summary_row_border_width=OptionsInfo(scss=True, category='grand_summary_row', type='px', value='6px'), grand_summary_row_border_color=OptionsInfo(scss=True, category='grand_summary_row', type='value', value='#D3D3D3'), footnotes_marks=OptionsInfo(scss=False, category='footnotes', type='values', value='numbers'), footnotes_spec_ref=OptionsInfo(scss=False, category='footnotes', type='value', value='^i'), footnotes_spec_ftr=OptionsInfo(scss=False, category='footnotes', type='value', value='^i'), footnotes_order=OptionsInfo(scss=False, category='footnotes', type='value', value='marks_last'), source_notes_padding=OptionsInfo(scss=True, category='source_notes', type='px', value='4px'), source_notes_padding_horizontal=OptionsInfo(scss=True, category='source_notes', type='px', value='5px'), source_notes_background_color=OptionsInfo(scss=True, category='source_notes', type='value', value=None), source_notes_font_size=OptionsInfo(scss=True, category='source_notes', type='px', value='90%'), source_notes_border_bottom_style=OptionsInfo(scss=True, category='source_notes', type='value', value='none'), source_notes_border_bottom_width=OptionsInfo(scss=True, category='source_notes', type='px', value='2px'), source_notes_border_bottom_color=OptionsInfo(scss=True, category='source_notes', type='value', value='#D3D3D3'), source_notes_border_lr_style=OptionsInfo(scss=True, category='source_notes', type='value', value='none'), source_notes_border_lr_width=OptionsInfo(scss=True, category='source_notes', type='px', value='2px'), source_notes_border_lr_color=OptionsInfo(scss=True, category='source_notes', type='value', value='#D3D3D3'), source_notes_multiline=OptionsInfo(scss=False, category='source_notes', type='boolean', value=True), source_notes_sep=OptionsInfo(scss=False, category='source_notes', type='value', value=' '), row_striping_background_color=OptionsInfo(scss=True, category='row', type='value', value='#F4F4F4'), row_striping_include_stub=OptionsInfo(scss=False, category='row', type='boolean', value=False), row_striping_include_table_body=OptionsInfo(scss=False, category='row', type='boolean', value=False), container_width=OptionsInfo(scss=False, category='container', type='px', value='auto'), container_height=OptionsInfo(scss=False, category='container', type='px', value='auto'), container_padding_x=OptionsInfo(scss=False, category='container', type='px', value='0px'), container_padding_y=OptionsInfo(scss=False, category='container', type='px', value='10px'), container_overflow_x=OptionsInfo(scss=False, category='container', type='overflow', value='auto'), container_overflow_y=OptionsInfo(scss=False, category='container', type='overflow', value='auto'), quarto_disable_processing=OptionsInfo(scss=False, category='quarto', type='logical', value=False), quarto_use_bootstrap=OptionsInfo(scss=False, category='quarto', type='logical', value=False), ihtml_active=OptionsInfo(scss=False, category='ihtml', type='boolean', value=False), ihtml_use_pagination=OptionsInfo(scss=False, category='ihtml', type='boolean', value=True), ihtml_use_pagination_info=OptionsInfo(scss=False, category='ihtml', type='boolean', value=True), ihtml_use_sorting=OptionsInfo(scss=False, category='ihtml', type='boolean', value=True), ihtml_use_search=OptionsInfo(scss=False, category='ihtml', type='boolean', value=False), ihtml_use_filters=OptionsInfo(scss=False, category='ihtml', type='boolean', value=False), ihtml_use_resizers=OptionsInfo(scss=False, category='ihtml', type='boolean', value=False), ihtml_use_highlight=OptionsInfo(scss=False, category='ihtml', type='boolean', value=False), ihtml_use_compact_mode=OptionsInfo(scss=False, category='ihtml', type='boolean', value=False), ihtml_use_text_wrapping=OptionsInfo(scss=False, category='ihtml', type='boolean', value=True), ihtml_use_page_size_select=OptionsInfo(scss=False, category='ihtml', type='boolean', value=False), ihtml_page_size_default=OptionsInfo(scss=False, category='ihtml', type='value', value=10), ihtml_page_size_values=OptionsInfo(scss=False, category='ihtml', type='values', value=[10, 25, 50, 100]), ihtml_pagination_type=OptionsInfo(scss=False, category='ihtml', type='value', value='numbers'), ihtml_height=OptionsInfo(scss=False, category='ihtml', type='value', value='auto'), ihtml_selection_mode=OptionsInfo(scss=False, category='ihtml', type='value', value=None)), _google_font_imports=GoogleFontImports(imports=frozenset()), _has_built=False)</w:t>
       </w:r>
     </w:p>
     <w:bookmarkEnd w:id="19"/>
@@ -2032,7 +2032,7 @@
         <w:pStyle w:val="FirstParagraph"/>
       </w:pPr>
       <w:r>
-        <w:t xml:space="preserve">En el modelo de lenguaje de tres palabras presentado por Rodrigo Castellanos en clase ("él", "gato", "duerme"), al partir de 100 textos iniciales distribuidos como [50, 40, 10], el vector evoluciona tras 2 pasos a [0.29, 0.33, 0.36] y se estabiliza cerca de 20 transiciones. Esta distribución límite</w:t>
+        <w:t xml:space="preserve">En un modelo de lenguaje de tres estados léxicos ("él", "gato", "duerme"), al partir de 100 secuencias iniciales distribuidas como [50, 40, 10], el vector evoluciona tras 2 pasos a [0.29, 0.33, 0.36] y se estabiliza cerca de 20 transiciones. Esta distribución límite</w:t>
       </w:r>
       <w:r>
         <w:t xml:space="preserve"> </w:t>
@@ -2273,7 +2273,7 @@
         <w:rPr>
           <w:rStyle w:val="VerbatimChar"/>
         </w:rPr>
-        <w:t xml:space="preserve">6  C#5    vii° (Sensible)              0.0437      4.37%, _body=&lt;great_tables._gt_data.Body object at 0xfe52a25f0410&gt;, _boxhead=Boxhead([ColInfo(var='Nota', type=&lt;ColInfoTypeEnum.default: 1&gt;, column_label='Nota', column_align='left', column_width=None, stub_level=None), ColInfo(var='Grado', type=&lt;ColInfoTypeEnum.default: 1&gt;, column_label='Grado', column_align='left', column_width=None, stub_level=None), ColInfo(var='Probabilidad límite', type=&lt;ColInfoTypeEnum.default: 1&gt;, column_label='Probabilidad límite', column_align='right', column_width=None, stub_level=None), ColInfo(var='Porcentaje', type=&lt;ColInfoTypeEnum.default: 1&gt;, column_label='Porcentaje', column_align='right', column_width=None, stub_level=None)]), _stub=&lt;great_tables._gt_data.Stub object at 0xfe52a2926650&gt;, _spanners=Spanners([]), _heading=Heading(title='Distribución Estacionaria Asintótica', subtitle=None, preheader=None), _stubhead=None, _summary_rows=&lt;great_tables._gt_data.SummaryRows object at 0xfe52a2558af0&gt;, _summary_rows_grand=&lt;great_tables._gt_data.SummaryRows object at 0xfe52a25599d0&gt;, _source_notes=[], _footnotes=[], _styles=[], _locale=&lt;great_tables._gt_data.Locale object at 0xfe52a2926d70&gt;, _formats=[], _substitutions=[], _col_merge=[], _transforms=[], _options=Options(table_id=OptionsInfo(scss=False, category='table', type='value', value=None), table_caption=OptionsInfo(scss=False, category='table', type='value', value=None), table_width=OptionsInfo(scss=True, category='table', type='px', value='auto'), table_layout=OptionsInfo(scss=True, category='table', type='value', value='fixed'), table_margin_left=OptionsInfo(scss=True, category='table', type='px', value='auto'), table_margin_right=OptionsInfo(scss=True, category='table', type='px', value='auto'), table_background_color=OptionsInfo(scss=True, category='table', type='value', value='#FFFFFF'), table_additional_css=OptionsInfo(scss=False, category='table', type='values', value=[]), table_font_names=OptionsInfo(scss=False, category='table', type='values', value=['-apple-system', 'BlinkMacSystemFont', 'Segoe UI', 'Roboto', 'Oxygen', 'Ubuntu', 'Cantarell', 'Helvetica Neue', 'Fira Sans', 'Droid Sans', 'Arial', 'sans-serif']), table_font_size=OptionsInfo(scss=True, category='table', type='px', value='16px'), table_font_weight=OptionsInfo(scss=True, category='table', type='value', value='normal'), table_font_style=OptionsInfo(scss=True, category='table', type='value', value='normal'), table_font_color=OptionsInfo(scss=True, category='table', type='value', value='#333333'), table_font_color_light=OptionsInfo(scss=True, category='table', type='value', value='#FFFFFF'), table_border_top_include=OptionsInfo(scss=False, category='table', type='boolean', value=True), table_border_top_style=OptionsInfo(scss=True, category='table', type='value', value='solid'), table_border_top_width=OptionsInfo(scss=True, category='table', type='px', value='2px'), table_border_top_color=OptionsInfo(scss=True, category='table', type='value', value='#A8A8A8'), table_border_right_style=OptionsInfo(scss=True, category='table', type='value', value='none'), table_border_right_width=OptionsInfo(scss=True, category='table', type='px', value='2px'), table_border_right_color=OptionsInfo(scss=True, category='table', type='value', value='#D3D3D3'), table_border_bottom_include=OptionsInfo(scss=False, category='table', type='boolean', value=True), table_border_bottom_style=OptionsInfo(scss=True, category='table', type='value', value='solid'), table_border_bottom_width=OptionsInfo(scss=True, category='table', type='px', value='2px'), table_border_bottom_color=OptionsInfo(scss=True, category='table', type='value', value='#A8A8A8'), table_border_left_style=OptionsInfo(scss=True, category='table', type='value', value='none'), table_border_left_width=OptionsInfo(scss=True, category='table', type='px', value='2px'), table_border_left_color=OptionsInfo(scss=True, category='table', type='value', value='#D3D3D3'), heading_background_color=OptionsInfo(scss=True, category='heading', type='value', value=None), heading_align=OptionsInfo(scss=True, category='heading', type='value', value='center'), heading_title_font_size=OptionsInfo(scss=True, category='heading', type='px', value='125%'), heading_title_font_weight=OptionsInfo(scss=True, category='heading', type='value', value='initial'), heading_subtitle_font_size=OptionsInfo(scss=True, category='heading', type='px', value='85%'), heading_subtitle_font_weight=OptionsInfo(scss=True, category='heading', type='value', value='initial'), heading_padding=OptionsInfo(scss=True, category='heading', type='px', value='4px'), heading_padding_horizontal=OptionsInfo(scss=True, category='heading', type='px', value='5px'), heading_border_bottom_style=OptionsInfo(scss=True, category='heading', type='value', value='solid'), heading_border_bottom_width=OptionsInfo(scss=True, category='heading', type='px', value='2px'), heading_border_bottom_color=OptionsInfo(scss=True, category='heading', type='value', value='#D3D3D3'), heading_border_lr_style=OptionsInfo(scss=True, category='heading', type='value', value='none'), heading_border_lr_width=OptionsInfo(scss=True, category='heading', type='px', value='1px'), heading_border_lr_color=OptionsInfo(scss=True, category='heading', type='value', value='#D3D3D3'), column_labels_background_color=OptionsInfo(scss=True, category='column_labels', type='value', value=None), column_labels_font_size=OptionsInfo(scss=True, category='column_labels', type='px', value='100%'), column_labels_font_weight=OptionsInfo(scss=True, category='column_labels', type='value', value='normal'), column_labels_text_transform=OptionsInfo(scss=True, category='column_labels', type='value', value='inherit'), column_labels_padding=OptionsInfo(scss=True, category='column_labels', type='px', value='5px'), column_labels_padding_horizontal=OptionsInfo(scss=True, category='column_labels', type='px', value='5px'), column_labels_vlines_style=OptionsInfo(scss=True, category='table_body', type='value', value='none'), column_labels_vlines_width=OptionsInfo(scss=True, category='table_body', type='px', value='1px'), column_labels_vlines_color=OptionsInfo(scss=True, category='table_body', type='value', value='#D3D3D3'), column_labels_border_top_style=OptionsInfo(scss=True, category='column_labels', type='value', value='solid'), column_labels_border_top_width=OptionsInfo(scss=True, category='column_labels', type='px', value='2px'), column_labels_border_top_color=OptionsInfo(scss=True, category='column_labels', type='value', value='#D3D3D3'), column_labels_border_bottom_style=OptionsInfo(scss=True, category='column_labels', type='value', value='solid'), column_labels_border_bottom_width=OptionsInfo(scss=True, category='column_labels', type='px', value='2px'), column_labels_border_bottom_color=OptionsInfo(scss=True, category='column_labels', type='value', value='#D3D3D3'), column_labels_border_lr_style=OptionsInfo(scss=True, category='column_labels', type='value', value='none'), column_labels_border_lr_width=OptionsInfo(scss=True, category='column_labels', type='px', value='1px'), column_labels_border_lr_color=OptionsInfo(scss=True, category='column_labels', type='value', value='#D3D3D3'), column_labels_hidden=OptionsInfo(scss=False, category='column_labels', type='boolean', value=False), row_group_background_color=OptionsInfo(scss=True, category='row_group', type='value', value=None), row_group_font_size=OptionsInfo(scss=True, category='row_group', type='px', value='100%'), row_group_font_weight=OptionsInfo(scss=True, category='row_group', type='value', value='initial'), row_group_text_transform=OptionsInfo(scss=True, category='row_group', type='value', value='inherit'), row_group_padding=OptionsInfo(scss=True, category='row_group', type='px', value='8px'), row_group_padding_horizontal=OptionsInfo(scss=True, category='row_group', type='px', value='5px'), row_group_border_top_style=OptionsInfo(scss=True, category='row_group', type='value', value='solid'), row_group_border_top_width=OptionsInfo(scss=True, category='row_group', type='px', value='2px'), row_group_border_top_color=OptionsInfo(scss=True, category='row_group', type='value', value='#D3D3D3'), row_group_border_right_style=OptionsInfo(scss=True, category='row_group', type='value', value='none'), row_group_border_right_width=OptionsInfo(scss=True, category='row_group', type='px', value='1px'), row_group_border_right_color=OptionsInfo(scss=True, category='row_group', type='value', value='#D3D3D3'), row_group_border_bottom_style=OptionsInfo(scss=True, category='row_group', type='value', value='solid'), row_group_border_bottom_width=OptionsInfo(scss=True, category='row_group', type='px', value='2px'), row_group_border_bottom_color=OptionsInfo(scss=True, category='row_group', type='value', value='#D3D3D3'), row_group_border_left_style=OptionsInfo(scss=True, category='row_group', type='value', value='none'), row_group_border_left_width=OptionsInfo(scss=True, category='row_group', type='px', value='1px'), row_group_border_left_color=OptionsInfo(scss=True, category='row_group', type='value', value='#D3D3D3'), row_group_as_column=OptionsInfo(scss=False, category='row_group', type='boolean', value=False), table_body_hlines_style=OptionsInfo(scss=True, category='table_body', type='value', value='solid'), table_body_hlines_width=OptionsInfo(scss=True, category='table_body', type='px', value='1px'), table_body_hlines_color=OptionsInfo(scss=True, category='table_body', type='value', value='#D3D3D3'), table_body_vlines_style=OptionsInfo(scss=True, category='table_body', type='value', value='none'), table_body_vlines_width=OptionsInfo(scss=True, category='table_body', type='px', value='1px'), table_body_vlines_color=OptionsInfo(scss=True, category='table_body', type='value', value='#D3D3D3'), table_body_border_top_style=OptionsInfo(scss=True, category='table_body', type='value', value='solid'), table_body_border_top_width=OptionsInfo(scss=True, category='table_body', type='px', value='2px'), table_body_border_top_color=OptionsInfo(scss=True, category='table_body', type='value', value='#D3D3D3'), table_body_border_bottom_style=OptionsInfo(scss=True, category='table_body', type='value', value='solid'), table_body_border_bottom_width=OptionsInfo(scss=True, category='table_body', type='px', value='2px'), table_body_border_bottom_color=OptionsInfo(scss=True, category='table_body', type='value', value='#D3D3D3'), data_row_padding=OptionsInfo(scss=True, category='data_row', type='px', value='8px'), data_row_padding_horizontal=OptionsInfo(scss=True, category='data_row', type='px', value='5px'), stub_background_color=OptionsInfo(scss=True, category='stub', type='value', value=None), stub_font_size=OptionsInfo(scss=True, category='stub', type='px', value='100%'), stub_font_weight=OptionsInfo(scss=True, category='stub', type='value', value='initial'), stub_text_transform=OptionsInfo(scss=True, category='stub', type='value', value='inherit'), stub_border_style=OptionsInfo(scss=True, category='stub', type='value', value='solid'), stub_border_width=OptionsInfo(scss=True, category='stub', type='px', value='2px'), stub_border_color=OptionsInfo(scss=True, category='stub', type='value', value='#D3D3D3'), stub_indent_length=OptionsInfo(scss=True, category='stub', type='px', value='5px'), stub_row_group_background_color=OptionsInfo(scss=True, category='stub', type='value', value=None), stub_row_group_font_size=OptionsInfo(scss=True, category='stub', type='px', value='100%'), stub_row_group_font_weight=OptionsInfo(scss=True, category='stub', type='value', value='initial'), stub_row_group_text_transform=OptionsInfo(scss=True, category='stub', type='value', value='inherit'), stub_row_group_border_style=OptionsInfo(scss=True, category='stub', type='value', value='solid'), stub_row_group_border_width=OptionsInfo(scss=True, category='stub', type='px', value='2px'), stub_row_group_border_color=OptionsInfo(scss=True, category='stub', type='value', value='#D3D3D3'), summary_row_padding=OptionsInfo(scss=True, category='summary_row', type='px', value='8px'), summary_row_padding_horizontal=OptionsInfo(scss=True, category='summary_row', type='px', value='5px'), summary_row_background_color=OptionsInfo(scss=True, category='summary_row', type='value', value=None), summary_row_text_transform=OptionsInfo(scss=True, category='summary_row', type='value', value='inherit'), summary_row_border_style=OptionsInfo(scss=True, category='summary_row', type='value', value='solid'), summary_row_border_width=OptionsInfo(scss=True, category='summary_row', type='px', value='2px'), summary_row_border_color=OptionsInfo(scss=True, category='summary_row', type='value', value='#D3D3D3'), grand_summary_row_padding=OptionsInfo(scss=True, category='grand_summary_row', type='px', value='8px'), grand_summary_row_padding_horizontal=OptionsInfo(scss=True, category='grand_summary_row', type='px', value='5px'), grand_summary_row_background_color=OptionsInfo(scss=True, category='grand_summary_row', type='value', value=None), grand_summary_row_text_transform=OptionsInfo(scss=True, category='grand_summary_row', type='value', value='inherit'), grand_summary_row_border_style=OptionsInfo(scss=True, category='grand_summary_row', type='value', value='double'), grand_summary_row_border_width=OptionsInfo(scss=True, category='grand_summary_row', type='px', value='6px'), grand_summary_row_border_color=OptionsInfo(scss=True, category='grand_summary_row', type='value', value='#D3D3D3'), footnotes_marks=OptionsInfo(scss=False, category='footnotes', type='values', value='numbers'), footnotes_spec_ref=OptionsInfo(scss=False, category='footnotes', type='value', value='^i'), footnotes_spec_ftr=OptionsInfo(scss=False, category='footnotes', type='value', value='^i'), footnotes_order=OptionsInfo(scss=False, category='footnotes', type='value', value='marks_last'), source_notes_padding=OptionsInfo(scss=True, category='source_notes', type='px', value='4px'), source_notes_padding_horizontal=OptionsInfo(scss=True, category='source_notes', type='px', value='5px'), source_notes_background_color=OptionsInfo(scss=True, category='source_notes', type='value', value=None), source_notes_font_size=OptionsInfo(scss=True, category='source_notes', type='px', value='90%'), source_notes_border_bottom_style=OptionsInfo(scss=True, category='source_notes', type='value', value='none'), source_notes_border_bottom_width=OptionsInfo(scss=True, category='source_notes', type='px', value='2px'), source_notes_border_bottom_color=OptionsInfo(scss=True, category='source_notes', type='value', value='#D3D3D3'), source_notes_border_lr_style=OptionsInfo(scss=True, category='source_notes', type='value', value='none'), source_notes_border_lr_width=OptionsInfo(scss=True, category='source_notes', type='px', value='2px'), source_notes_border_lr_color=OptionsInfo(scss=True, category='source_notes', type='value', value='#D3D3D3'), source_notes_multiline=OptionsInfo(scss=False, category='source_notes', type='boolean', value=True), source_notes_sep=OptionsInfo(scss=False, category='source_notes', type='value', value=' '), row_striping_background_color=OptionsInfo(scss=True, category='row', type='value', value='#F4F4F4'), row_striping_include_stub=OptionsInfo(scss=False, category='row', type='boolean', value=False), row_striping_include_table_body=OptionsInfo(scss=False, category='row', type='boolean', value=False), container_width=OptionsInfo(scss=False, category='container', type='px', value='auto'), container_height=OptionsInfo(scss=False, category='container', type='px', value='auto'), container_padding_x=OptionsInfo(scss=False, category='container', type='px', value='0px'), container_padding_y=OptionsInfo(scss=False, category='container', type='px', value='10px'), container_overflow_x=OptionsInfo(scss=False, category='container', type='overflow', value='auto'), container_overflow_y=OptionsInfo(scss=False, category='container', type='overflow', value='auto'), quarto_disable_processing=OptionsInfo(scss=False, category='quarto', type='logical', value=False), quarto_use_bootstrap=OptionsInfo(scss=False, category='quarto', type='logical', value=False), ihtml_active=OptionsInfo(scss=False, category='ihtml', type='boolean', value=False), ihtml_use_pagination=OptionsInfo(scss=False, category='ihtml', type='boolean', value=True), ihtml_use_pagination_info=OptionsInfo(scss=False, category='ihtml', type='boolean', value=True), ihtml_use_sorting=OptionsInfo(scss=False, category='ihtml', type='boolean', value=True), ihtml_use_search=OptionsInfo(scss=False, category='ihtml', type='boolean', value=False), ihtml_use_filters=OptionsInfo(scss=False, category='ihtml', type='boolean', value=False), ihtml_use_resizers=OptionsInfo(scss=False, category='ihtml', type='boolean', value=False), ihtml_use_highlight=OptionsInfo(scss=False, category='ihtml', type='boolean', value=False), ihtml_use_compact_mode=OptionsInfo(scss=False, category='ihtml', type='boolean', value=False), ihtml_use_text_wrapping=OptionsInfo(scss=False, category='ihtml', type='boolean', value=True), ihtml_use_page_size_select=OptionsInfo(scss=False, category='ihtml', type='boolean', value=False), ihtml_page_size_default=OptionsInfo(scss=False, category='ihtml', type='value', value=10), ihtml_page_size_values=OptionsInfo(scss=False, category='ihtml', type='values', value=[10, 25, 50, 100]), ihtml_pagination_type=OptionsInfo(scss=False, category='ihtml', type='value', value='numbers'), ihtml_height=OptionsInfo(scss=False, category='ihtml', type='value', value='auto'), ihtml_selection_mode=OptionsInfo(scss=False, category='ihtml', type='value', value=None)), _google_font_imports=GoogleFontImports(imports=frozenset()), _has_built=False)</w:t>
+        <w:t xml:space="preserve">6  C#5    vii° (Sensible)              0.0437      4.37%, _body=&lt;great_tables._gt_data.Body object at 0xf08285d04410&gt;, _boxhead=Boxhead([ColInfo(var='Nota', type=&lt;ColInfoTypeEnum.default: 1&gt;, column_label='Nota', column_align='left', column_width=None, stub_level=None), ColInfo(var='Grado', type=&lt;ColInfoTypeEnum.default: 1&gt;, column_label='Grado', column_align='left', column_width=None, stub_level=None), ColInfo(var='Probabilidad límite', type=&lt;ColInfoTypeEnum.default: 1&gt;, column_label='Probabilidad límite', column_align='right', column_width=None, stub_level=None), ColInfo(var='Porcentaje', type=&lt;ColInfoTypeEnum.default: 1&gt;, column_label='Porcentaje', column_align='right', column_width=None, stub_level=None)]), _stub=&lt;great_tables._gt_data.Stub object at 0xf0828832e650&gt;, _spanners=Spanners([]), _heading=Heading(title='Distribución Estacionaria Asintótica', subtitle=None, preheader=None), _stubhead=None, _summary_rows=&lt;great_tables._gt_data.SummaryRows object at 0xf08287f60af0&gt;, _summary_rows_grand=&lt;great_tables._gt_data.SummaryRows object at 0xf08287f619d0&gt;, _source_notes=[], _footnotes=[], _styles=[], _locale=&lt;great_tables._gt_data.Locale object at 0xf0828832ed70&gt;, _formats=[], _substitutions=[], _col_merge=[], _transforms=[], _options=Options(table_id=OptionsInfo(scss=False, category='table', type='value', value=None), table_caption=OptionsInfo(scss=False, category='table', type='value', value=None), table_width=OptionsInfo(scss=True, category='table', type='px', value='auto'), table_layout=OptionsInfo(scss=True, category='table', type='value', value='fixed'), table_margin_left=OptionsInfo(scss=True, category='table', type='px', value='auto'), table_margin_right=OptionsInfo(scss=True, category='table', type='px', value='auto'), table_background_color=OptionsInfo(scss=True, category='table', type='value', value='#FFFFFF'), table_additional_css=OptionsInfo(scss=False, category='table', type='values', value=[]), table_font_names=OptionsInfo(scss=False, category='table', type='values', value=['-apple-system', 'BlinkMacSystemFont', 'Segoe UI', 'Roboto', 'Oxygen', 'Ubuntu', 'Cantarell', 'Helvetica Neue', 'Fira Sans', 'Droid Sans', 'Arial', 'sans-serif']), table_font_size=OptionsInfo(scss=True, category='table', type='px', value='16px'), table_font_weight=OptionsInfo(scss=True, category='table', type='value', value='normal'), table_font_style=OptionsInfo(scss=True, category='table', type='value', value='normal'), table_font_color=OptionsInfo(scss=True, category='table', type='value', value='#333333'), table_font_color_light=OptionsInfo(scss=True, category='table', type='value', value='#FFFFFF'), table_border_top_include=OptionsInfo(scss=False, category='table', type='boolean', value=True), table_border_top_style=OptionsInfo(scss=True, category='table', type='value', value='solid'), table_border_top_width=OptionsInfo(scss=True, category='table', type='px', value='2px'), table_border_top_color=OptionsInfo(scss=True, category='table', type='value', value='#A8A8A8'), table_border_right_style=OptionsInfo(scss=True, category='table', type='value', value='none'), table_border_right_width=OptionsInfo(scss=True, category='table', type='px', value='2px'), table_border_right_color=OptionsInfo(scss=True, category='table', type='value', value='#D3D3D3'), table_border_bottom_include=OptionsInfo(scss=False, category='table', type='boolean', value=True), table_border_bottom_style=OptionsInfo(scss=True, category='table', type='value', value='solid'), table_border_bottom_width=OptionsInfo(scss=True, category='table', type='px', value='2px'), table_border_bottom_color=OptionsInfo(scss=True, category='table', type='value', value='#A8A8A8'), table_border_left_style=OptionsInfo(scss=True, category='table', type='value', value='none'), table_border_left_width=OptionsInfo(scss=True, category='table', type='px', value='2px'), table_border_left_color=OptionsInfo(scss=True, category='table', type='value', value='#D3D3D3'), heading_background_color=OptionsInfo(scss=True, category='heading', type='value', value=None), heading_align=OptionsInfo(scss=True, category='heading', type='value', value='center'), heading_title_font_size=OptionsInfo(scss=True, category='heading', type='px', value='125%'), heading_title_font_weight=OptionsInfo(scss=True, category='heading', type='value', value='initial'), heading_subtitle_font_size=OptionsInfo(scss=True, category='heading', type='px', value='85%'), heading_subtitle_font_weight=OptionsInfo(scss=True, category='heading', type='value', value='initial'), heading_padding=OptionsInfo(scss=True, category='heading', type='px', value='4px'), heading_padding_horizontal=OptionsInfo(scss=True, category='heading', type='px', value='5px'), heading_border_bottom_style=OptionsInfo(scss=True, category='heading', type='value', value='solid'), heading_border_bottom_width=OptionsInfo(scss=True, category='heading', type='px', value='2px'), heading_border_bottom_color=OptionsInfo(scss=True, category='heading', type='value', value='#D3D3D3'), heading_border_lr_style=OptionsInfo(scss=True, category='heading', type='value', value='none'), heading_border_lr_width=OptionsInfo(scss=True, category='heading', type='px', value='1px'), heading_border_lr_color=OptionsInfo(scss=True, category='heading', type='value', value='#D3D3D3'), column_labels_background_color=OptionsInfo(scss=True, category='column_labels', type='value', value=None), column_labels_font_size=OptionsInfo(scss=True, category='column_labels', type='px', value='100%'), column_labels_font_weight=OptionsInfo(scss=True, category='column_labels', type='value', value='normal'), column_labels_text_transform=OptionsInfo(scss=True, category='column_labels', type='value', value='inherit'), column_labels_padding=OptionsInfo(scss=True, category='column_labels', type='px', value='5px'), column_labels_padding_horizontal=OptionsInfo(scss=True, category='column_labels', type='px', value='5px'), column_labels_vlines_style=OptionsInfo(scss=True, category='table_body', type='value', value='none'), column_labels_vlines_width=OptionsInfo(scss=True, category='table_body', type='px', value='1px'), column_labels_vlines_color=OptionsInfo(scss=True, category='table_body', type='value', value='#D3D3D3'), column_labels_border_top_style=OptionsInfo(scss=True, category='column_labels', type='value', value='solid'), column_labels_border_top_width=OptionsInfo(scss=True, category='column_labels', type='px', value='2px'), column_labels_border_top_color=OptionsInfo(scss=True, category='column_labels', type='value', value='#D3D3D3'), column_labels_border_bottom_style=OptionsInfo(scss=True, category='column_labels', type='value', value='solid'), column_labels_border_bottom_width=OptionsInfo(scss=True, category='column_labels', type='px', value='2px'), column_labels_border_bottom_color=OptionsInfo(scss=True, category='column_labels', type='value', value='#D3D3D3'), column_labels_border_lr_style=OptionsInfo(scss=True, category='column_labels', type='value', value='none'), column_labels_border_lr_width=OptionsInfo(scss=True, category='column_labels', type='px', value='1px'), column_labels_border_lr_color=OptionsInfo(scss=True, category='column_labels', type='value', value='#D3D3D3'), column_labels_hidden=OptionsInfo(scss=False, category='column_labels', type='boolean', value=False), row_group_background_color=OptionsInfo(scss=True, category='row_group', type='value', value=None), row_group_font_size=OptionsInfo(scss=True, category='row_group', type='px', value='100%'), row_group_font_weight=OptionsInfo(scss=True, category='row_group', type='value', value='initial'), row_group_text_transform=OptionsInfo(scss=True, category='row_group', type='value', value='inherit'), row_group_padding=OptionsInfo(scss=True, category='row_group', type='px', value='8px'), row_group_padding_horizontal=OptionsInfo(scss=True, category='row_group', type='px', value='5px'), row_group_border_top_style=OptionsInfo(scss=True, category='row_group', type='value', value='solid'), row_group_border_top_width=OptionsInfo(scss=True, category='row_group', type='px', value='2px'), row_group_border_top_color=OptionsInfo(scss=True, category='row_group', type='value', value='#D3D3D3'), row_group_border_right_style=OptionsInfo(scss=True, category='row_group', type='value', value='none'), row_group_border_right_width=OptionsInfo(scss=True, category='row_group', type='px', value='1px'), row_group_border_right_color=OptionsInfo(scss=True, category='row_group', type='value', value='#D3D3D3'), row_group_border_bottom_style=OptionsInfo(scss=True, category='row_group', type='value', value='solid'), row_group_border_bottom_width=OptionsInfo(scss=True, category='row_group', type='px', value='2px'), row_group_border_bottom_color=OptionsInfo(scss=True, category='row_group', type='value', value='#D3D3D3'), row_group_border_left_style=OptionsInfo(scss=True, category='row_group', type='value', value='none'), row_group_border_left_width=OptionsInfo(scss=True, category='row_group', type='px', value='1px'), row_group_border_left_color=OptionsInfo(scss=True, category='row_group', type='value', value='#D3D3D3'), row_group_as_column=OptionsInfo(scss=False, category='row_group', type='boolean', value=False), table_body_hlines_style=OptionsInfo(scss=True, category='table_body', type='value', value='solid'), table_body_hlines_width=OptionsInfo(scss=True, category='table_body', type='px', value='1px'), table_body_hlines_color=OptionsInfo(scss=True, category='table_body', type='value', value='#D3D3D3'), table_body_vlines_style=OptionsInfo(scss=True, category='table_body', type='value', value='none'), table_body_vlines_width=OptionsInfo(scss=True, category='table_body', type='px', value='1px'), table_body_vlines_color=OptionsInfo(scss=True, category='table_body', type='value', value='#D3D3D3'), table_body_border_top_style=OptionsInfo(scss=True, category='table_body', type='value', value='solid'), table_body_border_top_width=OptionsInfo(scss=True, category='table_body', type='px', value='2px'), table_body_border_top_color=OptionsInfo(scss=True, category='table_body', type='value', value='#D3D3D3'), table_body_border_bottom_style=OptionsInfo(scss=True, category='table_body', type='value', value='solid'), table_body_border_bottom_width=OptionsInfo(scss=True, category='table_body', type='px', value='2px'), table_body_border_bottom_color=OptionsInfo(scss=True, category='table_body', type='value', value='#D3D3D3'), data_row_padding=OptionsInfo(scss=True, category='data_row', type='px', value='8px'), data_row_padding_horizontal=OptionsInfo(scss=True, category='data_row', type='px', value='5px'), stub_background_color=OptionsInfo(scss=True, category='stub', type='value', value=None), stub_font_size=OptionsInfo(scss=True, category='stub', type='px', value='100%'), stub_font_weight=OptionsInfo(scss=True, category='stub', type='value', value='initial'), stub_text_transform=OptionsInfo(scss=True, category='stub', type='value', value='inherit'), stub_border_style=OptionsInfo(scss=True, category='stub', type='value', value='solid'), stub_border_width=OptionsInfo(scss=True, category='stub', type='px', value='2px'), stub_border_color=OptionsInfo(scss=True, category='stub', type='value', value='#D3D3D3'), stub_indent_length=OptionsInfo(scss=True, category='stub', type='px', value='5px'), stub_row_group_background_color=OptionsInfo(scss=True, category='stub', type='value', value=None), stub_row_group_font_size=OptionsInfo(scss=True, category='stub', type='px', value='100%'), stub_row_group_font_weight=OptionsInfo(scss=True, category='stub', type='value', value='initial'), stub_row_group_text_transform=OptionsInfo(scss=True, category='stub', type='value', value='inherit'), stub_row_group_border_style=OptionsInfo(scss=True, category='stub', type='value', value='solid'), stub_row_group_border_width=OptionsInfo(scss=True, category='stub', type='px', value='2px'), stub_row_group_border_color=OptionsInfo(scss=True, category='stub', type='value', value='#D3D3D3'), summary_row_padding=OptionsInfo(scss=True, category='summary_row', type='px', value='8px'), summary_row_padding_horizontal=OptionsInfo(scss=True, category='summary_row', type='px', value='5px'), summary_row_background_color=OptionsInfo(scss=True, category='summary_row', type='value', value=None), summary_row_text_transform=OptionsInfo(scss=True, category='summary_row', type='value', value='inherit'), summary_row_border_style=OptionsInfo(scss=True, category='summary_row', type='value', value='solid'), summary_row_border_width=OptionsInfo(scss=True, category='summary_row', type='px', value='2px'), summary_row_border_color=OptionsInfo(scss=True, category='summary_row', type='value', value='#D3D3D3'), grand_summary_row_padding=OptionsInfo(scss=True, category='grand_summary_row', type='px', value='8px'), grand_summary_row_padding_horizontal=OptionsInfo(scss=True, category='grand_summary_row', type='px', value='5px'), grand_summary_row_background_color=OptionsInfo(scss=True, category='grand_summary_row', type='value', value=None), grand_summary_row_text_transform=OptionsInfo(scss=True, category='grand_summary_row', type='value', value='inherit'), grand_summary_row_border_style=OptionsInfo(scss=True, category='grand_summary_row', type='value', value='double'), grand_summary_row_border_width=OptionsInfo(scss=True, category='grand_summary_row', type='px', value='6px'), grand_summary_row_border_color=OptionsInfo(scss=True, category='grand_summary_row', type='value', value='#D3D3D3'), footnotes_marks=OptionsInfo(scss=False, category='footnotes', type='values', value='numbers'), footnotes_spec_ref=OptionsInfo(scss=False, category='footnotes', type='value', value='^i'), footnotes_spec_ftr=OptionsInfo(scss=False, category='footnotes', type='value', value='^i'), footnotes_order=OptionsInfo(scss=False, category='footnotes', type='value', value='marks_last'), source_notes_padding=OptionsInfo(scss=True, category='source_notes', type='px', value='4px'), source_notes_padding_horizontal=OptionsInfo(scss=True, category='source_notes', type='px', value='5px'), source_notes_background_color=OptionsInfo(scss=True, category='source_notes', type='value', value=None), source_notes_font_size=OptionsInfo(scss=True, category='source_notes', type='px', value='90%'), source_notes_border_bottom_style=OptionsInfo(scss=True, category='source_notes', type='value', value='none'), source_notes_border_bottom_width=OptionsInfo(scss=True, category='source_notes', type='px', value='2px'), source_notes_border_bottom_color=OptionsInfo(scss=True, category='source_notes', type='value', value='#D3D3D3'), source_notes_border_lr_style=OptionsInfo(scss=True, category='source_notes', type='value', value='none'), source_notes_border_lr_width=OptionsInfo(scss=True, category='source_notes', type='px', value='2px'), source_notes_border_lr_color=OptionsInfo(scss=True, category='source_notes', type='value', value='#D3D3D3'), source_notes_multiline=OptionsInfo(scss=False, category='source_notes', type='boolean', value=True), source_notes_sep=OptionsInfo(scss=False, category='source_notes', type='value', value=' '), row_striping_background_color=OptionsInfo(scss=True, category='row', type='value', value='#F4F4F4'), row_striping_include_stub=OptionsInfo(scss=False, category='row', type='boolean', value=False), row_striping_include_table_body=OptionsInfo(scss=False, category='row', type='boolean', value=False), container_width=OptionsInfo(scss=False, category='container', type='px', value='auto'), container_height=OptionsInfo(scss=False, category='container', type='px', value='auto'), container_padding_x=OptionsInfo(scss=False, category='container', type='px', value='0px'), container_padding_y=OptionsInfo(scss=False, category='container', type='px', value='10px'), container_overflow_x=OptionsInfo(scss=False, category='container', type='overflow', value='auto'), container_overflow_y=OptionsInfo(scss=False, category='container', type='overflow', value='auto'), quarto_disable_processing=OptionsInfo(scss=False, category='quarto', type='logical', value=False), quarto_use_bootstrap=OptionsInfo(scss=False, category='quarto', type='logical', value=False), ihtml_active=OptionsInfo(scss=False, category='ihtml', type='boolean', value=False), ihtml_use_pagination=OptionsInfo(scss=False, category='ihtml', type='boolean', value=True), ihtml_use_pagination_info=OptionsInfo(scss=False, category='ihtml', type='boolean', value=True), ihtml_use_sorting=OptionsInfo(scss=False, category='ihtml', type='boolean', value=True), ihtml_use_search=OptionsInfo(scss=False, category='ihtml', type='boolean', value=False), ihtml_use_filters=OptionsInfo(scss=False, category='ihtml', type='boolean', value=False), ihtml_use_resizers=OptionsInfo(scss=False, category='ihtml', type='boolean', value=False), ihtml_use_highlight=OptionsInfo(scss=False, category='ihtml', type='boolean', value=False), ihtml_use_compact_mode=OptionsInfo(scss=False, category='ihtml', type='boolean', value=False), ihtml_use_text_wrapping=OptionsInfo(scss=False, category='ihtml', type='boolean', value=True), ihtml_use_page_size_select=OptionsInfo(scss=False, category='ihtml', type='boolean', value=False), ihtml_page_size_default=OptionsInfo(scss=False, category='ihtml', type='value', value=10), ihtml_page_size_values=OptionsInfo(scss=False, category='ihtml', type='values', value=[10, 25, 50, 100]), ihtml_pagination_type=OptionsInfo(scss=False, category='ihtml', type='value', value='numbers'), ihtml_height=OptionsInfo(scss=False, category='ihtml', type='value', value='auto'), ihtml_selection_mode=OptionsInfo(scss=False, category='ihtml', type='value', value=None)), _google_font_imports=GoogleFontImports(imports=frozenset()), _has_built=False)</w:t>
       </w:r>
     </w:p>
     <w:bookmarkEnd w:id="29"/>
@@ -2785,7 +2785,7 @@
         <w:rPr>
           <w:rStyle w:val="VerbatimChar"/>
         </w:rPr>
-        <w:t xml:space="preserve">16    16          A4   E4      329.63      1.00         10.25, _body=&lt;great_tables._gt_data.Body object at 0xfe52a03e7cf0&gt;, _boxhead=Boxhead([ColInfo(var='Paso', type=&lt;ColInfoTypeEnum.default: 1&gt;, column_label='Paso', column_align='center', column_width=None, stub_level=None), ColInfo(var='Estado ant.', type=&lt;ColInfoTypeEnum.default: 1&gt;, column_label='Estado ant.', column_align='left', column_width=None, stub_level=None), ColInfo(var='Nota', type=&lt;ColInfoTypeEnum.default: 1&gt;, column_label='Nota', column_align='left', column_width=None, stub_level=None), ColInfo(var='Frecuencia', type=&lt;ColInfoTypeEnum.default: 1&gt;, column_label='Frecuencia', column_align='right', column_width=None, stub_level=None), ColInfo(var='Duración', type=&lt;ColInfoTypeEnum.default: 1&gt;, column_label='Duración', column_align='right', column_width=None, stub_level=None), ColInfo(var='Tiempo acum.', type=&lt;ColInfoTypeEnum.default: 1&gt;, column_label='Tiempo acum.', column_align='right', column_width=None, stub_level=None)]), _stub=&lt;great_tables._gt_data.Stub object at 0xfe52a29269e0&gt;, _spanners=Spanners([]), _heading=Heading(title='Secuencia: 16 Transiciones', subtitle=None, preheader=None), _stubhead=None, _summary_rows=&lt;great_tables._gt_data.SummaryRows object at 0xfe52a2547850&gt;, _summary_rows_grand=&lt;great_tables._gt_data.SummaryRows object at 0xfe52a2547950&gt;, _source_notes=[], _footnotes=[], _styles=[], _locale=&lt;great_tables._gt_data.Locale object at 0xfe52a2563a80&gt;, _formats=[], _substitutions=[], _col_merge=[], _transforms=[], _options=Options(table_id=OptionsInfo(scss=False, category='table', type='value', value=None), table_caption=OptionsInfo(scss=False, category='table', type='value', value=None), table_width=OptionsInfo(scss=True, category='table', type='px', value='auto'), table_layout=OptionsInfo(scss=True, category='table', type='value', value='fixed'), table_margin_left=OptionsInfo(scss=True, category='table', type='px', value='auto'), table_margin_right=OptionsInfo(scss=True, category='table', type='px', value='auto'), table_background_color=OptionsInfo(scss=True, category='table', type='value', value='#FFFFFF'), table_additional_css=OptionsInfo(scss=False, category='table', type='values', value=[]), table_font_names=OptionsInfo(scss=False, category='table', type='values', value=['-apple-system', 'BlinkMacSystemFont', 'Segoe UI', 'Roboto', 'Oxygen', 'Ubuntu', 'Cantarell', 'Helvetica Neue', 'Fira Sans', 'Droid Sans', 'Arial', 'sans-serif']), table_font_size=OptionsInfo(scss=True, category='table', type='px', value='16px'), table_font_weight=OptionsInfo(scss=True, category='table', type='value', value='normal'), table_font_style=OptionsInfo(scss=True, category='table', type='value', value='normal'), table_font_color=OptionsInfo(scss=True, category='table', type='value', value='#333333'), table_font_color_light=OptionsInfo(scss=True, category='table', type='value', value='#FFFFFF'), table_border_top_include=OptionsInfo(scss=False, category='table', type='boolean', value=True), table_border_top_style=OptionsInfo(scss=True, category='table', type='value', value='solid'), table_border_top_width=OptionsInfo(scss=True, category='table', type='px', value='2px'), table_border_top_color=OptionsInfo(scss=True, category='table', type='value', value='#A8A8A8'), table_border_right_style=OptionsInfo(scss=True, category='table', type='value', value='none'), table_border_right_width=OptionsInfo(scss=True, category='table', type='px', value='2px'), table_border_right_color=OptionsInfo(scss=True, category='table', type='value', value='#D3D3D3'), table_border_bottom_include=OptionsInfo(scss=False, category='table', type='boolean', value=True), table_border_bottom_style=OptionsInfo(scss=True, category='table', type='value', value='solid'), table_border_bottom_width=OptionsInfo(scss=True, category='table', type='px', value='2px'), table_border_bottom_color=OptionsInfo(scss=True, category='table', type='value', value='#A8A8A8'), table_border_left_style=OptionsInfo(scss=True, category='table', type='value', value='none'), table_border_left_width=OptionsInfo(scss=True, category='table', type='px', value='2px'), table_border_left_color=OptionsInfo(scss=True, category='table', type='value', value='#D3D3D3'), heading_background_color=OptionsInfo(scss=True, category='heading', type='value', value=None), heading_align=OptionsInfo(scss=True, category='heading', type='value', value='center'), heading_title_font_size=OptionsInfo(scss=True, category='heading', type='px', value='125%'), heading_title_font_weight=OptionsInfo(scss=True, category='heading', type='value', value='initial'), heading_subtitle_font_size=OptionsInfo(scss=True, category='heading', type='px', value='85%'), heading_subtitle_font_weight=OptionsInfo(scss=True, category='heading', type='value', value='initial'), heading_padding=OptionsInfo(scss=True, category='heading', type='px', value='4px'), heading_padding_horizontal=OptionsInfo(scss=True, category='heading', type='px', value='5px'), heading_border_bottom_style=OptionsInfo(scss=True, category='heading', type='value', value='solid'), heading_border_bottom_width=OptionsInfo(scss=True, category='heading', type='px', value='2px'), heading_border_bottom_color=OptionsInfo(scss=True, category='heading', type='value', value='#D3D3D3'), heading_border_lr_style=OptionsInfo(scss=True, category='heading', type='value', value='none'), heading_border_lr_width=OptionsInfo(scss=True, category='heading', type='px', value='1px'), heading_border_lr_color=OptionsInfo(scss=True, category='heading', type='value', value='#D3D3D3'), column_labels_background_color=OptionsInfo(scss=True, category='column_labels', type='value', value=None), column_labels_font_size=OptionsInfo(scss=True, category='column_labels', type='px', value='100%'), column_labels_font_weight=OptionsInfo(scss=True, category='column_labels', type='value', value='normal'), column_labels_text_transform=OptionsInfo(scss=True, category='column_labels', type='value', value='inherit'), column_labels_padding=OptionsInfo(scss=True, category='column_labels', type='px', value='5px'), column_labels_padding_horizontal=OptionsInfo(scss=True, category='column_labels', type='px', value='5px'), column_labels_vlines_style=OptionsInfo(scss=True, category='table_body', type='value', value='none'), column_labels_vlines_width=OptionsInfo(scss=True, category='table_body', type='px', value='1px'), column_labels_vlines_color=OptionsInfo(scss=True, category='table_body', type='value', value='#D3D3D3'), column_labels_border_top_style=OptionsInfo(scss=True, category='column_labels', type='value', value='solid'), column_labels_border_top_width=OptionsInfo(scss=True, category='column_labels', type='px', value='2px'), column_labels_border_top_color=OptionsInfo(scss=True, category='column_labels', type='value', value='#D3D3D3'), column_labels_border_bottom_style=OptionsInfo(scss=True, category='column_labels', type='value', value='solid'), column_labels_border_bottom_width=OptionsInfo(scss=True, category='column_labels', type='px', value='2px'), column_labels_border_bottom_color=OptionsInfo(scss=True, category='column_labels', type='value', value='#D3D3D3'), column_labels_border_lr_style=OptionsInfo(scss=True, category='column_labels', type='value', value='none'), column_labels_border_lr_width=OptionsInfo(scss=True, category='column_labels', type='px', value='1px'), column_labels_border_lr_color=OptionsInfo(scss=True, category='column_labels', type='value', value='#D3D3D3'), column_labels_hidden=OptionsInfo(scss=False, category='column_labels', type='boolean', value=False), row_group_background_color=OptionsInfo(scss=True, category='row_group', type='value', value=None), row_group_font_size=OptionsInfo(scss=True, category='row_group', type='px', value='100%'), row_group_font_weight=OptionsInfo(scss=True, category='row_group', type='value', value='initial'), row_group_text_transform=OptionsInfo(scss=True, category='row_group', type='value', value='inherit'), row_group_padding=OptionsInfo(scss=True, category='row_group', type='px', value='8px'), row_group_padding_horizontal=OptionsInfo(scss=True, category='row_group', type='px', value='5px'), row_group_border_top_style=OptionsInfo(scss=True, category='row_group', type='value', value='solid'), row_group_border_top_width=OptionsInfo(scss=True, category='row_group', type='px', value='2px'), row_group_border_top_color=OptionsInfo(scss=True, category='row_group', type='value', value='#D3D3D3'), row_group_border_right_style=OptionsInfo(scss=True, category='row_group', type='value', value='none'), row_group_border_right_width=OptionsInfo(scss=True, category='row_group', type='px', value='1px'), row_group_border_right_color=OptionsInfo(scss=True, category='row_group', type='value', value='#D3D3D3'), row_group_border_bottom_style=OptionsInfo(scss=True, category='row_group', type='value', value='solid'), row_group_border_bottom_width=OptionsInfo(scss=True, category='row_group', type='px', value='2px'), row_group_border_bottom_color=OptionsInfo(scss=True, category='row_group', type='value', value='#D3D3D3'), row_group_border_left_style=OptionsInfo(scss=True, category='row_group', type='value', value='none'), row_group_border_left_width=OptionsInfo(scss=True, category='row_group', type='px', value='1px'), row_group_border_left_color=OptionsInfo(scss=True, category='row_group', type='value', value='#D3D3D3'), row_group_as_column=OptionsInfo(scss=False, category='row_group', type='boolean', value=False), table_body_hlines_style=OptionsInfo(scss=True, category='table_body', type='value', value='solid'), table_body_hlines_width=OptionsInfo(scss=True, category='table_body', type='px', value='1px'), table_body_hlines_color=OptionsInfo(scss=True, category='table_body', type='value', value='#D3D3D3'), table_body_vlines_style=OptionsInfo(scss=True, category='table_body', type='value', value='none'), table_body_vlines_width=OptionsInfo(scss=True, category='table_body', type='px', value='1px'), table_body_vlines_color=OptionsInfo(scss=True, category='table_body', type='value', value='#D3D3D3'), table_body_border_top_style=OptionsInfo(scss=True, category='table_body', type='value', value='solid'), table_body_border_top_width=OptionsInfo(scss=True, category='table_body', type='px', value='2px'), table_body_border_top_color=OptionsInfo(scss=True, category='table_body', type='value', value='#D3D3D3'), table_body_border_bottom_style=OptionsInfo(scss=True, category='table_body', type='value', value='solid'), table_body_border_bottom_width=OptionsInfo(scss=True, category='table_body', type='px', value='2px'), table_body_border_bottom_color=OptionsInfo(scss=True, category='table_body', type='value', value='#D3D3D3'), data_row_padding=OptionsInfo(scss=True, category='data_row', type='px', value='8px'), data_row_padding_horizontal=OptionsInfo(scss=True, category='data_row', type='px', value='5px'), stub_background_color=OptionsInfo(scss=True, category='stub', type='value', value=None), stub_font_size=OptionsInfo(scss=True, category='stub', type='px', value='100%'), stub_font_weight=OptionsInfo(scss=True, category='stub', type='value', value='initial'), stub_text_transform=OptionsInfo(scss=True, category='stub', type='value', value='inherit'), stub_border_style=OptionsInfo(scss=True, category='stub', type='value', value='solid'), stub_border_width=OptionsInfo(scss=True, category='stub', type='px', value='2px'), stub_border_color=OptionsInfo(scss=True, category='stub', type='value', value='#D3D3D3'), stub_indent_length=OptionsInfo(scss=True, category='stub', type='px', value='5px'), stub_row_group_background_color=OptionsInfo(scss=True, category='stub', type='value', value=None), stub_row_group_font_size=OptionsInfo(scss=True, category='stub', type='px', value='100%'), stub_row_group_font_weight=OptionsInfo(scss=True, category='stub', type='value', value='initial'), stub_row_group_text_transform=OptionsInfo(scss=True, category='stub', type='value', value='inherit'), stub_row_group_border_style=OptionsInfo(scss=True, category='stub', type='value', value='solid'), stub_row_group_border_width=OptionsInfo(scss=True, category='stub', type='px', value='2px'), stub_row_group_border_color=OptionsInfo(scss=True, category='stub', type='value', value='#D3D3D3'), summary_row_padding=OptionsInfo(scss=True, category='summary_row', type='px', value='8px'), summary_row_padding_horizontal=OptionsInfo(scss=True, category='summary_row', type='px', value='5px'), summary_row_background_color=OptionsInfo(scss=True, category='summary_row', type='value', value=None), summary_row_text_transform=OptionsInfo(scss=True, category='summary_row', type='value', value='inherit'), summary_row_border_style=OptionsInfo(scss=True, category='summary_row', type='value', value='solid'), summary_row_border_width=OptionsInfo(scss=True, category='summary_row', type='px', value='2px'), summary_row_border_color=OptionsInfo(scss=True, category='summary_row', type='value', value='#D3D3D3'), grand_summary_row_padding=OptionsInfo(scss=True, category='grand_summary_row', type='px', value='8px'), grand_summary_row_padding_horizontal=OptionsInfo(scss=True, category='grand_summary_row', type='px', value='5px'), grand_summary_row_background_color=OptionsInfo(scss=True, category='grand_summary_row', type='value', value=None), grand_summary_row_text_transform=OptionsInfo(scss=True, category='grand_summary_row', type='value', value='inherit'), grand_summary_row_border_style=OptionsInfo(scss=True, category='grand_summary_row', type='value', value='double'), grand_summary_row_border_width=OptionsInfo(scss=True, category='grand_summary_row', type='px', value='6px'), grand_summary_row_border_color=OptionsInfo(scss=True, category='grand_summary_row', type='value', value='#D3D3D3'), footnotes_marks=OptionsInfo(scss=False, category='footnotes', type='values', value='numbers'), footnotes_spec_ref=OptionsInfo(scss=False, category='footnotes', type='value', value='^i'), footnotes_spec_ftr=OptionsInfo(scss=False, category='footnotes', type='value', value='^i'), footnotes_order=OptionsInfo(scss=False, category='footnotes', type='value', value='marks_last'), source_notes_padding=OptionsInfo(scss=True, category='source_notes', type='px', value='4px'), source_notes_padding_horizontal=OptionsInfo(scss=True, category='source_notes', type='px', value='5px'), source_notes_background_color=OptionsInfo(scss=True, category='source_notes', type='value', value=None), source_notes_font_size=OptionsInfo(scss=True, category='source_notes', type='px', value='90%'), source_notes_border_bottom_style=OptionsInfo(scss=True, category='source_notes', type='value', value='none'), source_notes_border_bottom_width=OptionsInfo(scss=True, category='source_notes', type='px', value='2px'), source_notes_border_bottom_color=OptionsInfo(scss=True, category='source_notes', type='value', value='#D3D3D3'), source_notes_border_lr_style=OptionsInfo(scss=True, category='source_notes', type='value', value='none'), source_notes_border_lr_width=OptionsInfo(scss=True, category='source_notes', type='px', value='2px'), source_notes_border_lr_color=OptionsInfo(scss=True, category='source_notes', type='value', value='#D3D3D3'), source_notes_multiline=OptionsInfo(scss=False, category='source_notes', type='boolean', value=True), source_notes_sep=OptionsInfo(scss=False, category='source_notes', type='value', value=' '), row_striping_background_color=OptionsInfo(scss=True, category='row', type='value', value='#F4F4F4'), row_striping_include_stub=OptionsInfo(scss=False, category='row', type='boolean', value=False), row_striping_include_table_body=OptionsInfo(scss=False, category='row', type='boolean', value=False), container_width=OptionsInfo(scss=False, category='container', type='px', value='auto'), container_height=OptionsInfo(scss=False, category='container', type='px', value='auto'), container_padding_x=OptionsInfo(scss=False, category='container', type='px', value='0px'), container_padding_y=OptionsInfo(scss=False, category='container', type='px', value='10px'), container_overflow_x=OptionsInfo(scss=False, category='container', type='overflow', value='auto'), container_overflow_y=OptionsInfo(scss=False, category='container', type='overflow', value='auto'), quarto_disable_processing=OptionsInfo(scss=False, category='quarto', type='logical', value=False), quarto_use_bootstrap=OptionsInfo(scss=False, category='quarto', type='logical', value=False), ihtml_active=OptionsInfo(scss=False, category='ihtml', type='boolean', value=False), ihtml_use_pagination=OptionsInfo(scss=False, category='ihtml', type='boolean', value=True), ihtml_use_pagination_info=OptionsInfo(scss=False, category='ihtml', type='boolean', value=True), ihtml_use_sorting=OptionsInfo(scss=False, category='ihtml', type='boolean', value=True), ihtml_use_search=OptionsInfo(scss=False, category='ihtml', type='boolean', value=False), ihtml_use_filters=OptionsInfo(scss=False, category='ihtml', type='boolean', value=False), ihtml_use_resizers=OptionsInfo(scss=False, category='ihtml', type='boolean', value=False), ihtml_use_highlight=OptionsInfo(scss=False, category='ihtml', type='boolean', value=False), ihtml_use_compact_mode=OptionsInfo(scss=False, category='ihtml', type='boolean', value=False), ihtml_use_text_wrapping=OptionsInfo(scss=False, category='ihtml', type='boolean', value=True), ihtml_use_page_size_select=OptionsInfo(scss=False, category='ihtml', type='boolean', value=False), ihtml_page_size_default=OptionsInfo(scss=False, category='ihtml', type='value', value=10), ihtml_page_size_values=OptionsInfo(scss=False, category='ihtml', type='values', value=[10, 25, 50, 100]), ihtml_pagination_type=OptionsInfo(scss=False, category='ihtml', type='value', value='numbers'), ihtml_height=OptionsInfo(scss=False, category='ihtml', type='value', value='auto'), ihtml_selection_mode=OptionsInfo(scss=False, category='ihtml', type='value', value=None)), _google_font_imports=GoogleFontImports(imports=frozenset()), _has_built=False)</w:t>
+        <w:t xml:space="preserve">16    16          A4   E4      329.63      1.00         10.25, _body=&lt;great_tables._gt_data.Body object at 0xf082883e2210&gt;, _boxhead=Boxhead([ColInfo(var='Paso', type=&lt;ColInfoTypeEnum.default: 1&gt;, column_label='Paso', column_align='center', column_width=None, stub_level=None), ColInfo(var='Estado ant.', type=&lt;ColInfoTypeEnum.default: 1&gt;, column_label='Estado ant.', column_align='left', column_width=None, stub_level=None), ColInfo(var='Nota', type=&lt;ColInfoTypeEnum.default: 1&gt;, column_label='Nota', column_align='left', column_width=None, stub_level=None), ColInfo(var='Frecuencia', type=&lt;ColInfoTypeEnum.default: 1&gt;, column_label='Frecuencia', column_align='right', column_width=None, stub_level=None), ColInfo(var='Duración', type=&lt;ColInfoTypeEnum.default: 1&gt;, column_label='Duración', column_align='right', column_width=None, stub_level=None), ColInfo(var='Tiempo acum.', type=&lt;ColInfoTypeEnum.default: 1&gt;, column_label='Tiempo acum.', column_align='right', column_width=None, stub_level=None)]), _stub=&lt;great_tables._gt_data.Stub object at 0xf0828832e9e0&gt;, _spanners=Spanners([]), _heading=Heading(title='Secuencia: 16 Transiciones', subtitle=None, preheader=None), _stubhead=None, _summary_rows=&lt;great_tables._gt_data.SummaryRows object at 0xf08287f4f850&gt;, _summary_rows_grand=&lt;great_tables._gt_data.SummaryRows object at 0xf08287f4f950&gt;, _source_notes=[], _footnotes=[], _styles=[], _locale=&lt;great_tables._gt_data.Locale object at 0xf08287f6ba80&gt;, _formats=[], _substitutions=[], _col_merge=[], _transforms=[], _options=Options(table_id=OptionsInfo(scss=False, category='table', type='value', value=None), table_caption=OptionsInfo(scss=False, category='table', type='value', value=None), table_width=OptionsInfo(scss=True, category='table', type='px', value='auto'), table_layout=OptionsInfo(scss=True, category='table', type='value', value='fixed'), table_margin_left=OptionsInfo(scss=True, category='table', type='px', value='auto'), table_margin_right=OptionsInfo(scss=True, category='table', type='px', value='auto'), table_background_color=OptionsInfo(scss=True, category='table', type='value', value='#FFFFFF'), table_additional_css=OptionsInfo(scss=False, category='table', type='values', value=[]), table_font_names=OptionsInfo(scss=False, category='table', type='values', value=['-apple-system', 'BlinkMacSystemFont', 'Segoe UI', 'Roboto', 'Oxygen', 'Ubuntu', 'Cantarell', 'Helvetica Neue', 'Fira Sans', 'Droid Sans', 'Arial', 'sans-serif']), table_font_size=OptionsInfo(scss=True, category='table', type='px', value='16px'), table_font_weight=OptionsInfo(scss=True, category='table', type='value', value='normal'), table_font_style=OptionsInfo(scss=True, category='table', type='value', value='normal'), table_font_color=OptionsInfo(scss=True, category='table', type='value', value='#333333'), table_font_color_light=OptionsInfo(scss=True, category='table', type='value', value='#FFFFFF'), table_border_top_include=OptionsInfo(scss=False, category='table', type='boolean', value=True), table_border_top_style=OptionsInfo(scss=True, category='table', type='value', value='solid'), table_border_top_width=OptionsInfo(scss=True, category='table', type='px', value='2px'), table_border_top_color=OptionsInfo(scss=True, category='table', type='value', value='#A8A8A8'), table_border_right_style=OptionsInfo(scss=True, category='table', type='value', value='none'), table_border_right_width=OptionsInfo(scss=True, category='table', type='px', value='2px'), table_border_right_color=OptionsInfo(scss=True, category='table', type='value', value='#D3D3D3'), table_border_bottom_include=OptionsInfo(scss=False, category='table', type='boolean', value=True), table_border_bottom_style=OptionsInfo(scss=True, category='table', type='value', value='solid'), table_border_bottom_width=OptionsInfo(scss=True, category='table', type='px', value='2px'), table_border_bottom_color=OptionsInfo(scss=True, category='table', type='value', value='#A8A8A8'), table_border_left_style=OptionsInfo(scss=True, category='table', type='value', value='none'), table_border_left_width=OptionsInfo(scss=True, category='table', type='px', value='2px'), table_border_left_color=OptionsInfo(scss=True, category='table', type='value', value='#D3D3D3'), heading_background_color=OptionsInfo(scss=True, category='heading', type='value', value=None), heading_align=OptionsInfo(scss=True, category='heading', type='value', value='center'), heading_title_font_size=OptionsInfo(scss=True, category='heading', type='px', value='125%'), heading_title_font_weight=OptionsInfo(scss=True, category='heading', type='value', value='initial'), heading_subtitle_font_size=OptionsInfo(scss=True, category='heading', type='px', value='85%'), heading_subtitle_font_weight=OptionsInfo(scss=True, category='heading', type='value', value='initial'), heading_padding=OptionsInfo(scss=True, category='heading', type='px', value='4px'), heading_padding_horizontal=OptionsInfo(scss=True, category='heading', type='px', value='5px'), heading_border_bottom_style=OptionsInfo(scss=True, category='heading', type='value', value='solid'), heading_border_bottom_width=OptionsInfo(scss=True, category='heading', type='px', value='2px'), heading_border_bottom_color=OptionsInfo(scss=True, category='heading', type='value', value='#D3D3D3'), heading_border_lr_style=OptionsInfo(scss=True, category='heading', type='value', value='none'), heading_border_lr_width=OptionsInfo(scss=True, category='heading', type='px', value='1px'), heading_border_lr_color=OptionsInfo(scss=True, category='heading', type='value', value='#D3D3D3'), column_labels_background_color=OptionsInfo(scss=True, category='column_labels', type='value', value=None), column_labels_font_size=OptionsInfo(scss=True, category='column_labels', type='px', value='100%'), column_labels_font_weight=OptionsInfo(scss=True, category='column_labels', type='value', value='normal'), column_labels_text_transform=OptionsInfo(scss=True, category='column_labels', type='value', value='inherit'), column_labels_padding=OptionsInfo(scss=True, category='column_labels', type='px', value='5px'), column_labels_padding_horizontal=OptionsInfo(scss=True, category='column_labels', type='px', value='5px'), column_labels_vlines_style=OptionsInfo(scss=True, category='table_body', type='value', value='none'), column_labels_vlines_width=OptionsInfo(scss=True, category='table_body', type='px', value='1px'), column_labels_vlines_color=OptionsInfo(scss=True, category='table_body', type='value', value='#D3D3D3'), column_labels_border_top_style=OptionsInfo(scss=True, category='column_labels', type='value', value='solid'), column_labels_border_top_width=OptionsInfo(scss=True, category='column_labels', type='px', value='2px'), column_labels_border_top_color=OptionsInfo(scss=True, category='column_labels', type='value', value='#D3D3D3'), column_labels_border_bottom_style=OptionsInfo(scss=True, category='column_labels', type='value', value='solid'), column_labels_border_bottom_width=OptionsInfo(scss=True, category='column_labels', type='px', value='2px'), column_labels_border_bottom_color=OptionsInfo(scss=True, category='column_labels', type='value', value='#D3D3D3'), column_labels_border_lr_style=OptionsInfo(scss=True, category='column_labels', type='value', value='none'), column_labels_border_lr_width=OptionsInfo(scss=True, category='column_labels', type='px', value='1px'), column_labels_border_lr_color=OptionsInfo(scss=True, category='column_labels', type='value', value='#D3D3D3'), column_labels_hidden=OptionsInfo(scss=False, category='column_labels', type='boolean', value=False), row_group_background_color=OptionsInfo(scss=True, category='row_group', type='value', value=None), row_group_font_size=OptionsInfo(scss=True, category='row_group', type='px', value='100%'), row_group_font_weight=OptionsInfo(scss=True, category='row_group', type='value', value='initial'), row_group_text_transform=OptionsInfo(scss=True, category='row_group', type='value', value='inherit'), row_group_padding=OptionsInfo(scss=True, category='row_group', type='px', value='8px'), row_group_padding_horizontal=OptionsInfo(scss=True, category='row_group', type='px', value='5px'), row_group_border_top_style=OptionsInfo(scss=True, category='row_group', type='value', value='solid'), row_group_border_top_width=OptionsInfo(scss=True, category='row_group', type='px', value='2px'), row_group_border_top_color=OptionsInfo(scss=True, category='row_group', type='value', value='#D3D3D3'), row_group_border_right_style=OptionsInfo(scss=True, category='row_group', type='value', value='none'), row_group_border_right_width=OptionsInfo(scss=True, category='row_group', type='px', value='1px'), row_group_border_right_color=OptionsInfo(scss=True, category='row_group', type='value', value='#D3D3D3'), row_group_border_bottom_style=OptionsInfo(scss=True, category='row_group', type='value', value='solid'), row_group_border_bottom_width=OptionsInfo(scss=True, category='row_group', type='px', value='2px'), row_group_border_bottom_color=OptionsInfo(scss=True, category='row_group', type='value', value='#D3D3D3'), row_group_border_left_style=OptionsInfo(scss=True, category='row_group', type='value', value='none'), row_group_border_left_width=OptionsInfo(scss=True, category='row_group', type='px', value='1px'), row_group_border_left_color=OptionsInfo(scss=True, category='row_group', type='value', value='#D3D3D3'), row_group_as_column=OptionsInfo(scss=False, category='row_group', type='boolean', value=False), table_body_hlines_style=OptionsInfo(scss=True, category='table_body', type='value', value='solid'), table_body_hlines_width=OptionsInfo(scss=True, category='table_body', type='px', value='1px'), table_body_hlines_color=OptionsInfo(scss=True, category='table_body', type='value', value='#D3D3D3'), table_body_vlines_style=OptionsInfo(scss=True, category='table_body', type='value', value='none'), table_body_vlines_width=OptionsInfo(scss=True, category='table_body', type='px', value='1px'), table_body_vlines_color=OptionsInfo(scss=True, category='table_body', type='value', value='#D3D3D3'), table_body_border_top_style=OptionsInfo(scss=True, category='table_body', type='value', value='solid'), table_body_border_top_width=OptionsInfo(scss=True, category='table_body', type='px', value='2px'), table_body_border_top_color=OptionsInfo(scss=True, category='table_body', type='value', value='#D3D3D3'), table_body_border_bottom_style=OptionsInfo(scss=True, category='table_body', type='value', value='solid'), table_body_border_bottom_width=OptionsInfo(scss=True, category='table_body', type='px', value='2px'), table_body_border_bottom_color=OptionsInfo(scss=True, category='table_body', type='value', value='#D3D3D3'), data_row_padding=OptionsInfo(scss=True, category='data_row', type='px', value='8px'), data_row_padding_horizontal=OptionsInfo(scss=True, category='data_row', type='px', value='5px'), stub_background_color=OptionsInfo(scss=True, category='stub', type='value', value=None), stub_font_size=OptionsInfo(scss=True, category='stub', type='px', value='100%'), stub_font_weight=OptionsInfo(scss=True, category='stub', type='value', value='initial'), stub_text_transform=OptionsInfo(scss=True, category='stub', type='value', value='inherit'), stub_border_style=OptionsInfo(scss=True, category='stub', type='value', value='solid'), stub_border_width=OptionsInfo(scss=True, category='stub', type='px', value='2px'), stub_border_color=OptionsInfo(scss=True, category='stub', type='value', value='#D3D3D3'), stub_indent_length=OptionsInfo(scss=True, category='stub', type='px', value='5px'), stub_row_group_background_color=OptionsInfo(scss=True, category='stub', type='value', value=None), stub_row_group_font_size=OptionsInfo(scss=True, category='stub', type='px', value='100%'), stub_row_group_font_weight=OptionsInfo(scss=True, category='stub', type='value', value='initial'), stub_row_group_text_transform=OptionsInfo(scss=True, category='stub', type='value', value='inherit'), stub_row_group_border_style=OptionsInfo(scss=True, category='stub', type='value', value='solid'), stub_row_group_border_width=OptionsInfo(scss=True, category='stub', type='px', value='2px'), stub_row_group_border_color=OptionsInfo(scss=True, category='stub', type='value', value='#D3D3D3'), summary_row_padding=OptionsInfo(scss=True, category='summary_row', type='px', value='8px'), summary_row_padding_horizontal=OptionsInfo(scss=True, category='summary_row', type='px', value='5px'), summary_row_background_color=OptionsInfo(scss=True, category='summary_row', type='value', value=None), summary_row_text_transform=OptionsInfo(scss=True, category='summary_row', type='value', value='inherit'), summary_row_border_style=OptionsInfo(scss=True, category='summary_row', type='value', value='solid'), summary_row_border_width=OptionsInfo(scss=True, category='summary_row', type='px', value='2px'), summary_row_border_color=OptionsInfo(scss=True, category='summary_row', type='value', value='#D3D3D3'), grand_summary_row_padding=OptionsInfo(scss=True, category='grand_summary_row', type='px', value='8px'), grand_summary_row_padding_horizontal=OptionsInfo(scss=True, category='grand_summary_row', type='px', value='5px'), grand_summary_row_background_color=OptionsInfo(scss=True, category='grand_summary_row', type='value', value=None), grand_summary_row_text_transform=OptionsInfo(scss=True, category='grand_summary_row', type='value', value='inherit'), grand_summary_row_border_style=OptionsInfo(scss=True, category='grand_summary_row', type='value', value='double'), grand_summary_row_border_width=OptionsInfo(scss=True, category='grand_summary_row', type='px', value='6px'), grand_summary_row_border_color=OptionsInfo(scss=True, category='grand_summary_row', type='value', value='#D3D3D3'), footnotes_marks=OptionsInfo(scss=False, category='footnotes', type='values', value='numbers'), footnotes_spec_ref=OptionsInfo(scss=False, category='footnotes', type='value', value='^i'), footnotes_spec_ftr=OptionsInfo(scss=False, category='footnotes', type='value', value='^i'), footnotes_order=OptionsInfo(scss=False, category='footnotes', type='value', value='marks_last'), source_notes_padding=OptionsInfo(scss=True, category='source_notes', type='px', value='4px'), source_notes_padding_horizontal=OptionsInfo(scss=True, category='source_notes', type='px', value='5px'), source_notes_background_color=OptionsInfo(scss=True, category='source_notes', type='value', value=None), source_notes_font_size=OptionsInfo(scss=True, category='source_notes', type='px', value='90%'), source_notes_border_bottom_style=OptionsInfo(scss=True, category='source_notes', type='value', value='none'), source_notes_border_bottom_width=OptionsInfo(scss=True, category='source_notes', type='px', value='2px'), source_notes_border_bottom_color=OptionsInfo(scss=True, category='source_notes', type='value', value='#D3D3D3'), source_notes_border_lr_style=OptionsInfo(scss=True, category='source_notes', type='value', value='none'), source_notes_border_lr_width=OptionsInfo(scss=True, category='source_notes', type='px', value='2px'), source_notes_border_lr_color=OptionsInfo(scss=True, category='source_notes', type='value', value='#D3D3D3'), source_notes_multiline=OptionsInfo(scss=False, category='source_notes', type='boolean', value=True), source_notes_sep=OptionsInfo(scss=False, category='source_notes', type='value', value=' '), row_striping_background_color=OptionsInfo(scss=True, category='row', type='value', value='#F4F4F4'), row_striping_include_stub=OptionsInfo(scss=False, category='row', type='boolean', value=False), row_striping_include_table_body=OptionsInfo(scss=False, category='row', type='boolean', value=False), container_width=OptionsInfo(scss=False, category='container', type='px', value='auto'), container_height=OptionsInfo(scss=False, category='container', type='px', value='auto'), container_padding_x=OptionsInfo(scss=False, category='container', type='px', value='0px'), container_padding_y=OptionsInfo(scss=False, category='container', type='px', value='10px'), container_overflow_x=OptionsInfo(scss=False, category='container', type='overflow', value='auto'), container_overflow_y=OptionsInfo(scss=False, category='container', type='overflow', value='auto'), quarto_disable_processing=OptionsInfo(scss=False, category='quarto', type='logical', value=False), quarto_use_bootstrap=OptionsInfo(scss=False, category='quarto', type='logical', value=False), ihtml_active=OptionsInfo(scss=False, category='ihtml', type='boolean', value=False), ihtml_use_pagination=OptionsInfo(scss=False, category='ihtml', type='boolean', value=True), ihtml_use_pagination_info=OptionsInfo(scss=False, category='ihtml', type='boolean', value=True), ihtml_use_sorting=OptionsInfo(scss=False, category='ihtml', type='boolean', value=True), ihtml_use_search=OptionsInfo(scss=False, category='ihtml', type='boolean', value=False), ihtml_use_filters=OptionsInfo(scss=False, category='ihtml', type='boolean', value=False), ihtml_use_resizers=OptionsInfo(scss=False, category='ihtml', type='boolean', value=False), ihtml_use_highlight=OptionsInfo(scss=False, category='ihtml', type='boolean', value=False), ihtml_use_compact_mode=OptionsInfo(scss=False, category='ihtml', type='boolean', value=False), ihtml_use_text_wrapping=OptionsInfo(scss=False, category='ihtml', type='boolean', value=True), ihtml_use_page_size_select=OptionsInfo(scss=False, category='ihtml', type='boolean', value=False), ihtml_page_size_default=OptionsInfo(scss=False, category='ihtml', type='value', value=10), ihtml_page_size_values=OptionsInfo(scss=False, category='ihtml', type='values', value=[10, 25, 50, 100]), ihtml_pagination_type=OptionsInfo(scss=False, category='ihtml', type='value', value='numbers'), ihtml_height=OptionsInfo(scss=False, category='ihtml', type='value', value='auto'), ihtml_selection_mode=OptionsInfo(scss=False, category='ihtml', type='value', value=None)), _google_font_imports=GoogleFontImports(imports=frozenset()), _has_built=False)</w:t>
       </w:r>
     </w:p>
     <w:bookmarkEnd w:id="38"/>
@@ -3020,7 +3020,7 @@
         <w:pStyle w:val="FirstParagraph"/>
       </w:pPr>
       <w:r>
-        <w:t xml:space="preserve">Uno empieza pensando que la música va a sonar robótica o caótica como en el prototipo de Netlify, donde cada nota tiene casi la misma probabilidad de salir. Pero en cuanto incorporas teoría armónica, la melodía cobra sentido. Como vimos con el profe Ricardo Peña en la clase del 8 de octubre, un proceso markoviano modela la dependencia condicional paso a paso. El caso de los registros de estudio de 20 días con 11 días de estudio lo ilustra bien: el conteo frecuentista no distingue entre seguir una regla o tirar una moneda, pero el análisis de bigramas revela la verdadera estructura. En música ocurre igual, pues la coherencia melódica surge de la probabilidad condicional entre notas consecutivas.</w:t>
+        <w:t xml:space="preserve">Uno empieza pensando que la música va a sonar robótica o caótica como en el prototipo de Netlify, donde cada nota tiene casi la misma probabilidad de salir. Pero en cuanto incorporas teoría armónica, la melodía cobra sentido. Un proceso markoviano modela la dependencia condicional paso a paso. El caso de registros de 20 observaciones con 11 eventos positivos lo ilustra bien: el conteo frecuentista no distingue entre seguir una regla o tirar una moneda, pero el análisis de bigramas revela la verdadera estructura. En música ocurre igual, pues la coherencia melódica surge de la probabilidad condicional entre notas consecutivas.</w:t>
       </w:r>
     </w:p>
     <w:p>
@@ -3028,7 +3028,7 @@
         <w:pStyle w:val="BodyText"/>
       </w:pPr>
       <w:r>
-        <w:t xml:space="preserve">La música real depende de la repetición deliberada de motivos y estribillos, pero una cadena de primer orden padece de amnesia temporal porque solo recuerda el estado actual. Para capturar patrones repetitivos se requeriría ampliar la memoria a órdenes superiores o usar modelos de orden variable, similar al ejercicio en clase del modelo de tres palabras de Rodrigo Castellanos ("él", "gato", "duerme") que estabilizó probabilidades tras 20 pasos, o como hace PageRank con caminantes aleatorios. Sin embargo, aumentar la memoria provoca una explosión en el espacio de estados, haciendo que el modelo memorice el corpus en lugar de generar variaciones fluidas.</w:t>
+        <w:t xml:space="preserve">La música real depende de la repetición deliberada de motivos y estribillos, pero una cadena de primer orden padece de amnesia temporal porque solo recuerda el estado actual. Para capturar patrones repetitivos se requeriría ampliar la memoria a órdenes superiores o usar modelos de orden variable, similar a modelos de juguete de tres palabras ("él", "gato", "duerme") que estabilizan probabilidades tras 20 pasos, o como hace PageRank con caminantes aleatorios. Sin embargo, aumentar la memoria provoca una explosión en el espacio de estados, haciendo que el modelo memorice el corpus en lugar de generar variaciones fluidas.</w:t>
       </w:r>
     </w:p>
     <w:p>
@@ -3044,7 +3044,7 @@
         <w:pStyle w:val="BodyText"/>
       </w:pPr>
       <w:r>
-        <w:t xml:space="preserve">Al igual que con el análisis de colas M/M/1 y el dimensionamiento de cajas en Walmart discutido en clase, estos modelos sirven para simular escenarios rápidos sin arrastrar historiales pesados. Con duraciones variables y envolvente ADSR para evitar chasquidos en los tonos senoidales, la cadena produce secuencias musicales interesantes con mínimo costo computacional. Aunque la generación actual utilice redes con atención, la cadena de Markov sigue siendo una base intuitiva y elegante para entender procesos estocásticos.</w:t>
+        <w:t xml:space="preserve">Al igual que con el análisis de colas M/M/1 y el dimensionamiento de servidores en sistemas de servicio, estos modelos sirven para simular escenarios rápidos sin arrastrar historiales pesados. Con duraciones variables y envolvente ADSR para evitar chasquidos en los tonos senoidales, la cadena produce secuencias musicales interesantes con mínimo costo computacional. Aunque la generación actual utilice redes con atención, la cadena de Markov sigue siendo una base intuitiva y elegante para entender procesos estocásticos.</w:t>
       </w:r>
     </w:p>
     <w:bookmarkEnd w:id="53"/>

</xml_diff>